<commit_message>
Memorando RGAC 1.2: propriedades das tabelas na ordem do esquema (larguras passam a ser respeitadas)
Co-Authored-By: Claude Opus 5.5 <noreply@anthropic.com>
Claude-Session: https://claude.ai/code/session_014DugHn4TLfFaZJnbpoBJVk
</commit_message>
<xml_diff>
--- a/memorando_rgac/Memorando_Acompanhamento_RGAC.docx
+++ b/memorando_rgac/Memorando_Acompanhamento_RGAC.docx
@@ -30,7 +30,7 @@
     </w:p>
     <w:tbl>
       <w:tblPr>
-        <w:tblLook w:firstColumn="1" w:firstRow="1" w:lastColumn="0" w:lastRow="0" w:noHBand="0" w:noVBand="1" w:val="04A0"/>
+        <w:tblW w:w="9071" w:type="dxa"/>
         <w:tblBorders>
           <w:top w:val="single" w:sz="4" w:space="0" w:color="000000"/>
           <w:left w:val="single" w:sz="4" w:space="0" w:color="000000"/>
@@ -39,8 +39,8 @@
           <w:insideH w:val="single" w:sz="4" w:space="0" w:color="000000"/>
           <w:insideV w:val="single" w:sz="4" w:space="0" w:color="000000"/>
         </w:tblBorders>
-        <w:tblW w:w="9071" w:type="dxa"/>
         <w:tblLayout w:type="fixed"/>
+        <w:tblLook w:firstColumn="1" w:firstRow="1" w:lastColumn="0" w:lastRow="0" w:noHBand="0" w:noVBand="1" w:val="04A0"/>
       </w:tblPr>
       <w:tblGrid>
         <w:gridCol w:w="2551"/>
@@ -79,7 +79,7 @@
                 <w:b w:val="0"/>
                 <w:sz w:val="20"/>
               </w:rPr>
-              <w:t>1.1</w:t>
+              <w:t>1.2</w:t>
             </w:r>
           </w:p>
         </w:tc>
@@ -1015,8 +1015,8 @@
     </w:p>
     <w:tbl>
       <w:tblPr>
+        <w:tblW w:w="9071" w:type="dxa"/>
         <w:jc w:val="center"/>
-        <w:tblLook w:firstColumn="1" w:firstRow="1" w:lastColumn="0" w:lastRow="0" w:noHBand="0" w:noVBand="1" w:val="04A0"/>
         <w:tblBorders>
           <w:top w:val="single" w:sz="4" w:space="0" w:color="000000"/>
           <w:left w:val="single" w:sz="4" w:space="0" w:color="000000"/>
@@ -1025,8 +1025,8 @@
           <w:insideH w:val="single" w:sz="4" w:space="0" w:color="000000"/>
           <w:insideV w:val="single" w:sz="4" w:space="0" w:color="000000"/>
         </w:tblBorders>
-        <w:tblW w:w="9071" w:type="dxa"/>
         <w:tblLayout w:type="fixed"/>
+        <w:tblLook w:firstColumn="1" w:firstRow="1" w:lastColumn="0" w:lastRow="0" w:noHBand="0" w:noVBand="1" w:val="04A0"/>
       </w:tblPr>
       <w:tblGrid>
         <w:gridCol w:w="1984"/>
@@ -1326,8 +1326,8 @@
     </w:p>
     <w:tbl>
       <w:tblPr>
+        <w:tblW w:w="9071" w:type="dxa"/>
         <w:jc w:val="center"/>
-        <w:tblLook w:firstColumn="1" w:firstRow="1" w:lastColumn="0" w:lastRow="0" w:noHBand="0" w:noVBand="1" w:val="04A0"/>
         <w:tblBorders>
           <w:top w:val="single" w:sz="4" w:space="0" w:color="000000"/>
           <w:left w:val="single" w:sz="4" w:space="0" w:color="000000"/>
@@ -1336,8 +1336,8 @@
           <w:insideH w:val="single" w:sz="4" w:space="0" w:color="000000"/>
           <w:insideV w:val="single" w:sz="4" w:space="0" w:color="000000"/>
         </w:tblBorders>
-        <w:tblW w:w="9071" w:type="dxa"/>
         <w:tblLayout w:type="fixed"/>
+        <w:tblLook w:firstColumn="1" w:firstRow="1" w:lastColumn="0" w:lastRow="0" w:noHBand="0" w:noVBand="1" w:val="04A0"/>
       </w:tblPr>
       <w:tblGrid>
         <w:gridCol w:w="1984"/>
@@ -1637,8 +1637,8 @@
     </w:p>
     <w:tbl>
       <w:tblPr>
+        <w:tblW w:w="9071" w:type="dxa"/>
         <w:jc w:val="center"/>
-        <w:tblLook w:firstColumn="1" w:firstRow="1" w:lastColumn="0" w:lastRow="0" w:noHBand="0" w:noVBand="1" w:val="04A0"/>
         <w:tblBorders>
           <w:top w:val="single" w:sz="4" w:space="0" w:color="000000"/>
           <w:left w:val="single" w:sz="4" w:space="0" w:color="000000"/>
@@ -1647,8 +1647,8 @@
           <w:insideH w:val="single" w:sz="4" w:space="0" w:color="000000"/>
           <w:insideV w:val="single" w:sz="4" w:space="0" w:color="000000"/>
         </w:tblBorders>
-        <w:tblW w:w="9071" w:type="dxa"/>
         <w:tblLayout w:type="fixed"/>
+        <w:tblLook w:firstColumn="1" w:firstRow="1" w:lastColumn="0" w:lastRow="0" w:noHBand="0" w:noVBand="1" w:val="04A0"/>
       </w:tblPr>
       <w:tblGrid>
         <w:gridCol w:w="1984"/>
@@ -1948,8 +1948,8 @@
     </w:p>
     <w:tbl>
       <w:tblPr>
+        <w:tblW w:w="9071" w:type="dxa"/>
         <w:jc w:val="center"/>
-        <w:tblLook w:firstColumn="1" w:firstRow="1" w:lastColumn="0" w:lastRow="0" w:noHBand="0" w:noVBand="1" w:val="04A0"/>
         <w:tblBorders>
           <w:top w:val="single" w:sz="4" w:space="0" w:color="000000"/>
           <w:left w:val="single" w:sz="4" w:space="0" w:color="000000"/>
@@ -1958,8 +1958,8 @@
           <w:insideH w:val="single" w:sz="4" w:space="0" w:color="000000"/>
           <w:insideV w:val="single" w:sz="4" w:space="0" w:color="000000"/>
         </w:tblBorders>
-        <w:tblW w:w="9071" w:type="dxa"/>
         <w:tblLayout w:type="fixed"/>
+        <w:tblLook w:firstColumn="1" w:firstRow="1" w:lastColumn="0" w:lastRow="0" w:noHBand="0" w:noVBand="1" w:val="04A0"/>
       </w:tblPr>
       <w:tblGrid>
         <w:gridCol w:w="1984"/>
@@ -2259,8 +2259,8 @@
     </w:p>
     <w:tbl>
       <w:tblPr>
+        <w:tblW w:w="9071" w:type="dxa"/>
         <w:jc w:val="center"/>
-        <w:tblLook w:firstColumn="1" w:firstRow="1" w:lastColumn="0" w:lastRow="0" w:noHBand="0" w:noVBand="1" w:val="04A0"/>
         <w:tblBorders>
           <w:top w:val="single" w:sz="4" w:space="0" w:color="000000"/>
           <w:left w:val="single" w:sz="4" w:space="0" w:color="000000"/>
@@ -2269,8 +2269,8 @@
           <w:insideH w:val="single" w:sz="4" w:space="0" w:color="000000"/>
           <w:insideV w:val="single" w:sz="4" w:space="0" w:color="000000"/>
         </w:tblBorders>
-        <w:tblW w:w="9071" w:type="dxa"/>
         <w:tblLayout w:type="fixed"/>
+        <w:tblLook w:firstColumn="1" w:firstRow="1" w:lastColumn="0" w:lastRow="0" w:noHBand="0" w:noVBand="1" w:val="04A0"/>
       </w:tblPr>
       <w:tblGrid>
         <w:gridCol w:w="1984"/>
@@ -2582,8 +2582,8 @@
     </w:p>
     <w:tbl>
       <w:tblPr>
+        <w:tblW w:w="9071" w:type="dxa"/>
         <w:jc w:val="center"/>
-        <w:tblLook w:firstColumn="1" w:firstRow="1" w:lastColumn="0" w:lastRow="0" w:noHBand="0" w:noVBand="1" w:val="04A0"/>
         <w:tblBorders>
           <w:top w:val="single" w:sz="4" w:space="0" w:color="000000"/>
           <w:left w:val="single" w:sz="4" w:space="0" w:color="000000"/>
@@ -2592,8 +2592,8 @@
           <w:insideH w:val="single" w:sz="4" w:space="0" w:color="000000"/>
           <w:insideV w:val="single" w:sz="4" w:space="0" w:color="000000"/>
         </w:tblBorders>
-        <w:tblW w:w="9071" w:type="dxa"/>
         <w:tblLayout w:type="fixed"/>
+        <w:tblLook w:firstColumn="1" w:firstRow="1" w:lastColumn="0" w:lastRow="0" w:noHBand="0" w:noVBand="1" w:val="04A0"/>
       </w:tblPr>
       <w:tblGrid>
         <w:gridCol w:w="1984"/>
@@ -2893,8 +2893,8 @@
     </w:p>
     <w:tbl>
       <w:tblPr>
+        <w:tblW w:w="9071" w:type="dxa"/>
         <w:jc w:val="center"/>
-        <w:tblLook w:firstColumn="1" w:firstRow="1" w:lastColumn="0" w:lastRow="0" w:noHBand="0" w:noVBand="1" w:val="04A0"/>
         <w:tblBorders>
           <w:top w:val="single" w:sz="4" w:space="0" w:color="000000"/>
           <w:left w:val="single" w:sz="4" w:space="0" w:color="000000"/>
@@ -2903,8 +2903,8 @@
           <w:insideH w:val="single" w:sz="4" w:space="0" w:color="000000"/>
           <w:insideV w:val="single" w:sz="4" w:space="0" w:color="000000"/>
         </w:tblBorders>
-        <w:tblW w:w="9071" w:type="dxa"/>
         <w:tblLayout w:type="fixed"/>
+        <w:tblLook w:firstColumn="1" w:firstRow="1" w:lastColumn="0" w:lastRow="0" w:noHBand="0" w:noVBand="1" w:val="04A0"/>
       </w:tblPr>
       <w:tblGrid>
         <w:gridCol w:w="1984"/>
@@ -3166,8 +3166,8 @@
     </w:p>
     <w:tbl>
       <w:tblPr>
+        <w:tblW w:w="9071" w:type="dxa"/>
         <w:jc w:val="center"/>
-        <w:tblLook w:firstColumn="1" w:firstRow="1" w:lastColumn="0" w:lastRow="0" w:noHBand="0" w:noVBand="1" w:val="04A0"/>
         <w:tblBorders>
           <w:top w:val="single" w:sz="4" w:space="0" w:color="000000"/>
           <w:left w:val="single" w:sz="4" w:space="0" w:color="000000"/>
@@ -3176,8 +3176,8 @@
           <w:insideH w:val="single" w:sz="4" w:space="0" w:color="000000"/>
           <w:insideV w:val="single" w:sz="4" w:space="0" w:color="000000"/>
         </w:tblBorders>
-        <w:tblW w:w="9071" w:type="dxa"/>
         <w:tblLayout w:type="fixed"/>
+        <w:tblLook w:firstColumn="1" w:firstRow="1" w:lastColumn="0" w:lastRow="0" w:noHBand="0" w:noVBand="1" w:val="04A0"/>
       </w:tblPr>
       <w:tblGrid>
         <w:gridCol w:w="1984"/>
@@ -3439,8 +3439,8 @@
     </w:p>
     <w:tbl>
       <w:tblPr>
+        <w:tblW w:w="9071" w:type="dxa"/>
         <w:jc w:val="center"/>
-        <w:tblLook w:firstColumn="1" w:firstRow="1" w:lastColumn="0" w:lastRow="0" w:noHBand="0" w:noVBand="1" w:val="04A0"/>
         <w:tblBorders>
           <w:top w:val="single" w:sz="4" w:space="0" w:color="000000"/>
           <w:left w:val="single" w:sz="4" w:space="0" w:color="000000"/>
@@ -3449,8 +3449,8 @@
           <w:insideH w:val="single" w:sz="4" w:space="0" w:color="000000"/>
           <w:insideV w:val="single" w:sz="4" w:space="0" w:color="000000"/>
         </w:tblBorders>
-        <w:tblW w:w="9071" w:type="dxa"/>
         <w:tblLayout w:type="fixed"/>
+        <w:tblLook w:firstColumn="1" w:firstRow="1" w:lastColumn="0" w:lastRow="0" w:noHBand="0" w:noVBand="1" w:val="04A0"/>
       </w:tblPr>
       <w:tblGrid>
         <w:gridCol w:w="1984"/>
@@ -3738,8 +3738,8 @@
     </w:p>
     <w:tbl>
       <w:tblPr>
+        <w:tblW w:w="9071" w:type="dxa"/>
         <w:jc w:val="center"/>
-        <w:tblLook w:firstColumn="1" w:firstRow="1" w:lastColumn="0" w:lastRow="0" w:noHBand="0" w:noVBand="1" w:val="04A0"/>
         <w:tblBorders>
           <w:top w:val="single" w:sz="4" w:space="0" w:color="000000"/>
           <w:left w:val="single" w:sz="4" w:space="0" w:color="000000"/>
@@ -3748,8 +3748,8 @@
           <w:insideH w:val="single" w:sz="4" w:space="0" w:color="000000"/>
           <w:insideV w:val="single" w:sz="4" w:space="0" w:color="000000"/>
         </w:tblBorders>
-        <w:tblW w:w="9071" w:type="dxa"/>
         <w:tblLayout w:type="fixed"/>
+        <w:tblLook w:firstColumn="1" w:firstRow="1" w:lastColumn="0" w:lastRow="0" w:noHBand="0" w:noVBand="1" w:val="04A0"/>
       </w:tblPr>
       <w:tblGrid>
         <w:gridCol w:w="1984"/>
@@ -3999,8 +3999,8 @@
     </w:p>
     <w:tbl>
       <w:tblPr>
+        <w:tblW w:w="9071" w:type="dxa"/>
         <w:jc w:val="center"/>
-        <w:tblLook w:firstColumn="1" w:firstRow="1" w:lastColumn="0" w:lastRow="0" w:noHBand="0" w:noVBand="1" w:val="04A0"/>
         <w:tblBorders>
           <w:top w:val="single" w:sz="4" w:space="0" w:color="000000"/>
           <w:left w:val="single" w:sz="4" w:space="0" w:color="000000"/>
@@ -4009,8 +4009,8 @@
           <w:insideH w:val="single" w:sz="4" w:space="0" w:color="000000"/>
           <w:insideV w:val="single" w:sz="4" w:space="0" w:color="000000"/>
         </w:tblBorders>
-        <w:tblW w:w="9071" w:type="dxa"/>
         <w:tblLayout w:type="fixed"/>
+        <w:tblLook w:firstColumn="1" w:firstRow="1" w:lastColumn="0" w:lastRow="0" w:noHBand="0" w:noVBand="1" w:val="04A0"/>
       </w:tblPr>
       <w:tblGrid>
         <w:gridCol w:w="1984"/>
@@ -4298,8 +4298,8 @@
     </w:p>
     <w:tbl>
       <w:tblPr>
+        <w:tblW w:w="9071" w:type="dxa"/>
         <w:jc w:val="center"/>
-        <w:tblLook w:firstColumn="1" w:firstRow="1" w:lastColumn="0" w:lastRow="0" w:noHBand="0" w:noVBand="1" w:val="04A0"/>
         <w:tblBorders>
           <w:top w:val="single" w:sz="4" w:space="0" w:color="000000"/>
           <w:left w:val="single" w:sz="4" w:space="0" w:color="000000"/>
@@ -4308,8 +4308,8 @@
           <w:insideH w:val="single" w:sz="4" w:space="0" w:color="000000"/>
           <w:insideV w:val="single" w:sz="4" w:space="0" w:color="000000"/>
         </w:tblBorders>
-        <w:tblW w:w="9071" w:type="dxa"/>
         <w:tblLayout w:type="fixed"/>
+        <w:tblLook w:firstColumn="1" w:firstRow="1" w:lastColumn="0" w:lastRow="0" w:noHBand="0" w:noVBand="1" w:val="04A0"/>
       </w:tblPr>
       <w:tblGrid>
         <w:gridCol w:w="1984"/>
@@ -4559,8 +4559,8 @@
     </w:p>
     <w:tbl>
       <w:tblPr>
+        <w:tblW w:w="9071" w:type="dxa"/>
         <w:jc w:val="center"/>
-        <w:tblLook w:firstColumn="1" w:firstRow="1" w:lastColumn="0" w:lastRow="0" w:noHBand="0" w:noVBand="1" w:val="04A0"/>
         <w:tblBorders>
           <w:top w:val="single" w:sz="4" w:space="0" w:color="000000"/>
           <w:left w:val="single" w:sz="4" w:space="0" w:color="000000"/>
@@ -4569,8 +4569,8 @@
           <w:insideH w:val="single" w:sz="4" w:space="0" w:color="000000"/>
           <w:insideV w:val="single" w:sz="4" w:space="0" w:color="000000"/>
         </w:tblBorders>
-        <w:tblW w:w="9071" w:type="dxa"/>
         <w:tblLayout w:type="fixed"/>
+        <w:tblLook w:firstColumn="1" w:firstRow="1" w:lastColumn="0" w:lastRow="0" w:noHBand="0" w:noVBand="1" w:val="04A0"/>
       </w:tblPr>
       <w:tblGrid>
         <w:gridCol w:w="1984"/>
@@ -4870,8 +4870,8 @@
     </w:p>
     <w:tbl>
       <w:tblPr>
+        <w:tblW w:w="9071" w:type="dxa"/>
         <w:jc w:val="center"/>
-        <w:tblLook w:firstColumn="1" w:firstRow="1" w:lastColumn="0" w:lastRow="0" w:noHBand="0" w:noVBand="1" w:val="04A0"/>
         <w:tblBorders>
           <w:top w:val="single" w:sz="4" w:space="0" w:color="000000"/>
           <w:left w:val="single" w:sz="4" w:space="0" w:color="000000"/>
@@ -4880,8 +4880,8 @@
           <w:insideH w:val="single" w:sz="4" w:space="0" w:color="000000"/>
           <w:insideV w:val="single" w:sz="4" w:space="0" w:color="000000"/>
         </w:tblBorders>
-        <w:tblW w:w="9071" w:type="dxa"/>
         <w:tblLayout w:type="fixed"/>
+        <w:tblLook w:firstColumn="1" w:firstRow="1" w:lastColumn="0" w:lastRow="0" w:noHBand="0" w:noVBand="1" w:val="04A0"/>
       </w:tblPr>
       <w:tblGrid>
         <w:gridCol w:w="1984"/>
@@ -5181,8 +5181,8 @@
     </w:p>
     <w:tbl>
       <w:tblPr>
+        <w:tblW w:w="9071" w:type="dxa"/>
         <w:jc w:val="center"/>
-        <w:tblLook w:firstColumn="1" w:firstRow="1" w:lastColumn="0" w:lastRow="0" w:noHBand="0" w:noVBand="1" w:val="04A0"/>
         <w:tblBorders>
           <w:top w:val="single" w:sz="4" w:space="0" w:color="000000"/>
           <w:left w:val="single" w:sz="4" w:space="0" w:color="000000"/>
@@ -5191,8 +5191,8 @@
           <w:insideH w:val="single" w:sz="4" w:space="0" w:color="000000"/>
           <w:insideV w:val="single" w:sz="4" w:space="0" w:color="000000"/>
         </w:tblBorders>
-        <w:tblW w:w="9071" w:type="dxa"/>
         <w:tblLayout w:type="fixed"/>
+        <w:tblLook w:firstColumn="1" w:firstRow="1" w:lastColumn="0" w:lastRow="0" w:noHBand="0" w:noVBand="1" w:val="04A0"/>
       </w:tblPr>
       <w:tblGrid>
         <w:gridCol w:w="1984"/>
@@ -5492,8 +5492,8 @@
     </w:p>
     <w:tbl>
       <w:tblPr>
+        <w:tblW w:w="9071" w:type="dxa"/>
         <w:jc w:val="center"/>
-        <w:tblLook w:firstColumn="1" w:firstRow="1" w:lastColumn="0" w:lastRow="0" w:noHBand="0" w:noVBand="1" w:val="04A0"/>
         <w:tblBorders>
           <w:top w:val="single" w:sz="4" w:space="0" w:color="000000"/>
           <w:left w:val="single" w:sz="4" w:space="0" w:color="000000"/>
@@ -5502,8 +5502,8 @@
           <w:insideH w:val="single" w:sz="4" w:space="0" w:color="000000"/>
           <w:insideV w:val="single" w:sz="4" w:space="0" w:color="000000"/>
         </w:tblBorders>
-        <w:tblW w:w="9071" w:type="dxa"/>
         <w:tblLayout w:type="fixed"/>
+        <w:tblLook w:firstColumn="1" w:firstRow="1" w:lastColumn="0" w:lastRow="0" w:noHBand="0" w:noVBand="1" w:val="04A0"/>
       </w:tblPr>
       <w:tblGrid>
         <w:gridCol w:w="1984"/>
@@ -5791,8 +5791,8 @@
     </w:p>
     <w:tbl>
       <w:tblPr>
+        <w:tblW w:w="9071" w:type="dxa"/>
         <w:jc w:val="center"/>
-        <w:tblLook w:firstColumn="1" w:firstRow="1" w:lastColumn="0" w:lastRow="0" w:noHBand="0" w:noVBand="1" w:val="04A0"/>
         <w:tblBorders>
           <w:top w:val="single" w:sz="4" w:space="0" w:color="000000"/>
           <w:left w:val="single" w:sz="4" w:space="0" w:color="000000"/>
@@ -5801,8 +5801,8 @@
           <w:insideH w:val="single" w:sz="4" w:space="0" w:color="000000"/>
           <w:insideV w:val="single" w:sz="4" w:space="0" w:color="000000"/>
         </w:tblBorders>
-        <w:tblW w:w="9071" w:type="dxa"/>
         <w:tblLayout w:type="fixed"/>
+        <w:tblLook w:firstColumn="1" w:firstRow="1" w:lastColumn="0" w:lastRow="0" w:noHBand="0" w:noVBand="1" w:val="04A0"/>
       </w:tblPr>
       <w:tblGrid>
         <w:gridCol w:w="1984"/>
@@ -6102,8 +6102,8 @@
     </w:p>
     <w:tbl>
       <w:tblPr>
+        <w:tblW w:w="9071" w:type="dxa"/>
         <w:jc w:val="center"/>
-        <w:tblLook w:firstColumn="1" w:firstRow="1" w:lastColumn="0" w:lastRow="0" w:noHBand="0" w:noVBand="1" w:val="04A0"/>
         <w:tblBorders>
           <w:top w:val="single" w:sz="4" w:space="0" w:color="000000"/>
           <w:left w:val="single" w:sz="4" w:space="0" w:color="000000"/>
@@ -6112,8 +6112,8 @@
           <w:insideH w:val="single" w:sz="4" w:space="0" w:color="000000"/>
           <w:insideV w:val="single" w:sz="4" w:space="0" w:color="000000"/>
         </w:tblBorders>
-        <w:tblW w:w="9071" w:type="dxa"/>
         <w:tblLayout w:type="fixed"/>
+        <w:tblLook w:firstColumn="1" w:firstRow="1" w:lastColumn="0" w:lastRow="0" w:noHBand="0" w:noVBand="1" w:val="04A0"/>
       </w:tblPr>
       <w:tblGrid>
         <w:gridCol w:w="1984"/>
@@ -6436,8 +6436,8 @@
     </w:p>
     <w:tbl>
       <w:tblPr>
+        <w:tblW w:w="9071" w:type="dxa"/>
         <w:jc w:val="center"/>
-        <w:tblLook w:firstColumn="1" w:firstRow="1" w:lastColumn="0" w:lastRow="0" w:noHBand="0" w:noVBand="1" w:val="04A0"/>
         <w:tblBorders>
           <w:top w:val="single" w:sz="4" w:space="0" w:color="000000"/>
           <w:left w:val="single" w:sz="4" w:space="0" w:color="000000"/>
@@ -6446,8 +6446,8 @@
           <w:insideH w:val="single" w:sz="4" w:space="0" w:color="000000"/>
           <w:insideV w:val="single" w:sz="4" w:space="0" w:color="000000"/>
         </w:tblBorders>
-        <w:tblW w:w="9071" w:type="dxa"/>
         <w:tblLayout w:type="fixed"/>
+        <w:tblLook w:firstColumn="1" w:firstRow="1" w:lastColumn="0" w:lastRow="0" w:noHBand="0" w:noVBand="1" w:val="04A0"/>
       </w:tblPr>
       <w:tblGrid>
         <w:gridCol w:w="1984"/>
@@ -6747,8 +6747,8 @@
     </w:p>
     <w:tbl>
       <w:tblPr>
+        <w:tblW w:w="9071" w:type="dxa"/>
         <w:jc w:val="center"/>
-        <w:tblLook w:firstColumn="1" w:firstRow="1" w:lastColumn="0" w:lastRow="0" w:noHBand="0" w:noVBand="1" w:val="04A0"/>
         <w:tblBorders>
           <w:top w:val="single" w:sz="4" w:space="0" w:color="000000"/>
           <w:left w:val="single" w:sz="4" w:space="0" w:color="000000"/>
@@ -6757,8 +6757,8 @@
           <w:insideH w:val="single" w:sz="4" w:space="0" w:color="000000"/>
           <w:insideV w:val="single" w:sz="4" w:space="0" w:color="000000"/>
         </w:tblBorders>
-        <w:tblW w:w="9071" w:type="dxa"/>
         <w:tblLayout w:type="fixed"/>
+        <w:tblLook w:firstColumn="1" w:firstRow="1" w:lastColumn="0" w:lastRow="0" w:noHBand="0" w:noVBand="1" w:val="04A0"/>
       </w:tblPr>
       <w:tblGrid>
         <w:gridCol w:w="1984"/>
@@ -7058,8 +7058,8 @@
     </w:p>
     <w:tbl>
       <w:tblPr>
+        <w:tblW w:w="9071" w:type="dxa"/>
         <w:jc w:val="center"/>
-        <w:tblLook w:firstColumn="1" w:firstRow="1" w:lastColumn="0" w:lastRow="0" w:noHBand="0" w:noVBand="1" w:val="04A0"/>
         <w:tblBorders>
           <w:top w:val="single" w:sz="4" w:space="0" w:color="000000"/>
           <w:left w:val="single" w:sz="4" w:space="0" w:color="000000"/>
@@ -7068,8 +7068,8 @@
           <w:insideH w:val="single" w:sz="4" w:space="0" w:color="000000"/>
           <w:insideV w:val="single" w:sz="4" w:space="0" w:color="000000"/>
         </w:tblBorders>
-        <w:tblW w:w="9071" w:type="dxa"/>
         <w:tblLayout w:type="fixed"/>
+        <w:tblLook w:firstColumn="1" w:firstRow="1" w:lastColumn="0" w:lastRow="0" w:noHBand="0" w:noVBand="1" w:val="04A0"/>
       </w:tblPr>
       <w:tblGrid>
         <w:gridCol w:w="1984"/>
@@ -7369,8 +7369,8 @@
     </w:p>
     <w:tbl>
       <w:tblPr>
+        <w:tblW w:w="9071" w:type="dxa"/>
         <w:jc w:val="center"/>
-        <w:tblLook w:firstColumn="1" w:firstRow="1" w:lastColumn="0" w:lastRow="0" w:noHBand="0" w:noVBand="1" w:val="04A0"/>
         <w:tblBorders>
           <w:top w:val="single" w:sz="4" w:space="0" w:color="000000"/>
           <w:left w:val="single" w:sz="4" w:space="0" w:color="000000"/>
@@ -7379,8 +7379,8 @@
           <w:insideH w:val="single" w:sz="4" w:space="0" w:color="000000"/>
           <w:insideV w:val="single" w:sz="4" w:space="0" w:color="000000"/>
         </w:tblBorders>
-        <w:tblW w:w="9071" w:type="dxa"/>
         <w:tblLayout w:type="fixed"/>
+        <w:tblLook w:firstColumn="1" w:firstRow="1" w:lastColumn="0" w:lastRow="0" w:noHBand="0" w:noVBand="1" w:val="04A0"/>
       </w:tblPr>
       <w:tblGrid>
         <w:gridCol w:w="1984"/>
@@ -7680,8 +7680,8 @@
     </w:p>
     <w:tbl>
       <w:tblPr>
+        <w:tblW w:w="9071" w:type="dxa"/>
         <w:jc w:val="center"/>
-        <w:tblLook w:firstColumn="1" w:firstRow="1" w:lastColumn="0" w:lastRow="0" w:noHBand="0" w:noVBand="1" w:val="04A0"/>
         <w:tblBorders>
           <w:top w:val="single" w:sz="4" w:space="0" w:color="000000"/>
           <w:left w:val="single" w:sz="4" w:space="0" w:color="000000"/>
@@ -7690,8 +7690,8 @@
           <w:insideH w:val="single" w:sz="4" w:space="0" w:color="000000"/>
           <w:insideV w:val="single" w:sz="4" w:space="0" w:color="000000"/>
         </w:tblBorders>
-        <w:tblW w:w="9071" w:type="dxa"/>
         <w:tblLayout w:type="fixed"/>
+        <w:tblLook w:firstColumn="1" w:firstRow="1" w:lastColumn="0" w:lastRow="0" w:noHBand="0" w:noVBand="1" w:val="04A0"/>
       </w:tblPr>
       <w:tblGrid>
         <w:gridCol w:w="1984"/>
@@ -7953,8 +7953,8 @@
     </w:p>
     <w:tbl>
       <w:tblPr>
+        <w:tblW w:w="9071" w:type="dxa"/>
         <w:jc w:val="center"/>
-        <w:tblLook w:firstColumn="1" w:firstRow="1" w:lastColumn="0" w:lastRow="0" w:noHBand="0" w:noVBand="1" w:val="04A0"/>
         <w:tblBorders>
           <w:top w:val="single" w:sz="4" w:space="0" w:color="000000"/>
           <w:left w:val="single" w:sz="4" w:space="0" w:color="000000"/>
@@ -7963,8 +7963,8 @@
           <w:insideH w:val="single" w:sz="4" w:space="0" w:color="000000"/>
           <w:insideV w:val="single" w:sz="4" w:space="0" w:color="000000"/>
         </w:tblBorders>
-        <w:tblW w:w="9071" w:type="dxa"/>
         <w:tblLayout w:type="fixed"/>
+        <w:tblLook w:firstColumn="1" w:firstRow="1" w:lastColumn="0" w:lastRow="0" w:noHBand="0" w:noVBand="1" w:val="04A0"/>
       </w:tblPr>
       <w:tblGrid>
         <w:gridCol w:w="1984"/>
@@ -8226,8 +8226,8 @@
     </w:p>
     <w:tbl>
       <w:tblPr>
+        <w:tblW w:w="9071" w:type="dxa"/>
         <w:jc w:val="center"/>
-        <w:tblLook w:firstColumn="1" w:firstRow="1" w:lastColumn="0" w:lastRow="0" w:noHBand="0" w:noVBand="1" w:val="04A0"/>
         <w:tblBorders>
           <w:top w:val="single" w:sz="4" w:space="0" w:color="000000"/>
           <w:left w:val="single" w:sz="4" w:space="0" w:color="000000"/>
@@ -8236,8 +8236,8 @@
           <w:insideH w:val="single" w:sz="4" w:space="0" w:color="000000"/>
           <w:insideV w:val="single" w:sz="4" w:space="0" w:color="000000"/>
         </w:tblBorders>
-        <w:tblW w:w="9071" w:type="dxa"/>
         <w:tblLayout w:type="fixed"/>
+        <w:tblLook w:firstColumn="1" w:firstRow="1" w:lastColumn="0" w:lastRow="0" w:noHBand="0" w:noVBand="1" w:val="04A0"/>
       </w:tblPr>
       <w:tblGrid>
         <w:gridCol w:w="1984"/>
@@ -8511,8 +8511,8 @@
     </w:p>
     <w:tbl>
       <w:tblPr>
+        <w:tblW w:w="9071" w:type="dxa"/>
         <w:jc w:val="center"/>
-        <w:tblLook w:firstColumn="1" w:firstRow="1" w:lastColumn="0" w:lastRow="0" w:noHBand="0" w:noVBand="1" w:val="04A0"/>
         <w:tblBorders>
           <w:top w:val="single" w:sz="4" w:space="0" w:color="000000"/>
           <w:left w:val="single" w:sz="4" w:space="0" w:color="000000"/>
@@ -8521,8 +8521,8 @@
           <w:insideH w:val="single" w:sz="4" w:space="0" w:color="000000"/>
           <w:insideV w:val="single" w:sz="4" w:space="0" w:color="000000"/>
         </w:tblBorders>
-        <w:tblW w:w="9071" w:type="dxa"/>
         <w:tblLayout w:type="fixed"/>
+        <w:tblLook w:firstColumn="1" w:firstRow="1" w:lastColumn="0" w:lastRow="0" w:noHBand="0" w:noVBand="1" w:val="04A0"/>
       </w:tblPr>
       <w:tblGrid>
         <w:gridCol w:w="1984"/>
@@ -8822,8 +8822,8 @@
     </w:p>
     <w:tbl>
       <w:tblPr>
+        <w:tblW w:w="9071" w:type="dxa"/>
         <w:jc w:val="center"/>
-        <w:tblLook w:firstColumn="1" w:firstRow="1" w:lastColumn="0" w:lastRow="0" w:noHBand="0" w:noVBand="1" w:val="04A0"/>
         <w:tblBorders>
           <w:top w:val="single" w:sz="4" w:space="0" w:color="000000"/>
           <w:left w:val="single" w:sz="4" w:space="0" w:color="000000"/>
@@ -8832,8 +8832,8 @@
           <w:insideH w:val="single" w:sz="4" w:space="0" w:color="000000"/>
           <w:insideV w:val="single" w:sz="4" w:space="0" w:color="000000"/>
         </w:tblBorders>
-        <w:tblW w:w="9071" w:type="dxa"/>
         <w:tblLayout w:type="fixed"/>
+        <w:tblLook w:firstColumn="1" w:firstRow="1" w:lastColumn="0" w:lastRow="0" w:noHBand="0" w:noVBand="1" w:val="04A0"/>
       </w:tblPr>
       <w:tblGrid>
         <w:gridCol w:w="1984"/>
@@ -9133,8 +9133,8 @@
     </w:p>
     <w:tbl>
       <w:tblPr>
+        <w:tblW w:w="9071" w:type="dxa"/>
         <w:jc w:val="center"/>
-        <w:tblLook w:firstColumn="1" w:firstRow="1" w:lastColumn="0" w:lastRow="0" w:noHBand="0" w:noVBand="1" w:val="04A0"/>
         <w:tblBorders>
           <w:top w:val="single" w:sz="4" w:space="0" w:color="000000"/>
           <w:left w:val="single" w:sz="4" w:space="0" w:color="000000"/>
@@ -9143,8 +9143,8 @@
           <w:insideH w:val="single" w:sz="4" w:space="0" w:color="000000"/>
           <w:insideV w:val="single" w:sz="4" w:space="0" w:color="000000"/>
         </w:tblBorders>
-        <w:tblW w:w="9071" w:type="dxa"/>
         <w:tblLayout w:type="fixed"/>
+        <w:tblLook w:firstColumn="1" w:firstRow="1" w:lastColumn="0" w:lastRow="0" w:noHBand="0" w:noVBand="1" w:val="04A0"/>
       </w:tblPr>
       <w:tblGrid>
         <w:gridCol w:w="1984"/>
@@ -9444,8 +9444,8 @@
     </w:p>
     <w:tbl>
       <w:tblPr>
+        <w:tblW w:w="9071" w:type="dxa"/>
         <w:jc w:val="center"/>
-        <w:tblLook w:firstColumn="1" w:firstRow="1" w:lastColumn="0" w:lastRow="0" w:noHBand="0" w:noVBand="1" w:val="04A0"/>
         <w:tblBorders>
           <w:top w:val="single" w:sz="4" w:space="0" w:color="000000"/>
           <w:left w:val="single" w:sz="4" w:space="0" w:color="000000"/>
@@ -9454,8 +9454,8 @@
           <w:insideH w:val="single" w:sz="4" w:space="0" w:color="000000"/>
           <w:insideV w:val="single" w:sz="4" w:space="0" w:color="000000"/>
         </w:tblBorders>
-        <w:tblW w:w="9071" w:type="dxa"/>
         <w:tblLayout w:type="fixed"/>
+        <w:tblLook w:firstColumn="1" w:firstRow="1" w:lastColumn="0" w:lastRow="0" w:noHBand="0" w:noVBand="1" w:val="04A0"/>
       </w:tblPr>
       <w:tblGrid>
         <w:gridCol w:w="1984"/>
@@ -9717,8 +9717,8 @@
     </w:p>
     <w:tbl>
       <w:tblPr>
+        <w:tblW w:w="9071" w:type="dxa"/>
         <w:jc w:val="center"/>
-        <w:tblLook w:firstColumn="1" w:firstRow="1" w:lastColumn="0" w:lastRow="0" w:noHBand="0" w:noVBand="1" w:val="04A0"/>
         <w:tblBorders>
           <w:top w:val="single" w:sz="4" w:space="0" w:color="000000"/>
           <w:left w:val="single" w:sz="4" w:space="0" w:color="000000"/>
@@ -9727,8 +9727,8 @@
           <w:insideH w:val="single" w:sz="4" w:space="0" w:color="000000"/>
           <w:insideV w:val="single" w:sz="4" w:space="0" w:color="000000"/>
         </w:tblBorders>
-        <w:tblW w:w="9071" w:type="dxa"/>
         <w:tblLayout w:type="fixed"/>
+        <w:tblLook w:firstColumn="1" w:firstRow="1" w:lastColumn="0" w:lastRow="0" w:noHBand="0" w:noVBand="1" w:val="04A0"/>
       </w:tblPr>
       <w:tblGrid>
         <w:gridCol w:w="1984"/>
@@ -9990,8 +9990,8 @@
     </w:p>
     <w:tbl>
       <w:tblPr>
+        <w:tblW w:w="9071" w:type="dxa"/>
         <w:jc w:val="center"/>
-        <w:tblLook w:firstColumn="1" w:firstRow="1" w:lastColumn="0" w:lastRow="0" w:noHBand="0" w:noVBand="1" w:val="04A0"/>
         <w:tblBorders>
           <w:top w:val="single" w:sz="4" w:space="0" w:color="000000"/>
           <w:left w:val="single" w:sz="4" w:space="0" w:color="000000"/>
@@ -10000,8 +10000,8 @@
           <w:insideH w:val="single" w:sz="4" w:space="0" w:color="000000"/>
           <w:insideV w:val="single" w:sz="4" w:space="0" w:color="000000"/>
         </w:tblBorders>
-        <w:tblW w:w="9071" w:type="dxa"/>
         <w:tblLayout w:type="fixed"/>
+        <w:tblLook w:firstColumn="1" w:firstRow="1" w:lastColumn="0" w:lastRow="0" w:noHBand="0" w:noVBand="1" w:val="04A0"/>
       </w:tblPr>
       <w:tblGrid>
         <w:gridCol w:w="1984"/>
@@ -10301,8 +10301,8 @@
     </w:p>
     <w:tbl>
       <w:tblPr>
+        <w:tblW w:w="9071" w:type="dxa"/>
         <w:jc w:val="center"/>
-        <w:tblLook w:firstColumn="1" w:firstRow="1" w:lastColumn="0" w:lastRow="0" w:noHBand="0" w:noVBand="1" w:val="04A0"/>
         <w:tblBorders>
           <w:top w:val="single" w:sz="4" w:space="0" w:color="000000"/>
           <w:left w:val="single" w:sz="4" w:space="0" w:color="000000"/>
@@ -10311,8 +10311,8 @@
           <w:insideH w:val="single" w:sz="4" w:space="0" w:color="000000"/>
           <w:insideV w:val="single" w:sz="4" w:space="0" w:color="000000"/>
         </w:tblBorders>
-        <w:tblW w:w="9071" w:type="dxa"/>
         <w:tblLayout w:type="fixed"/>
+        <w:tblLook w:firstColumn="1" w:firstRow="1" w:lastColumn="0" w:lastRow="0" w:noHBand="0" w:noVBand="1" w:val="04A0"/>
       </w:tblPr>
       <w:tblGrid>
         <w:gridCol w:w="1984"/>
@@ -10600,8 +10600,8 @@
     </w:p>
     <w:tbl>
       <w:tblPr>
+        <w:tblW w:w="9071" w:type="dxa"/>
         <w:jc w:val="center"/>
-        <w:tblLook w:firstColumn="1" w:firstRow="1" w:lastColumn="0" w:lastRow="0" w:noHBand="0" w:noVBand="1" w:val="04A0"/>
         <w:tblBorders>
           <w:top w:val="single" w:sz="4" w:space="0" w:color="000000"/>
           <w:left w:val="single" w:sz="4" w:space="0" w:color="000000"/>
@@ -10610,8 +10610,8 @@
           <w:insideH w:val="single" w:sz="4" w:space="0" w:color="000000"/>
           <w:insideV w:val="single" w:sz="4" w:space="0" w:color="000000"/>
         </w:tblBorders>
-        <w:tblW w:w="9071" w:type="dxa"/>
         <w:tblLayout w:type="fixed"/>
+        <w:tblLook w:firstColumn="1" w:firstRow="1" w:lastColumn="0" w:lastRow="0" w:noHBand="0" w:noVBand="1" w:val="04A0"/>
       </w:tblPr>
       <w:tblGrid>
         <w:gridCol w:w="1984"/>
@@ -10861,8 +10861,8 @@
     </w:p>
     <w:tbl>
       <w:tblPr>
+        <w:tblW w:w="9071" w:type="dxa"/>
         <w:jc w:val="center"/>
-        <w:tblLook w:firstColumn="1" w:firstRow="1" w:lastColumn="0" w:lastRow="0" w:noHBand="0" w:noVBand="1" w:val="04A0"/>
         <w:tblBorders>
           <w:top w:val="single" w:sz="4" w:space="0" w:color="000000"/>
           <w:left w:val="single" w:sz="4" w:space="0" w:color="000000"/>
@@ -10871,8 +10871,8 @@
           <w:insideH w:val="single" w:sz="4" w:space="0" w:color="000000"/>
           <w:insideV w:val="single" w:sz="4" w:space="0" w:color="000000"/>
         </w:tblBorders>
-        <w:tblW w:w="9071" w:type="dxa"/>
         <w:tblLayout w:type="fixed"/>
+        <w:tblLook w:firstColumn="1" w:firstRow="1" w:lastColumn="0" w:lastRow="0" w:noHBand="0" w:noVBand="1" w:val="04A0"/>
       </w:tblPr>
       <w:tblGrid>
         <w:gridCol w:w="1984"/>
@@ -11160,8 +11160,8 @@
     </w:p>
     <w:tbl>
       <w:tblPr>
+        <w:tblW w:w="9071" w:type="dxa"/>
         <w:jc w:val="center"/>
-        <w:tblLook w:firstColumn="1" w:firstRow="1" w:lastColumn="0" w:lastRow="0" w:noHBand="0" w:noVBand="1" w:val="04A0"/>
         <w:tblBorders>
           <w:top w:val="single" w:sz="4" w:space="0" w:color="000000"/>
           <w:left w:val="single" w:sz="4" w:space="0" w:color="000000"/>
@@ -11170,8 +11170,8 @@
           <w:insideH w:val="single" w:sz="4" w:space="0" w:color="000000"/>
           <w:insideV w:val="single" w:sz="4" w:space="0" w:color="000000"/>
         </w:tblBorders>
-        <w:tblW w:w="9071" w:type="dxa"/>
         <w:tblLayout w:type="fixed"/>
+        <w:tblLook w:firstColumn="1" w:firstRow="1" w:lastColumn="0" w:lastRow="0" w:noHBand="0" w:noVBand="1" w:val="04A0"/>
       </w:tblPr>
       <w:tblGrid>
         <w:gridCol w:w="1984"/>
@@ -11596,7 +11596,7 @@
     </w:p>
     <w:tbl>
       <w:tblPr>
-        <w:tblLook w:firstColumn="1" w:firstRow="1" w:lastColumn="0" w:lastRow="0" w:noHBand="0" w:noVBand="1" w:val="04A0"/>
+        <w:tblW w:w="14513" w:type="dxa"/>
         <w:tblBorders>
           <w:top w:val="single" w:sz="4" w:space="0" w:color="000000"/>
           <w:left w:val="single" w:sz="4" w:space="0" w:color="000000"/>
@@ -11605,8 +11605,8 @@
           <w:insideH w:val="single" w:sz="4" w:space="0" w:color="000000"/>
           <w:insideV w:val="single" w:sz="4" w:space="0" w:color="000000"/>
         </w:tblBorders>
-        <w:tblW w:w="14513" w:type="dxa"/>
         <w:tblLayout w:type="fixed"/>
+        <w:tblLook w:firstColumn="1" w:firstRow="1" w:lastColumn="0" w:lastRow="0" w:noHBand="0" w:noVBand="1" w:val="04A0"/>
       </w:tblPr>
       <w:tblGrid>
         <w:gridCol w:w="1020"/>
@@ -14969,7 +14969,7 @@
     </w:p>
     <w:tbl>
       <w:tblPr>
-        <w:tblLook w:firstColumn="1" w:firstRow="1" w:lastColumn="0" w:lastRow="0" w:noHBand="0" w:noVBand="1" w:val="04A0"/>
+        <w:tblW w:w="14570" w:type="dxa"/>
         <w:tblBorders>
           <w:top w:val="single" w:sz="4" w:space="0" w:color="000000"/>
           <w:left w:val="single" w:sz="4" w:space="0" w:color="000000"/>
@@ -14978,8 +14978,8 @@
           <w:insideH w:val="single" w:sz="4" w:space="0" w:color="000000"/>
           <w:insideV w:val="single" w:sz="4" w:space="0" w:color="000000"/>
         </w:tblBorders>
-        <w:tblW w:w="14570" w:type="dxa"/>
         <w:tblLayout w:type="fixed"/>
+        <w:tblLook w:firstColumn="1" w:firstRow="1" w:lastColumn="0" w:lastRow="0" w:noHBand="0" w:noVBand="1" w:val="04A0"/>
       </w:tblPr>
       <w:tblGrid>
         <w:gridCol w:w="2835"/>
@@ -19249,7 +19249,7 @@
     </w:p>
     <w:tbl>
       <w:tblPr>
-        <w:tblLook w:firstColumn="1" w:firstRow="1" w:lastColumn="0" w:lastRow="0" w:noHBand="0" w:noVBand="1" w:val="04A0"/>
+        <w:tblW w:w="9071" w:type="dxa"/>
         <w:tblBorders>
           <w:top w:val="single" w:sz="4" w:space="0" w:color="000000"/>
           <w:left w:val="single" w:sz="4" w:space="0" w:color="000000"/>
@@ -19258,8 +19258,8 @@
           <w:insideH w:val="single" w:sz="4" w:space="0" w:color="000000"/>
           <w:insideV w:val="single" w:sz="4" w:space="0" w:color="000000"/>
         </w:tblBorders>
-        <w:tblW w:w="9071" w:type="dxa"/>
         <w:tblLayout w:type="fixed"/>
+        <w:tblLook w:firstColumn="1" w:firstRow="1" w:lastColumn="0" w:lastRow="0" w:noHBand="0" w:noVBand="1" w:val="04A0"/>
       </w:tblPr>
       <w:tblGrid>
         <w:gridCol w:w="1020"/>
@@ -19430,6 +19430,62 @@
                 <w:sz w:val="20"/>
               </w:rPr>
               <w:t>Correção de formatação: larguras fixas das colunas em todas as tabelas; anexos A e B em páginas na horizontal. Sem alterações de conteúdo.</w:t>
+            </w:r>
+          </w:p>
+        </w:tc>
+      </w:tr>
+      <w:tr>
+        <w:tc>
+          <w:tcPr>
+            <w:tcW w:w="1020" w:type="dxa"/>
+          </w:tcPr>
+          <w:p>
+            <w:pPr>
+              <w:spacing w:after="60"/>
+            </w:pPr>
+            <w:r/>
+            <w:r>
+              <w:rPr>
+                <w:b w:val="0"/>
+                <w:sz w:val="20"/>
+              </w:rPr>
+              <w:t>1.2</w:t>
+            </w:r>
+          </w:p>
+        </w:tc>
+        <w:tc>
+          <w:tcPr>
+            <w:tcW w:w="1417" w:type="dxa"/>
+          </w:tcPr>
+          <w:p>
+            <w:pPr>
+              <w:spacing w:after="60"/>
+            </w:pPr>
+            <w:r/>
+            <w:r>
+              <w:rPr>
+                <w:b w:val="0"/>
+                <w:sz w:val="20"/>
+              </w:rPr>
+              <w:t>25.9.2026</w:t>
+            </w:r>
+          </w:p>
+        </w:tc>
+        <w:tc>
+          <w:tcPr>
+            <w:tcW w:w="6633" w:type="dxa"/>
+          </w:tcPr>
+          <w:p>
+            <w:pPr>
+              <w:spacing w:after="60"/>
+            </w:pPr>
+            <w:r/>
+            <w:r>
+              <w:rPr>
+                <w:b w:val="0"/>
+                <w:sz w:val="20"/>
+              </w:rPr>
+              <w:t>Correção das tabelas: as propriedades de largura estavam fora da ordem exigida pelo Word e eram ignoradas. Ficheiro validado contra o esquema. Sem alterações de conteúdo.</w:t>
             </w:r>
           </w:p>
         </w:tc>
@@ -19456,7 +19512,7 @@
       <w:rPr>
         <w:sz w:val="16"/>
       </w:rPr>
-      <w:t xml:space="preserve">Memorando de acompanhamento do RGAC, versão 1.1. Página </w:t>
+      <w:t xml:space="preserve">Memorando de acompanhamento do RGAC, versão 1.2. Página </w:t>
     </w:r>
     <w:r>
       <w:rPr>

</xml_diff>

<commit_message>
Memorando RGAC v1.3: posições da imprensa passam a nota no Anexo B
Co-Authored-By: Claude Opus 5.5 <noreply@anthropic.com>
Claude-Session: https://claude.ai/code/session_014DugHn4TLfFaZJnbpoBJVk
</commit_message>
<xml_diff>
--- a/memorando_rgac/Memorando_Acompanhamento_RGAC.docx
+++ b/memorando_rgac/Memorando_Acompanhamento_RGAC.docx
@@ -79,7 +79,7 @@
                 <w:b w:val="0"/>
                 <w:sz w:val="20"/>
               </w:rPr>
-              <w:t>1.2</w:t>
+              <w:t>1.3</w:t>
             </w:r>
           </w:p>
         </w:tc>
@@ -818,6 +818,15 @@
       </w:r>
     </w:p>
     <w:p>
+      <w:r>
+        <w:rPr>
+          <w:b w:val="0"/>
+          <w:i w:val="0"/>
+        </w:rPr>
+        <w:t>As posições de entidades externas apoiam-se, sempre que possível, em documentos: diplomas, pareceres, relatórios, estratégias, recomendações, acórdãos, doutrina e artigos científicos. Quando uma posição só é conhecida pela imprensa, a ficha indica «fonte: imprensa» e a entrada fica numa nota própria no Anexo B, até se encontrar o documento de origem.</w:t>
+      </w:r>
+    </w:p>
+    <w:p>
       <w:pPr>
         <w:spacing w:after="40"/>
       </w:pPr>
@@ -4773,7 +4782,7 @@
                 <w:b w:val="0"/>
                 <w:sz w:val="20"/>
               </w:rPr>
-              <w:t>Contributos dos médicos veterinários municipais (6.3.2026); Tribunal da Relação de Coimbra, proc. 281/10.1TBCV.C1 (11.7.2012); Tribunal da Relação do Porto (11.11.2024); CDU (resposta de 2024)</w:t>
+              <w:t>Contributos dos médicos veterinários municipais (6.3.2026); Tribunal da Relação de Coimbra, proc. 281/10.1TBCV.C1 (11.7.2012); Tribunal da Relação do Porto (11.11.2024), fonte: imprensa; CDU (resposta de 2024)</w:t>
             </w:r>
           </w:p>
         </w:tc>
@@ -5084,7 +5093,7 @@
                 <w:b w:val="0"/>
                 <w:sz w:val="20"/>
               </w:rPr>
-              <w:t>Estratégia Nacional para os Animais Errantes (ENAE), pp. 30-31; Contributos dos médicos veterinários municipais (6.3.2026); PAN (estatuto da família de acolhimento, 2024); Iniciativa Liberal (programa 2024); SNMV (contra registos provisórios no SIAC)</w:t>
+              <w:t>Estratégia Nacional para os Animais Errantes (ENAE), pp. 30-31; Contributos dos médicos veterinários municipais (6.3.2026); PAN (estatuto da família de acolhimento, 2024); Iniciativa Liberal (programa 2024), fonte: imprensa; SNMV (contra registos provisórios no SIAC)</w:t>
             </w:r>
           </w:p>
         </w:tc>
@@ -5694,7 +5703,7 @@
                 <w:b w:val="0"/>
                 <w:sz w:val="20"/>
               </w:rPr>
-              <w:t>Contributos dos médicos veterinários municipais (6.3.2026); ANVETEM (falta de regulação das entidades privadas de proteção animal, 2020)</w:t>
+              <w:t>Contributos dos médicos veterinários municipais (6.3.2026); ANVETEM (falta de regulação das entidades privadas de proteção animal, 2020), fonte: imprensa</w:t>
             </w:r>
           </w:p>
         </w:tc>
@@ -6650,7 +6659,7 @@
                 <w:b w:val="0"/>
                 <w:sz w:val="20"/>
               </w:rPr>
-              <w:t>ENAE, p. 35 («Os programas CED não estão instituídos em todo o território»); Livre e PAN (respostas de 2024); ARPA (o CED é dever legal dos municípios, dez. 2022); Chega (programa 2024); Animais de Rua (18.11.2024)</w:t>
+              <w:t>ENAE, p. 35 («Os programas CED não estão instituídos em todo o território»); Livre e PAN (respostas de 2024); ARPA (o CED é dever legal dos municípios, dez. 2022); Chega (programa 2024), fonte: imprensa; Animais de Rua (18.11.2024), fonte: imprensa</w:t>
             </w:r>
           </w:p>
         </w:tc>
@@ -6961,7 +6970,7 @@
                 <w:b w:val="0"/>
                 <w:sz w:val="20"/>
               </w:rPr>
-              <w:t>ENAE, p. 35 («não está definido o conceito de "cuidador da colónia"»); Contributos dos médicos veterinários municipais (6.3.2026); PAN (figura do animal comunitário, PJL 662/XV); BE, Chega e Livre (animal comunitário, programas 2024); Assembleia Municipal de Coimbra (regulamento de cuidadores, 30.6.2026); Câmara Municipal do Porto (gestão diária pelas associações, 2021)</w:t>
+              <w:t>ENAE, p. 35 («não está definido o conceito de "cuidador da colónia"»); Contributos dos médicos veterinários municipais (6.3.2026); PAN (figura do animal comunitário, PJL 662/XV); BE, Chega e Livre (animal comunitário, programas 2024), fonte: imprensa; Assembleia Municipal de Coimbra (regulamento de cuidadores, 30.6.2026), fonte: imprensa; Câmara Municipal do Porto (gestão diária pelas associações, 2021), fonte: imprensa</w:t>
             </w:r>
           </w:p>
         </w:tc>
@@ -7894,7 +7903,7 @@
                 <w:b w:val="0"/>
                 <w:sz w:val="20"/>
               </w:rPr>
-              <w:t>Relatório final do GTBEA (DGAV, 2021); Projeto de revisão da Portaria 146/2017 (ANMP, 2021); ANMP (2018); Provedora do Animal (cerca de 80 mil animais nos CRO, 25.10.2023)</w:t>
+              <w:t>Relatório final do GTBEA (DGAV, 2021); Projeto de revisão da Portaria 146/2017 (ANMP, 2021); ANMP (2018), fonte: imprensa; Provedora do Animal (cerca de 80 mil animais nos CRO, 25.10.2023), fonte: imprensa</w:t>
             </w:r>
           </w:p>
         </w:tc>
@@ -8167,7 +8176,7 @@
                 <w:b w:val="0"/>
                 <w:sz w:val="20"/>
               </w:rPr>
-              <w:t>OMV (25.11.2025); APMVEAC (parecer set. 2023); PAN e BE (2024); Contributos dos médicos veterinários municipais (6.3.2026); FEDRA; PCP (proposta ao OE2026); Livre (programa 2024); Movimento de Intervenção pelas Matilhas (Coimbra); Projeto de alteração da Portaria 146/2017 (esterilização excecional de cães)</w:t>
+              <w:t>OMV (25.11.2025), fonte: imprensa; APMVEAC (parecer set. 2023); PAN e BE (2024); Contributos dos médicos veterinários municipais (6.3.2026); FEDRA; PCP (proposta ao OE2026); Livre (programa 2024); Movimento de Intervenção pelas Matilhas (Coimbra); Projeto de alteração da Portaria 146/2017 (esterilização excecional de cães)</w:t>
             </w:r>
           </w:p>
         </w:tc>
@@ -8725,7 +8734,7 @@
                 <w:b w:val="0"/>
                 <w:sz w:val="20"/>
               </w:rPr>
-              <w:t>CDU (resposta de 2024); Análise interna; Câmara Municipal do Porto (2021); PCP (proposta ao OE2026); ARPA (dez. 2022)</w:t>
+              <w:t>CDU (resposta de 2024); Análise interna; Câmara Municipal do Porto (2021), fonte: imprensa; PCP (proposta ao OE2026); ARPA (dez. 2022)</w:t>
             </w:r>
           </w:p>
         </w:tc>
@@ -9036,7 +9045,7 @@
                 <w:b w:val="0"/>
                 <w:sz w:val="20"/>
               </w:rPr>
-              <w:t>ENAE, p. 35 («não é possível aferir o número de animais nem o número e localização das colónias»); ENAE, §33 (número de registo nacional da colónia); Assembleia Municipal de Coimbra (mapeamento georreferenciado, 30.6.2026); Provedoria dos Animais de Lisboa (sinalização de colónias, 10.9.2024)</w:t>
+              <w:t>ENAE, p. 35 («não é possível aferir o número de animais nem o número e localização das colónias»); ENAE, §33 (número de registo nacional da colónia); Assembleia Municipal de Coimbra (mapeamento georreferenciado, 30.6.2026), fonte: imprensa; Provedoria dos Animais de Lisboa (sinalização de colónias, 10.9.2024), fonte: imprensa</w:t>
             </w:r>
           </w:p>
         </w:tc>
@@ -10802,7 +10811,7 @@
                 <w:b w:val="0"/>
                 <w:sz w:val="20"/>
               </w:rPr>
-              <w:t>Relatório final do GTBEA (DGAV, 2021): financiamento como principal constrangimento; Inventário interno de zonas cinzentas do CED (zona 20); DGAV (140 médicos veterinários reconhecidos para 138 municípios, 8.1.2026); OMV (cerca de 45% dos municípios com médico veterinário municipal, 22.8.2026); Provedoria dos Animais de Lisboa (9.1.2026); PCP (2021); ANMP (OE2025 sem verbas próprias para CRO)</w:t>
+              <w:t>Relatório final do GTBEA (DGAV, 2021): financiamento como principal constrangimento; Inventário interno de zonas cinzentas do CED (zona 20); DGAV (140 médicos veterinários reconhecidos para 138 municípios, 8.1.2026), fonte: imprensa; OMV (cerca de 45% dos municípios com médico veterinário municipal, 22.8.2026), fonte: imprensa; Provedoria dos Animais de Lisboa (9.1.2026), fonte: imprensa; PCP (2021); ANMP (OE2025 sem verbas próprias para CRO), fonte: imprensa</w:t>
             </w:r>
           </w:p>
         </w:tc>
@@ -11374,7 +11383,7 @@
                 <w:b w:val="0"/>
                 <w:sz w:val="20"/>
               </w:rPr>
-              <w:t>Comentário do grupo de trabalho ao art. 85.º («prever sanções para os Municípios que não informam a DGAV»); Provedora do Animal (25.10.2023); Paulo Afonso (21.4.2026)</w:t>
+              <w:t>Comentário do grupo de trabalho ao art. 85.º («prever sanções para os Municípios que não informam a DGAV»); Provedora do Animal (25.10.2023), fonte: imprensa; Paulo Afonso (21.4.2026), fonte: imprensa</w:t>
             </w:r>
           </w:p>
         </w:tc>
@@ -14964,7 +14973,7 @@
           <w:b w:val="0"/>
           <w:i w:val="0"/>
         </w:rPr>
-        <w:t>Posições públicas e contributos recolhidos sobre os dois temas deste memorando. As citações estão entre aspas e foram transcritas das fontes indicadas. Tema T: titular, detentor, proprietário e operador. Tema C: CED, colónias e animais errantes.</w:t>
+        <w:t>Posições recolhidas em documentos oficiais, pareceres, estratégias, doutrina, artigos científicos e decisões judiciais sobre os dois temas deste memorando. As citações estão entre aspas e foram transcritas das fontes indicadas. Tema T: titular, detentor, proprietário e operador. Tema C: CED, colónias e animais errantes.</w:t>
       </w:r>
     </w:p>
     <w:tbl>
@@ -15322,7 +15331,7 @@
                 <w:b w:val="0"/>
                 <w:sz w:val="20"/>
               </w:rPr>
-              <w:t>DGAV, diretora-geral (audição na Comissão de Agricultura) (8.1.2026)</w:t>
+              <w:t>Provedor de Justiça, Recomendação 4/A/2013 (Síndrome de Diógenes) (6.5.2013)</w:t>
             </w:r>
           </w:p>
         </w:tc>
@@ -15340,7 +15349,7 @@
                 <w:b w:val="0"/>
                 <w:sz w:val="20"/>
               </w:rPr>
-              <w:t>C</w:t>
+              <w:t>T</w:t>
             </w:r>
           </w:p>
         </w:tc>
@@ -15358,7 +15367,7 @@
                 <w:b w:val="0"/>
                 <w:sz w:val="20"/>
               </w:rPr>
-              <w:t>Defende que todos os concelhos tenham autoridade sanitária veterinária concelhia. Indica 140 médicos veterinários reconhecidos para 138 municípios.</w:t>
+              <w:t>Pede um guia para as autoridades de saúde nos casos de acumulação de animais, com articulação entre saúde, câmara, Ministério Público e tribunais.</w:t>
             </w:r>
           </w:p>
         </w:tc>
@@ -15376,7 +15385,7 @@
                 <w:b w:val="0"/>
                 <w:sz w:val="20"/>
               </w:rPr>
-              <w:t>https://sapo.pt/artigo/diretora-da-dgav-defende-que-todos-os-municipios-tenham-medico-veterinario-concelhio-69600006ab728f90f0c5c2cf</w:t>
+              <w:t>https://www.provedor-jus.pt/documentos/ambiente-salubridade-habitacao-acumulacao-de-residuos-saude-mental-sindrome-de-diogenes-004-a-2013/</w:t>
             </w:r>
           </w:p>
         </w:tc>
@@ -15396,7 +15405,7 @@
                 <w:b w:val="0"/>
                 <w:sz w:val="20"/>
               </w:rPr>
-              <w:t>Provedora do Animal (audição parlamentar) (25.10.2023)</w:t>
+              <w:t>Provedor de Justiça, Recomendação 82/A/96 (CM Oeiras) (18.10.1996)</w:t>
             </w:r>
           </w:p>
         </w:tc>
@@ -15414,7 +15423,7 @@
                 <w:b w:val="0"/>
                 <w:sz w:val="20"/>
               </w:rPr>
-              <w:t>C</w:t>
+              <w:t>T</w:t>
             </w:r>
           </w:p>
         </w:tc>
@@ -15432,7 +15441,7 @@
                 <w:b w:val="0"/>
                 <w:sz w:val="20"/>
               </w:rPr>
-              <w:t>Cerca de 80 mil animais a viver nos CRO, com tendência para 100 mil, e custos muito elevados. Os dados anuais não permitem definir políticas.</w:t>
+              <w:t>Considera abusivo exigir a arrendatários de habitação social que prescindam dos animais. Citação: «Não se faça depender a celebração dos contratos de arrendamento de habitações a custos controladas do facto de os promitentes arrendatários prescindirem da posse dos seus animais domésticos».</w:t>
             </w:r>
           </w:p>
         </w:tc>
@@ -15450,7 +15459,7 @@
                 <w:b w:val="0"/>
                 <w:sz w:val="20"/>
               </w:rPr>
-              <w:t>https://observador.pt/2023/10/25/ha-80-000-animais-habitantes-nos-centros-de-recolha-alerta-provedora-do-animal/</w:t>
+              <w:t>https://www.provedor-jus.pt/documentos/082A_96.pdf</w:t>
             </w:r>
           </w:p>
         </w:tc>
@@ -15470,7 +15479,7 @@
                 <w:b w:val="0"/>
                 <w:sz w:val="20"/>
               </w:rPr>
-              <w:t>Provedora do Animal (24.7.2026)</w:t>
+              <w:t>Provedor de Justiça, anotação R4579/08 (CM Lajes do Pico) (8.5.2009)</w:t>
             </w:r>
           </w:p>
         </w:tc>
@@ -15506,7 +15515,7 @@
                 <w:b w:val="0"/>
                 <w:sz w:val="20"/>
               </w:rPr>
-              <w:t>Defende a esterilização obrigatória com vales de livre escolha do centro veterinário e equipas nacionais de resgate.</w:t>
+              <w:t>A resposta a matilhas perigosas não é só municipal. Recomenda plano de ação coordenado entre câmara, forças de segurança e médico veterinário municipal.</w:t>
             </w:r>
           </w:p>
         </w:tc>
@@ -15524,7 +15533,7 @@
                 <w:b w:val="0"/>
                 <w:sz w:val="20"/>
               </w:rPr>
-              <w:t>https://www.veterinaria-atual.pt/na-gestao/word-spay-day-esterilizacao/</w:t>
+              <w:t>https://www.provedor-jus.pt/documentos/canideos-captura-alojamento-e-abate/</w:t>
             </w:r>
           </w:p>
         </w:tc>
@@ -15532,73 +15541,20 @@
       <w:tr>
         <w:tc>
           <w:tcPr>
-            <w:tcW w:w="2835" w:type="dxa"/>
-          </w:tcPr>
-          <w:p>
-            <w:pPr>
-              <w:spacing w:after="60"/>
-            </w:pPr>
-            <w:r/>
-            <w:r>
-              <w:rPr>
-                <w:b w:val="0"/>
-                <w:sz w:val="20"/>
-              </w:rPr>
-              <w:t>Provedoria dos Animais de Lisboa (9.1.2026)</w:t>
-            </w:r>
-          </w:p>
-        </w:tc>
-        <w:tc>
-          <w:tcPr>
-            <w:tcW w:w="907" w:type="dxa"/>
-          </w:tcPr>
-          <w:p>
-            <w:pPr>
-              <w:spacing w:after="60"/>
-            </w:pPr>
-            <w:r/>
-            <w:r>
-              <w:rPr>
-                <w:b w:val="0"/>
-                <w:sz w:val="20"/>
-              </w:rPr>
-              <w:t>C</w:t>
-            </w:r>
-          </w:p>
-        </w:tc>
-        <w:tc>
-          <w:tcPr>
-            <w:tcW w:w="6860" w:type="dxa"/>
-          </w:tcPr>
-          <w:p>
-            <w:pPr>
-              <w:spacing w:after="60"/>
-            </w:pPr>
-            <w:r/>
-            <w:r>
-              <w:rPr>
-                <w:b w:val="0"/>
-                <w:sz w:val="20"/>
-              </w:rPr>
-              <w:t>Recomenda a nomeação do médico veterinário municipal em Lisboa, que não existe. Sem ele ficam comprometidos a direção técnica do CRO, o destino dos animais e o parecer exigido para os CED.</w:t>
-            </w:r>
-          </w:p>
-        </w:tc>
-        <w:tc>
-          <w:tcPr>
-            <w:tcW w:w="3969" w:type="dxa"/>
-          </w:tcPr>
-          <w:p>
-            <w:pPr>
-              <w:spacing w:after="60"/>
-            </w:pPr>
-            <w:r/>
-            <w:r>
-              <w:rPr>
-                <w:b w:val="0"/>
-                <w:sz w:val="20"/>
-              </w:rPr>
-              <w:t>https://www.veterinaria-atual.pt/na-gestao/veterinario-municipal/</w:t>
+            <w:tcW w:w="14570" w:type="dxa"/>
+            <w:gridSpan w:val="4"/>
+          </w:tcPr>
+          <w:p>
+            <w:pPr>
+              <w:spacing w:after="60"/>
+            </w:pPr>
+            <w:r/>
+            <w:r>
+              <w:rPr>
+                <w:b/>
+                <w:sz w:val="20"/>
+              </w:rPr>
+              <w:t>Conservação da natureza</w:t>
             </w:r>
           </w:p>
         </w:tc>
@@ -15618,7 +15574,7 @@
                 <w:b w:val="0"/>
                 <w:sz w:val="20"/>
               </w:rPr>
-              <w:t>Provedoria dos Animais de Lisboa (10.9.2024)</w:t>
+              <w:t>SPEA, parecer aos planos de gestão dos parques naturais dos Açores (2020)</w:t>
             </w:r>
           </w:p>
         </w:tc>
@@ -15654,7 +15610,7 @@
                 <w:b w:val="0"/>
                 <w:sz w:val="20"/>
               </w:rPr>
-              <w:t>Propõe sinalização das colónias CED (cerca de 12 000 gatos em mais de 1 500 colónias em Lisboa) e contactos de cuidadores para emergências.</w:t>
+              <w:t>Prioridade ao controlo de predadores introduzidos. Citação: «com prioridade para o controlo e esterilização de gatos (84% da predação é da responsabilidade dos gatos, Hervías et al., 2013)».</w:t>
             </w:r>
           </w:p>
         </w:tc>
@@ -15672,7 +15628,7 @@
                 <w:b w:val="0"/>
                 <w:sz w:val="20"/>
               </w:rPr>
-              <w:t>https://www.publico.pt/2024/09/10/local/noticia/provedoria-animais-lisboa-propoe-nova-sinaletica-proteger-animais-casos-emergencias-2103558</w:t>
+              <w:t>https://www.spea.pt/wp-content/uploads/2020/09/ParecerSPEA_Planos-Gestao-Parques-Naturais-Ilha-2020.pdf</w:t>
             </w:r>
           </w:p>
         </w:tc>
@@ -15692,7 +15648,7 @@
                 <w:b w:val="0"/>
                 <w:sz w:val="20"/>
               </w:rPr>
-              <w:t>Provedor de Justiça, Recomendação 4/A/2013 (Síndrome de Diógenes) (6.5.2013)</w:t>
+              <w:t>SPEA (27.12.2021)</w:t>
             </w:r>
           </w:p>
         </w:tc>
@@ -15710,7 +15666,7 @@
                 <w:b w:val="0"/>
                 <w:sz w:val="20"/>
               </w:rPr>
-              <w:t>T</w:t>
+              <w:t>C</w:t>
             </w:r>
           </w:p>
         </w:tc>
@@ -15728,7 +15684,7 @@
                 <w:b w:val="0"/>
                 <w:sz w:val="20"/>
               </w:rPr>
-              <w:t>Pede um guia para as autoridades de saúde nos casos de acumulação de animais, com articulação entre saúde, câmara, Ministério Público e tribunais.</w:t>
+              <w:t>Recomenda gestão responsável dos gatos com dono, incluindo recolhimento noturno, para reduzir a predação de aves.</w:t>
             </w:r>
           </w:p>
         </w:tc>
@@ -15746,7 +15702,7 @@
                 <w:b w:val="0"/>
                 <w:sz w:val="20"/>
               </w:rPr>
-              <w:t>https://www.provedor-jus.pt/documentos/ambiente-salubridade-habitacao-acumulacao-de-residuos-saude-mental-sindrome-de-diogenes-004-a-2013/</w:t>
+              <w:t>https://spea.pt/um-gato-feliz-e-alimentado-mantem-o-passarinho-afastado/</w:t>
             </w:r>
           </w:p>
         </w:tc>
@@ -15754,73 +15710,20 @@
       <w:tr>
         <w:tc>
           <w:tcPr>
-            <w:tcW w:w="2835" w:type="dxa"/>
-          </w:tcPr>
-          <w:p>
-            <w:pPr>
-              <w:spacing w:after="60"/>
-            </w:pPr>
-            <w:r/>
-            <w:r>
-              <w:rPr>
-                <w:b w:val="0"/>
-                <w:sz w:val="20"/>
-              </w:rPr>
-              <w:t>Provedor de Justiça, Recomendação 82/A/96 (CM Oeiras) (18.10.1996)</w:t>
-            </w:r>
-          </w:p>
-        </w:tc>
-        <w:tc>
-          <w:tcPr>
-            <w:tcW w:w="907" w:type="dxa"/>
-          </w:tcPr>
-          <w:p>
-            <w:pPr>
-              <w:spacing w:after="60"/>
-            </w:pPr>
-            <w:r/>
-            <w:r>
-              <w:rPr>
-                <w:b w:val="0"/>
-                <w:sz w:val="20"/>
-              </w:rPr>
-              <w:t>T</w:t>
-            </w:r>
-          </w:p>
-        </w:tc>
-        <w:tc>
-          <w:tcPr>
-            <w:tcW w:w="6860" w:type="dxa"/>
-          </w:tcPr>
-          <w:p>
-            <w:pPr>
-              <w:spacing w:after="60"/>
-            </w:pPr>
-            <w:r/>
-            <w:r>
-              <w:rPr>
-                <w:b w:val="0"/>
-                <w:sz w:val="20"/>
-              </w:rPr>
-              <w:t>Considera abusivo exigir a arrendatários de habitação social que prescindam dos animais. Citação: «Não se faça depender a celebração dos contratos de arrendamento de habitações a custos controladas do facto de os promitentes arrendatários prescindirem da posse dos seus animais domésticos».</w:t>
-            </w:r>
-          </w:p>
-        </w:tc>
-        <w:tc>
-          <w:tcPr>
-            <w:tcW w:w="3969" w:type="dxa"/>
-          </w:tcPr>
-          <w:p>
-            <w:pPr>
-              <w:spacing w:after="60"/>
-            </w:pPr>
-            <w:r/>
-            <w:r>
-              <w:rPr>
-                <w:b w:val="0"/>
-                <w:sz w:val="20"/>
-              </w:rPr>
-              <w:t>https://www.provedor-jus.pt/documentos/082A_96.pdf</w:t>
+            <w:tcW w:w="14570" w:type="dxa"/>
+            <w:gridSpan w:val="4"/>
+          </w:tcPr>
+          <w:p>
+            <w:pPr>
+              <w:spacing w:after="60"/>
+            </w:pPr>
+            <w:r/>
+            <w:r>
+              <w:rPr>
+                <w:b/>
+                <w:sz w:val="20"/>
+              </w:rPr>
+              <w:t>Juristas, academia e tribunais</w:t>
             </w:r>
           </w:p>
         </w:tc>
@@ -15840,7 +15743,7 @@
                 <w:b w:val="0"/>
                 <w:sz w:val="20"/>
               </w:rPr>
-              <w:t>Provedor de Justiça, anotação R4579/08 (CM Lajes do Pico) (8.5.2009)</w:t>
+              <w:t>Teresa Quintela de Brito, «O abandono de animais de companhia», RJLB (2019)</w:t>
             </w:r>
           </w:p>
         </w:tc>
@@ -15858,7 +15761,7 @@
                 <w:b w:val="0"/>
                 <w:sz w:val="20"/>
               </w:rPr>
-              <w:t>C</w:t>
+              <w:t>T</w:t>
             </w:r>
           </w:p>
         </w:tc>
@@ -15876,7 +15779,7 @@
                 <w:b w:val="0"/>
                 <w:sz w:val="20"/>
               </w:rPr>
-              <w:t>A resposta a matilhas perigosas não é só municipal. Recomenda plano de ação coordenado entre câmara, forças de segurança e médico veterinário municipal.</w:t>
+              <w:t>O crime de abandono só pode ser cometido por quem já tem o dever de guardar, vigiar ou assistir o animal. Citação: «Não é possível a imputação de responsabilidade por estes crimes a associações ou sociedades zoófilas ou a quaisquer outras pessoas colectivas».</w:t>
             </w:r>
           </w:p>
         </w:tc>
@@ -15894,7 +15797,7 @@
                 <w:b w:val="0"/>
                 <w:sz w:val="20"/>
               </w:rPr>
-              <w:t>https://www.provedor-jus.pt/documentos/canideos-captura-alojamento-e-abate/</w:t>
+              <w:t>https://www.cidp.pt/revistas/rjlb/2019/2/2019_02_0077_0095.pdf</w:t>
             </w:r>
           </w:p>
         </w:tc>
@@ -15902,6 +15805,228 @@
       <w:tr>
         <w:tc>
           <w:tcPr>
+            <w:tcW w:w="2835" w:type="dxa"/>
+          </w:tcPr>
+          <w:p>
+            <w:pPr>
+              <w:spacing w:after="60"/>
+            </w:pPr>
+            <w:r/>
+            <w:r>
+              <w:rPr>
+                <w:b w:val="0"/>
+                <w:sz w:val="20"/>
+              </w:rPr>
+              <w:t>Tribunal da Relação de Coimbra, proc. 281/10.1TBCV.C1 (11.7.2012)</w:t>
+            </w:r>
+          </w:p>
+        </w:tc>
+        <w:tc>
+          <w:tcPr>
+            <w:tcW w:w="907" w:type="dxa"/>
+          </w:tcPr>
+          <w:p>
+            <w:pPr>
+              <w:spacing w:after="60"/>
+            </w:pPr>
+            <w:r/>
+            <w:r>
+              <w:rPr>
+                <w:b w:val="0"/>
+                <w:sz w:val="20"/>
+              </w:rPr>
+              <w:t>T</w:t>
+            </w:r>
+          </w:p>
+        </w:tc>
+        <w:tc>
+          <w:tcPr>
+            <w:tcW w:w="6860" w:type="dxa"/>
+          </w:tcPr>
+          <w:p>
+            <w:pPr>
+              <w:spacing w:after="60"/>
+            </w:pPr>
+            <w:r/>
+            <w:r>
+              <w:rPr>
+                <w:b w:val="0"/>
+                <w:sz w:val="20"/>
+              </w:rPr>
+              <w:t>O dever de vigilância do art. 493.º, n.º 1 do Código Civil decorre do poder de facto sobre o animal e não tem de recair sobre o dono.</w:t>
+            </w:r>
+          </w:p>
+        </w:tc>
+        <w:tc>
+          <w:tcPr>
+            <w:tcW w:w="3969" w:type="dxa"/>
+          </w:tcPr>
+          <w:p>
+            <w:pPr>
+              <w:spacing w:after="60"/>
+            </w:pPr>
+            <w:r/>
+            <w:r>
+              <w:rPr>
+                <w:b w:val="0"/>
+                <w:sz w:val="20"/>
+              </w:rPr>
+              <w:t>https://trc.pt/responsabilidade-civil-danos-causados-por-animais-dever-de-vigilancia/</w:t>
+            </w:r>
+          </w:p>
+        </w:tc>
+      </w:tr>
+      <w:tr>
+        <w:tc>
+          <w:tcPr>
+            <w:tcW w:w="2835" w:type="dxa"/>
+          </w:tcPr>
+          <w:p>
+            <w:pPr>
+              <w:spacing w:after="60"/>
+            </w:pPr>
+            <w:r/>
+            <w:r>
+              <w:rPr>
+                <w:b w:val="0"/>
+                <w:sz w:val="20"/>
+              </w:rPr>
+              <w:t>Tribunal da Relação de Lisboa, proc. 1642/24.4T8AMD.L1-8 (30.4.2025)</w:t>
+            </w:r>
+          </w:p>
+        </w:tc>
+        <w:tc>
+          <w:tcPr>
+            <w:tcW w:w="907" w:type="dxa"/>
+          </w:tcPr>
+          <w:p>
+            <w:pPr>
+              <w:spacing w:after="60"/>
+            </w:pPr>
+            <w:r/>
+            <w:r>
+              <w:rPr>
+                <w:b w:val="0"/>
+                <w:sz w:val="20"/>
+              </w:rPr>
+              <w:t>T</w:t>
+            </w:r>
+          </w:p>
+        </w:tc>
+        <w:tc>
+          <w:tcPr>
+            <w:tcW w:w="6860" w:type="dxa"/>
+          </w:tcPr>
+          <w:p>
+            <w:pPr>
+              <w:spacing w:after="60"/>
+            </w:pPr>
+            <w:r/>
+            <w:r>
+              <w:rPr>
+                <w:b w:val="0"/>
+                <w:sz w:val="20"/>
+              </w:rPr>
+              <w:t>O registo no SIAC pode relevar para presumir a propriedade, mas não afasta a prova da posse. O tribunal revogou uma decisão que se apoiava só no registo.</w:t>
+            </w:r>
+          </w:p>
+        </w:tc>
+        <w:tc>
+          <w:tcPr>
+            <w:tcW w:w="3969" w:type="dxa"/>
+          </w:tcPr>
+          <w:p>
+            <w:pPr>
+              <w:spacing w:after="60"/>
+            </w:pPr>
+            <w:r/>
+            <w:r>
+              <w:rPr>
+                <w:b w:val="0"/>
+                <w:sz w:val="20"/>
+              </w:rPr>
+              <w:t>https://www.dgsi.pt/jtrl.nsf/33182fc732316039802565fa00497eec/7462ba7a0546bac680258c8b0049a31e?OpenDocument</w:t>
+            </w:r>
+          </w:p>
+        </w:tc>
+      </w:tr>
+      <w:tr>
+        <w:tc>
+          <w:tcPr>
+            <w:tcW w:w="2835" w:type="dxa"/>
+          </w:tcPr>
+          <w:p>
+            <w:pPr>
+              <w:spacing w:after="60"/>
+            </w:pPr>
+            <w:r/>
+            <w:r>
+              <w:rPr>
+                <w:b w:val="0"/>
+                <w:sz w:val="20"/>
+              </w:rPr>
+              <w:t>Tribunal Constitucional, Acórdãos 70/2024 e 478/2024 (2024)</w:t>
+            </w:r>
+          </w:p>
+        </w:tc>
+        <w:tc>
+          <w:tcPr>
+            <w:tcW w:w="907" w:type="dxa"/>
+          </w:tcPr>
+          <w:p>
+            <w:pPr>
+              <w:spacing w:after="60"/>
+            </w:pPr>
+            <w:r/>
+            <w:r>
+              <w:rPr>
+                <w:b w:val="0"/>
+                <w:sz w:val="20"/>
+              </w:rPr>
+              <w:t>T</w:t>
+            </w:r>
+          </w:p>
+        </w:tc>
+        <w:tc>
+          <w:tcPr>
+            <w:tcW w:w="6860" w:type="dxa"/>
+          </w:tcPr>
+          <w:p>
+            <w:pPr>
+              <w:spacing w:after="60"/>
+            </w:pPr>
+            <w:r/>
+            <w:r>
+              <w:rPr>
+                <w:b w:val="0"/>
+                <w:sz w:val="20"/>
+              </w:rPr>
+              <w:t>Não julgam inconstitucionais os arts. 387.º e 388.º do Código Penal (maus-tratos e abandono), invertendo a jurisprudência anterior.</w:t>
+            </w:r>
+          </w:p>
+        </w:tc>
+        <w:tc>
+          <w:tcPr>
+            <w:tcW w:w="3969" w:type="dxa"/>
+          </w:tcPr>
+          <w:p>
+            <w:pPr>
+              <w:spacing w:after="60"/>
+            </w:pPr>
+            <w:r/>
+            <w:r>
+              <w:rPr>
+                <w:b w:val="0"/>
+                <w:sz w:val="20"/>
+              </w:rPr>
+              <w:t>https://www.tribunalconstitucional.pt/tc/acordaos/20240070.html</w:t>
+            </w:r>
+          </w:p>
+        </w:tc>
+      </w:tr>
+      <w:tr>
+        <w:tc>
+          <w:tcPr>
             <w:tcW w:w="14570" w:type="dxa"/>
             <w:gridSpan w:val="4"/>
           </w:tcPr>
@@ -15915,7 +16040,7 @@
                 <w:b/>
                 <w:sz w:val="20"/>
               </w:rPr>
-              <w:t>Conservação da natureza</w:t>
+              <w:t>Municípios e ANMP</w:t>
             </w:r>
           </w:p>
         </w:tc>
@@ -15935,7 +16060,7 @@
                 <w:b w:val="0"/>
                 <w:sz w:val="20"/>
               </w:rPr>
-              <w:t>SPEA, parecer aos planos de gestão dos parques naturais dos Açores (2020)</w:t>
+              <w:t>Regulamentos municipais (Lisboa, Porto, Oeiras, Cascais, Sintra, Leiria, entre outros) (vários)</w:t>
             </w:r>
           </w:p>
         </w:tc>
@@ -15971,7 +16096,7 @@
                 <w:b w:val="0"/>
                 <w:sz w:val="20"/>
               </w:rPr>
-              <w:t>Prioridade ao controlo de predadores introduzidos. Citação: «com prioridade para o controlo e esterilização de gatos (84% da predação é da responsabilidade dos gatos, Hervías et al., 2013)».</w:t>
+              <w:t>Proíbem alimentar animais na via pública, com coimas que em Oeiras chegam a 8 000 euros. Em regra excecionam os cuidadores registados.</w:t>
             </w:r>
           </w:p>
         </w:tc>
@@ -15989,7 +16114,7 @@
                 <w:b w:val="0"/>
                 <w:sz w:val="20"/>
               </w:rPr>
-              <w:t>https://www.spea.pt/wp-content/uploads/2020/09/ParecerSPEA_Planos-Gestao-Parques-Naturais-Ilha-2020.pdf</w:t>
+              <w:t>https://www.oeiras.pt/-/alimentacao-animais-via-publica</w:t>
             </w:r>
           </w:p>
         </w:tc>
@@ -15997,73 +16122,20 @@
       <w:tr>
         <w:tc>
           <w:tcPr>
-            <w:tcW w:w="2835" w:type="dxa"/>
-          </w:tcPr>
-          <w:p>
-            <w:pPr>
-              <w:spacing w:after="60"/>
-            </w:pPr>
-            <w:r/>
-            <w:r>
-              <w:rPr>
-                <w:b w:val="0"/>
-                <w:sz w:val="20"/>
-              </w:rPr>
-              <w:t>SPEA (27.12.2021)</w:t>
-            </w:r>
-          </w:p>
-        </w:tc>
-        <w:tc>
-          <w:tcPr>
-            <w:tcW w:w="907" w:type="dxa"/>
-          </w:tcPr>
-          <w:p>
-            <w:pPr>
-              <w:spacing w:after="60"/>
-            </w:pPr>
-            <w:r/>
-            <w:r>
-              <w:rPr>
-                <w:b w:val="0"/>
-                <w:sz w:val="20"/>
-              </w:rPr>
-              <w:t>C</w:t>
-            </w:r>
-          </w:p>
-        </w:tc>
-        <w:tc>
-          <w:tcPr>
-            <w:tcW w:w="6860" w:type="dxa"/>
-          </w:tcPr>
-          <w:p>
-            <w:pPr>
-              <w:spacing w:after="60"/>
-            </w:pPr>
-            <w:r/>
-            <w:r>
-              <w:rPr>
-                <w:b w:val="0"/>
-                <w:sz w:val="20"/>
-              </w:rPr>
-              <w:t>Recomenda gestão responsável dos gatos com dono, incluindo recolhimento noturno, para reduzir a predação de aves.</w:t>
-            </w:r>
-          </w:p>
-        </w:tc>
-        <w:tc>
-          <w:tcPr>
-            <w:tcW w:w="3969" w:type="dxa"/>
-          </w:tcPr>
-          <w:p>
-            <w:pPr>
-              <w:spacing w:after="60"/>
-            </w:pPr>
-            <w:r/>
-            <w:r>
-              <w:rPr>
-                <w:b w:val="0"/>
-                <w:sz w:val="20"/>
-              </w:rPr>
-              <w:t>https://spea.pt/um-gato-feliz-e-alimentado-mantem-o-passarinho-afastado/</w:t>
+            <w:tcW w:w="14570" w:type="dxa"/>
+            <w:gridSpan w:val="4"/>
+          </w:tcPr>
+          <w:p>
+            <w:pPr>
+              <w:spacing w:after="60"/>
+            </w:pPr>
+            <w:r/>
+            <w:r>
+              <w:rPr>
+                <w:b/>
+                <w:sz w:val="20"/>
+              </w:rPr>
+              <w:t>Médicos veterinários municipais</w:t>
             </w:r>
           </w:p>
         </w:tc>
@@ -16083,7 +16155,7 @@
                 <w:b w:val="0"/>
                 <w:sz w:val="20"/>
               </w:rPr>
-              <w:t>Miguel Clavero, Estação Biológica de Doñana (Espanha), entrevista ao DN (14.4.2023)</w:t>
+              <w:t>Contributos dos MVM, reunião de Santarém (6.3.2026)</w:t>
             </w:r>
           </w:p>
         </w:tc>
@@ -16101,7 +16173,7 @@
                 <w:b w:val="0"/>
                 <w:sz w:val="20"/>
               </w:rPr>
-              <w:t>C</w:t>
+              <w:t>T e C</w:t>
             </w:r>
           </w:p>
         </w:tc>
@@ -16119,7 +16191,7 @@
                 <w:b w:val="0"/>
                 <w:sz w:val="20"/>
               </w:rPr>
-              <w:t>Cientista espanhol. Defende que os gatos sem dono sejam retirados do meio natural, por métodos não letais sempre que possível, porque as colónias alimentadas continuam a caçar.</w:t>
+              <w:t>Pedem as figuras de cuidador, família de acolhimento temporário, fiel depositário e animal comunitário; um regime excecional de cães comunitários; responsabilização dos detentores de facto; enquadramento das colónias em quintais e do conflito entre cuidadores e vizinhos; clareza sobre responsabilidades entre associação titular e família de acolhimento. Um MVM pede coimas aos alimentadores; outro opõe-se ao CED.</w:t>
             </w:r>
           </w:p>
         </w:tc>
@@ -16137,7 +16209,7 @@
                 <w:b w:val="0"/>
                 <w:sz w:val="20"/>
               </w:rPr>
-              <w:t>https://www.dn.pt/sociedade/ha-que-manter-os-gatos-sem-dono-fora-do-meio-ambiente-16178512.html</w:t>
+              <w:t>Contributos MVM.docx (repositório)</w:t>
             </w:r>
           </w:p>
         </w:tc>
@@ -16158,7 +16230,7 @@
                 <w:b/>
                 <w:sz w:val="20"/>
               </w:rPr>
-              <w:t>Juristas, academia e tribunais</w:t>
+              <w:t>ONG e associações de proteção animal</w:t>
             </w:r>
           </w:p>
         </w:tc>
@@ -16178,7 +16250,7 @@
                 <w:b w:val="0"/>
                 <w:sz w:val="20"/>
               </w:rPr>
-              <w:t>Teresa Quintela de Brito, «O abandono de animais de companhia», RJLB (2019)</w:t>
+              <w:t>ARPA, parecer sobre o DL 82/2019 (dez. 2022)</w:t>
             </w:r>
           </w:p>
         </w:tc>
@@ -16196,7 +16268,7 @@
                 <w:b w:val="0"/>
                 <w:sz w:val="20"/>
               </w:rPr>
-              <w:t>T</w:t>
+              <w:t>T e C</w:t>
             </w:r>
           </w:p>
         </w:tc>
@@ -16214,7 +16286,7 @@
                 <w:b w:val="0"/>
                 <w:sz w:val="20"/>
               </w:rPr>
-              <w:t>O crime de abandono só pode ser cometido por quem já tem o dever de guardar, vigiar ou assistir o animal. Citação: «Não é possível a imputação de responsabilidade por estes crimes a associações ou sociedades zoófilas ou a quaisquer outras pessoas colectivas».</w:t>
+              <w:t>Registar gatos de colónia em nome do cuidador torna-o responsável por animais que não controla, desincentiva a esterilização e cria falsas presunções de abandono. Defende o registo em nome do município nos CED municipais e que o CED é um dever legal dos municípios. Citação: «o que não podem é onerá-las com responsabilidades que além de não estarem legamente previstas, apenas as desencorajam a agir».</w:t>
             </w:r>
           </w:p>
         </w:tc>
@@ -16232,7 +16304,7 @@
                 <w:b w:val="0"/>
                 <w:sz w:val="20"/>
               </w:rPr>
-              <w:t>https://www.cidp.pt/revistas/rjlb/2019/2/2019_02_0077_0095.pdf</w:t>
+              <w:t>https://www.arpa-associacao.pt/media/attachments/2022/12/14/parecer-arpa-versAo-4-final.pdf</w:t>
             </w:r>
           </w:p>
         </w:tc>
@@ -16252,7 +16324,7 @@
                 <w:b w:val="0"/>
                 <w:sz w:val="20"/>
               </w:rPr>
-              <w:t>Tribunal da Relação de Coimbra, proc. 281/10.1TBCV.C1 (11.7.2012)</w:t>
+              <w:t>FEDRA, plano de políticas públicas (2024)</w:t>
             </w:r>
           </w:p>
         </w:tc>
@@ -16270,7 +16342,7 @@
                 <w:b w:val="0"/>
                 <w:sz w:val="20"/>
               </w:rPr>
-              <w:t>T</w:t>
+              <w:t>C</w:t>
             </w:r>
           </w:p>
         </w:tc>
@@ -16288,7 +16360,7 @@
                 <w:b w:val="0"/>
                 <w:sz w:val="20"/>
               </w:rPr>
-              <w:t>O dever de vigilância do art. 493.º, n.º 1 do Código Civil decorre do poder de facto sobre o animal e não tem de recair sobre o dono.</w:t>
+              <w:t>Diz que o microchip nos gatos de colónia não é viável na maioria dos casos e pede exceções. Propõe CED para cães e parques de matilhas.</w:t>
             </w:r>
           </w:p>
         </w:tc>
@@ -16306,7 +16378,7 @@
                 <w:b w:val="0"/>
                 <w:sz w:val="20"/>
               </w:rPr>
-              <w:t>https://trc.pt/responsabilidade-civil-danos-causados-por-animais-dever-de-vigilancia/</w:t>
+              <w:t>FEDRA - Plano de políticas públcias.pdf (repositório)</w:t>
             </w:r>
           </w:p>
         </w:tc>
@@ -16326,7 +16398,7 @@
                 <w:b w:val="0"/>
                 <w:sz w:val="20"/>
               </w:rPr>
-              <w:t>Tribunal da Relação do Porto (11.11.2024)</w:t>
+              <w:t>Movimento de Intervenção pelas Matilhas (Coimbra) (s/d)</w:t>
             </w:r>
           </w:p>
         </w:tc>
@@ -16344,7 +16416,7 @@
                 <w:b w:val="0"/>
                 <w:sz w:val="20"/>
               </w:rPr>
-              <w:t>T</w:t>
+              <w:t>C</w:t>
             </w:r>
           </w:p>
         </w:tc>
@@ -16362,7 +16434,7 @@
                 <w:b w:val="0"/>
                 <w:sz w:val="20"/>
               </w:rPr>
-              <w:t>O detentor que mantinha o cão em sua casa responde pelos danos, ainda que não seja proprietário.</w:t>
+              <w:t>Defende o CED em cães, com devolução ao território acompanhada por cuidadores, vacinação e microchip.</w:t>
             </w:r>
           </w:p>
         </w:tc>
@@ -16380,7 +16452,7 @@
                 <w:b w:val="0"/>
                 <w:sz w:val="20"/>
               </w:rPr>
-              <w:t>https://www.lexpoint.pt/conteudos/987/133651/noticias/responsabilidade-por-danos-causados-por-animal</w:t>
+              <w:t>https://matilhascoimbra.pt/pages/projecto-2</w:t>
             </w:r>
           </w:p>
         </w:tc>
@@ -16388,73 +16460,20 @@
       <w:tr>
         <w:tc>
           <w:tcPr>
-            <w:tcW w:w="2835" w:type="dxa"/>
-          </w:tcPr>
-          <w:p>
-            <w:pPr>
-              <w:spacing w:after="60"/>
-            </w:pPr>
-            <w:r/>
-            <w:r>
-              <w:rPr>
-                <w:b w:val="0"/>
-                <w:sz w:val="20"/>
-              </w:rPr>
-              <w:t>Tribunal da Relação de Lisboa, proc. 1642/24.4T8AMD.L1-8 (30.4.2025)</w:t>
-            </w:r>
-          </w:p>
-        </w:tc>
-        <w:tc>
-          <w:tcPr>
-            <w:tcW w:w="907" w:type="dxa"/>
-          </w:tcPr>
-          <w:p>
-            <w:pPr>
-              <w:spacing w:after="60"/>
-            </w:pPr>
-            <w:r/>
-            <w:r>
-              <w:rPr>
-                <w:b w:val="0"/>
-                <w:sz w:val="20"/>
-              </w:rPr>
-              <w:t>T</w:t>
-            </w:r>
-          </w:p>
-        </w:tc>
-        <w:tc>
-          <w:tcPr>
-            <w:tcW w:w="6860" w:type="dxa"/>
-          </w:tcPr>
-          <w:p>
-            <w:pPr>
-              <w:spacing w:after="60"/>
-            </w:pPr>
-            <w:r/>
-            <w:r>
-              <w:rPr>
-                <w:b w:val="0"/>
-                <w:sz w:val="20"/>
-              </w:rPr>
-              <w:t>O registo no SIAC pode relevar para presumir a propriedade, mas não afasta a prova da posse. O tribunal revogou uma decisão que se apoiava só no registo.</w:t>
-            </w:r>
-          </w:p>
-        </w:tc>
-        <w:tc>
-          <w:tcPr>
-            <w:tcW w:w="3969" w:type="dxa"/>
-          </w:tcPr>
-          <w:p>
-            <w:pPr>
-              <w:spacing w:after="60"/>
-            </w:pPr>
-            <w:r/>
-            <w:r>
-              <w:rPr>
-                <w:b w:val="0"/>
-                <w:sz w:val="20"/>
-              </w:rPr>
-              <w:t>https://www.dgsi.pt/jtrl.nsf/33182fc732316039802565fa00497eec/7462ba7a0546bac680258c8b0049a31e?OpenDocument</w:t>
+            <w:tcW w:w="14570" w:type="dxa"/>
+            <w:gridSpan w:val="4"/>
+          </w:tcPr>
+          <w:p>
+            <w:pPr>
+              <w:spacing w:after="60"/>
+            </w:pPr>
+            <w:r/>
+            <w:r>
+              <w:rPr>
+                <w:b/>
+                <w:sz w:val="20"/>
+              </w:rPr>
+              <w:t>Ordens e associações profissionais</w:t>
             </w:r>
           </w:p>
         </w:tc>
@@ -16474,7 +16493,7 @@
                 <w:b w:val="0"/>
                 <w:sz w:val="20"/>
               </w:rPr>
-              <w:t>Tribunal Constitucional, Acórdãos 70/2024 e 478/2024 (2024)</w:t>
+              <w:t>OMV, parecer sobre abandono em centros veterinários (nov. 2015)</w:t>
             </w:r>
           </w:p>
         </w:tc>
@@ -16510,7 +16529,7 @@
                 <w:b w:val="0"/>
                 <w:sz w:val="20"/>
               </w:rPr>
-              <w:t>Não julgam inconstitucionais os arts. 387.º e 388.º do Código Penal (maus-tratos e abandono), invertendo a jurisprudência anterior.</w:t>
+              <w:t>A lei é omissa sobre animais que os donos não vão buscar depois do tratamento. Propõe termo de responsabilidade com prazo a partir do qual se presume o abandono. Citação: «A legislação é omissa quanto à situação de animais abandonados, após tratamento, em CAMV's».</w:t>
             </w:r>
           </w:p>
         </w:tc>
@@ -16528,7 +16547,7 @@
                 <w:b w:val="0"/>
                 <w:sz w:val="20"/>
               </w:rPr>
-              <w:t>https://www.tribunalconstitucional.pt/tc/acordaos/20240070.html</w:t>
+              <w:t>https://www.omv.pt/dmdocuments/vi_formacao_omv/abandono_animais_camv_ultimoparecer_nov2015.pdf</w:t>
             </w:r>
           </w:p>
         </w:tc>
@@ -16548,7 +16567,7 @@
                 <w:b w:val="0"/>
                 <w:sz w:val="20"/>
               </w:rPr>
-              <w:t>Paulo Afonso, docente e médico veterinário (21.4.2026)</w:t>
+              <w:t>OMV e SNMV, comentários nos documentos de trabalho do RGBEAC e do RGAC (2025-2026)</w:t>
             </w:r>
           </w:p>
         </w:tc>
@@ -16566,7 +16585,7 @@
                 <w:b w:val="0"/>
                 <w:sz w:val="20"/>
               </w:rPr>
-              <w:t>C</w:t>
+              <w:t>T</w:t>
             </w:r>
           </w:p>
         </w:tc>
@@ -16584,7 +16603,7 @@
                 <w:b w:val="0"/>
                 <w:sz w:val="20"/>
               </w:rPr>
-              <w:t>A Lei 27/2016 ficou aquém: os CRO recolhem o mesmo número de animais que antes, sem coordenação nacional nem identificação suficiente.</w:t>
+              <w:t>Prazo para comunicar desaparecimento: SNMV propõe 48 horas, OMV propõe 72 horas. SNMV opõe-se a registos provisórios no SIAC por gerarem dúvidas sobre a responsabilidade pelos atos do animal.</w:t>
             </w:r>
           </w:p>
         </w:tc>
@@ -16602,7 +16621,7 @@
                 <w:b w:val="0"/>
                 <w:sz w:val="20"/>
               </w:rPr>
-              <w:t>https://greensavers.sapo.pt/problema-dos-animais-errantes-persiste-uma-decada-depois-da-proibicao-de-abate/</w:t>
+              <w:t>Documentos de trabalho do RGBEAC e do RGAC (repositório)</w:t>
             </w:r>
           </w:p>
         </w:tc>
@@ -16610,6 +16629,154 @@
       <w:tr>
         <w:tc>
           <w:tcPr>
+            <w:tcW w:w="2835" w:type="dxa"/>
+          </w:tcPr>
+          <w:p>
+            <w:pPr>
+              <w:spacing w:after="60"/>
+            </w:pPr>
+            <w:r/>
+            <w:r>
+              <w:rPr>
+                <w:b w:val="0"/>
+                <w:sz w:val="20"/>
+              </w:rPr>
+              <w:t>APMVEAC, revisão crítica da legislação (9.4.2021)</w:t>
+            </w:r>
+          </w:p>
+        </w:tc>
+        <w:tc>
+          <w:tcPr>
+            <w:tcW w:w="907" w:type="dxa"/>
+          </w:tcPr>
+          <w:p>
+            <w:pPr>
+              <w:spacing w:after="60"/>
+            </w:pPr>
+            <w:r/>
+            <w:r>
+              <w:rPr>
+                <w:b w:val="0"/>
+                <w:sz w:val="20"/>
+              </w:rPr>
+              <w:t>T e C</w:t>
+            </w:r>
+          </w:p>
+        </w:tc>
+        <w:tc>
+          <w:tcPr>
+            <w:tcW w:w="6860" w:type="dxa"/>
+          </w:tcPr>
+          <w:p>
+            <w:pPr>
+              <w:spacing w:after="60"/>
+            </w:pPr>
+            <w:r/>
+            <w:r>
+              <w:rPr>
+                <w:b w:val="0"/>
+                <w:sz w:val="20"/>
+              </w:rPr>
+              <w:t>Critica que a lei ponha autarquias e sociedades zoófilas em pé de igualdade no abandono, sem definir estas últimas. Citação: «a lei pode estar a passar responsabilidades elevadas para um sector que os legisladores foram até agora incapazes de caracterizar e definir cabalmente.» Sobre a Portaria 146/2017, sugere rever a adoção de animais com menos de 6 meses sem esterilização.</w:t>
+            </w:r>
+          </w:p>
+        </w:tc>
+        <w:tc>
+          <w:tcPr>
+            <w:tcW w:w="3969" w:type="dxa"/>
+          </w:tcPr>
+          <w:p>
+            <w:pPr>
+              <w:spacing w:after="60"/>
+            </w:pPr>
+            <w:r/>
+            <w:r>
+              <w:rPr>
+                <w:b w:val="0"/>
+                <w:sz w:val="20"/>
+              </w:rPr>
+              <w:t>https://apmveac.pt/wp-content/uploads/2021/04/Legislacao.Animais.Companhia_09-04-2021-amarelo-final-.pdf</w:t>
+            </w:r>
+          </w:p>
+        </w:tc>
+      </w:tr>
+      <w:tr>
+        <w:tc>
+          <w:tcPr>
+            <w:tcW w:w="2835" w:type="dxa"/>
+          </w:tcPr>
+          <w:p>
+            <w:pPr>
+              <w:spacing w:after="60"/>
+            </w:pPr>
+            <w:r/>
+            <w:r>
+              <w:rPr>
+                <w:b w:val="0"/>
+                <w:sz w:val="20"/>
+              </w:rPr>
+              <w:t>APMVEAC, parecer à ENAE (set. 2023)</w:t>
+            </w:r>
+          </w:p>
+        </w:tc>
+        <w:tc>
+          <w:tcPr>
+            <w:tcW w:w="907" w:type="dxa"/>
+          </w:tcPr>
+          <w:p>
+            <w:pPr>
+              <w:spacing w:after="60"/>
+            </w:pPr>
+            <w:r/>
+            <w:r>
+              <w:rPr>
+                <w:b w:val="0"/>
+                <w:sz w:val="20"/>
+              </w:rPr>
+              <w:t>C</w:t>
+            </w:r>
+          </w:p>
+        </w:tc>
+        <w:tc>
+          <w:tcPr>
+            <w:tcW w:w="6860" w:type="dxa"/>
+          </w:tcPr>
+          <w:p>
+            <w:pPr>
+              <w:spacing w:after="60"/>
+            </w:pPr>
+            <w:r/>
+            <w:r>
+              <w:rPr>
+                <w:b w:val="0"/>
+                <w:sz w:val="20"/>
+              </w:rPr>
+              <w:t>Contra a dispersão de tutelas e contra o CED em cães. Diz que o enquadramento legal é parte do problema e que a eutanásia é ato clínico da responsabilidade exclusiva do médico veterinário.</w:t>
+            </w:r>
+          </w:p>
+        </w:tc>
+        <w:tc>
+          <w:tcPr>
+            <w:tcW w:w="3969" w:type="dxa"/>
+          </w:tcPr>
+          <w:p>
+            <w:pPr>
+              <w:spacing w:after="60"/>
+            </w:pPr>
+            <w:r/>
+            <w:r>
+              <w:rPr>
+                <w:b w:val="0"/>
+                <w:sz w:val="20"/>
+              </w:rPr>
+              <w:t>https://apmveac.pt/wp-content/uploads/2023/09/Parecer-APMVEAC-Consulta-Publica-ENAE.pdf</w:t>
+            </w:r>
+          </w:p>
+        </w:tc>
+      </w:tr>
+      <w:tr>
+        <w:tc>
+          <w:tcPr>
             <w:tcW w:w="14570" w:type="dxa"/>
             <w:gridSpan w:val="4"/>
           </w:tcPr>
@@ -16623,7 +16790,7 @@
                 <w:b/>
                 <w:sz w:val="20"/>
               </w:rPr>
-              <w:t>Municípios e ANMP</w:t>
+              <w:t>Partidos</w:t>
             </w:r>
           </w:p>
         </w:tc>
@@ -16643,7 +16810,7 @@
                 <w:b w:val="0"/>
                 <w:sz w:val="20"/>
               </w:rPr>
-              <w:t>ANMP (2018 e 2024)</w:t>
+              <w:t>PAN (2021 a 2025)</w:t>
             </w:r>
           </w:p>
         </w:tc>
@@ -16661,7 +16828,7 @@
                 <w:b w:val="0"/>
                 <w:sz w:val="20"/>
               </w:rPr>
-              <w:t>C</w:t>
+              <w:t>T e C</w:t>
             </w:r>
           </w:p>
         </w:tc>
@@ -16679,7 +16846,7 @@
                 <w:b w:val="0"/>
                 <w:sz w:val="20"/>
               </w:rPr>
-              <w:t>Em 2018 disse ser impossível cumprir ao mesmo tempo a recolha obrigatória e a proibição do abate. Em 2024 lamentou que o OE2025 deixasse de prever verbas próprias para os CRO.</w:t>
+              <w:t>Figura do animal comunitário (projeto aprovado na generalidade em 2021, caducado, retomado nos PJL 662/XV e 88/XVI). Estatuto da família de acolhimento temporário (2024). Critica o OE2026 por nenhum avanço para animais comunitários e matilhas.</w:t>
             </w:r>
           </w:p>
         </w:tc>
@@ -16697,7 +16864,7 @@
                 <w:b w:val="0"/>
                 <w:sz w:val="20"/>
               </w:rPr>
-              <w:t>https://www.rtp.pt/noticias/economia/anmp-lamenta-que-orcamento-do-estado-nao-contemple-verbas-para-centros-de-recolha-animal_n1612994</w:t>
+              <w:t>https://www.pan.com.pt/pan-destaca-vitorias-no-bem-estar-animal-mas-denuncia-retrocesso-grave-no-orcamento-do-estado-para-2026/</w:t>
             </w:r>
           </w:p>
         </w:tc>
@@ -16717,7 +16884,7 @@
                 <w:b w:val="0"/>
                 <w:sz w:val="20"/>
               </w:rPr>
-              <w:t>Representante dos municípios (audição parlamentar) (25.10.2023)</w:t>
+              <w:t>PCP, proposta ao OE2026 (5.11.2025)</w:t>
             </w:r>
           </w:p>
         </w:tc>
@@ -16735,7 +16902,7 @@
                 <w:b w:val="0"/>
                 <w:sz w:val="20"/>
               </w:rPr>
-              <w:t>C</w:t>
+              <w:t>T e C</w:t>
             </w:r>
           </w:p>
         </w:tc>
@@ -16753,7 +16920,7 @@
                 <w:b w:val="0"/>
                 <w:sz w:val="20"/>
               </w:rPr>
-              <w:t>Só cerca de 200 dos 308 municípios têm CRO, mas todos estão obrigados a recolher.</w:t>
+              <w:t>Campanha nacional de esterilização com CED para cães não perigosos, registados no SIAC sem responsabilidade do município. Citação: «a título exclusivamente informativo, mediante a identificação genérica ‘Cães CED’ e com a exclusão das responsabilidades desses municípios inerentes à propriedade ou detenção desses animais».</w:t>
             </w:r>
           </w:p>
         </w:tc>
@@ -16771,7 +16938,7 @@
                 <w:b w:val="0"/>
                 <w:sz w:val="20"/>
               </w:rPr>
-              <w:t>https://observador.pt/2023/10/25/ha-80-000-animais-habitantes-nos-centros-de-recolha-alerta-provedora-do-animal/</w:t>
+              <w:t>https://www.pcp.pt/campanha-nacional-de-esterilizacao-de-animais-errantes-0</w:t>
             </w:r>
           </w:p>
         </w:tc>
@@ -16791,7 +16958,7 @@
                 <w:b w:val="0"/>
                 <w:sz w:val="20"/>
               </w:rPr>
-              <w:t>Câmara Municipal do Porto (6.8.2021)</w:t>
+              <w:t>PCP (12.11.2021)</w:t>
             </w:r>
           </w:p>
         </w:tc>
@@ -16809,7 +16976,7 @@
                 <w:b w:val="0"/>
                 <w:sz w:val="20"/>
               </w:rPr>
-              <w:t>T e C</w:t>
+              <w:t>C</w:t>
             </w:r>
           </w:p>
         </w:tc>
@@ -16827,7 +16994,7 @@
                 <w:b w:val="0"/>
                 <w:sz w:val="20"/>
               </w:rPr>
-              <w:t>Os gatos das colónias CED estão registados no SIAC em nome da câmara, mas a gestão diária cabe às associações. Mais de 70 colónias.</w:t>
+              <w:t>Contra criar novas figuras legais sem meios: a solução é a esterilização e uma rede pública de médicos veterinários.</w:t>
             </w:r>
           </w:p>
         </w:tc>
@@ -16845,7 +17012,7 @@
                 <w:b w:val="0"/>
                 <w:sz w:val="20"/>
               </w:rPr>
-              <w:t>https://poligrafo.sapo.pt/fact-check/colonia-de-gatos-sinalizada-por-placa-no-porto-esta-legalizada-e-os-animais-sao-propriedade-da-autarquia/</w:t>
+              <w:t>https://www.pcp.pt/solucao-prevencao-pela-esterilizacao-rede-publica-de-veterinarios-nao-abate-de-animais-abandonados</w:t>
             </w:r>
           </w:p>
         </w:tc>
@@ -16865,7 +17032,7 @@
                 <w:b w:val="0"/>
                 <w:sz w:val="20"/>
               </w:rPr>
-              <w:t>Câmara Municipal do Entroncamento (14.9.2025)</w:t>
+              <w:t>Livre, programa eleitoral (2024)</w:t>
             </w:r>
           </w:p>
         </w:tc>
@@ -16901,7 +17068,7 @@
                 <w:b w:val="0"/>
                 <w:sz w:val="20"/>
               </w:rPr>
-              <w:t>O médico veterinário municipal está sob grande pressão; a câmara vai contratar clínicas para esterilizações.</w:t>
+              <w:t>Reforço dos CED e alargamento a cães errantes, valorização do animal comunitário, protocolos com associações com metas e financiamento.</w:t>
             </w:r>
           </w:p>
         </w:tc>
@@ -16919,7 +17086,7 @@
                 <w:b w:val="0"/>
                 <w:sz w:val="20"/>
               </w:rPr>
-              <w:t>https://omirante.pt/sociedade/2025-09-14-associacao-do-entroncamento-critica-falta-de-controlo-de-colonias-de-gatos-1a4940a3</w:t>
+              <w:t>https://programa.partidolivre.pt/propostas/N.13/</w:t>
             </w:r>
           </w:p>
         </w:tc>
@@ -16939,7 +17106,7 @@
                 <w:b w:val="0"/>
                 <w:sz w:val="20"/>
               </w:rPr>
-              <w:t>Assembleia Municipal de Coimbra (proposta aprovada) (30.6.2026)</w:t>
+              <w:t>Respostas dos partidos (Maratona pelos Animais) (mar. 2024)</w:t>
             </w:r>
           </w:p>
         </w:tc>
@@ -16975,7 +17142,7 @@
                 <w:b w:val="0"/>
                 <w:sz w:val="20"/>
               </w:rPr>
-              <w:t>Mapeamento georreferenciado das colónias, regulamento municipal de cuidadores com formação, identificação, direitos e deveres, metas anuais de CED e apoio alimentar aos cuidadores.</w:t>
+              <w:t>Sobre o CED em cães: PAN e BE a favor; Chega a favor em local circunscrito com cuidadores designados; CDU prudente por questões práticas e de responsabilidade civil; AD disponível para refletir; PS e IL não responderam.</w:t>
             </w:r>
           </w:p>
         </w:tc>
@@ -16993,7 +17160,127 @@
                 <w:b w:val="0"/>
                 <w:sz w:val="20"/>
               </w:rPr>
-              <w:t>https://www.diariocoimbra.pt/2026/06/30/municipio-planeia-fazer-uma-melhor-gestao-das-colonias-de-gatos/</w:t>
+              <w:t>https://maratonapelosanimais.pt/wp-content/uploads/2024/03/respostas-completas.pdf</w:t>
+            </w:r>
+          </w:p>
+        </w:tc>
+      </w:tr>
+    </w:tbl>
+    <w:p/>
+    <w:p>
+      <w:pPr>
+        <w:pStyle w:val="Heading2"/>
+      </w:pPr>
+      <w:r>
+        <w:rPr>
+          <w:i w:val="0"/>
+          <w:color w:val="000000"/>
+        </w:rPr>
+        <w:t>Nota. Posições conhecidas apenas através da imprensa</w:t>
+      </w:r>
+    </w:p>
+    <w:p>
+      <w:r>
+        <w:rPr>
+          <w:b w:val="0"/>
+          <w:i w:val="0"/>
+        </w:rPr>
+        <w:t>As posições seguintes foram recolhidas em notícias, entrevistas ou resumos publicados na imprensa. Ficam registadas como indicação, mas não servem de fundamento sem confirmação no documento de origem (comunicado, audição parlamentar, recomendação, programa eleitoral ou acórdão). Quando esse documento for encontrado, a entrada passa para a tabela principal.</w:t>
+      </w:r>
+    </w:p>
+    <w:tbl>
+      <w:tblPr>
+        <w:tblW w:w="14570" w:type="dxa"/>
+        <w:tblBorders>
+          <w:top w:val="single" w:sz="4" w:space="0" w:color="000000"/>
+          <w:left w:val="single" w:sz="4" w:space="0" w:color="000000"/>
+          <w:bottom w:val="single" w:sz="4" w:space="0" w:color="000000"/>
+          <w:right w:val="single" w:sz="4" w:space="0" w:color="000000"/>
+          <w:insideH w:val="single" w:sz="4" w:space="0" w:color="000000"/>
+          <w:insideV w:val="single" w:sz="4" w:space="0" w:color="000000"/>
+        </w:tblBorders>
+        <w:tblLayout w:type="fixed"/>
+        <w:tblLook w:firstColumn="1" w:firstRow="1" w:lastColumn="0" w:lastRow="0" w:noHBand="0" w:noVBand="1" w:val="04A0"/>
+      </w:tblPr>
+      <w:tblGrid>
+        <w:gridCol w:w="2835"/>
+        <w:gridCol w:w="907"/>
+        <w:gridCol w:w="6860"/>
+        <w:gridCol w:w="3969"/>
+      </w:tblGrid>
+      <w:tr>
+        <w:trPr>
+          <w:tblHeader w:val="true"/>
+        </w:trPr>
+        <w:tc>
+          <w:tcPr>
+            <w:tcW w:w="2835" w:type="dxa"/>
+          </w:tcPr>
+          <w:p>
+            <w:pPr>
+              <w:spacing w:after="60"/>
+            </w:pPr>
+            <w:r/>
+            <w:r>
+              <w:rPr>
+                <w:b/>
+                <w:sz w:val="20"/>
+              </w:rPr>
+              <w:t>Entidade</w:t>
+            </w:r>
+          </w:p>
+        </w:tc>
+        <w:tc>
+          <w:tcPr>
+            <w:tcW w:w="907" w:type="dxa"/>
+          </w:tcPr>
+          <w:p>
+            <w:pPr>
+              <w:spacing w:after="60"/>
+            </w:pPr>
+            <w:r/>
+            <w:r>
+              <w:rPr>
+                <w:b/>
+                <w:sz w:val="20"/>
+              </w:rPr>
+              <w:t>Tema</w:t>
+            </w:r>
+          </w:p>
+        </w:tc>
+        <w:tc>
+          <w:tcPr>
+            <w:tcW w:w="6860" w:type="dxa"/>
+          </w:tcPr>
+          <w:p>
+            <w:pPr>
+              <w:spacing w:after="60"/>
+            </w:pPr>
+            <w:r/>
+            <w:r>
+              <w:rPr>
+                <w:b/>
+                <w:sz w:val="20"/>
+              </w:rPr>
+              <w:t>Posição</w:t>
+            </w:r>
+          </w:p>
+        </w:tc>
+        <w:tc>
+          <w:tcPr>
+            <w:tcW w:w="3969" w:type="dxa"/>
+          </w:tcPr>
+          <w:p>
+            <w:pPr>
+              <w:spacing w:after="60"/>
+            </w:pPr>
+            <w:r/>
+            <w:r>
+              <w:rPr>
+                <w:b/>
+                <w:sz w:val="20"/>
+              </w:rPr>
+              <w:t>Fonte</w:t>
             </w:r>
           </w:p>
         </w:tc>
@@ -17001,73 +17288,20 @@
       <w:tr>
         <w:tc>
           <w:tcPr>
-            <w:tcW w:w="2835" w:type="dxa"/>
-          </w:tcPr>
-          <w:p>
-            <w:pPr>
-              <w:spacing w:after="60"/>
-            </w:pPr>
-            <w:r/>
-            <w:r>
-              <w:rPr>
-                <w:b w:val="0"/>
-                <w:sz w:val="20"/>
-              </w:rPr>
-              <w:t>Regulamentos municipais (Lisboa, Porto, Oeiras, Cascais, Sintra, Leiria, entre outros) (vários)</w:t>
-            </w:r>
-          </w:p>
-        </w:tc>
-        <w:tc>
-          <w:tcPr>
-            <w:tcW w:w="907" w:type="dxa"/>
-          </w:tcPr>
-          <w:p>
-            <w:pPr>
-              <w:spacing w:after="60"/>
-            </w:pPr>
-            <w:r/>
-            <w:r>
-              <w:rPr>
-                <w:b w:val="0"/>
-                <w:sz w:val="20"/>
-              </w:rPr>
-              <w:t>C</w:t>
-            </w:r>
-          </w:p>
-        </w:tc>
-        <w:tc>
-          <w:tcPr>
-            <w:tcW w:w="6860" w:type="dxa"/>
-          </w:tcPr>
-          <w:p>
-            <w:pPr>
-              <w:spacing w:after="60"/>
-            </w:pPr>
-            <w:r/>
-            <w:r>
-              <w:rPr>
-                <w:b w:val="0"/>
-                <w:sz w:val="20"/>
-              </w:rPr>
-              <w:t>Proíbem alimentar animais na via pública, com coimas que em Oeiras chegam a 8 000 euros. Em regra excecionam os cuidadores registados.</w:t>
-            </w:r>
-          </w:p>
-        </w:tc>
-        <w:tc>
-          <w:tcPr>
-            <w:tcW w:w="3969" w:type="dxa"/>
-          </w:tcPr>
-          <w:p>
-            <w:pPr>
-              <w:spacing w:after="60"/>
-            </w:pPr>
-            <w:r/>
-            <w:r>
-              <w:rPr>
-                <w:b w:val="0"/>
-                <w:sz w:val="20"/>
-              </w:rPr>
-              <w:t>https://www.oeiras.pt/-/alimentacao-animais-via-publica</w:t>
+            <w:tcW w:w="14570" w:type="dxa"/>
+            <w:gridSpan w:val="4"/>
+          </w:tcPr>
+          <w:p>
+            <w:pPr>
+              <w:spacing w:after="60"/>
+            </w:pPr>
+            <w:r/>
+            <w:r>
+              <w:rPr>
+                <w:b/>
+                <w:sz w:val="20"/>
+              </w:rPr>
+              <w:t>Administração pública</w:t>
             </w:r>
           </w:p>
         </w:tc>
@@ -17075,6 +17309,376 @@
       <w:tr>
         <w:tc>
           <w:tcPr>
+            <w:tcW w:w="2835" w:type="dxa"/>
+          </w:tcPr>
+          <w:p>
+            <w:pPr>
+              <w:spacing w:after="60"/>
+            </w:pPr>
+            <w:r/>
+            <w:r>
+              <w:rPr>
+                <w:b w:val="0"/>
+                <w:sz w:val="20"/>
+              </w:rPr>
+              <w:t>DGAV, diretora-geral (audição na Comissão de Agricultura) (8.1.2026)</w:t>
+            </w:r>
+          </w:p>
+        </w:tc>
+        <w:tc>
+          <w:tcPr>
+            <w:tcW w:w="907" w:type="dxa"/>
+          </w:tcPr>
+          <w:p>
+            <w:pPr>
+              <w:spacing w:after="60"/>
+            </w:pPr>
+            <w:r/>
+            <w:r>
+              <w:rPr>
+                <w:b w:val="0"/>
+                <w:sz w:val="20"/>
+              </w:rPr>
+              <w:t>C</w:t>
+            </w:r>
+          </w:p>
+        </w:tc>
+        <w:tc>
+          <w:tcPr>
+            <w:tcW w:w="6860" w:type="dxa"/>
+          </w:tcPr>
+          <w:p>
+            <w:pPr>
+              <w:spacing w:after="60"/>
+            </w:pPr>
+            <w:r/>
+            <w:r>
+              <w:rPr>
+                <w:b w:val="0"/>
+                <w:sz w:val="20"/>
+              </w:rPr>
+              <w:t>Defende que todos os concelhos tenham autoridade sanitária veterinária concelhia. Indica 140 médicos veterinários reconhecidos para 138 municípios.</w:t>
+            </w:r>
+          </w:p>
+        </w:tc>
+        <w:tc>
+          <w:tcPr>
+            <w:tcW w:w="3969" w:type="dxa"/>
+          </w:tcPr>
+          <w:p>
+            <w:pPr>
+              <w:spacing w:after="60"/>
+            </w:pPr>
+            <w:r/>
+            <w:r>
+              <w:rPr>
+                <w:b w:val="0"/>
+                <w:sz w:val="20"/>
+              </w:rPr>
+              <w:t>https://sapo.pt/artigo/diretora-da-dgav-defende-que-todos-os-municipios-tenham-medico-veterinario-concelhio-69600006ab728f90f0c5c2cf</w:t>
+            </w:r>
+          </w:p>
+        </w:tc>
+      </w:tr>
+      <w:tr>
+        <w:tc>
+          <w:tcPr>
+            <w:tcW w:w="2835" w:type="dxa"/>
+          </w:tcPr>
+          <w:p>
+            <w:pPr>
+              <w:spacing w:after="60"/>
+            </w:pPr>
+            <w:r/>
+            <w:r>
+              <w:rPr>
+                <w:b w:val="0"/>
+                <w:sz w:val="20"/>
+              </w:rPr>
+              <w:t>Provedora do Animal (audição parlamentar) (25.10.2023)</w:t>
+            </w:r>
+          </w:p>
+        </w:tc>
+        <w:tc>
+          <w:tcPr>
+            <w:tcW w:w="907" w:type="dxa"/>
+          </w:tcPr>
+          <w:p>
+            <w:pPr>
+              <w:spacing w:after="60"/>
+            </w:pPr>
+            <w:r/>
+            <w:r>
+              <w:rPr>
+                <w:b w:val="0"/>
+                <w:sz w:val="20"/>
+              </w:rPr>
+              <w:t>C</w:t>
+            </w:r>
+          </w:p>
+        </w:tc>
+        <w:tc>
+          <w:tcPr>
+            <w:tcW w:w="6860" w:type="dxa"/>
+          </w:tcPr>
+          <w:p>
+            <w:pPr>
+              <w:spacing w:after="60"/>
+            </w:pPr>
+            <w:r/>
+            <w:r>
+              <w:rPr>
+                <w:b w:val="0"/>
+                <w:sz w:val="20"/>
+              </w:rPr>
+              <w:t>Cerca de 80 mil animais a viver nos CRO, com tendência para 100 mil, e custos muito elevados. Os dados anuais não permitem definir políticas.</w:t>
+            </w:r>
+          </w:p>
+        </w:tc>
+        <w:tc>
+          <w:tcPr>
+            <w:tcW w:w="3969" w:type="dxa"/>
+          </w:tcPr>
+          <w:p>
+            <w:pPr>
+              <w:spacing w:after="60"/>
+            </w:pPr>
+            <w:r/>
+            <w:r>
+              <w:rPr>
+                <w:b w:val="0"/>
+                <w:sz w:val="20"/>
+              </w:rPr>
+              <w:t>https://observador.pt/2023/10/25/ha-80-000-animais-habitantes-nos-centros-de-recolha-alerta-provedora-do-animal/</w:t>
+            </w:r>
+          </w:p>
+        </w:tc>
+      </w:tr>
+      <w:tr>
+        <w:tc>
+          <w:tcPr>
+            <w:tcW w:w="2835" w:type="dxa"/>
+          </w:tcPr>
+          <w:p>
+            <w:pPr>
+              <w:spacing w:after="60"/>
+            </w:pPr>
+            <w:r/>
+            <w:r>
+              <w:rPr>
+                <w:b w:val="0"/>
+                <w:sz w:val="20"/>
+              </w:rPr>
+              <w:t>Provedora do Animal (24.7.2026)</w:t>
+            </w:r>
+          </w:p>
+        </w:tc>
+        <w:tc>
+          <w:tcPr>
+            <w:tcW w:w="907" w:type="dxa"/>
+          </w:tcPr>
+          <w:p>
+            <w:pPr>
+              <w:spacing w:after="60"/>
+            </w:pPr>
+            <w:r/>
+            <w:r>
+              <w:rPr>
+                <w:b w:val="0"/>
+                <w:sz w:val="20"/>
+              </w:rPr>
+              <w:t>C</w:t>
+            </w:r>
+          </w:p>
+        </w:tc>
+        <w:tc>
+          <w:tcPr>
+            <w:tcW w:w="6860" w:type="dxa"/>
+          </w:tcPr>
+          <w:p>
+            <w:pPr>
+              <w:spacing w:after="60"/>
+            </w:pPr>
+            <w:r/>
+            <w:r>
+              <w:rPr>
+                <w:b w:val="0"/>
+                <w:sz w:val="20"/>
+              </w:rPr>
+              <w:t>Defende a esterilização obrigatória com vales de livre escolha do centro veterinário e equipas nacionais de resgate.</w:t>
+            </w:r>
+          </w:p>
+        </w:tc>
+        <w:tc>
+          <w:tcPr>
+            <w:tcW w:w="3969" w:type="dxa"/>
+          </w:tcPr>
+          <w:p>
+            <w:pPr>
+              <w:spacing w:after="60"/>
+            </w:pPr>
+            <w:r/>
+            <w:r>
+              <w:rPr>
+                <w:b w:val="0"/>
+                <w:sz w:val="20"/>
+              </w:rPr>
+              <w:t>https://www.veterinaria-atual.pt/na-gestao/word-spay-day-esterilizacao/</w:t>
+            </w:r>
+          </w:p>
+        </w:tc>
+      </w:tr>
+      <w:tr>
+        <w:tc>
+          <w:tcPr>
+            <w:tcW w:w="2835" w:type="dxa"/>
+          </w:tcPr>
+          <w:p>
+            <w:pPr>
+              <w:spacing w:after="60"/>
+            </w:pPr>
+            <w:r/>
+            <w:r>
+              <w:rPr>
+                <w:b w:val="0"/>
+                <w:sz w:val="20"/>
+              </w:rPr>
+              <w:t>Provedoria dos Animais de Lisboa (9.1.2026)</w:t>
+            </w:r>
+          </w:p>
+        </w:tc>
+        <w:tc>
+          <w:tcPr>
+            <w:tcW w:w="907" w:type="dxa"/>
+          </w:tcPr>
+          <w:p>
+            <w:pPr>
+              <w:spacing w:after="60"/>
+            </w:pPr>
+            <w:r/>
+            <w:r>
+              <w:rPr>
+                <w:b w:val="0"/>
+                <w:sz w:val="20"/>
+              </w:rPr>
+              <w:t>C</w:t>
+            </w:r>
+          </w:p>
+        </w:tc>
+        <w:tc>
+          <w:tcPr>
+            <w:tcW w:w="6860" w:type="dxa"/>
+          </w:tcPr>
+          <w:p>
+            <w:pPr>
+              <w:spacing w:after="60"/>
+            </w:pPr>
+            <w:r/>
+            <w:r>
+              <w:rPr>
+                <w:b w:val="0"/>
+                <w:sz w:val="20"/>
+              </w:rPr>
+              <w:t>Recomenda a nomeação do médico veterinário municipal em Lisboa, que não existe. Sem ele ficam comprometidos a direção técnica do CRO, o destino dos animais e o parecer exigido para os CED.</w:t>
+            </w:r>
+          </w:p>
+        </w:tc>
+        <w:tc>
+          <w:tcPr>
+            <w:tcW w:w="3969" w:type="dxa"/>
+          </w:tcPr>
+          <w:p>
+            <w:pPr>
+              <w:spacing w:after="60"/>
+            </w:pPr>
+            <w:r/>
+            <w:r>
+              <w:rPr>
+                <w:b w:val="0"/>
+                <w:sz w:val="20"/>
+              </w:rPr>
+              <w:t>https://www.veterinaria-atual.pt/na-gestao/veterinario-municipal/</w:t>
+            </w:r>
+          </w:p>
+        </w:tc>
+      </w:tr>
+      <w:tr>
+        <w:tc>
+          <w:tcPr>
+            <w:tcW w:w="2835" w:type="dxa"/>
+          </w:tcPr>
+          <w:p>
+            <w:pPr>
+              <w:spacing w:after="60"/>
+            </w:pPr>
+            <w:r/>
+            <w:r>
+              <w:rPr>
+                <w:b w:val="0"/>
+                <w:sz w:val="20"/>
+              </w:rPr>
+              <w:t>Provedoria dos Animais de Lisboa (10.9.2024)</w:t>
+            </w:r>
+          </w:p>
+        </w:tc>
+        <w:tc>
+          <w:tcPr>
+            <w:tcW w:w="907" w:type="dxa"/>
+          </w:tcPr>
+          <w:p>
+            <w:pPr>
+              <w:spacing w:after="60"/>
+            </w:pPr>
+            <w:r/>
+            <w:r>
+              <w:rPr>
+                <w:b w:val="0"/>
+                <w:sz w:val="20"/>
+              </w:rPr>
+              <w:t>C</w:t>
+            </w:r>
+          </w:p>
+        </w:tc>
+        <w:tc>
+          <w:tcPr>
+            <w:tcW w:w="6860" w:type="dxa"/>
+          </w:tcPr>
+          <w:p>
+            <w:pPr>
+              <w:spacing w:after="60"/>
+            </w:pPr>
+            <w:r/>
+            <w:r>
+              <w:rPr>
+                <w:b w:val="0"/>
+                <w:sz w:val="20"/>
+              </w:rPr>
+              <w:t>Propõe sinalização das colónias CED (cerca de 12 000 gatos em mais de 1 500 colónias em Lisboa) e contactos de cuidadores para emergências.</w:t>
+            </w:r>
+          </w:p>
+        </w:tc>
+        <w:tc>
+          <w:tcPr>
+            <w:tcW w:w="3969" w:type="dxa"/>
+          </w:tcPr>
+          <w:p>
+            <w:pPr>
+              <w:spacing w:after="60"/>
+            </w:pPr>
+            <w:r/>
+            <w:r>
+              <w:rPr>
+                <w:b w:val="0"/>
+                <w:sz w:val="20"/>
+              </w:rPr>
+              <w:t>https://www.publico.pt/2024/09/10/local/noticia/provedoria-animais-lisboa-propoe-nova-sinaletica-proteger-animais-casos-emergencias-2103558</w:t>
+            </w:r>
+          </w:p>
+        </w:tc>
+      </w:tr>
+      <w:tr>
+        <w:tc>
+          <w:tcPr>
             <w:tcW w:w="14570" w:type="dxa"/>
             <w:gridSpan w:val="4"/>
           </w:tcPr>
@@ -17088,7 +17692,7 @@
                 <w:b/>
                 <w:sz w:val="20"/>
               </w:rPr>
-              <w:t>Médicos veterinários municipais</w:t>
+              <w:t>Conservação da natureza</w:t>
             </w:r>
           </w:p>
         </w:tc>
@@ -17108,7 +17712,7 @@
                 <w:b w:val="0"/>
                 <w:sz w:val="20"/>
               </w:rPr>
-              <w:t>Contributos dos MVM, reunião de Santarém (6.3.2026)</w:t>
+              <w:t>Miguel Clavero, Estação Biológica de Doñana (Espanha), entrevista ao DN (14.4.2023)</w:t>
             </w:r>
           </w:p>
         </w:tc>
@@ -17126,7 +17730,7 @@
                 <w:b w:val="0"/>
                 <w:sz w:val="20"/>
               </w:rPr>
-              <w:t>T e C</w:t>
+              <w:t>C</w:t>
             </w:r>
           </w:p>
         </w:tc>
@@ -17144,7 +17748,7 @@
                 <w:b w:val="0"/>
                 <w:sz w:val="20"/>
               </w:rPr>
-              <w:t>Pedem as figuras de cuidador, família de acolhimento temporário, fiel depositário e animal comunitário; um regime excecional de cães comunitários; responsabilização dos detentores de facto; enquadramento das colónias em quintais e do conflito entre cuidadores e vizinhos; clareza sobre responsabilidades entre associação titular e família de acolhimento. Um MVM pede coimas aos alimentadores; outro opõe-se ao CED.</w:t>
+              <w:t>Cientista espanhol. Defende que os gatos sem dono sejam retirados do meio natural, por métodos não letais sempre que possível, porque as colónias alimentadas continuam a caçar.</w:t>
             </w:r>
           </w:p>
         </w:tc>
@@ -17162,7 +17766,7 @@
                 <w:b w:val="0"/>
                 <w:sz w:val="20"/>
               </w:rPr>
-              <w:t>Contributos MVM.docx (repositório)</w:t>
+              <w:t>https://www.dn.pt/sociedade/ha-que-manter-os-gatos-sem-dono-fora-do-meio-ambiente-16178512.html</w:t>
             </w:r>
           </w:p>
         </w:tc>
@@ -17183,7 +17787,7 @@
                 <w:b/>
                 <w:sz w:val="20"/>
               </w:rPr>
-              <w:t>ONG e associações de proteção animal</w:t>
+              <w:t>Juristas, academia e tribunais</w:t>
             </w:r>
           </w:p>
         </w:tc>
@@ -17203,7 +17807,7 @@
                 <w:b w:val="0"/>
                 <w:sz w:val="20"/>
               </w:rPr>
-              <w:t>ARPA, parecer sobre o DL 82/2019 (dez. 2022)</w:t>
+              <w:t>Tribunal da Relação do Porto (11.11.2024)</w:t>
             </w:r>
           </w:p>
         </w:tc>
@@ -17221,7 +17825,7 @@
                 <w:b w:val="0"/>
                 <w:sz w:val="20"/>
               </w:rPr>
-              <w:t>T e C</w:t>
+              <w:t>T</w:t>
             </w:r>
           </w:p>
         </w:tc>
@@ -17239,7 +17843,7 @@
                 <w:b w:val="0"/>
                 <w:sz w:val="20"/>
               </w:rPr>
-              <w:t>Registar gatos de colónia em nome do cuidador torna-o responsável por animais que não controla, desincentiva a esterilização e cria falsas presunções de abandono. Defende o registo em nome do município nos CED municipais e que o CED é um dever legal dos municípios. Citação: «o que não podem é onerá-las com responsabilidades que além de não estarem legamente previstas, apenas as desencorajam a agir».</w:t>
+              <w:t>O detentor que mantinha o cão em sua casa responde pelos danos, ainda que não seja proprietário.</w:t>
             </w:r>
           </w:p>
         </w:tc>
@@ -17257,7 +17861,7 @@
                 <w:b w:val="0"/>
                 <w:sz w:val="20"/>
               </w:rPr>
-              <w:t>https://www.arpa-associacao.pt/media/attachments/2022/12/14/parecer-arpa-versAo-4-final.pdf</w:t>
+              <w:t>https://www.lexpoint.pt/conteudos/987/133651/noticias/responsabilidade-por-danos-causados-por-animal</w:t>
             </w:r>
           </w:p>
         </w:tc>
@@ -17277,7 +17881,7 @@
                 <w:b w:val="0"/>
                 <w:sz w:val="20"/>
               </w:rPr>
-              <w:t>FEDRA (federação de associações) (22.8.2026)</w:t>
+              <w:t>Paulo Afonso, docente e médico veterinário (21.4.2026)</w:t>
             </w:r>
           </w:p>
         </w:tc>
@@ -17313,7 +17917,7 @@
                 <w:b w:val="0"/>
                 <w:sz w:val="20"/>
               </w:rPr>
-              <w:t>Esterilização obrigatória como serviço público, financiamento estável e CED para cães. Diz que as associações suportam as falhas do sistema.</w:t>
+              <w:t>A Lei 27/2016 ficou aquém: os CRO recolhem o mesmo número de animais que antes, sem coordenação nacional nem identificação suficiente.</w:t>
             </w:r>
           </w:p>
         </w:tc>
@@ -17331,7 +17935,7 @@
                 <w:b w:val="0"/>
                 <w:sz w:val="20"/>
               </w:rPr>
-              <w:t>https://observador.pt/2026/08/22/veterinarios-e-associacoes-defendem-mais-investimento-na-esterilizacao-de-animais/</w:t>
+              <w:t>https://greensavers.sapo.pt/problema-dos-animais-errantes-persiste-uma-decada-depois-da-proibicao-de-abate/</w:t>
             </w:r>
           </w:p>
         </w:tc>
@@ -17339,73 +17943,20 @@
       <w:tr>
         <w:tc>
           <w:tcPr>
-            <w:tcW w:w="2835" w:type="dxa"/>
-          </w:tcPr>
-          <w:p>
-            <w:pPr>
-              <w:spacing w:after="60"/>
-            </w:pPr>
-            <w:r/>
-            <w:r>
-              <w:rPr>
-                <w:b w:val="0"/>
-                <w:sz w:val="20"/>
-              </w:rPr>
-              <w:t>FEDRA, plano de políticas públicas (2024)</w:t>
-            </w:r>
-          </w:p>
-        </w:tc>
-        <w:tc>
-          <w:tcPr>
-            <w:tcW w:w="907" w:type="dxa"/>
-          </w:tcPr>
-          <w:p>
-            <w:pPr>
-              <w:spacing w:after="60"/>
-            </w:pPr>
-            <w:r/>
-            <w:r>
-              <w:rPr>
-                <w:b w:val="0"/>
-                <w:sz w:val="20"/>
-              </w:rPr>
-              <w:t>C</w:t>
-            </w:r>
-          </w:p>
-        </w:tc>
-        <w:tc>
-          <w:tcPr>
-            <w:tcW w:w="6860" w:type="dxa"/>
-          </w:tcPr>
-          <w:p>
-            <w:pPr>
-              <w:spacing w:after="60"/>
-            </w:pPr>
-            <w:r/>
-            <w:r>
-              <w:rPr>
-                <w:b w:val="0"/>
-                <w:sz w:val="20"/>
-              </w:rPr>
-              <w:t>Diz que o microchip nos gatos de colónia não é viável na maioria dos casos e pede exceções. Propõe CED para cães e parques de matilhas.</w:t>
-            </w:r>
-          </w:p>
-        </w:tc>
-        <w:tc>
-          <w:tcPr>
-            <w:tcW w:w="3969" w:type="dxa"/>
-          </w:tcPr>
-          <w:p>
-            <w:pPr>
-              <w:spacing w:after="60"/>
-            </w:pPr>
-            <w:r/>
-            <w:r>
-              <w:rPr>
-                <w:b w:val="0"/>
-                <w:sz w:val="20"/>
-              </w:rPr>
-              <w:t>FEDRA - Plano de políticas públcias.pdf (repositório)</w:t>
+            <w:tcW w:w="14570" w:type="dxa"/>
+            <w:gridSpan w:val="4"/>
+          </w:tcPr>
+          <w:p>
+            <w:pPr>
+              <w:spacing w:after="60"/>
+            </w:pPr>
+            <w:r/>
+            <w:r>
+              <w:rPr>
+                <w:b/>
+                <w:sz w:val="20"/>
+              </w:rPr>
+              <w:t>Municípios e ANMP</w:t>
             </w:r>
           </w:p>
         </w:tc>
@@ -17425,7 +17976,7 @@
                 <w:b w:val="0"/>
                 <w:sz w:val="20"/>
               </w:rPr>
-              <w:t>Animais de Rua (18.11.2024)</w:t>
+              <w:t>ANMP (2018 e 2024)</w:t>
             </w:r>
           </w:p>
         </w:tc>
@@ -17461,7 +18012,7 @@
                 <w:b w:val="0"/>
                 <w:sz w:val="20"/>
               </w:rPr>
-              <w:t>Pede mais pressão sobre os municípios para cumprirem o CED e colaboração com as ONG. Contra o corte de apoios no OE2025.</w:t>
+              <w:t>Em 2018 disse ser impossível cumprir ao mesmo tempo a recolha obrigatória e a proibição do abate. Em 2024 lamentou que o OE2025 deixasse de prever verbas próprias para os CRO.</w:t>
             </w:r>
           </w:p>
         </w:tc>
@@ -17479,7 +18030,7 @@
                 <w:b w:val="0"/>
                 <w:sz w:val="20"/>
               </w:rPr>
-              <w:t>https://jornaleconomico.sapo.pt/noticias/estamos-perante-um-retrocesso-inaceitavel-se-bem-estar-animal-nao-for-incluido-no-oe2025-diz-animais-de-rua/</w:t>
+              <w:t>https://www.rtp.pt/noticias/economia/anmp-lamenta-que-orcamento-do-estado-nao-contemple-verbas-para-centros-de-recolha-animal_n1612994</w:t>
             </w:r>
           </w:p>
         </w:tc>
@@ -17499,7 +18050,7 @@
                 <w:b w:val="0"/>
                 <w:sz w:val="20"/>
               </w:rPr>
-              <w:t>SOS Animal e ANIMAL (25.10.2019)</w:t>
+              <w:t>Representante dos municípios (audição parlamentar) (25.10.2023)</w:t>
             </w:r>
           </w:p>
         </w:tc>
@@ -17517,7 +18068,7 @@
                 <w:b w:val="0"/>
                 <w:sz w:val="20"/>
               </w:rPr>
-              <w:t>T</w:t>
+              <w:t>C</w:t>
             </w:r>
           </w:p>
         </w:tc>
@@ -17535,7 +18086,7 @@
                 <w:b w:val="0"/>
                 <w:sz w:val="20"/>
               </w:rPr>
-              <w:t>O Estado não cumpre a lei: CRO lotados e listas de espera, com os animais a ficarem a cargo das associações.</w:t>
+              <w:t>Só cerca de 200 dos 308 municípios têm CRO, mas todos estão obrigados a recolher.</w:t>
             </w:r>
           </w:p>
         </w:tc>
@@ -17553,7 +18104,7 @@
                 <w:b w:val="0"/>
                 <w:sz w:val="20"/>
               </w:rPr>
-              <w:t>https://tvi.iol.pt/noticias/sociedade/canis/associacoes-culpam-o-estado-nao-ha-capacidade-para-receber-os-animais</w:t>
+              <w:t>https://observador.pt/2023/10/25/ha-80-000-animais-habitantes-nos-centros-de-recolha-alerta-provedora-do-animal/</w:t>
             </w:r>
           </w:p>
         </w:tc>
@@ -17573,7 +18124,7 @@
                 <w:b w:val="0"/>
                 <w:sz w:val="20"/>
               </w:rPr>
-              <w:t>Abraços de 4 Patas (Entroncamento) (14.9.2025)</w:t>
+              <w:t>Câmara Municipal do Porto (6.8.2021)</w:t>
             </w:r>
           </w:p>
         </w:tc>
@@ -17591,7 +18142,7 @@
                 <w:b w:val="0"/>
                 <w:sz w:val="20"/>
               </w:rPr>
-              <w:t>C</w:t>
+              <w:t>T e C</w:t>
             </w:r>
           </w:p>
         </w:tc>
@@ -17609,7 +18160,7 @@
                 <w:b w:val="0"/>
                 <w:sz w:val="20"/>
               </w:rPr>
-              <w:t>O CED municipal perdeu eficácia, as esterilizações caíram e os voluntários fazem trabalho do médico veterinário municipal.</w:t>
+              <w:t>Os gatos das colónias CED estão registados no SIAC em nome da câmara, mas a gestão diária cabe às associações. Mais de 70 colónias.</w:t>
             </w:r>
           </w:p>
         </w:tc>
@@ -17627,7 +18178,7 @@
                 <w:b w:val="0"/>
                 <w:sz w:val="20"/>
               </w:rPr>
-              <w:t>https://omirante.pt/sociedade/2025-09-14-associacao-do-entroncamento-critica-falta-de-controlo-de-colonias-de-gatos-1a4940a3</w:t>
+              <w:t>https://poligrafo.sapo.pt/fact-check/colonia-de-gatos-sinalizada-por-placa-no-porto-esta-legalizada-e-os-animais-sao-propriedade-da-autarquia/</w:t>
             </w:r>
           </w:p>
         </w:tc>
@@ -17647,7 +18198,7 @@
                 <w:b w:val="0"/>
                 <w:sz w:val="20"/>
               </w:rPr>
-              <w:t>Movimento de Intervenção pelas Matilhas (Coimbra) (s/d)</w:t>
+              <w:t>Câmara Municipal do Entroncamento (14.9.2025)</w:t>
             </w:r>
           </w:p>
         </w:tc>
@@ -17683,7 +18234,7 @@
                 <w:b w:val="0"/>
                 <w:sz w:val="20"/>
               </w:rPr>
-              <w:t>Defende o CED em cães, com devolução ao território acompanhada por cuidadores, vacinação e microchip.</w:t>
+              <w:t>O médico veterinário municipal está sob grande pressão; a câmara vai contratar clínicas para esterilizações.</w:t>
             </w:r>
           </w:p>
         </w:tc>
@@ -17701,7 +18252,7 @@
                 <w:b w:val="0"/>
                 <w:sz w:val="20"/>
               </w:rPr>
-              <w:t>https://matilhascoimbra.pt/pages/projecto-2</w:t>
+              <w:t>https://omirante.pt/sociedade/2025-09-14-associacao-do-entroncamento-critica-falta-de-controlo-de-colonias-de-gatos-1a4940a3</w:t>
             </w:r>
           </w:p>
         </w:tc>
@@ -17721,7 +18272,7 @@
                 <w:b w:val="0"/>
                 <w:sz w:val="20"/>
               </w:rPr>
-              <w:t>Associação São Francisco de Assis (Cascais) (29.1.2021)</w:t>
+              <w:t>Assembleia Municipal de Coimbra (proposta aprovada) (30.6.2026)</w:t>
             </w:r>
           </w:p>
         </w:tc>
@@ -17757,7 +18308,7 @@
                 <w:b w:val="0"/>
                 <w:sz w:val="20"/>
               </w:rPr>
-              <w:t>Defendeu a proibição de alimentar animais na via pública para gerir uma matilha no Guincho.</w:t>
+              <w:t>Mapeamento georreferenciado das colónias, regulamento municipal de cuidadores com formação, identificação, direitos e deveres, metas anuais de CED e apoio alimentar aos cuidadores.</w:t>
             </w:r>
           </w:p>
         </w:tc>
@@ -17775,7 +18326,7 @@
                 <w:b w:val="0"/>
                 <w:sz w:val="20"/>
               </w:rPr>
-              <w:t>https://poligrafo.sapo.pt/fact-check/proibido-alimentar-os-animais-punivel-com-coima-imagem-deste-cartaz-em-cascais-e-autentica</w:t>
+              <w:t>https://www.diariocoimbra.pt/2026/06/30/municipio-planeia-fazer-uma-melhor-gestao-das-colonias-de-gatos/</w:t>
             </w:r>
           </w:p>
         </w:tc>
@@ -17796,7 +18347,7 @@
                 <w:b/>
                 <w:sz w:val="20"/>
               </w:rPr>
-              <w:t>Ordens e associações profissionais</w:t>
+              <w:t>ONG e associações de proteção animal</w:t>
             </w:r>
           </w:p>
         </w:tc>
@@ -17816,7 +18367,7 @@
                 <w:b w:val="0"/>
                 <w:sz w:val="20"/>
               </w:rPr>
-              <w:t>OMV, comunicado sobre CED em cães (21.11.2025)</w:t>
+              <w:t>FEDRA (federação de associações) (22.8.2026)</w:t>
             </w:r>
           </w:p>
         </w:tc>
@@ -17852,7 +18403,7 @@
                 <w:b w:val="0"/>
                 <w:sz w:val="20"/>
               </w:rPr>
-              <w:t>Contra o CED em cães, que considera tecnicamente infundado e socialmente perigoso e uma desistência da administração local. Apoia o CED em gatos. Propõe reforço da captura e do alojamento em CRO.</w:t>
+              <w:t>Esterilização obrigatória como serviço público, financiamento estável e CED para cães. Diz que as associações suportam as falhas do sistema.</w:t>
             </w:r>
           </w:p>
         </w:tc>
@@ -17870,7 +18421,7 @@
                 <w:b w:val="0"/>
                 <w:sz w:val="20"/>
               </w:rPr>
-              <w:t>https://www.veterinaria-atual.pt/na-gestao/omv-programa-ced-caes/</w:t>
+              <w:t>https://observador.pt/2026/08/22/veterinarios-e-associacoes-defendem-mais-investimento-na-esterilizacao-de-animais/</w:t>
             </w:r>
           </w:p>
         </w:tc>
@@ -17890,7 +18441,7 @@
                 <w:b w:val="0"/>
                 <w:sz w:val="20"/>
               </w:rPr>
-              <w:t>OMV, bastonário (22.8.2026)</w:t>
+              <w:t>Animais de Rua (18.11.2024)</w:t>
             </w:r>
           </w:p>
         </w:tc>
@@ -17908,7 +18459,7 @@
                 <w:b w:val="0"/>
                 <w:sz w:val="20"/>
               </w:rPr>
-              <w:t>T e C</w:t>
+              <w:t>C</w:t>
             </w:r>
           </w:p>
         </w:tc>
@@ -17926,7 +18477,7 @@
                 <w:b w:val="0"/>
                 <w:sz w:val="20"/>
               </w:rPr>
-              <w:t>Esterilização obrigatória com financiamento público, registo SIAC com rastreio de ninhadas e um médico veterinário municipal por concelho. Refere que só cerca de 45% dos municípios têm médico veterinário municipal.</w:t>
+              <w:t>Pede mais pressão sobre os municípios para cumprirem o CED e colaboração com as ONG. Contra o corte de apoios no OE2025.</w:t>
             </w:r>
           </w:p>
         </w:tc>
@@ -17944,7 +18495,7 @@
                 <w:b w:val="0"/>
                 <w:sz w:val="20"/>
               </w:rPr>
-              <w:t>https://observador.pt/2026/08/22/veterinarios-e-associacoes-defendem-mais-investimento-na-esterilizacao-de-animais/</w:t>
+              <w:t>https://jornaleconomico.sapo.pt/noticias/estamos-perante-um-retrocesso-inaceitavel-se-bem-estar-animal-nao-for-incluido-no-oe2025-diz-animais-de-rua/</w:t>
             </w:r>
           </w:p>
         </w:tc>
@@ -17964,7 +18515,7 @@
                 <w:b w:val="0"/>
                 <w:sz w:val="20"/>
               </w:rPr>
-              <w:t>OMV, parecer sobre abandono em centros veterinários (nov. 2015)</w:t>
+              <w:t>SOS Animal e ANIMAL (25.10.2019)</w:t>
             </w:r>
           </w:p>
         </w:tc>
@@ -18000,7 +18551,7 @@
                 <w:b w:val="0"/>
                 <w:sz w:val="20"/>
               </w:rPr>
-              <w:t>A lei é omissa sobre animais que os donos não vão buscar depois do tratamento. Propõe termo de responsabilidade com prazo a partir do qual se presume o abandono. Citação: «A legislação é omissa quanto à situação de animais abandonados, após tratamento, em CAMV's».</w:t>
+              <w:t>O Estado não cumpre a lei: CRO lotados e listas de espera, com os animais a ficarem a cargo das associações.</w:t>
             </w:r>
           </w:p>
         </w:tc>
@@ -18018,7 +18569,7 @@
                 <w:b w:val="0"/>
                 <w:sz w:val="20"/>
               </w:rPr>
-              <w:t>https://www.omv.pt/dmdocuments/vi_formacao_omv/abandono_animais_camv_ultimoparecer_nov2015.pdf</w:t>
+              <w:t>https://tvi.iol.pt/noticias/sociedade/canis/associacoes-culpam-o-estado-nao-ha-capacidade-para-receber-os-animais</w:t>
             </w:r>
           </w:p>
         </w:tc>
@@ -18038,7 +18589,7 @@
                 <w:b w:val="0"/>
                 <w:sz w:val="20"/>
               </w:rPr>
-              <w:t>OMV e SNMV, comentários nos documentos de trabalho do RGBEAC e do RGAC (2025-2026)</w:t>
+              <w:t>Abraços de 4 Patas (Entroncamento) (14.9.2025)</w:t>
             </w:r>
           </w:p>
         </w:tc>
@@ -18056,7 +18607,7 @@
                 <w:b w:val="0"/>
                 <w:sz w:val="20"/>
               </w:rPr>
-              <w:t>T</w:t>
+              <w:t>C</w:t>
             </w:r>
           </w:p>
         </w:tc>
@@ -18074,7 +18625,7 @@
                 <w:b w:val="0"/>
                 <w:sz w:val="20"/>
               </w:rPr>
-              <w:t>Prazo para comunicar desaparecimento: SNMV propõe 48 horas, OMV propõe 72 horas. SNMV opõe-se a registos provisórios no SIAC por gerarem dúvidas sobre a responsabilidade pelos atos do animal.</w:t>
+              <w:t>O CED municipal perdeu eficácia, as esterilizações caíram e os voluntários fazem trabalho do médico veterinário municipal.</w:t>
             </w:r>
           </w:p>
         </w:tc>
@@ -18092,7 +18643,7 @@
                 <w:b w:val="0"/>
                 <w:sz w:val="20"/>
               </w:rPr>
-              <w:t>Documentos de trabalho do RGBEAC e do RGAC (repositório)</w:t>
+              <w:t>https://omirante.pt/sociedade/2025-09-14-associacao-do-entroncamento-critica-falta-de-controlo-de-colonias-de-gatos-1a4940a3</w:t>
             </w:r>
           </w:p>
         </w:tc>
@@ -18112,7 +18663,7 @@
                 <w:b w:val="0"/>
                 <w:sz w:val="20"/>
               </w:rPr>
-              <w:t>APMVEAC, revisão crítica da legislação (9.4.2021)</w:t>
+              <w:t>Associação São Francisco de Assis (Cascais) (29.1.2021)</w:t>
             </w:r>
           </w:p>
         </w:tc>
@@ -18130,7 +18681,7 @@
                 <w:b w:val="0"/>
                 <w:sz w:val="20"/>
               </w:rPr>
-              <w:t>T e C</w:t>
+              <w:t>C</w:t>
             </w:r>
           </w:p>
         </w:tc>
@@ -18148,7 +18699,7 @@
                 <w:b w:val="0"/>
                 <w:sz w:val="20"/>
               </w:rPr>
-              <w:t>Critica que a lei ponha autarquias e sociedades zoófilas em pé de igualdade no abandono, sem definir estas últimas. Citação: «a lei pode estar a passar responsabilidades elevadas para um sector que os legisladores foram até agora incapazes de caracterizar e definir cabalmente.» Sobre a Portaria 146/2017, sugere rever a adoção de animais com menos de 6 meses sem esterilização.</w:t>
+              <w:t>Defendeu a proibição de alimentar animais na via pública para gerir uma matilha no Guincho.</w:t>
             </w:r>
           </w:p>
         </w:tc>
@@ -18166,7 +18717,7 @@
                 <w:b w:val="0"/>
                 <w:sz w:val="20"/>
               </w:rPr>
-              <w:t>https://apmveac.pt/wp-content/uploads/2021/04/Legislacao.Animais.Companhia_09-04-2021-amarelo-final-.pdf</w:t>
+              <w:t>https://poligrafo.sapo.pt/fact-check/proibido-alimentar-os-animais-punivel-com-coima-imagem-deste-cartaz-em-cascais-e-autentica</w:t>
             </w:r>
           </w:p>
         </w:tc>
@@ -18174,73 +18725,20 @@
       <w:tr>
         <w:tc>
           <w:tcPr>
-            <w:tcW w:w="2835" w:type="dxa"/>
-          </w:tcPr>
-          <w:p>
-            <w:pPr>
-              <w:spacing w:after="60"/>
-            </w:pPr>
-            <w:r/>
-            <w:r>
-              <w:rPr>
-                <w:b w:val="0"/>
-                <w:sz w:val="20"/>
-              </w:rPr>
-              <w:t>APMVEAC, parecer à ENAE (set. 2023)</w:t>
-            </w:r>
-          </w:p>
-        </w:tc>
-        <w:tc>
-          <w:tcPr>
-            <w:tcW w:w="907" w:type="dxa"/>
-          </w:tcPr>
-          <w:p>
-            <w:pPr>
-              <w:spacing w:after="60"/>
-            </w:pPr>
-            <w:r/>
-            <w:r>
-              <w:rPr>
-                <w:b w:val="0"/>
-                <w:sz w:val="20"/>
-              </w:rPr>
-              <w:t>C</w:t>
-            </w:r>
-          </w:p>
-        </w:tc>
-        <w:tc>
-          <w:tcPr>
-            <w:tcW w:w="6860" w:type="dxa"/>
-          </w:tcPr>
-          <w:p>
-            <w:pPr>
-              <w:spacing w:after="60"/>
-            </w:pPr>
-            <w:r/>
-            <w:r>
-              <w:rPr>
-                <w:b w:val="0"/>
-                <w:sz w:val="20"/>
-              </w:rPr>
-              <w:t>Contra a dispersão de tutelas e contra o CED em cães. Diz que o enquadramento legal é parte do problema e que a eutanásia é ato clínico da responsabilidade exclusiva do médico veterinário.</w:t>
-            </w:r>
-          </w:p>
-        </w:tc>
-        <w:tc>
-          <w:tcPr>
-            <w:tcW w:w="3969" w:type="dxa"/>
-          </w:tcPr>
-          <w:p>
-            <w:pPr>
-              <w:spacing w:after="60"/>
-            </w:pPr>
-            <w:r/>
-            <w:r>
-              <w:rPr>
-                <w:b w:val="0"/>
-                <w:sz w:val="20"/>
-              </w:rPr>
-              <w:t>https://apmveac.pt/wp-content/uploads/2023/09/Parecer-APMVEAC-Consulta-Publica-ENAE.pdf</w:t>
+            <w:tcW w:w="14570" w:type="dxa"/>
+            <w:gridSpan w:val="4"/>
+          </w:tcPr>
+          <w:p>
+            <w:pPr>
+              <w:spacing w:after="60"/>
+            </w:pPr>
+            <w:r/>
+            <w:r>
+              <w:rPr>
+                <w:b/>
+                <w:sz w:val="20"/>
+              </w:rPr>
+              <w:t>Ordens e associações profissionais</w:t>
             </w:r>
           </w:p>
         </w:tc>
@@ -18260,7 +18758,7 @@
                 <w:b w:val="0"/>
                 <w:sz w:val="20"/>
               </w:rPr>
-              <w:t>ANVETEM (2020)</w:t>
+              <w:t>OMV, comunicado sobre CED em cães (21.11.2025)</w:t>
             </w:r>
           </w:p>
         </w:tc>
@@ -18296,7 +18794,7 @@
                 <w:b w:val="0"/>
                 <w:sz w:val="20"/>
               </w:rPr>
-              <w:t>Diz que a Lei 27/2016 assentou em pressupostos errados e que os CRO estão sobrelotados. Aponta a falta de regulação das entidades privadas de proteção animal. Refere que só 172 dos 308 municípios tinham médico veterinário municipal.</w:t>
+              <w:t>Contra o CED em cães, que considera tecnicamente infundado e socialmente perigoso e uma desistência da administração local. Apoia o CED em gatos. Propõe reforço da captura e do alojamento em CRO.</w:t>
             </w:r>
           </w:p>
         </w:tc>
@@ -18314,7 +18812,7 @@
                 <w:b w:val="0"/>
                 <w:sz w:val="20"/>
               </w:rPr>
-              <w:t>https://observador.pt/2020/03/08/associacao-de-veterinarios-diz-que-situacao-nos-canis-municipais-e-dramatica/</w:t>
+              <w:t>https://www.veterinaria-atual.pt/na-gestao/omv-programa-ced-caes/</w:t>
             </w:r>
           </w:p>
         </w:tc>
@@ -18322,6 +18820,154 @@
       <w:tr>
         <w:tc>
           <w:tcPr>
+            <w:tcW w:w="2835" w:type="dxa"/>
+          </w:tcPr>
+          <w:p>
+            <w:pPr>
+              <w:spacing w:after="60"/>
+            </w:pPr>
+            <w:r/>
+            <w:r>
+              <w:rPr>
+                <w:b w:val="0"/>
+                <w:sz w:val="20"/>
+              </w:rPr>
+              <w:t>OMV, bastonário (22.8.2026)</w:t>
+            </w:r>
+          </w:p>
+        </w:tc>
+        <w:tc>
+          <w:tcPr>
+            <w:tcW w:w="907" w:type="dxa"/>
+          </w:tcPr>
+          <w:p>
+            <w:pPr>
+              <w:spacing w:after="60"/>
+            </w:pPr>
+            <w:r/>
+            <w:r>
+              <w:rPr>
+                <w:b w:val="0"/>
+                <w:sz w:val="20"/>
+              </w:rPr>
+              <w:t>T e C</w:t>
+            </w:r>
+          </w:p>
+        </w:tc>
+        <w:tc>
+          <w:tcPr>
+            <w:tcW w:w="6860" w:type="dxa"/>
+          </w:tcPr>
+          <w:p>
+            <w:pPr>
+              <w:spacing w:after="60"/>
+            </w:pPr>
+            <w:r/>
+            <w:r>
+              <w:rPr>
+                <w:b w:val="0"/>
+                <w:sz w:val="20"/>
+              </w:rPr>
+              <w:t>Esterilização obrigatória com financiamento público, registo SIAC com rastreio de ninhadas e um médico veterinário municipal por concelho. Refere que só cerca de 45% dos municípios têm médico veterinário municipal.</w:t>
+            </w:r>
+          </w:p>
+        </w:tc>
+        <w:tc>
+          <w:tcPr>
+            <w:tcW w:w="3969" w:type="dxa"/>
+          </w:tcPr>
+          <w:p>
+            <w:pPr>
+              <w:spacing w:after="60"/>
+            </w:pPr>
+            <w:r/>
+            <w:r>
+              <w:rPr>
+                <w:b w:val="0"/>
+                <w:sz w:val="20"/>
+              </w:rPr>
+              <w:t>https://observador.pt/2026/08/22/veterinarios-e-associacoes-defendem-mais-investimento-na-esterilizacao-de-animais/</w:t>
+            </w:r>
+          </w:p>
+        </w:tc>
+      </w:tr>
+      <w:tr>
+        <w:tc>
+          <w:tcPr>
+            <w:tcW w:w="2835" w:type="dxa"/>
+          </w:tcPr>
+          <w:p>
+            <w:pPr>
+              <w:spacing w:after="60"/>
+            </w:pPr>
+            <w:r/>
+            <w:r>
+              <w:rPr>
+                <w:b w:val="0"/>
+                <w:sz w:val="20"/>
+              </w:rPr>
+              <w:t>ANVETEM (2020)</w:t>
+            </w:r>
+          </w:p>
+        </w:tc>
+        <w:tc>
+          <w:tcPr>
+            <w:tcW w:w="907" w:type="dxa"/>
+          </w:tcPr>
+          <w:p>
+            <w:pPr>
+              <w:spacing w:after="60"/>
+            </w:pPr>
+            <w:r/>
+            <w:r>
+              <w:rPr>
+                <w:b w:val="0"/>
+                <w:sz w:val="20"/>
+              </w:rPr>
+              <w:t>C</w:t>
+            </w:r>
+          </w:p>
+        </w:tc>
+        <w:tc>
+          <w:tcPr>
+            <w:tcW w:w="6860" w:type="dxa"/>
+          </w:tcPr>
+          <w:p>
+            <w:pPr>
+              <w:spacing w:after="60"/>
+            </w:pPr>
+            <w:r/>
+            <w:r>
+              <w:rPr>
+                <w:b w:val="0"/>
+                <w:sz w:val="20"/>
+              </w:rPr>
+              <w:t>Diz que a Lei 27/2016 assentou em pressupostos errados e que os CRO estão sobrelotados. Aponta a falta de regulação das entidades privadas de proteção animal. Refere que só 172 dos 308 municípios tinham médico veterinário municipal.</w:t>
+            </w:r>
+          </w:p>
+        </w:tc>
+        <w:tc>
+          <w:tcPr>
+            <w:tcW w:w="3969" w:type="dxa"/>
+          </w:tcPr>
+          <w:p>
+            <w:pPr>
+              <w:spacing w:after="60"/>
+            </w:pPr>
+            <w:r/>
+            <w:r>
+              <w:rPr>
+                <w:b w:val="0"/>
+                <w:sz w:val="20"/>
+              </w:rPr>
+              <w:t>https://observador.pt/2020/03/08/associacao-de-veterinarios-diz-que-situacao-nos-canis-municipais-e-dramatica/</w:t>
+            </w:r>
+          </w:p>
+        </w:tc>
+      </w:tr>
+      <w:tr>
+        <w:tc>
+          <w:tcPr>
             <w:tcW w:w="14570" w:type="dxa"/>
             <w:gridSpan w:val="4"/>
           </w:tcPr>
@@ -18355,7 +19001,7 @@
                 <w:b w:val="0"/>
                 <w:sz w:val="20"/>
               </w:rPr>
-              <w:t>PAN (2021 a 2025)</w:t>
+              <w:t>PAN, Inês Sousa Real (1.9.2026)</w:t>
             </w:r>
           </w:p>
         </w:tc>
@@ -18373,7 +19019,7 @@
                 <w:b w:val="0"/>
                 <w:sz w:val="20"/>
               </w:rPr>
-              <w:t>T e C</w:t>
+              <w:t>C</w:t>
             </w:r>
           </w:p>
         </w:tc>
@@ -18391,7 +19037,7 @@
                 <w:b w:val="0"/>
                 <w:sz w:val="20"/>
               </w:rPr>
-              <w:t>Figura do animal comunitário (projeto aprovado na generalidade em 2021, caducado, retomado nos PJL 662/XV e 88/XVI). Estatuto da família de acolhimento temporário (2024). Critica o OE2026 por nenhum avanço para animais comunitários e matilhas.</w:t>
+              <w:t>A execução da Lei 27/2016 fica aquém: esterilizações em queda, pelo menos 96 municípios sem CRO e só 45% com médico veterinário municipal.</w:t>
             </w:r>
           </w:p>
         </w:tc>
@@ -18409,7 +19055,7 @@
                 <w:b w:val="0"/>
                 <w:sz w:val="20"/>
               </w:rPr>
-              <w:t>https://www.pan.com.pt/pan-destaca-vitorias-no-bem-estar-animal-mas-denuncia-retrocesso-grave-no-orcamento-do-estado-para-2026/</w:t>
+              <w:t>https://pit.nit.pt/animais/10-anos-sem-abate-nos-canis-ha-leis-que-salvam-vidas</w:t>
             </w:r>
           </w:p>
         </w:tc>
@@ -18429,7 +19075,7 @@
                 <w:b w:val="0"/>
                 <w:sz w:val="20"/>
               </w:rPr>
-              <w:t>PAN, Inês Sousa Real (1.9.2026)</w:t>
+              <w:t>Bloco de Esquerda, programa eleitoral (2024)</w:t>
             </w:r>
           </w:p>
         </w:tc>
@@ -18465,7 +19111,7 @@
                 <w:b w:val="0"/>
                 <w:sz w:val="20"/>
               </w:rPr>
-              <w:t>A execução da Lei 27/2016 fica aquém: esterilizações em queda, pelo menos 96 municípios sem CRO e só 45% com médico veterinário municipal.</w:t>
+              <w:t>CED, figura do animal comunitário e um médico veterinário municipal a tempo inteiro por município.</w:t>
             </w:r>
           </w:p>
         </w:tc>
@@ -18483,7 +19129,7 @@
                 <w:b w:val="0"/>
                 <w:sz w:val="20"/>
               </w:rPr>
-              <w:t>https://pit.nit.pt/animais/10-anos-sem-abate-nos-canis-ha-leis-que-salvam-vidas</w:t>
+              <w:t>https://pit.nit.pt/animais/legislativas-estao-ai-prometem-os-partidos-defesa-do-bem-estar-animal</w:t>
             </w:r>
           </w:p>
         </w:tc>
@@ -18503,7 +19149,7 @@
                 <w:b w:val="0"/>
                 <w:sz w:val="20"/>
               </w:rPr>
-              <w:t>PCP, proposta ao OE2026 (5.11.2025)</w:t>
+              <w:t>Chega, programa eleitoral (2024)</w:t>
             </w:r>
           </w:p>
         </w:tc>
@@ -18521,7 +19167,7 @@
                 <w:b w:val="0"/>
                 <w:sz w:val="20"/>
               </w:rPr>
-              <w:t>T e C</w:t>
+              <w:t>C</w:t>
             </w:r>
           </w:p>
         </w:tc>
@@ -18539,7 +19185,7 @@
                 <w:b w:val="0"/>
                 <w:sz w:val="20"/>
               </w:rPr>
-              <w:t>Campanha nacional de esterilização com CED para cães não perigosos, registados no SIAC sem responsabilidade do município. Citação: «a título exclusivamente informativo, mediante a identificação genérica ‘Cães CED’ e com a exclusão das responsabilidades desses municípios inerentes à propriedade ou detenção desses animais».</w:t>
+              <w:t>Garantir o CED em todos os municípios e criar o estatuto do animal comunitário.</w:t>
             </w:r>
           </w:p>
         </w:tc>
@@ -18557,7 +19203,7 @@
                 <w:b w:val="0"/>
                 <w:sz w:val="20"/>
               </w:rPr>
-              <w:t>https://www.pcp.pt/campanha-nacional-de-esterilizacao-de-animais-errantes-0</w:t>
+              <w:t>https://pit.nit.pt/animais/legislativas-estao-ai-prometem-os-partidos-defesa-do-bem-estar-animal</w:t>
             </w:r>
           </w:p>
         </w:tc>
@@ -18577,7 +19223,7 @@
                 <w:b w:val="0"/>
                 <w:sz w:val="20"/>
               </w:rPr>
-              <w:t>PCP (12.11.2021)</w:t>
+              <w:t>PS, programa eleitoral (2024)</w:t>
             </w:r>
           </w:p>
         </w:tc>
@@ -18613,7 +19259,7 @@
                 <w:b w:val="0"/>
                 <w:sz w:val="20"/>
               </w:rPr>
-              <w:t>Contra criar novas figuras legais sem meios: a solução é a esterilização e uma rede pública de médicos veterinários.</w:t>
+              <w:t>Programas de esterilização e vacinação para matilhas errantes. Não se pronuncia sobre CED de gatos.</w:t>
             </w:r>
           </w:p>
         </w:tc>
@@ -18631,7 +19277,7 @@
                 <w:b w:val="0"/>
                 <w:sz w:val="20"/>
               </w:rPr>
-              <w:t>https://www.pcp.pt/solucao-prevencao-pela-esterilizacao-rede-publica-de-veterinarios-nao-abate-de-animais-abandonados</w:t>
+              <w:t>https://pit.nit.pt/animais/legislativas-estao-ai-prometem-os-partidos-defesa-do-bem-estar-animal</w:t>
             </w:r>
           </w:p>
         </w:tc>
@@ -18651,7 +19297,7 @@
                 <w:b w:val="0"/>
                 <w:sz w:val="20"/>
               </w:rPr>
-              <w:t>Livre, programa eleitoral (2024)</w:t>
+              <w:t>PSD/AD e Iniciativa Liberal, programas eleitorais (2024)</w:t>
             </w:r>
           </w:p>
         </w:tc>
@@ -18669,7 +19315,7 @@
                 <w:b w:val="0"/>
                 <w:sz w:val="20"/>
               </w:rPr>
-              <w:t>C</w:t>
+              <w:t>T</w:t>
             </w:r>
           </w:p>
         </w:tc>
@@ -18687,7 +19333,7 @@
                 <w:b w:val="0"/>
                 <w:sz w:val="20"/>
               </w:rPr>
-              <w:t>Reforço dos CED e alargamento a cães errantes, valorização do animal comunitário, protocolos com associações com metas e financiamento.</w:t>
+              <w:t>PSD/AD: campanhas contra o abandono e reforço dos CRO. IL: permitir que os CRO entreguem animais a particulares com apoio do Estado e financiar as associações em função dos animais a cargo.</w:t>
             </w:r>
           </w:p>
         </w:tc>
@@ -18705,377 +19351,7 @@
                 <w:b w:val="0"/>
                 <w:sz w:val="20"/>
               </w:rPr>
-              <w:t>https://programa.partidolivre.pt/propostas/N.13/</w:t>
-            </w:r>
-          </w:p>
-        </w:tc>
-      </w:tr>
-      <w:tr>
-        <w:tc>
-          <w:tcPr>
-            <w:tcW w:w="2835" w:type="dxa"/>
-          </w:tcPr>
-          <w:p>
-            <w:pPr>
-              <w:spacing w:after="60"/>
-            </w:pPr>
-            <w:r/>
-            <w:r>
-              <w:rPr>
-                <w:b w:val="0"/>
-                <w:sz w:val="20"/>
-              </w:rPr>
-              <w:t>Bloco de Esquerda, programa eleitoral (2024)</w:t>
-            </w:r>
-          </w:p>
-        </w:tc>
-        <w:tc>
-          <w:tcPr>
-            <w:tcW w:w="907" w:type="dxa"/>
-          </w:tcPr>
-          <w:p>
-            <w:pPr>
-              <w:spacing w:after="60"/>
-            </w:pPr>
-            <w:r/>
-            <w:r>
-              <w:rPr>
-                <w:b w:val="0"/>
-                <w:sz w:val="20"/>
-              </w:rPr>
-              <w:t>C</w:t>
-            </w:r>
-          </w:p>
-        </w:tc>
-        <w:tc>
-          <w:tcPr>
-            <w:tcW w:w="6860" w:type="dxa"/>
-          </w:tcPr>
-          <w:p>
-            <w:pPr>
-              <w:spacing w:after="60"/>
-            </w:pPr>
-            <w:r/>
-            <w:r>
-              <w:rPr>
-                <w:b w:val="0"/>
-                <w:sz w:val="20"/>
-              </w:rPr>
-              <w:t>CED, figura do animal comunitário e um médico veterinário municipal a tempo inteiro por município.</w:t>
-            </w:r>
-          </w:p>
-        </w:tc>
-        <w:tc>
-          <w:tcPr>
-            <w:tcW w:w="3969" w:type="dxa"/>
-          </w:tcPr>
-          <w:p>
-            <w:pPr>
-              <w:spacing w:after="60"/>
-            </w:pPr>
-            <w:r/>
-            <w:r>
-              <w:rPr>
-                <w:b w:val="0"/>
-                <w:sz w:val="20"/>
-              </w:rPr>
               <w:t>https://pit.nit.pt/animais/legislativas-estao-ai-prometem-os-partidos-defesa-do-bem-estar-animal</w:t>
-            </w:r>
-          </w:p>
-        </w:tc>
-      </w:tr>
-      <w:tr>
-        <w:tc>
-          <w:tcPr>
-            <w:tcW w:w="2835" w:type="dxa"/>
-          </w:tcPr>
-          <w:p>
-            <w:pPr>
-              <w:spacing w:after="60"/>
-            </w:pPr>
-            <w:r/>
-            <w:r>
-              <w:rPr>
-                <w:b w:val="0"/>
-                <w:sz w:val="20"/>
-              </w:rPr>
-              <w:t>Chega, programa eleitoral (2024)</w:t>
-            </w:r>
-          </w:p>
-        </w:tc>
-        <w:tc>
-          <w:tcPr>
-            <w:tcW w:w="907" w:type="dxa"/>
-          </w:tcPr>
-          <w:p>
-            <w:pPr>
-              <w:spacing w:after="60"/>
-            </w:pPr>
-            <w:r/>
-            <w:r>
-              <w:rPr>
-                <w:b w:val="0"/>
-                <w:sz w:val="20"/>
-              </w:rPr>
-              <w:t>C</w:t>
-            </w:r>
-          </w:p>
-        </w:tc>
-        <w:tc>
-          <w:tcPr>
-            <w:tcW w:w="6860" w:type="dxa"/>
-          </w:tcPr>
-          <w:p>
-            <w:pPr>
-              <w:spacing w:after="60"/>
-            </w:pPr>
-            <w:r/>
-            <w:r>
-              <w:rPr>
-                <w:b w:val="0"/>
-                <w:sz w:val="20"/>
-              </w:rPr>
-              <w:t>Garantir o CED em todos os municípios e criar o estatuto do animal comunitário.</w:t>
-            </w:r>
-          </w:p>
-        </w:tc>
-        <w:tc>
-          <w:tcPr>
-            <w:tcW w:w="3969" w:type="dxa"/>
-          </w:tcPr>
-          <w:p>
-            <w:pPr>
-              <w:spacing w:after="60"/>
-            </w:pPr>
-            <w:r/>
-            <w:r>
-              <w:rPr>
-                <w:b w:val="0"/>
-                <w:sz w:val="20"/>
-              </w:rPr>
-              <w:t>https://pit.nit.pt/animais/legislativas-estao-ai-prometem-os-partidos-defesa-do-bem-estar-animal</w:t>
-            </w:r>
-          </w:p>
-        </w:tc>
-      </w:tr>
-      <w:tr>
-        <w:tc>
-          <w:tcPr>
-            <w:tcW w:w="2835" w:type="dxa"/>
-          </w:tcPr>
-          <w:p>
-            <w:pPr>
-              <w:spacing w:after="60"/>
-            </w:pPr>
-            <w:r/>
-            <w:r>
-              <w:rPr>
-                <w:b w:val="0"/>
-                <w:sz w:val="20"/>
-              </w:rPr>
-              <w:t>PS, programa eleitoral (2024)</w:t>
-            </w:r>
-          </w:p>
-        </w:tc>
-        <w:tc>
-          <w:tcPr>
-            <w:tcW w:w="907" w:type="dxa"/>
-          </w:tcPr>
-          <w:p>
-            <w:pPr>
-              <w:spacing w:after="60"/>
-            </w:pPr>
-            <w:r/>
-            <w:r>
-              <w:rPr>
-                <w:b w:val="0"/>
-                <w:sz w:val="20"/>
-              </w:rPr>
-              <w:t>C</w:t>
-            </w:r>
-          </w:p>
-        </w:tc>
-        <w:tc>
-          <w:tcPr>
-            <w:tcW w:w="6860" w:type="dxa"/>
-          </w:tcPr>
-          <w:p>
-            <w:pPr>
-              <w:spacing w:after="60"/>
-            </w:pPr>
-            <w:r/>
-            <w:r>
-              <w:rPr>
-                <w:b w:val="0"/>
-                <w:sz w:val="20"/>
-              </w:rPr>
-              <w:t>Programas de esterilização e vacinação para matilhas errantes. Não se pronuncia sobre CED de gatos.</w:t>
-            </w:r>
-          </w:p>
-        </w:tc>
-        <w:tc>
-          <w:tcPr>
-            <w:tcW w:w="3969" w:type="dxa"/>
-          </w:tcPr>
-          <w:p>
-            <w:pPr>
-              <w:spacing w:after="60"/>
-            </w:pPr>
-            <w:r/>
-            <w:r>
-              <w:rPr>
-                <w:b w:val="0"/>
-                <w:sz w:val="20"/>
-              </w:rPr>
-              <w:t>https://pit.nit.pt/animais/legislativas-estao-ai-prometem-os-partidos-defesa-do-bem-estar-animal</w:t>
-            </w:r>
-          </w:p>
-        </w:tc>
-      </w:tr>
-      <w:tr>
-        <w:tc>
-          <w:tcPr>
-            <w:tcW w:w="2835" w:type="dxa"/>
-          </w:tcPr>
-          <w:p>
-            <w:pPr>
-              <w:spacing w:after="60"/>
-            </w:pPr>
-            <w:r/>
-            <w:r>
-              <w:rPr>
-                <w:b w:val="0"/>
-                <w:sz w:val="20"/>
-              </w:rPr>
-              <w:t>PSD/AD e Iniciativa Liberal, programas eleitorais (2024)</w:t>
-            </w:r>
-          </w:p>
-        </w:tc>
-        <w:tc>
-          <w:tcPr>
-            <w:tcW w:w="907" w:type="dxa"/>
-          </w:tcPr>
-          <w:p>
-            <w:pPr>
-              <w:spacing w:after="60"/>
-            </w:pPr>
-            <w:r/>
-            <w:r>
-              <w:rPr>
-                <w:b w:val="0"/>
-                <w:sz w:val="20"/>
-              </w:rPr>
-              <w:t>T</w:t>
-            </w:r>
-          </w:p>
-        </w:tc>
-        <w:tc>
-          <w:tcPr>
-            <w:tcW w:w="6860" w:type="dxa"/>
-          </w:tcPr>
-          <w:p>
-            <w:pPr>
-              <w:spacing w:after="60"/>
-            </w:pPr>
-            <w:r/>
-            <w:r>
-              <w:rPr>
-                <w:b w:val="0"/>
-                <w:sz w:val="20"/>
-              </w:rPr>
-              <w:t>PSD/AD: campanhas contra o abandono e reforço dos CRO. IL: permitir que os CRO entreguem animais a particulares com apoio do Estado e financiar as associações em função dos animais a cargo.</w:t>
-            </w:r>
-          </w:p>
-        </w:tc>
-        <w:tc>
-          <w:tcPr>
-            <w:tcW w:w="3969" w:type="dxa"/>
-          </w:tcPr>
-          <w:p>
-            <w:pPr>
-              <w:spacing w:after="60"/>
-            </w:pPr>
-            <w:r/>
-            <w:r>
-              <w:rPr>
-                <w:b w:val="0"/>
-                <w:sz w:val="20"/>
-              </w:rPr>
-              <w:t>https://pit.nit.pt/animais/legislativas-estao-ai-prometem-os-partidos-defesa-do-bem-estar-animal</w:t>
-            </w:r>
-          </w:p>
-        </w:tc>
-      </w:tr>
-      <w:tr>
-        <w:tc>
-          <w:tcPr>
-            <w:tcW w:w="2835" w:type="dxa"/>
-          </w:tcPr>
-          <w:p>
-            <w:pPr>
-              <w:spacing w:after="60"/>
-            </w:pPr>
-            <w:r/>
-            <w:r>
-              <w:rPr>
-                <w:b w:val="0"/>
-                <w:sz w:val="20"/>
-              </w:rPr>
-              <w:t>Respostas dos partidos (Maratona pelos Animais) (mar. 2024)</w:t>
-            </w:r>
-          </w:p>
-        </w:tc>
-        <w:tc>
-          <w:tcPr>
-            <w:tcW w:w="907" w:type="dxa"/>
-          </w:tcPr>
-          <w:p>
-            <w:pPr>
-              <w:spacing w:after="60"/>
-            </w:pPr>
-            <w:r/>
-            <w:r>
-              <w:rPr>
-                <w:b w:val="0"/>
-                <w:sz w:val="20"/>
-              </w:rPr>
-              <w:t>C</w:t>
-            </w:r>
-          </w:p>
-        </w:tc>
-        <w:tc>
-          <w:tcPr>
-            <w:tcW w:w="6860" w:type="dxa"/>
-          </w:tcPr>
-          <w:p>
-            <w:pPr>
-              <w:spacing w:after="60"/>
-            </w:pPr>
-            <w:r/>
-            <w:r>
-              <w:rPr>
-                <w:b w:val="0"/>
-                <w:sz w:val="20"/>
-              </w:rPr>
-              <w:t>Sobre o CED em cães: PAN e BE a favor; Chega a favor em local circunscrito com cuidadores designados; CDU prudente por questões práticas e de responsabilidade civil; AD disponível para refletir; PS e IL não responderam.</w:t>
-            </w:r>
-          </w:p>
-        </w:tc>
-        <w:tc>
-          <w:tcPr>
-            <w:tcW w:w="3969" w:type="dxa"/>
-          </w:tcPr>
-          <w:p>
-            <w:pPr>
-              <w:spacing w:after="60"/>
-            </w:pPr>
-            <w:r/>
-            <w:r>
-              <w:rPr>
-                <w:b w:val="0"/>
-                <w:sz w:val="20"/>
-              </w:rPr>
-              <w:t>https://maratonapelosanimais.pt/wp-content/uploads/2024/03/respostas-completas.pdf</w:t>
             </w:r>
           </w:p>
         </w:tc>
@@ -19490,6 +19766,62 @@
           </w:p>
         </w:tc>
       </w:tr>
+      <w:tr>
+        <w:tc>
+          <w:tcPr>
+            <w:tcW w:w="1020" w:type="dxa"/>
+          </w:tcPr>
+          <w:p>
+            <w:pPr>
+              <w:spacing w:after="60"/>
+            </w:pPr>
+            <w:r/>
+            <w:r>
+              <w:rPr>
+                <w:b w:val="0"/>
+                <w:sz w:val="20"/>
+              </w:rPr>
+              <w:t>1.3</w:t>
+            </w:r>
+          </w:p>
+        </w:tc>
+        <w:tc>
+          <w:tcPr>
+            <w:tcW w:w="1417" w:type="dxa"/>
+          </w:tcPr>
+          <w:p>
+            <w:pPr>
+              <w:spacing w:after="60"/>
+            </w:pPr>
+            <w:r/>
+            <w:r>
+              <w:rPr>
+                <w:b w:val="0"/>
+                <w:sz w:val="20"/>
+              </w:rPr>
+              <w:t>25.9.2026</w:t>
+            </w:r>
+          </w:p>
+        </w:tc>
+        <w:tc>
+          <w:tcPr>
+            <w:tcW w:w="6633" w:type="dxa"/>
+          </w:tcPr>
+          <w:p>
+            <w:pPr>
+              <w:spacing w:after="60"/>
+            </w:pPr>
+            <w:r/>
+            <w:r>
+              <w:rPr>
+                <w:b w:val="0"/>
+                <w:sz w:val="20"/>
+              </w:rPr>
+              <w:t>Fontes: as posições conhecidas só pela imprensa passam para uma nota no fim do Anexo B e ficam marcadas nas fichas com «fonte: imprensa». A tabela principal do Anexo B fica reservada a documentos. Nenhuma posição foi retirada.</w:t>
+            </w:r>
+          </w:p>
+        </w:tc>
+      </w:tr>
     </w:tbl>
     <w:sectPr>
       <w:pgSz w:w="11906" w:h="16838"/>
@@ -19512,7 +19844,7 @@
       <w:rPr>
         <w:sz w:val="16"/>
       </w:rPr>
-      <w:t xml:space="preserve">Memorando de acompanhamento do RGAC, versão 1.2. Página </w:t>
+      <w:t xml:space="preserve">Memorando de acompanhamento do RGAC, versão 1.3. Página </w:t>
     </w:r>
     <w:r>
       <w:rPr>

</xml_diff>

<commit_message>
Memorando RGAC v1.4: fontes documentais no Anexo B e nas fichas
Co-Authored-By: Claude Opus 5.5 <noreply@anthropic.com>
Claude-Session: https://claude.ai/code/session_014DugHn4TLfFaZJnbpoBJVk
</commit_message>
<xml_diff>
--- a/memorando_rgac/Memorando_Acompanhamento_RGAC.docx
+++ b/memorando_rgac/Memorando_Acompanhamento_RGAC.docx
@@ -79,7 +79,7 @@
                 <w:b w:val="0"/>
                 <w:sz w:val="20"/>
               </w:rPr>
-              <w:t>1.3</w:t>
+              <w:t>1.4</w:t>
             </w:r>
           </w:p>
         </w:tc>
@@ -2805,7 +2805,7 @@
                 <w:b w:val="0"/>
                 <w:sz w:val="20"/>
               </w:rPr>
-              <w:t>Análise interna; Teresa Quintela de Brito, RJLB 2019 (o crime de abandono só abrange quem já tem dever de guarda)</w:t>
+              <w:t>Análise interna; Teresa Quintela de Brito, RJLB 2019 (o crime de abandono só abrange quem já tem dever de guarda); Raúl Farias, e-book do CEJ «Direito dos animais» (2022): o abandono situa-se ao nível da detenção; Cátia Simões, RJLB 2019 (o abandono é difícil de provar); Tribunal Constitucional, Acórdão 478/2024 (o art. 388.º do Código Penal não é inconstitucional)</w:t>
             </w:r>
           </w:p>
         </w:tc>
@@ -4782,7 +4782,7 @@
                 <w:b w:val="0"/>
                 <w:sz w:val="20"/>
               </w:rPr>
-              <w:t>Contributos dos médicos veterinários municipais (6.3.2026); Tribunal da Relação de Coimbra, proc. 281/10.1TBCV.C1 (11.7.2012); Tribunal da Relação do Porto (11.11.2024), fonte: imprensa; CDU (resposta de 2024)</w:t>
+              <w:t>Contributos dos médicos veterinários municipais (6.3.2026); Tribunal da Relação de Coimbra, proc. 281/10.1TBCV.C1 (11.7.2012); Tribunal da Relação do Porto (11.11.2024), fonte: imprensa; STJ, proc. 478/05.6TBMGL.C1.S1 (14.11.2013): os arts. 493.º e 502.º do Código Civil podem coexistir; Tribunal da Relação de Lisboa, proc. 3121/03.4TBCSC.L1-6 (24.11.2009); Tribunal da Relação de Coimbra, proc. 6/22.9GCPBL.C1 (7.2.2024): dever de vigilância do detentor; CDU (resposta de 2024)</w:t>
             </w:r>
           </w:p>
         </w:tc>
@@ -5093,7 +5093,7 @@
                 <w:b w:val="0"/>
                 <w:sz w:val="20"/>
               </w:rPr>
-              <w:t>Estratégia Nacional para os Animais Errantes (ENAE), pp. 30-31; Contributos dos médicos veterinários municipais (6.3.2026); PAN (estatuto da família de acolhimento, 2024); Iniciativa Liberal (programa 2024), fonte: imprensa; SNMV (contra registos provisórios no SIAC)</w:t>
+              <w:t>Estratégia Nacional para os Animais Errantes (ENAE), pp. 30-31; Contributos dos médicos veterinários municipais (6.3.2026); PAN (estatuto da família de acolhimento, 2024); Iniciativa Liberal (programa 2024), fonte: imprensa; SNMV (contra registos provisórios no SIAC); Raúl Farias, e-book do CEJ (2022): as associações, como pessoas coletivas, não respondem pelo crime de abandono</w:t>
             </w:r>
           </w:p>
         </w:tc>
@@ -5703,7 +5703,7 @@
                 <w:b w:val="0"/>
                 <w:sz w:val="20"/>
               </w:rPr>
-              <w:t>Contributos dos médicos veterinários municipais (6.3.2026); ANVETEM (falta de regulação das entidades privadas de proteção animal, 2020), fonte: imprensa</w:t>
+              <w:t>Contributos dos médicos veterinários municipais (6.3.2026); ANVETEM (falta de regulação das entidades privadas de proteção animal, 2020), fonte: imprensa; Tribunal da Relação de Lisboa, proc. 3121/03.4TBCSC.L1-6 (24.11.2009): detentor é aquele em cuja casa o animal é albergado; ENAE (família de acolhimento temporário e cuidador não regulados); Lei 8/2017, art. 493.º-A do Código Civil (despesas de quem socorreu o animal)</w:t>
             </w:r>
           </w:p>
         </w:tc>
@@ -6313,7 +6313,7 @@
                 <w:b w:val="0"/>
                 <w:sz w:val="20"/>
               </w:rPr>
-              <w:t>OMV, parecer sobre abandono de animais em centros veterinários (nov. 2015)</w:t>
+              <w:t>OMV, parecer sobre abandono de animais em centros veterinários (nov. 2015); Cátia Simões, RJLB 2019 (o animal não recolhido de hotel ou CAMV escapa à definição de abandono)</w:t>
             </w:r>
           </w:p>
         </w:tc>
@@ -6659,7 +6659,7 @@
                 <w:b w:val="0"/>
                 <w:sz w:val="20"/>
               </w:rPr>
-              <w:t>ENAE, p. 35 («Os programas CED não estão instituídos em todo o território»); Livre e PAN (respostas de 2024); ARPA (o CED é dever legal dos municípios, dez. 2022); Chega (programa 2024), fonte: imprensa; Animais de Rua (18.11.2024), fonte: imprensa</w:t>
+              <w:t>ENAE, p. 35 («Os programas CED não estão instituídos em todo o território»); Livre e PAN (respostas de 2024); ARPA (o CED é dever legal dos municípios, dez. 2022); Chega (programa 2024), fonte: imprensa; Animais de Rua (18.11.2024), fonte: imprensa; Gunther e outros, PNAS 2022, e Boone e outros, 2019 (o CED só resulta com esterilização intensa e contínua); Comissão Europeia, SWD(2024) 88 (errantes fora do âmbito do Regulamento (UE) 2026/1818)</w:t>
             </w:r>
           </w:p>
         </w:tc>
@@ -6970,7 +6970,7 @@
                 <w:b w:val="0"/>
                 <w:sz w:val="20"/>
               </w:rPr>
-              <w:t>ENAE, p. 35 («não está definido o conceito de "cuidador da colónia"»); Contributos dos médicos veterinários municipais (6.3.2026); PAN (figura do animal comunitário, PJL 662/XV); BE, Chega e Livre (animal comunitário, programas 2024), fonte: imprensa; Assembleia Municipal de Coimbra (regulamento de cuidadores, 30.6.2026), fonte: imprensa; Câmara Municipal do Porto (gestão diária pelas associações, 2021), fonte: imprensa</w:t>
+              <w:t>ENAE, p. 35 («não está definido o conceito de "cuidador da colónia"»); Contributos dos médicos veterinários municipais (6.3.2026); PAN (figura do animal comunitário, PJL 662/XV); BE, Chega e Livre (animal comunitário, programas 2024), fonte: imprensa; Assembleia Municipal de Coimbra (regulamento de cuidadores, 30.6.2026), fonte: imprensa; Câmara Municipal do Porto (gestão diária pelas associações, 2021), fonte: imprensa; OMV, parecer ao PJL 662/XV (5.1.2024): contra o animal comunitário por diluir a responsabilidade; PAN, PJL 662/XV (definição de animal comunitário); Município do Fundão, Edital 145/2023, art. 4.º, n.º 1 (cuidador registado responsável pela colónia); Município da Moita, Regulamento 143/2025, art. 3.º, n.º 2</w:t>
             </w:r>
           </w:p>
         </w:tc>
@@ -7281,7 +7281,7 @@
                 <w:b w:val="0"/>
                 <w:sz w:val="20"/>
               </w:rPr>
-              <w:t>ENAE, p. 35 («Existem regulamentos ou posturas camarárias que proíbem alimentar animais errantes»); Contributo de um médico veterinário municipal (pede coimas aos alimentadores, posição contrária); Regulamentos municipais de Lisboa, Porto, Oeiras, Cascais e outros (excecionam cuidadores registados)</w:t>
+              <w:t>ENAE, p. 35 («Existem regulamentos ou posturas camarárias que proíbem alimentar animais errantes»); Contributo de um médico veterinário municipal (pede coimas aos alimentadores, posição contrária); Regulamentos municipais de Lisboa, Porto, Oeiras, Cascais e outros (excecionam cuidadores registados); Provedor de Justiça, Relatório 2020 (campanhas da DGAV contra a alimentação de errantes)</w:t>
             </w:r>
           </w:p>
         </w:tc>
@@ -7903,7 +7903,7 @@
                 <w:b w:val="0"/>
                 <w:sz w:val="20"/>
               </w:rPr>
-              <w:t>Relatório final do GTBEA (DGAV, 2021); Projeto de revisão da Portaria 146/2017 (ANMP, 2021); ANMP (2018), fonte: imprensa; Provedora do Animal (cerca de 80 mil animais nos CRO, 25.10.2023), fonte: imprensa</w:t>
+              <w:t>Relatório final do GTBEA (DGAV, 2021); Projeto de revisão da Portaria 146/2017 (ANMP, 2021); ANMP (2018), fonte: imprensa; Provedora do Animal (cerca de 80 mil animais nos CRO, 25.10.2023), fonte: imprensa; Provedor de Justiça, Relatório 2023 (queixas sobre sobrelotação dos CRO)</w:t>
             </w:r>
           </w:p>
         </w:tc>
@@ -8176,7 +8176,7 @@
                 <w:b w:val="0"/>
                 <w:sz w:val="20"/>
               </w:rPr>
-              <w:t>OMV (25.11.2025), fonte: imprensa; APMVEAC (parecer set. 2023); PAN e BE (2024); Contributos dos médicos veterinários municipais (6.3.2026); FEDRA; PCP (proposta ao OE2026); Livre (programa 2024); Movimento de Intervenção pelas Matilhas (Coimbra); Projeto de alteração da Portaria 146/2017 (esterilização excecional de cães)</w:t>
+              <w:t>OMV (25.11.2025), fonte: imprensa; OMV, parecer ao PJL 662/XV (5.1.2024): contra o CED em cães; WOAH, Código Sanitário dos Animais Terrestres, cap. 7.7 (CED em cães só como medida complementar); APMVEAC (parecer set. 2023); PAN e BE (2024); Contributos dos médicos veterinários municipais (6.3.2026); FEDRA; PCP (proposta ao OE2026); Livre (programa 2024); Movimento de Intervenção pelas Matilhas (Coimbra); Projeto de alteração da Portaria 146/2017 (esterilização excecional de cães)</w:t>
             </w:r>
           </w:p>
         </w:tc>
@@ -9045,7 +9045,7 @@
                 <w:b w:val="0"/>
                 <w:sz w:val="20"/>
               </w:rPr>
-              <w:t>ENAE, p. 35 («não é possível aferir o número de animais nem o número e localização das colónias»); ENAE, §33 (número de registo nacional da colónia); Assembleia Municipal de Coimbra (mapeamento georreferenciado, 30.6.2026), fonte: imprensa; Provedoria dos Animais de Lisboa (sinalização de colónias, 10.9.2024), fonte: imprensa</w:t>
+              <w:t>ENAE, p. 35 («não é possível aferir o número de animais nem o número e localização das colónias»); ENAE, §33 (número de registo nacional da colónia); Assembleia Municipal de Coimbra (mapeamento georreferenciado, 30.6.2026), fonte: imprensa; Provedoria dos Animais de Lisboa (sinalização de colónias, 10.9.2024), fonte: imprensa; Provedor de Justiça, Relatório 2023 (planos CED autorizados sem divulgação pública)</w:t>
             </w:r>
           </w:p>
         </w:tc>
@@ -9667,7 +9667,7 @@
                 <w:b w:val="0"/>
                 <w:sz w:val="20"/>
               </w:rPr>
-              <w:t>SPEA; RGBEAC (jun. 2025), art. 44.º, n.º 3; SPEA, parecer Açores 2020 (84% da predação de cagarros por gatos); Projeto de alteração da Portaria 146/2017 (articulação com o ICNF)</w:t>
+              <w:t>SPEA; RGBEAC (jun. 2025), art. 44.º, n.º 3; SPEA, parecer Açores 2020 (84% da predação de cagarros por gatos); Trouwborst e Somsen, Journal of Environmental Law, 2020 (Diretivas Aves e Habitats); Galão e outros, Biological Conservation, 2025 (predação na Madeira); Loss, Will e Marra, Nature Communications, 2013; Projeto de alteração da Portaria 146/2017 (articulação com o ICNF)</w:t>
             </w:r>
           </w:p>
         </w:tc>
@@ -15541,6 +15541,302 @@
       <w:tr>
         <w:tc>
           <w:tcPr>
+            <w:tcW w:w="2835" w:type="dxa"/>
+          </w:tcPr>
+          <w:p>
+            <w:pPr>
+              <w:spacing w:after="60"/>
+            </w:pPr>
+            <w:r/>
+            <w:r>
+              <w:rPr>
+                <w:b w:val="0"/>
+                <w:sz w:val="20"/>
+              </w:rPr>
+              <w:t>Provedor de Justiça, Relatório à Assembleia da República 2023 (2024)</w:t>
+            </w:r>
+          </w:p>
+        </w:tc>
+        <w:tc>
+          <w:tcPr>
+            <w:tcW w:w="907" w:type="dxa"/>
+          </w:tcPr>
+          <w:p>
+            <w:pPr>
+              <w:spacing w:after="60"/>
+            </w:pPr>
+            <w:r/>
+            <w:r>
+              <w:rPr>
+                <w:b w:val="0"/>
+                <w:sz w:val="20"/>
+              </w:rPr>
+              <w:t>C</w:t>
+            </w:r>
+          </w:p>
+        </w:tc>
+        <w:tc>
+          <w:tcPr>
+            <w:tcW w:w="6860" w:type="dxa"/>
+          </w:tcPr>
+          <w:p>
+            <w:pPr>
+              <w:spacing w:after="60"/>
+            </w:pPr>
+            <w:r/>
+            <w:r>
+              <w:rPr>
+                <w:b w:val="0"/>
+                <w:sz w:val="20"/>
+              </w:rPr>
+              <w:t>Queixas sobre sobrelotação dos CRO, falta de recolha de matilhas e colónias de gatos. Muitas colónias são afinal CED autorizados, sem divulgação pública. Citação: «Em muitos casos verifica-se estarem afinal em causa planos de gestão devidamente autorizados pelos serviços veterinários municipais, o que levanta a questão da falta da sua divulgação pública.»</w:t>
+            </w:r>
+          </w:p>
+        </w:tc>
+        <w:tc>
+          <w:tcPr>
+            <w:tcW w:w="3969" w:type="dxa"/>
+          </w:tcPr>
+          <w:p>
+            <w:pPr>
+              <w:spacing w:after="60"/>
+            </w:pPr>
+            <w:r/>
+            <w:r>
+              <w:rPr>
+                <w:b w:val="0"/>
+                <w:sz w:val="20"/>
+              </w:rPr>
+              <w:t>https://www.provedor-jus.pt/documentos/Relatorio%202023.pdf</w:t>
+            </w:r>
+          </w:p>
+        </w:tc>
+      </w:tr>
+      <w:tr>
+        <w:tc>
+          <w:tcPr>
+            <w:tcW w:w="2835" w:type="dxa"/>
+          </w:tcPr>
+          <w:p>
+            <w:pPr>
+              <w:spacing w:after="60"/>
+            </w:pPr>
+            <w:r/>
+            <w:r>
+              <w:rPr>
+                <w:b w:val="0"/>
+                <w:sz w:val="20"/>
+              </w:rPr>
+              <w:t>Provedor de Justiça, Relatório à Assembleia da República 2020 (2021)</w:t>
+            </w:r>
+          </w:p>
+        </w:tc>
+        <w:tc>
+          <w:tcPr>
+            <w:tcW w:w="907" w:type="dxa"/>
+          </w:tcPr>
+          <w:p>
+            <w:pPr>
+              <w:spacing w:after="60"/>
+            </w:pPr>
+            <w:r/>
+            <w:r>
+              <w:rPr>
+                <w:b w:val="0"/>
+                <w:sz w:val="20"/>
+              </w:rPr>
+              <w:t>T e C</w:t>
+            </w:r>
+          </w:p>
+        </w:tc>
+        <w:tc>
+          <w:tcPr>
+            <w:tcW w:w="6860" w:type="dxa"/>
+          </w:tcPr>
+          <w:p>
+            <w:pPr>
+              <w:spacing w:after="60"/>
+            </w:pPr>
+            <w:r/>
+            <w:r>
+              <w:rPr>
+                <w:b w:val="0"/>
+                <w:sz w:val="20"/>
+              </w:rPr>
+              <w:t>Junta os errantes na via pública, o abandono e as campanhas da DGAV contra a alimentação de animais errantes. Citação: «a nossa preocupação tem a ver com a sobrepopulação, os animais errantes e o grave problema do abandono animal.»</w:t>
+            </w:r>
+          </w:p>
+        </w:tc>
+        <w:tc>
+          <w:tcPr>
+            <w:tcW w:w="3969" w:type="dxa"/>
+          </w:tcPr>
+          <w:p>
+            <w:pPr>
+              <w:spacing w:after="60"/>
+            </w:pPr>
+            <w:r/>
+            <w:r>
+              <w:rPr>
+                <w:b w:val="0"/>
+                <w:sz w:val="20"/>
+              </w:rPr>
+              <w:t>https://www.provedor-jus.pt/documentos/Relat2020%20_Relatorio.pdf</w:t>
+            </w:r>
+          </w:p>
+        </w:tc>
+      </w:tr>
+      <w:tr>
+        <w:tc>
+          <w:tcPr>
+            <w:tcW w:w="2835" w:type="dxa"/>
+          </w:tcPr>
+          <w:p>
+            <w:pPr>
+              <w:spacing w:after="60"/>
+            </w:pPr>
+            <w:r/>
+            <w:r>
+              <w:rPr>
+                <w:b w:val="0"/>
+                <w:sz w:val="20"/>
+              </w:rPr>
+              <w:t>Assembleia da República, nota técnica ao Projeto de Lei 88/XVI (animal comunitário) (31.5.2024)</w:t>
+            </w:r>
+          </w:p>
+        </w:tc>
+        <w:tc>
+          <w:tcPr>
+            <w:tcW w:w="907" w:type="dxa"/>
+          </w:tcPr>
+          <w:p>
+            <w:pPr>
+              <w:spacing w:after="60"/>
+            </w:pPr>
+            <w:r/>
+            <w:r>
+              <w:rPr>
+                <w:b w:val="0"/>
+                <w:sz w:val="20"/>
+              </w:rPr>
+              <w:t>C</w:t>
+            </w:r>
+          </w:p>
+        </w:tc>
+        <w:tc>
+          <w:tcPr>
+            <w:tcW w:w="6860" w:type="dxa"/>
+          </w:tcPr>
+          <w:p>
+            <w:pPr>
+              <w:spacing w:after="60"/>
+            </w:pPr>
+            <w:r/>
+            <w:r>
+              <w:rPr>
+                <w:b w:val="0"/>
+                <w:sz w:val="20"/>
+              </w:rPr>
+              <w:t>Enquadra a Lei 27/2016 e a Portaria 146/2017, lista as iniciativas anteriores e regista pareceres da ANAFRE e da ANMP. Citação: «Foram recebidos sobre o tema pareceres da Associação Nacional de Freguesias (ANAFRE) e da Associação Nacional de Municípios Portugueses (ANMP), disponíveis na página relativa a esta iniciativa.»</w:t>
+            </w:r>
+          </w:p>
+        </w:tc>
+        <w:tc>
+          <w:tcPr>
+            <w:tcW w:w="3969" w:type="dxa"/>
+          </w:tcPr>
+          <w:p>
+            <w:pPr>
+              <w:spacing w:after="60"/>
+            </w:pPr>
+            <w:r/>
+            <w:r>
+              <w:rPr>
+                <w:b w:val="0"/>
+                <w:sz w:val="20"/>
+              </w:rPr>
+              <w:t>parlamento.pt, página da iniciativa PJL 88/XVI</w:t>
+            </w:r>
+          </w:p>
+        </w:tc>
+      </w:tr>
+      <w:tr>
+        <w:tc>
+          <w:tcPr>
+            <w:tcW w:w="2835" w:type="dxa"/>
+          </w:tcPr>
+          <w:p>
+            <w:pPr>
+              <w:spacing w:after="60"/>
+            </w:pPr>
+            <w:r/>
+            <w:r>
+              <w:rPr>
+                <w:b w:val="0"/>
+                <w:sz w:val="20"/>
+              </w:rPr>
+              <w:t>ICNF, ENAE: famílias de acolhimento e cuidadores (2023)</w:t>
+            </w:r>
+          </w:p>
+        </w:tc>
+        <w:tc>
+          <w:tcPr>
+            <w:tcW w:w="907" w:type="dxa"/>
+          </w:tcPr>
+          <w:p>
+            <w:pPr>
+              <w:spacing w:after="60"/>
+            </w:pPr>
+            <w:r/>
+            <w:r>
+              <w:rPr>
+                <w:b w:val="0"/>
+                <w:sz w:val="20"/>
+              </w:rPr>
+              <w:t>T e C</w:t>
+            </w:r>
+          </w:p>
+        </w:tc>
+        <w:tc>
+          <w:tcPr>
+            <w:tcW w:w="6860" w:type="dxa"/>
+          </w:tcPr>
+          <w:p>
+            <w:pPr>
+              <w:spacing w:after="60"/>
+            </w:pPr>
+            <w:r/>
+            <w:r>
+              <w:rPr>
+                <w:b w:val="0"/>
+                <w:sz w:val="20"/>
+              </w:rPr>
+              <w:t>Reconhece que a família de acolhimento temporário e o estatuto de cuidador não estão regulados. Citação: «não se encontram regulados o conceito de “família de acolhimento temporário” de animais de companhia ou o estatuto de cuidador por forma a resultar clara a articulação entre estes e as entidades competentes.»</w:t>
+            </w:r>
+          </w:p>
+        </w:tc>
+        <w:tc>
+          <w:tcPr>
+            <w:tcW w:w="3969" w:type="dxa"/>
+          </w:tcPr>
+          <w:p>
+            <w:pPr>
+              <w:spacing w:after="60"/>
+            </w:pPr>
+            <w:r/>
+            <w:r>
+              <w:rPr>
+                <w:b w:val="0"/>
+                <w:sz w:val="20"/>
+              </w:rPr>
+              <w:t>https://www.icnf.pt/api/file/doc/41f8f44aee23be1a</w:t>
+            </w:r>
+          </w:p>
+        </w:tc>
+      </w:tr>
+      <w:tr>
+        <w:tc>
+          <w:tcPr>
             <w:tcW w:w="14570" w:type="dxa"/>
             <w:gridSpan w:val="4"/>
           </w:tcPr>
@@ -15710,6 +16006,228 @@
       <w:tr>
         <w:tc>
           <w:tcPr>
+            <w:tcW w:w="2835" w:type="dxa"/>
+          </w:tcPr>
+          <w:p>
+            <w:pPr>
+              <w:spacing w:after="60"/>
+            </w:pPr>
+            <w:r/>
+            <w:r>
+              <w:rPr>
+                <w:b w:val="0"/>
+                <w:sz w:val="20"/>
+              </w:rPr>
+              <w:t>Trouwborst e Somsen, Journal of Environmental Law 32(3) (2020)</w:t>
+            </w:r>
+          </w:p>
+        </w:tc>
+        <w:tc>
+          <w:tcPr>
+            <w:tcW w:w="907" w:type="dxa"/>
+          </w:tcPr>
+          <w:p>
+            <w:pPr>
+              <w:spacing w:after="60"/>
+            </w:pPr>
+            <w:r/>
+            <w:r>
+              <w:rPr>
+                <w:b w:val="0"/>
+                <w:sz w:val="20"/>
+              </w:rPr>
+              <w:t>C</w:t>
+            </w:r>
+          </w:p>
+        </w:tc>
+        <w:tc>
+          <w:tcPr>
+            <w:tcW w:w="6860" w:type="dxa"/>
+          </w:tcPr>
+          <w:p>
+            <w:pPr>
+              <w:spacing w:after="60"/>
+            </w:pPr>
+            <w:r/>
+            <w:r>
+              <w:rPr>
+                <w:b w:val="0"/>
+                <w:sz w:val="20"/>
+              </w:rPr>
+              <w:t>As Diretivas Aves e Habitats obrigam a controlar gatos sem dono que ameacem espécies ou sítios protegidos. Citação: «Regarding (unowned) stray and feral cats, these must be removed or controlled when they pose a threat to protected species and/or sites.» (Os gatos errantes e assilvestrados sem dono devem ser removidos ou controlados quando ameacem espécies ou sítios protegidos.)</w:t>
+            </w:r>
+          </w:p>
+        </w:tc>
+        <w:tc>
+          <w:tcPr>
+            <w:tcW w:w="3969" w:type="dxa"/>
+          </w:tcPr>
+          <w:p>
+            <w:pPr>
+              <w:spacing w:after="60"/>
+            </w:pPr>
+            <w:r/>
+            <w:r>
+              <w:rPr>
+                <w:b w:val="0"/>
+                <w:sz w:val="20"/>
+              </w:rPr>
+              <w:t>https://academic.oup.com/jel/article/32/3/391/5640440</w:t>
+            </w:r>
+          </w:p>
+        </w:tc>
+      </w:tr>
+      <w:tr>
+        <w:tc>
+          <w:tcPr>
+            <w:tcW w:w="2835" w:type="dxa"/>
+          </w:tcPr>
+          <w:p>
+            <w:pPr>
+              <w:spacing w:after="60"/>
+            </w:pPr>
+            <w:r/>
+            <w:r>
+              <w:rPr>
+                <w:b w:val="0"/>
+                <w:sz w:val="20"/>
+              </w:rPr>
+              <w:t>Galão e outros, Biological Conservation 305 (Madeira) (2025)</w:t>
+            </w:r>
+          </w:p>
+        </w:tc>
+        <w:tc>
+          <w:tcPr>
+            <w:tcW w:w="907" w:type="dxa"/>
+          </w:tcPr>
+          <w:p>
+            <w:pPr>
+              <w:spacing w:after="60"/>
+            </w:pPr>
+            <w:r/>
+            <w:r>
+              <w:rPr>
+                <w:b w:val="0"/>
+                <w:sz w:val="20"/>
+              </w:rPr>
+              <w:t>C</w:t>
+            </w:r>
+          </w:p>
+        </w:tc>
+        <w:tc>
+          <w:tcPr>
+            <w:tcW w:w="6860" w:type="dxa"/>
+          </w:tcPr>
+          <w:p>
+            <w:pPr>
+              <w:spacing w:after="60"/>
+            </w:pPr>
+            <w:r/>
+            <w:r>
+              <w:rPr>
+                <w:b w:val="0"/>
+                <w:sz w:val="20"/>
+              </w:rPr>
+              <w:t>Estudo na Madeira sobre a dieta de gatos em liberdade. Citação: «we found that cats consume over 20 distinct taxa from ten orders, including native and non-native prey, as well as taxa associated with anthropogenic food.» (Os gatos consomem mais de 20 taxa distintos de dez ordens, incluindo presas nativas e não nativas, e alimento de origem humana.)</w:t>
+            </w:r>
+          </w:p>
+        </w:tc>
+        <w:tc>
+          <w:tcPr>
+            <w:tcW w:w="3969" w:type="dxa"/>
+          </w:tcPr>
+          <w:p>
+            <w:pPr>
+              <w:spacing w:after="60"/>
+            </w:pPr>
+            <w:r/>
+            <w:r>
+              <w:rPr>
+                <w:b w:val="0"/>
+                <w:sz w:val="20"/>
+              </w:rPr>
+              <w:t>https://doi.org/10.1016/j.biocon.2025.111089</w:t>
+            </w:r>
+          </w:p>
+        </w:tc>
+      </w:tr>
+      <w:tr>
+        <w:tc>
+          <w:tcPr>
+            <w:tcW w:w="2835" w:type="dxa"/>
+          </w:tcPr>
+          <w:p>
+            <w:pPr>
+              <w:spacing w:after="60"/>
+            </w:pPr>
+            <w:r/>
+            <w:r>
+              <w:rPr>
+                <w:b w:val="0"/>
+                <w:sz w:val="20"/>
+              </w:rPr>
+              <w:t>Loss, Will e Marra, Nature Communications 4:1396 (2013)</w:t>
+            </w:r>
+          </w:p>
+        </w:tc>
+        <w:tc>
+          <w:tcPr>
+            <w:tcW w:w="907" w:type="dxa"/>
+          </w:tcPr>
+          <w:p>
+            <w:pPr>
+              <w:spacing w:after="60"/>
+            </w:pPr>
+            <w:r/>
+            <w:r>
+              <w:rPr>
+                <w:b w:val="0"/>
+                <w:sz w:val="20"/>
+              </w:rPr>
+              <w:t>C</w:t>
+            </w:r>
+          </w:p>
+        </w:tc>
+        <w:tc>
+          <w:tcPr>
+            <w:tcW w:w="6860" w:type="dxa"/>
+          </w:tcPr>
+          <w:p>
+            <w:pPr>
+              <w:spacing w:after="60"/>
+            </w:pPr>
+            <w:r/>
+            <w:r>
+              <w:rPr>
+                <w:b w:val="0"/>
+                <w:sz w:val="20"/>
+              </w:rPr>
+              <w:t>Nos EUA, os gatos sem dono causam a maior parte da mortalidade de fauna atribuída a gatos. Citação: «Un-owned cats, as opposed to owned pets, cause the majority of this mortality.» (São os gatos sem dono, e não os que têm dono, que causam a maior parte desta mortalidade.)</w:t>
+            </w:r>
+          </w:p>
+        </w:tc>
+        <w:tc>
+          <w:tcPr>
+            <w:tcW w:w="3969" w:type="dxa"/>
+          </w:tcPr>
+          <w:p>
+            <w:pPr>
+              <w:spacing w:after="60"/>
+            </w:pPr>
+            <w:r/>
+            <w:r>
+              <w:rPr>
+                <w:b w:val="0"/>
+                <w:sz w:val="20"/>
+              </w:rPr>
+              <w:t>https://www.nature.com/articles/ncomms2380</w:t>
+            </w:r>
+          </w:p>
+        </w:tc>
+      </w:tr>
+      <w:tr>
+        <w:tc>
+          <w:tcPr>
             <w:tcW w:w="14570" w:type="dxa"/>
             <w:gridSpan w:val="4"/>
           </w:tcPr>
@@ -15723,7 +16241,7 @@
                 <w:b/>
                 <w:sz w:val="20"/>
               </w:rPr>
-              <w:t>Juristas, academia e tribunais</w:t>
+              <w:t>Investigação científica</w:t>
             </w:r>
           </w:p>
         </w:tc>
@@ -15743,7 +16261,7 @@
                 <w:b w:val="0"/>
                 <w:sz w:val="20"/>
               </w:rPr>
-              <w:t>Teresa Quintela de Brito, «O abandono de animais de companhia», RJLB (2019)</w:t>
+              <w:t>Gunther e outros, PNAS (2022)</w:t>
             </w:r>
           </w:p>
         </w:tc>
@@ -15761,7 +16279,7 @@
                 <w:b w:val="0"/>
                 <w:sz w:val="20"/>
               </w:rPr>
-              <w:t>T</w:t>
+              <w:t>C</w:t>
             </w:r>
           </w:p>
         </w:tc>
@@ -15779,7 +16297,7 @@
                 <w:b w:val="0"/>
                 <w:sz w:val="20"/>
               </w:rPr>
-              <w:t>O crime de abandono só pode ser cometido por quem já tem o dever de guardar, vigiar ou assistir o animal. Citação: «Não é possível a imputação de responsabilidade por estes crimes a associações ou sociedades zoófilas ou a quaisquer outras pessoas colectivas».</w:t>
+              <w:t>Estudo em Israel, à escala de uma cidade: o CED só reduz a população com esterilização intensa, contínua e em áreas contíguas. Citação: «We conclude that cat population management by TNR should be performed with high intensity, continuously, and in geographic contiguity to enable population reduction.» (Concluímos que a gestão da população de gatos por CED deve ser feita com alta intensidade, de forma contínua e em contiguidade geográfica, para permitir a redução da população.)</w:t>
             </w:r>
           </w:p>
         </w:tc>
@@ -15797,7 +16315,7 @@
                 <w:b w:val="0"/>
                 <w:sz w:val="20"/>
               </w:rPr>
-              <w:t>https://www.cidp.pt/revistas/rjlb/2019/2/2019_02_0077_0095.pdf</w:t>
+              <w:t>https://pmc.ncbi.nlm.nih.gov/articles/PMC9169806/</w:t>
             </w:r>
           </w:p>
         </w:tc>
@@ -15817,7 +16335,7 @@
                 <w:b w:val="0"/>
                 <w:sz w:val="20"/>
               </w:rPr>
-              <w:t>Tribunal da Relação de Coimbra, proc. 281/10.1TBCV.C1 (11.7.2012)</w:t>
+              <w:t>Boone e outros, Frontiers in Veterinary Science 6:238 (2019)</w:t>
             </w:r>
           </w:p>
         </w:tc>
@@ -15835,7 +16353,7 @@
                 <w:b w:val="0"/>
                 <w:sz w:val="20"/>
               </w:rPr>
-              <w:t>T</w:t>
+              <w:t>C</w:t>
             </w:r>
           </w:p>
         </w:tc>
@@ -15853,7 +16371,7 @@
                 <w:b w:val="0"/>
                 <w:sz w:val="20"/>
               </w:rPr>
-              <w:t>O dever de vigilância do art. 493.º, n.º 1 do Código Civil decorre do poder de facto sobre o animal e não tem de recair sobre o dono.</w:t>
+              <w:t>Com baixa intensidade, as vantagens do CED desaparecem. Citação: «With sufficient intensity, management by TNR offers significant advantages in terms of combined lifesaving and population size reduction. At lower intensity levels, these advantages are greatly reduced or eliminated.» (Com intensidade suficiente, o CED traz vantagens claras em vidas salvas e redução da população. Com intensidade mais baixa, essas vantagens ficam muito reduzidas ou desaparecem.)</w:t>
             </w:r>
           </w:p>
         </w:tc>
@@ -15871,7 +16389,7 @@
                 <w:b w:val="0"/>
                 <w:sz w:val="20"/>
               </w:rPr>
-              <w:t>https://trc.pt/responsabilidade-civil-danos-causados-por-animais-dever-de-vigilancia/</w:t>
+              <w:t>https://www.frontiersin.org/journals/veterinary-science/articles/10.3389/fvets.2019.00238/full</w:t>
             </w:r>
           </w:p>
         </w:tc>
@@ -15891,7 +16409,7 @@
                 <w:b w:val="0"/>
                 <w:sz w:val="20"/>
               </w:rPr>
-              <w:t>Tribunal da Relação de Lisboa, proc. 1642/24.4T8AMD.L1-8 (30.4.2025)</w:t>
+              <w:t>Foley e outros, JAVMA 227(11) (2005)</w:t>
             </w:r>
           </w:p>
         </w:tc>
@@ -15909,7 +16427,7 @@
                 <w:b w:val="0"/>
                 <w:sz w:val="20"/>
               </w:rPr>
-              <w:t>T</w:t>
+              <w:t>C</w:t>
             </w:r>
           </w:p>
         </w:tc>
@@ -15927,7 +16445,7 @@
                 <w:b w:val="0"/>
                 <w:sz w:val="20"/>
               </w:rPr>
-              <w:t>O registo no SIAC pode relevar para presumir a propriedade, mas não afasta a prova da posse. O tribunal revogou uma decisão que se apoiava só no registo.</w:t>
+              <w:t>Em dois condados dos EUA, os programas CED não mostraram redução consistente do crescimento da população. Citação: «In both counties, results of analyses did not indicate a consistent reduction in per capita growth, the population multiplier, or the proportion of female cats that were pregnant.» (Em ambos os condados, as análises não mostraram redução consistente do crescimento per capita, do multiplicador populacional nem da proporção de gatas gestantes.)</w:t>
             </w:r>
           </w:p>
         </w:tc>
@@ -15945,7 +16463,7 @@
                 <w:b w:val="0"/>
                 <w:sz w:val="20"/>
               </w:rPr>
-              <w:t>https://www.dgsi.pt/jtrl.nsf/33182fc732316039802565fa00497eec/7462ba7a0546bac680258c8b0049a31e?OpenDocument</w:t>
+              <w:t>https://doi.org/10.2460/javma.2005.227.1775</w:t>
             </w:r>
           </w:p>
         </w:tc>
@@ -15965,7 +16483,7 @@
                 <w:b w:val="0"/>
                 <w:sz w:val="20"/>
               </w:rPr>
-              <w:t>Tribunal Constitucional, Acórdãos 70/2024 e 478/2024 (2024)</w:t>
+              <w:t>Spehar e Wolf, Frontiers in Veterinary Science 6:77 (2019)</w:t>
             </w:r>
           </w:p>
         </w:tc>
@@ -15983,7 +16501,7 @@
                 <w:b w:val="0"/>
                 <w:sz w:val="20"/>
               </w:rPr>
-              <w:t>T</w:t>
+              <w:t>C</w:t>
             </w:r>
           </w:p>
         </w:tc>
@@ -16001,7 +16519,7 @@
                 <w:b w:val="0"/>
                 <w:sz w:val="20"/>
               </w:rPr>
-              <w:t>Não julgam inconstitucionais os arts. 387.º e 388.º do Código Penal (maus-tratos e abandono), invertendo a jurisprudência anterior.</w:t>
+              <w:t>CED dirigido e devolução ao local reduziram as entradas de gatos e a eutanásia em seis abrigos municipais. Citação: «A median reduction of 32% in feline intake, as well as a median decline of 83% in feline euthanasia occurred across the six CCPs» (Redução mediana de 32% nas entradas de gatos e de 83% na eutanásia de gatos nos seis programas.)</w:t>
             </w:r>
           </w:p>
         </w:tc>
@@ -16019,7 +16537,7 @@
                 <w:b w:val="0"/>
                 <w:sz w:val="20"/>
               </w:rPr>
-              <w:t>https://www.tribunalconstitucional.pt/tc/acordaos/20240070.html</w:t>
+              <w:t>https://www.frontiersin.org/journals/veterinary-science/articles/10.3389/fvets.2019.00077/full</w:t>
             </w:r>
           </w:p>
         </w:tc>
@@ -16027,6 +16545,80 @@
       <w:tr>
         <w:tc>
           <w:tcPr>
+            <w:tcW w:w="2835" w:type="dxa"/>
+          </w:tcPr>
+          <w:p>
+            <w:pPr>
+              <w:spacing w:after="60"/>
+            </w:pPr>
+            <w:r/>
+            <w:r>
+              <w:rPr>
+                <w:b w:val="0"/>
+                <w:sz w:val="20"/>
+              </w:rPr>
+              <w:t>Azevedo e outros, Animals 15(6):771 (inquérito em Portugal) (2025)</w:t>
+            </w:r>
+          </w:p>
+        </w:tc>
+        <w:tc>
+          <w:tcPr>
+            <w:tcW w:w="907" w:type="dxa"/>
+          </w:tcPr>
+          <w:p>
+            <w:pPr>
+              <w:spacing w:after="60"/>
+            </w:pPr>
+            <w:r/>
+            <w:r>
+              <w:rPr>
+                <w:b w:val="0"/>
+                <w:sz w:val="20"/>
+              </w:rPr>
+              <w:t>C e T</w:t>
+            </w:r>
+          </w:p>
+        </w:tc>
+        <w:tc>
+          <w:tcPr>
+            <w:tcW w:w="6860" w:type="dxa"/>
+          </w:tcPr>
+          <w:p>
+            <w:pPr>
+              <w:spacing w:after="60"/>
+            </w:pPr>
+            <w:r/>
+            <w:r>
+              <w:rPr>
+                <w:b w:val="0"/>
+                <w:sz w:val="20"/>
+              </w:rPr>
+              <w:t>Inquérito com 1083 respostas em Portugal. Citação: «we found strong support for trap-neuter-release, sheltering, sanctions on abandonment, and educational campaigns.» (Encontrámos forte apoio ao CED, ao alojamento em abrigos, a sanções pelo abandono e a campanhas educativas.)</w:t>
+            </w:r>
+          </w:p>
+        </w:tc>
+        <w:tc>
+          <w:tcPr>
+            <w:tcW w:w="3969" w:type="dxa"/>
+          </w:tcPr>
+          <w:p>
+            <w:pPr>
+              <w:spacing w:after="60"/>
+            </w:pPr>
+            <w:r/>
+            <w:r>
+              <w:rPr>
+                <w:b w:val="0"/>
+                <w:sz w:val="20"/>
+              </w:rPr>
+              <w:t>https://www.ncbi.nlm.nih.gov/pmc/articles/PMC11939513/</w:t>
+            </w:r>
+          </w:p>
+        </w:tc>
+      </w:tr>
+      <w:tr>
+        <w:tc>
+          <w:tcPr>
             <w:tcW w:w="14570" w:type="dxa"/>
             <w:gridSpan w:val="4"/>
           </w:tcPr>
@@ -16040,7 +16632,7 @@
                 <w:b/>
                 <w:sz w:val="20"/>
               </w:rPr>
-              <w:t>Municípios e ANMP</w:t>
+              <w:t>Juristas, academia e tribunais</w:t>
             </w:r>
           </w:p>
         </w:tc>
@@ -16060,7 +16652,7 @@
                 <w:b w:val="0"/>
                 <w:sz w:val="20"/>
               </w:rPr>
-              <w:t>Regulamentos municipais (Lisboa, Porto, Oeiras, Cascais, Sintra, Leiria, entre outros) (vários)</w:t>
+              <w:t>Teresa Quintela de Brito, «O abandono de animais de companhia», RJLB (2019)</w:t>
             </w:r>
           </w:p>
         </w:tc>
@@ -16078,7 +16670,7 @@
                 <w:b w:val="0"/>
                 <w:sz w:val="20"/>
               </w:rPr>
-              <w:t>C</w:t>
+              <w:t>T</w:t>
             </w:r>
           </w:p>
         </w:tc>
@@ -16096,7 +16688,7 @@
                 <w:b w:val="0"/>
                 <w:sz w:val="20"/>
               </w:rPr>
-              <w:t>Proíbem alimentar animais na via pública, com coimas que em Oeiras chegam a 8 000 euros. Em regra excecionam os cuidadores registados.</w:t>
+              <w:t>O crime de abandono só pode ser cometido por quem já tem o dever de guardar, vigiar ou assistir o animal. Citação: «Não é possível a imputação de responsabilidade por estes crimes a associações ou sociedades zoófilas ou a quaisquer outras pessoas colectivas».</w:t>
             </w:r>
           </w:p>
         </w:tc>
@@ -16114,7 +16706,7 @@
                 <w:b w:val="0"/>
                 <w:sz w:val="20"/>
               </w:rPr>
-              <w:t>https://www.oeiras.pt/-/alimentacao-animais-via-publica</w:t>
+              <w:t>https://www.cidp.pt/revistas/rjlb/2019/2/2019_02_0077_0095.pdf</w:t>
             </w:r>
           </w:p>
         </w:tc>
@@ -16122,6 +16714,672 @@
       <w:tr>
         <w:tc>
           <w:tcPr>
+            <w:tcW w:w="2835" w:type="dxa"/>
+          </w:tcPr>
+          <w:p>
+            <w:pPr>
+              <w:spacing w:after="60"/>
+            </w:pPr>
+            <w:r/>
+            <w:r>
+              <w:rPr>
+                <w:b w:val="0"/>
+                <w:sz w:val="20"/>
+              </w:rPr>
+              <w:t>Tribunal da Relação de Coimbra, proc. 281/10.1TBCV.C1 (11.7.2012)</w:t>
+            </w:r>
+          </w:p>
+        </w:tc>
+        <w:tc>
+          <w:tcPr>
+            <w:tcW w:w="907" w:type="dxa"/>
+          </w:tcPr>
+          <w:p>
+            <w:pPr>
+              <w:spacing w:after="60"/>
+            </w:pPr>
+            <w:r/>
+            <w:r>
+              <w:rPr>
+                <w:b w:val="0"/>
+                <w:sz w:val="20"/>
+              </w:rPr>
+              <w:t>T</w:t>
+            </w:r>
+          </w:p>
+        </w:tc>
+        <w:tc>
+          <w:tcPr>
+            <w:tcW w:w="6860" w:type="dxa"/>
+          </w:tcPr>
+          <w:p>
+            <w:pPr>
+              <w:spacing w:after="60"/>
+            </w:pPr>
+            <w:r/>
+            <w:r>
+              <w:rPr>
+                <w:b w:val="0"/>
+                <w:sz w:val="20"/>
+              </w:rPr>
+              <w:t>O dever de vigilância do art. 493.º, n.º 1 do Código Civil decorre do poder de facto sobre o animal e não tem de recair sobre o dono.</w:t>
+            </w:r>
+          </w:p>
+        </w:tc>
+        <w:tc>
+          <w:tcPr>
+            <w:tcW w:w="3969" w:type="dxa"/>
+          </w:tcPr>
+          <w:p>
+            <w:pPr>
+              <w:spacing w:after="60"/>
+            </w:pPr>
+            <w:r/>
+            <w:r>
+              <w:rPr>
+                <w:b w:val="0"/>
+                <w:sz w:val="20"/>
+              </w:rPr>
+              <w:t>https://trc.pt/responsabilidade-civil-danos-causados-por-animais-dever-de-vigilancia/</w:t>
+            </w:r>
+          </w:p>
+        </w:tc>
+      </w:tr>
+      <w:tr>
+        <w:tc>
+          <w:tcPr>
+            <w:tcW w:w="2835" w:type="dxa"/>
+          </w:tcPr>
+          <w:p>
+            <w:pPr>
+              <w:spacing w:after="60"/>
+            </w:pPr>
+            <w:r/>
+            <w:r>
+              <w:rPr>
+                <w:b w:val="0"/>
+                <w:sz w:val="20"/>
+              </w:rPr>
+              <w:t>Tribunal da Relação de Lisboa, proc. 1642/24.4T8AMD.L1-8 (30.4.2025)</w:t>
+            </w:r>
+          </w:p>
+        </w:tc>
+        <w:tc>
+          <w:tcPr>
+            <w:tcW w:w="907" w:type="dxa"/>
+          </w:tcPr>
+          <w:p>
+            <w:pPr>
+              <w:spacing w:after="60"/>
+            </w:pPr>
+            <w:r/>
+            <w:r>
+              <w:rPr>
+                <w:b w:val="0"/>
+                <w:sz w:val="20"/>
+              </w:rPr>
+              <w:t>T</w:t>
+            </w:r>
+          </w:p>
+        </w:tc>
+        <w:tc>
+          <w:tcPr>
+            <w:tcW w:w="6860" w:type="dxa"/>
+          </w:tcPr>
+          <w:p>
+            <w:pPr>
+              <w:spacing w:after="60"/>
+            </w:pPr>
+            <w:r/>
+            <w:r>
+              <w:rPr>
+                <w:b w:val="0"/>
+                <w:sz w:val="20"/>
+              </w:rPr>
+              <w:t>O registo no SIAC pode relevar para presumir a propriedade, mas não afasta a prova da posse. O tribunal revogou uma decisão que se apoiava só no registo.</w:t>
+            </w:r>
+          </w:p>
+        </w:tc>
+        <w:tc>
+          <w:tcPr>
+            <w:tcW w:w="3969" w:type="dxa"/>
+          </w:tcPr>
+          <w:p>
+            <w:pPr>
+              <w:spacing w:after="60"/>
+            </w:pPr>
+            <w:r/>
+            <w:r>
+              <w:rPr>
+                <w:b w:val="0"/>
+                <w:sz w:val="20"/>
+              </w:rPr>
+              <w:t>https://www.dgsi.pt/jtrl.nsf/33182fc732316039802565fa00497eec/7462ba7a0546bac680258c8b0049a31e?OpenDocument</w:t>
+            </w:r>
+          </w:p>
+        </w:tc>
+      </w:tr>
+      <w:tr>
+        <w:tc>
+          <w:tcPr>
+            <w:tcW w:w="2835" w:type="dxa"/>
+          </w:tcPr>
+          <w:p>
+            <w:pPr>
+              <w:spacing w:after="60"/>
+            </w:pPr>
+            <w:r/>
+            <w:r>
+              <w:rPr>
+                <w:b w:val="0"/>
+                <w:sz w:val="20"/>
+              </w:rPr>
+              <w:t>Tribunal Constitucional, Acórdãos 70/2024 e 478/2024 (2024)</w:t>
+            </w:r>
+          </w:p>
+        </w:tc>
+        <w:tc>
+          <w:tcPr>
+            <w:tcW w:w="907" w:type="dxa"/>
+          </w:tcPr>
+          <w:p>
+            <w:pPr>
+              <w:spacing w:after="60"/>
+            </w:pPr>
+            <w:r/>
+            <w:r>
+              <w:rPr>
+                <w:b w:val="0"/>
+                <w:sz w:val="20"/>
+              </w:rPr>
+              <w:t>T</w:t>
+            </w:r>
+          </w:p>
+        </w:tc>
+        <w:tc>
+          <w:tcPr>
+            <w:tcW w:w="6860" w:type="dxa"/>
+          </w:tcPr>
+          <w:p>
+            <w:pPr>
+              <w:spacing w:after="60"/>
+            </w:pPr>
+            <w:r/>
+            <w:r>
+              <w:rPr>
+                <w:b w:val="0"/>
+                <w:sz w:val="20"/>
+              </w:rPr>
+              <w:t>Não julgam inconstitucionais os arts. 387.º e 388.º do Código Penal (maus-tratos e abandono), invertendo a jurisprudência anterior.</w:t>
+            </w:r>
+          </w:p>
+        </w:tc>
+        <w:tc>
+          <w:tcPr>
+            <w:tcW w:w="3969" w:type="dxa"/>
+          </w:tcPr>
+          <w:p>
+            <w:pPr>
+              <w:spacing w:after="60"/>
+            </w:pPr>
+            <w:r/>
+            <w:r>
+              <w:rPr>
+                <w:b w:val="0"/>
+                <w:sz w:val="20"/>
+              </w:rPr>
+              <w:t>https://www.tribunalconstitucional.pt/tc/acordaos/20240070.html</w:t>
+            </w:r>
+          </w:p>
+        </w:tc>
+      </w:tr>
+      <w:tr>
+        <w:tc>
+          <w:tcPr>
+            <w:tcW w:w="2835" w:type="dxa"/>
+          </w:tcPr>
+          <w:p>
+            <w:pPr>
+              <w:spacing w:after="60"/>
+            </w:pPr>
+            <w:r/>
+            <w:r>
+              <w:rPr>
+                <w:b w:val="0"/>
+                <w:sz w:val="20"/>
+              </w:rPr>
+              <w:t>Raúl Farias, em «Direito dos animais», e-book do CEJ (2022)</w:t>
+            </w:r>
+          </w:p>
+        </w:tc>
+        <w:tc>
+          <w:tcPr>
+            <w:tcW w:w="907" w:type="dxa"/>
+          </w:tcPr>
+          <w:p>
+            <w:pPr>
+              <w:spacing w:after="60"/>
+            </w:pPr>
+            <w:r/>
+            <w:r>
+              <w:rPr>
+                <w:b w:val="0"/>
+                <w:sz w:val="20"/>
+              </w:rPr>
+              <w:t>T</w:t>
+            </w:r>
+          </w:p>
+        </w:tc>
+        <w:tc>
+          <w:tcPr>
+            <w:tcW w:w="6860" w:type="dxa"/>
+          </w:tcPr>
+          <w:p>
+            <w:pPr>
+              <w:spacing w:after="60"/>
+            </w:pPr>
+            <w:r/>
+            <w:r>
+              <w:rPr>
+                <w:b w:val="0"/>
+                <w:sz w:val="20"/>
+              </w:rPr>
+              <w:t>O crime de abandono atinge quem detém o animal. As associações, como pessoas coletivas, não respondem criminalmente. Citações: «O agente do crime poderá ser todo aquele que tem o dever de guardar, vigiar ou assistir animal de companhia, o que coloca a esfera de punição normativa ao nível da detenção do animal.» «as pessoas coletivas não podem ser responsabilizadas criminalmente pela prática deste tipo de crime (art.º 11.º do Código Penal), o que afasta de imediato a imputação criminal de associações ou sociedades zoófilas […]»</w:t>
+            </w:r>
+          </w:p>
+        </w:tc>
+        <w:tc>
+          <w:tcPr>
+            <w:tcW w:w="3969" w:type="dxa"/>
+          </w:tcPr>
+          <w:p>
+            <w:pPr>
+              <w:spacing w:after="60"/>
+            </w:pPr>
+            <w:r/>
+            <w:r>
+              <w:rPr>
+                <w:b w:val="0"/>
+                <w:sz w:val="20"/>
+              </w:rPr>
+              <w:t>https://cej.justica.gov.pt/LinkClick.aspx?fileticket=VpuQj7jZ-us%3D&amp;portalid=30</w:t>
+            </w:r>
+          </w:p>
+        </w:tc>
+      </w:tr>
+      <w:tr>
+        <w:tc>
+          <w:tcPr>
+            <w:tcW w:w="2835" w:type="dxa"/>
+          </w:tcPr>
+          <w:p>
+            <w:pPr>
+              <w:spacing w:after="60"/>
+            </w:pPr>
+            <w:r/>
+            <w:r>
+              <w:rPr>
+                <w:b w:val="0"/>
+                <w:sz w:val="20"/>
+              </w:rPr>
+              <w:t>Cátia Simões (médica veterinária municipal), «O papel dos municípios na gestão do bem-estar animal», RJLB (2019)</w:t>
+            </w:r>
+          </w:p>
+        </w:tc>
+        <w:tc>
+          <w:tcPr>
+            <w:tcW w:w="907" w:type="dxa"/>
+          </w:tcPr>
+          <w:p>
+            <w:pPr>
+              <w:spacing w:after="60"/>
+            </w:pPr>
+            <w:r/>
+            <w:r>
+              <w:rPr>
+                <w:b w:val="0"/>
+                <w:sz w:val="20"/>
+              </w:rPr>
+              <w:t>T e C</w:t>
+            </w:r>
+          </w:p>
+        </w:tc>
+        <w:tc>
+          <w:tcPr>
+            <w:tcW w:w="6860" w:type="dxa"/>
+          </w:tcPr>
+          <w:p>
+            <w:pPr>
+              <w:spacing w:after="60"/>
+            </w:pPr>
+            <w:r/>
+            <w:r>
+              <w:rPr>
+                <w:b w:val="0"/>
+                <w:sz w:val="20"/>
+              </w:rPr>
+              <w:t>O abandono é difícil de provar e há situações que escapam à definição, como o animal não recolhido de um hotel ou de um CAMV e o depósito não consentido no CRO. Citação: «o abandono é uma ação difícil de comprovar, da qual até os infratores detetados em flagrante muitas vezes se conseguem escusar, esquivando-se assim ao pagamento da coima correspondente»</w:t>
+            </w:r>
+          </w:p>
+        </w:tc>
+        <w:tc>
+          <w:tcPr>
+            <w:tcW w:w="3969" w:type="dxa"/>
+          </w:tcPr>
+          <w:p>
+            <w:pPr>
+              <w:spacing w:after="60"/>
+            </w:pPr>
+            <w:r/>
+            <w:r>
+              <w:rPr>
+                <w:b w:val="0"/>
+                <w:sz w:val="20"/>
+              </w:rPr>
+              <w:t>https://www.cidp.pt/revistas/rjlb/2019/2/2019_02_0305_0348.pdf</w:t>
+            </w:r>
+          </w:p>
+        </w:tc>
+      </w:tr>
+      <w:tr>
+        <w:tc>
+          <w:tcPr>
+            <w:tcW w:w="2835" w:type="dxa"/>
+          </w:tcPr>
+          <w:p>
+            <w:pPr>
+              <w:spacing w:after="60"/>
+            </w:pPr>
+            <w:r/>
+            <w:r>
+              <w:rPr>
+                <w:b w:val="0"/>
+                <w:sz w:val="20"/>
+              </w:rPr>
+              <w:t>Tribunal da Relação de Lisboa, proc. 3121/03.4TBCSC.L1-6 (24.11.2009)</w:t>
+            </w:r>
+          </w:p>
+        </w:tc>
+        <w:tc>
+          <w:tcPr>
+            <w:tcW w:w="907" w:type="dxa"/>
+          </w:tcPr>
+          <w:p>
+            <w:pPr>
+              <w:spacing w:after="60"/>
+            </w:pPr>
+            <w:r/>
+            <w:r>
+              <w:rPr>
+                <w:b w:val="0"/>
+                <w:sz w:val="20"/>
+              </w:rPr>
+              <w:t>T</w:t>
+            </w:r>
+          </w:p>
+        </w:tc>
+        <w:tc>
+          <w:tcPr>
+            <w:tcW w:w="6860" w:type="dxa"/>
+          </w:tcPr>
+          <w:p>
+            <w:pPr>
+              <w:spacing w:after="60"/>
+            </w:pPr>
+            <w:r/>
+            <w:r>
+              <w:rPr>
+                <w:b w:val="0"/>
+                <w:sz w:val="20"/>
+              </w:rPr>
+              <w:t>O detentor tem um âmbito mais largo do que o proprietário. Citação do sumário: «a responsabilidade pelo risco recai sobre quem tiver a qualidade de “detentor do animal”, figura com um âmbito mais abrangente que a de “proprietário”; - “detentor” do animal é aquele em cuja casa o animal é albergado, não transitoriamente mas com um certo tempo de duração»</w:t>
+            </w:r>
+          </w:p>
+        </w:tc>
+        <w:tc>
+          <w:tcPr>
+            <w:tcW w:w="3969" w:type="dxa"/>
+          </w:tcPr>
+          <w:p>
+            <w:pPr>
+              <w:spacing w:after="60"/>
+            </w:pPr>
+            <w:r/>
+            <w:r>
+              <w:rPr>
+                <w:b w:val="0"/>
+                <w:sz w:val="20"/>
+              </w:rPr>
+              <w:t>https://jurisprudencia.pt/acordao/76412/</w:t>
+            </w:r>
+          </w:p>
+        </w:tc>
+      </w:tr>
+      <w:tr>
+        <w:tc>
+          <w:tcPr>
+            <w:tcW w:w="2835" w:type="dxa"/>
+          </w:tcPr>
+          <w:p>
+            <w:pPr>
+              <w:spacing w:after="60"/>
+            </w:pPr>
+            <w:r/>
+            <w:r>
+              <w:rPr>
+                <w:b w:val="0"/>
+                <w:sz w:val="20"/>
+              </w:rPr>
+              <w:t>Supremo Tribunal de Justiça, proc. 478/05.6TBMGL.C1.S1 (14.11.2013)</w:t>
+            </w:r>
+          </w:p>
+        </w:tc>
+        <w:tc>
+          <w:tcPr>
+            <w:tcW w:w="907" w:type="dxa"/>
+          </w:tcPr>
+          <w:p>
+            <w:pPr>
+              <w:spacing w:after="60"/>
+            </w:pPr>
+            <w:r/>
+            <w:r>
+              <w:rPr>
+                <w:b w:val="0"/>
+                <w:sz w:val="20"/>
+              </w:rPr>
+              <w:t>T</w:t>
+            </w:r>
+          </w:p>
+        </w:tc>
+        <w:tc>
+          <w:tcPr>
+            <w:tcW w:w="6860" w:type="dxa"/>
+          </w:tcPr>
+          <w:p>
+            <w:pPr>
+              <w:spacing w:after="60"/>
+            </w:pPr>
+            <w:r/>
+            <w:r>
+              <w:rPr>
+                <w:b w:val="0"/>
+                <w:sz w:val="20"/>
+              </w:rPr>
+              <w:t>Articula os arts. 493.º e 502.º do Código Civil: as duas responsabilidades podem coexistir. Citação do sumário: «O art. 493.º do CC tem em vista os animais que, por sua natureza, estão sujeitos à guarda e vigilância dos respectivos donos (ou de outrem sobre quem recaia tal obrigação).»</w:t>
+            </w:r>
+          </w:p>
+        </w:tc>
+        <w:tc>
+          <w:tcPr>
+            <w:tcW w:w="3969" w:type="dxa"/>
+          </w:tcPr>
+          <w:p>
+            <w:pPr>
+              <w:spacing w:after="60"/>
+            </w:pPr>
+            <w:r/>
+            <w:r>
+              <w:rPr>
+                <w:b w:val="0"/>
+                <w:sz w:val="20"/>
+              </w:rPr>
+              <w:t>https://jurisprudencia.pt/acordao/128487/</w:t>
+            </w:r>
+          </w:p>
+        </w:tc>
+      </w:tr>
+      <w:tr>
+        <w:tc>
+          <w:tcPr>
+            <w:tcW w:w="2835" w:type="dxa"/>
+          </w:tcPr>
+          <w:p>
+            <w:pPr>
+              <w:spacing w:after="60"/>
+            </w:pPr>
+            <w:r/>
+            <w:r>
+              <w:rPr>
+                <w:b w:val="0"/>
+                <w:sz w:val="20"/>
+              </w:rPr>
+              <w:t>Tribunal da Relação de Coimbra, proc. 6/22.9GCPBL.C1 (7.2.2024)</w:t>
+            </w:r>
+          </w:p>
+        </w:tc>
+        <w:tc>
+          <w:tcPr>
+            <w:tcW w:w="907" w:type="dxa"/>
+          </w:tcPr>
+          <w:p>
+            <w:pPr>
+              <w:spacing w:after="60"/>
+            </w:pPr>
+            <w:r/>
+            <w:r>
+              <w:rPr>
+                <w:b w:val="0"/>
+                <w:sz w:val="20"/>
+              </w:rPr>
+              <w:t>T</w:t>
+            </w:r>
+          </w:p>
+        </w:tc>
+        <w:tc>
+          <w:tcPr>
+            <w:tcW w:w="6860" w:type="dxa"/>
+          </w:tcPr>
+          <w:p>
+            <w:pPr>
+              <w:spacing w:after="60"/>
+            </w:pPr>
+            <w:r/>
+            <w:r>
+              <w:rPr>
+                <w:b w:val="0"/>
+                <w:sz w:val="20"/>
+              </w:rPr>
+              <w:t>O dever de vigilância cabe ao detentor. Citação do sumário: «Impende sobre o detentor de canídeo não classificado como perigoso o dever de o vigiar e assim evitar que ponha em risco a vida ou integridade física de outras pessoas ou animais.»</w:t>
+            </w:r>
+          </w:p>
+        </w:tc>
+        <w:tc>
+          <w:tcPr>
+            <w:tcW w:w="3969" w:type="dxa"/>
+          </w:tcPr>
+          <w:p>
+            <w:pPr>
+              <w:spacing w:after="60"/>
+            </w:pPr>
+            <w:r/>
+            <w:r>
+              <w:rPr>
+                <w:b w:val="0"/>
+                <w:sz w:val="20"/>
+              </w:rPr>
+              <w:t>https://jurisprudencia.pt/acordao/221373/</w:t>
+            </w:r>
+          </w:p>
+        </w:tc>
+      </w:tr>
+      <w:tr>
+        <w:tc>
+          <w:tcPr>
+            <w:tcW w:w="2835" w:type="dxa"/>
+          </w:tcPr>
+          <w:p>
+            <w:pPr>
+              <w:spacing w:after="60"/>
+            </w:pPr>
+            <w:r/>
+            <w:r>
+              <w:rPr>
+                <w:b w:val="0"/>
+                <w:sz w:val="20"/>
+              </w:rPr>
+              <w:t>Tribunal Constitucional, Acórdão 867/2021 (10.11.2021)</w:t>
+            </w:r>
+          </w:p>
+        </w:tc>
+        <w:tc>
+          <w:tcPr>
+            <w:tcW w:w="907" w:type="dxa"/>
+          </w:tcPr>
+          <w:p>
+            <w:pPr>
+              <w:spacing w:after="60"/>
+            </w:pPr>
+            <w:r/>
+            <w:r>
+              <w:rPr>
+                <w:b w:val="0"/>
+                <w:sz w:val="20"/>
+              </w:rPr>
+              <w:t>T</w:t>
+            </w:r>
+          </w:p>
+        </w:tc>
+        <w:tc>
+          <w:tcPr>
+            <w:tcW w:w="6860" w:type="dxa"/>
+          </w:tcPr>
+          <w:p>
+            <w:pPr>
+              <w:spacing w:after="60"/>
+            </w:pPr>
+            <w:r/>
+            <w:r>
+              <w:rPr>
+                <w:b w:val="0"/>
+                <w:sz w:val="20"/>
+              </w:rPr>
+              <w:t>Julgou inconstitucional o art. 387.º do Código Penal. É a decisão que os Acórdãos 70/2024 e 478/2024 vieram contrariar.</w:t>
+            </w:r>
+          </w:p>
+        </w:tc>
+        <w:tc>
+          <w:tcPr>
+            <w:tcW w:w="3969" w:type="dxa"/>
+          </w:tcPr>
+          <w:p>
+            <w:pPr>
+              <w:spacing w:after="60"/>
+            </w:pPr>
+            <w:r/>
+            <w:r>
+              <w:rPr>
+                <w:b w:val="0"/>
+                <w:sz w:val="20"/>
+              </w:rPr>
+              <w:t>https://www.tribunalconstitucional.pt/tc/acordaos/20210867.html</w:t>
+            </w:r>
+          </w:p>
+        </w:tc>
+      </w:tr>
+      <w:tr>
+        <w:tc>
+          <w:tcPr>
             <w:tcW w:w="14570" w:type="dxa"/>
             <w:gridSpan w:val="4"/>
           </w:tcPr>
@@ -16135,7 +17393,7 @@
                 <w:b/>
                 <w:sz w:val="20"/>
               </w:rPr>
-              <w:t>Médicos veterinários municipais</w:t>
+              <w:t>Municípios e ANMP</w:t>
             </w:r>
           </w:p>
         </w:tc>
@@ -16155,7 +17413,7 @@
                 <w:b w:val="0"/>
                 <w:sz w:val="20"/>
               </w:rPr>
-              <w:t>Contributos dos MVM, reunião de Santarém (6.3.2026)</w:t>
+              <w:t>Regulamentos municipais (Lisboa, Porto, Oeiras, Cascais, Sintra, Leiria, entre outros) (vários)</w:t>
             </w:r>
           </w:p>
         </w:tc>
@@ -16173,7 +17431,7 @@
                 <w:b w:val="0"/>
                 <w:sz w:val="20"/>
               </w:rPr>
-              <w:t>T e C</w:t>
+              <w:t>C</w:t>
             </w:r>
           </w:p>
         </w:tc>
@@ -16191,7 +17449,7 @@
                 <w:b w:val="0"/>
                 <w:sz w:val="20"/>
               </w:rPr>
-              <w:t>Pedem as figuras de cuidador, família de acolhimento temporário, fiel depositário e animal comunitário; um regime excecional de cães comunitários; responsabilização dos detentores de facto; enquadramento das colónias em quintais e do conflito entre cuidadores e vizinhos; clareza sobre responsabilidades entre associação titular e família de acolhimento. Um MVM pede coimas aos alimentadores; outro opõe-se ao CED.</w:t>
+              <w:t>Proíbem alimentar animais na via pública, com coimas que em Oeiras chegam a 8 000 euros. Em regra excecionam os cuidadores registados.</w:t>
             </w:r>
           </w:p>
         </w:tc>
@@ -16209,7 +17467,7 @@
                 <w:b w:val="0"/>
                 <w:sz w:val="20"/>
               </w:rPr>
-              <w:t>Contributos MVM.docx (repositório)</w:t>
+              <w:t>https://www.oeiras.pt/-/alimentacao-animais-via-publica</w:t>
             </w:r>
           </w:p>
         </w:tc>
@@ -16217,6 +17475,154 @@
       <w:tr>
         <w:tc>
           <w:tcPr>
+            <w:tcW w:w="2835" w:type="dxa"/>
+          </w:tcPr>
+          <w:p>
+            <w:pPr>
+              <w:spacing w:after="60"/>
+            </w:pPr>
+            <w:r/>
+            <w:r>
+              <w:rPr>
+                <w:b w:val="0"/>
+                <w:sz w:val="20"/>
+              </w:rPr>
+              <w:t>Município do Fundão, Edital 145/2023 (Regulamento do Programa de Gestão das Colónias de Gatos) (23.1.2023)</w:t>
+            </w:r>
+          </w:p>
+        </w:tc>
+        <w:tc>
+          <w:tcPr>
+            <w:tcW w:w="907" w:type="dxa"/>
+          </w:tcPr>
+          <w:p>
+            <w:pPr>
+              <w:spacing w:after="60"/>
+            </w:pPr>
+            <w:r/>
+            <w:r>
+              <w:rPr>
+                <w:b w:val="0"/>
+                <w:sz w:val="20"/>
+              </w:rPr>
+              <w:t>C e T</w:t>
+            </w:r>
+          </w:p>
+        </w:tc>
+        <w:tc>
+          <w:tcPr>
+            <w:tcW w:w="6860" w:type="dxa"/>
+          </w:tcPr>
+          <w:p>
+            <w:pPr>
+              <w:spacing w:after="60"/>
+            </w:pPr>
+            <w:r/>
+            <w:r>
+              <w:rPr>
+                <w:b w:val="0"/>
+                <w:sz w:val="20"/>
+              </w:rPr>
+              <w:t>Modelo de cuidador registado, com termo de responsabilidade e supervisão do MVM. Citação (art. 4.º, n.º 1): «O cuidador registado é responsável pelo bem-estar dos gatos que integram a colónia ao seu cuidado, devendo assegurar a limpeza do local em que a sua manutenção é autorizada, bem como pela alimentação e a vigilância periódica dos mesmos.»</w:t>
+            </w:r>
+          </w:p>
+        </w:tc>
+        <w:tc>
+          <w:tcPr>
+            <w:tcW w:w="3969" w:type="dxa"/>
+          </w:tcPr>
+          <w:p>
+            <w:pPr>
+              <w:spacing w:after="60"/>
+            </w:pPr>
+            <w:r/>
+            <w:r>
+              <w:rPr>
+                <w:b w:val="0"/>
+                <w:sz w:val="20"/>
+              </w:rPr>
+              <w:t>https://files.dre.pt/2s/2023/01/016000000/0033100335.pdf</w:t>
+            </w:r>
+          </w:p>
+        </w:tc>
+      </w:tr>
+      <w:tr>
+        <w:tc>
+          <w:tcPr>
+            <w:tcW w:w="2835" w:type="dxa"/>
+          </w:tcPr>
+          <w:p>
+            <w:pPr>
+              <w:spacing w:after="60"/>
+            </w:pPr>
+            <w:r/>
+            <w:r>
+              <w:rPr>
+                <w:b w:val="0"/>
+                <w:sz w:val="20"/>
+              </w:rPr>
+              <w:t>Município da Moita, Regulamento 143/2025 (cuidador informal das colónias de gatos) (23.1.2025)</w:t>
+            </w:r>
+          </w:p>
+        </w:tc>
+        <w:tc>
+          <w:tcPr>
+            <w:tcW w:w="907" w:type="dxa"/>
+          </w:tcPr>
+          <w:p>
+            <w:pPr>
+              <w:spacing w:after="60"/>
+            </w:pPr>
+            <w:r/>
+            <w:r>
+              <w:rPr>
+                <w:b w:val="0"/>
+                <w:sz w:val="20"/>
+              </w:rPr>
+              <w:t>C e T</w:t>
+            </w:r>
+          </w:p>
+        </w:tc>
+        <w:tc>
+          <w:tcPr>
+            <w:tcW w:w="6860" w:type="dxa"/>
+          </w:tcPr>
+          <w:p>
+            <w:pPr>
+              <w:spacing w:after="60"/>
+            </w:pPr>
+            <w:r/>
+            <w:r>
+              <w:rPr>
+                <w:b w:val="0"/>
+                <w:sz w:val="20"/>
+              </w:rPr>
+              <w:t>A colónia e as despesas ficam a cargo do cuidador. Citação (art. 3.º, n.º 2): «As colónias autorizadas nos termos do presente regulamento são da responsabilidade dos respetivos cuidadores.»</w:t>
+            </w:r>
+          </w:p>
+        </w:tc>
+        <w:tc>
+          <w:tcPr>
+            <w:tcW w:w="3969" w:type="dxa"/>
+          </w:tcPr>
+          <w:p>
+            <w:pPr>
+              <w:spacing w:after="60"/>
+            </w:pPr>
+            <w:r/>
+            <w:r>
+              <w:rPr>
+                <w:b w:val="0"/>
+                <w:sz w:val="20"/>
+              </w:rPr>
+              <w:t>https://www.cm-moita.pt/cmmoita/uploads/writer_file/document/9889/regulamento_cuidador_informal.pdf</w:t>
+            </w:r>
+          </w:p>
+        </w:tc>
+      </w:tr>
+      <w:tr>
+        <w:tc>
+          <w:tcPr>
             <w:tcW w:w="14570" w:type="dxa"/>
             <w:gridSpan w:val="4"/>
           </w:tcPr>
@@ -16230,7 +17636,7 @@
                 <w:b/>
                 <w:sz w:val="20"/>
               </w:rPr>
-              <w:t>ONG e associações de proteção animal</w:t>
+              <w:t>Médicos veterinários municipais</w:t>
             </w:r>
           </w:p>
         </w:tc>
@@ -16250,7 +17656,7 @@
                 <w:b w:val="0"/>
                 <w:sz w:val="20"/>
               </w:rPr>
-              <w:t>ARPA, parecer sobre o DL 82/2019 (dez. 2022)</w:t>
+              <w:t>Contributos dos MVM, reunião de Santarém (6.3.2026)</w:t>
             </w:r>
           </w:p>
         </w:tc>
@@ -16286,7 +17692,7 @@
                 <w:b w:val="0"/>
                 <w:sz w:val="20"/>
               </w:rPr>
-              <w:t>Registar gatos de colónia em nome do cuidador torna-o responsável por animais que não controla, desincentiva a esterilização e cria falsas presunções de abandono. Defende o registo em nome do município nos CED municipais e que o CED é um dever legal dos municípios. Citação: «o que não podem é onerá-las com responsabilidades que além de não estarem legamente previstas, apenas as desencorajam a agir».</w:t>
+              <w:t>Pedem as figuras de cuidador, família de acolhimento temporário, fiel depositário e animal comunitário; um regime excecional de cães comunitários; responsabilização dos detentores de facto; enquadramento das colónias em quintais e do conflito entre cuidadores e vizinhos; clareza sobre responsabilidades entre associação titular e família de acolhimento. Um MVM pede coimas aos alimentadores; outro opõe-se ao CED.</w:t>
             </w:r>
           </w:p>
         </w:tc>
@@ -16304,7 +17710,7 @@
                 <w:b w:val="0"/>
                 <w:sz w:val="20"/>
               </w:rPr>
-              <w:t>https://www.arpa-associacao.pt/media/attachments/2022/12/14/parecer-arpa-versAo-4-final.pdf</w:t>
+              <w:t>Contributos MVM.docx (repositório)</w:t>
             </w:r>
           </w:p>
         </w:tc>
@@ -16312,73 +17718,20 @@
       <w:tr>
         <w:tc>
           <w:tcPr>
-            <w:tcW w:w="2835" w:type="dxa"/>
-          </w:tcPr>
-          <w:p>
-            <w:pPr>
-              <w:spacing w:after="60"/>
-            </w:pPr>
-            <w:r/>
-            <w:r>
-              <w:rPr>
-                <w:b w:val="0"/>
-                <w:sz w:val="20"/>
-              </w:rPr>
-              <w:t>FEDRA, plano de políticas públicas (2024)</w:t>
-            </w:r>
-          </w:p>
-        </w:tc>
-        <w:tc>
-          <w:tcPr>
-            <w:tcW w:w="907" w:type="dxa"/>
-          </w:tcPr>
-          <w:p>
-            <w:pPr>
-              <w:spacing w:after="60"/>
-            </w:pPr>
-            <w:r/>
-            <w:r>
-              <w:rPr>
-                <w:b w:val="0"/>
-                <w:sz w:val="20"/>
-              </w:rPr>
-              <w:t>C</w:t>
-            </w:r>
-          </w:p>
-        </w:tc>
-        <w:tc>
-          <w:tcPr>
-            <w:tcW w:w="6860" w:type="dxa"/>
-          </w:tcPr>
-          <w:p>
-            <w:pPr>
-              <w:spacing w:after="60"/>
-            </w:pPr>
-            <w:r/>
-            <w:r>
-              <w:rPr>
-                <w:b w:val="0"/>
-                <w:sz w:val="20"/>
-              </w:rPr>
-              <w:t>Diz que o microchip nos gatos de colónia não é viável na maioria dos casos e pede exceções. Propõe CED para cães e parques de matilhas.</w:t>
-            </w:r>
-          </w:p>
-        </w:tc>
-        <w:tc>
-          <w:tcPr>
-            <w:tcW w:w="3969" w:type="dxa"/>
-          </w:tcPr>
-          <w:p>
-            <w:pPr>
-              <w:spacing w:after="60"/>
-            </w:pPr>
-            <w:r/>
-            <w:r>
-              <w:rPr>
-                <w:b w:val="0"/>
-                <w:sz w:val="20"/>
-              </w:rPr>
-              <w:t>FEDRA - Plano de políticas públcias.pdf (repositório)</w:t>
+            <w:tcW w:w="14570" w:type="dxa"/>
+            <w:gridSpan w:val="4"/>
+          </w:tcPr>
+          <w:p>
+            <w:pPr>
+              <w:spacing w:after="60"/>
+            </w:pPr>
+            <w:r/>
+            <w:r>
+              <w:rPr>
+                <w:b/>
+                <w:sz w:val="20"/>
+              </w:rPr>
+              <w:t>ONG e associações de proteção animal</w:t>
             </w:r>
           </w:p>
         </w:tc>
@@ -16398,7 +17751,7 @@
                 <w:b w:val="0"/>
                 <w:sz w:val="20"/>
               </w:rPr>
-              <w:t>Movimento de Intervenção pelas Matilhas (Coimbra) (s/d)</w:t>
+              <w:t>ARPA, parecer sobre o DL 82/2019 (dez. 2022)</w:t>
             </w:r>
           </w:p>
         </w:tc>
@@ -16416,7 +17769,7 @@
                 <w:b w:val="0"/>
                 <w:sz w:val="20"/>
               </w:rPr>
-              <w:t>C</w:t>
+              <w:t>T e C</w:t>
             </w:r>
           </w:p>
         </w:tc>
@@ -16434,7 +17787,7 @@
                 <w:b w:val="0"/>
                 <w:sz w:val="20"/>
               </w:rPr>
-              <w:t>Defende o CED em cães, com devolução ao território acompanhada por cuidadores, vacinação e microchip.</w:t>
+              <w:t>Registar gatos de colónia em nome do cuidador torna-o responsável por animais que não controla, desincentiva a esterilização e cria falsas presunções de abandono. Defende o registo em nome do município nos CED municipais e que o CED é um dever legal dos municípios. Citação: «o que não podem é onerá-las com responsabilidades que além de não estarem legamente previstas, apenas as desencorajam a agir».</w:t>
             </w:r>
           </w:p>
         </w:tc>
@@ -16452,7 +17805,7 @@
                 <w:b w:val="0"/>
                 <w:sz w:val="20"/>
               </w:rPr>
-              <w:t>https://matilhascoimbra.pt/pages/projecto-2</w:t>
+              <w:t>https://www.arpa-associacao.pt/media/attachments/2022/12/14/parecer-arpa-versAo-4-final.pdf</w:t>
             </w:r>
           </w:p>
         </w:tc>
@@ -16460,6 +17813,154 @@
       <w:tr>
         <w:tc>
           <w:tcPr>
+            <w:tcW w:w="2835" w:type="dxa"/>
+          </w:tcPr>
+          <w:p>
+            <w:pPr>
+              <w:spacing w:after="60"/>
+            </w:pPr>
+            <w:r/>
+            <w:r>
+              <w:rPr>
+                <w:b w:val="0"/>
+                <w:sz w:val="20"/>
+              </w:rPr>
+              <w:t>FEDRA, plano de políticas públicas (2024)</w:t>
+            </w:r>
+          </w:p>
+        </w:tc>
+        <w:tc>
+          <w:tcPr>
+            <w:tcW w:w="907" w:type="dxa"/>
+          </w:tcPr>
+          <w:p>
+            <w:pPr>
+              <w:spacing w:after="60"/>
+            </w:pPr>
+            <w:r/>
+            <w:r>
+              <w:rPr>
+                <w:b w:val="0"/>
+                <w:sz w:val="20"/>
+              </w:rPr>
+              <w:t>C</w:t>
+            </w:r>
+          </w:p>
+        </w:tc>
+        <w:tc>
+          <w:tcPr>
+            <w:tcW w:w="6860" w:type="dxa"/>
+          </w:tcPr>
+          <w:p>
+            <w:pPr>
+              <w:spacing w:after="60"/>
+            </w:pPr>
+            <w:r/>
+            <w:r>
+              <w:rPr>
+                <w:b w:val="0"/>
+                <w:sz w:val="20"/>
+              </w:rPr>
+              <w:t>Diz que o microchip nos gatos de colónia não é viável na maioria dos casos e pede exceções. Propõe CED para cães e parques de matilhas.</w:t>
+            </w:r>
+          </w:p>
+        </w:tc>
+        <w:tc>
+          <w:tcPr>
+            <w:tcW w:w="3969" w:type="dxa"/>
+          </w:tcPr>
+          <w:p>
+            <w:pPr>
+              <w:spacing w:after="60"/>
+            </w:pPr>
+            <w:r/>
+            <w:r>
+              <w:rPr>
+                <w:b w:val="0"/>
+                <w:sz w:val="20"/>
+              </w:rPr>
+              <w:t>FEDRA - Plano de políticas públcias.pdf (repositório)</w:t>
+            </w:r>
+          </w:p>
+        </w:tc>
+      </w:tr>
+      <w:tr>
+        <w:tc>
+          <w:tcPr>
+            <w:tcW w:w="2835" w:type="dxa"/>
+          </w:tcPr>
+          <w:p>
+            <w:pPr>
+              <w:spacing w:after="60"/>
+            </w:pPr>
+            <w:r/>
+            <w:r>
+              <w:rPr>
+                <w:b w:val="0"/>
+                <w:sz w:val="20"/>
+              </w:rPr>
+              <w:t>Movimento de Intervenção pelas Matilhas (Coimbra) (s/d)</w:t>
+            </w:r>
+          </w:p>
+        </w:tc>
+        <w:tc>
+          <w:tcPr>
+            <w:tcW w:w="907" w:type="dxa"/>
+          </w:tcPr>
+          <w:p>
+            <w:pPr>
+              <w:spacing w:after="60"/>
+            </w:pPr>
+            <w:r/>
+            <w:r>
+              <w:rPr>
+                <w:b w:val="0"/>
+                <w:sz w:val="20"/>
+              </w:rPr>
+              <w:t>C</w:t>
+            </w:r>
+          </w:p>
+        </w:tc>
+        <w:tc>
+          <w:tcPr>
+            <w:tcW w:w="6860" w:type="dxa"/>
+          </w:tcPr>
+          <w:p>
+            <w:pPr>
+              <w:spacing w:after="60"/>
+            </w:pPr>
+            <w:r/>
+            <w:r>
+              <w:rPr>
+                <w:b w:val="0"/>
+                <w:sz w:val="20"/>
+              </w:rPr>
+              <w:t>Defende o CED em cães, com devolução ao território acompanhada por cuidadores, vacinação e microchip.</w:t>
+            </w:r>
+          </w:p>
+        </w:tc>
+        <w:tc>
+          <w:tcPr>
+            <w:tcW w:w="3969" w:type="dxa"/>
+          </w:tcPr>
+          <w:p>
+            <w:pPr>
+              <w:spacing w:after="60"/>
+            </w:pPr>
+            <w:r/>
+            <w:r>
+              <w:rPr>
+                <w:b w:val="0"/>
+                <w:sz w:val="20"/>
+              </w:rPr>
+              <w:t>https://matilhascoimbra.pt/pages/projecto-2</w:t>
+            </w:r>
+          </w:p>
+        </w:tc>
+      </w:tr>
+      <w:tr>
+        <w:tc>
+          <w:tcPr>
             <w:tcW w:w="14570" w:type="dxa"/>
             <w:gridSpan w:val="4"/>
           </w:tcPr>
@@ -16777,6 +18278,80 @@
       <w:tr>
         <w:tc>
           <w:tcPr>
+            <w:tcW w:w="2835" w:type="dxa"/>
+          </w:tcPr>
+          <w:p>
+            <w:pPr>
+              <w:spacing w:after="60"/>
+            </w:pPr>
+            <w:r/>
+            <w:r>
+              <w:rPr>
+                <w:b w:val="0"/>
+                <w:sz w:val="20"/>
+              </w:rPr>
+              <w:t>OMV, parecer ao Projeto de Lei 662/XV (Of. 02/CD/2024) (5.1.2024)</w:t>
+            </w:r>
+          </w:p>
+        </w:tc>
+        <w:tc>
+          <w:tcPr>
+            <w:tcW w:w="907" w:type="dxa"/>
+          </w:tcPr>
+          <w:p>
+            <w:pPr>
+              <w:spacing w:after="60"/>
+            </w:pPr>
+            <w:r/>
+            <w:r>
+              <w:rPr>
+                <w:b w:val="0"/>
+                <w:sz w:val="20"/>
+              </w:rPr>
+              <w:t>T e C</w:t>
+            </w:r>
+          </w:p>
+        </w:tc>
+        <w:tc>
+          <w:tcPr>
+            <w:tcW w:w="6860" w:type="dxa"/>
+          </w:tcPr>
+          <w:p>
+            <w:pPr>
+              <w:spacing w:after="60"/>
+            </w:pPr>
+            <w:r/>
+            <w:r>
+              <w:rPr>
+                <w:b w:val="0"/>
+                <w:sz w:val="20"/>
+              </w:rPr>
+              <w:t>Parecer desfavorável ao animal comunitário, aos parques de matilhas e ao CED em cães. Citações: «O diluir da responsabilidade individual da detenção de um animal por vários indivíduos de uma comunidade conduz à desresponsabilização individual.» «A implementação dos programas CED em cães representa a normalização e legitimação da existência de cães na rua.»</w:t>
+            </w:r>
+          </w:p>
+        </w:tc>
+        <w:tc>
+          <w:tcPr>
+            <w:tcW w:w="3969" w:type="dxa"/>
+          </w:tcPr>
+          <w:p>
+            <w:pPr>
+              <w:spacing w:after="60"/>
+            </w:pPr>
+            <w:r/>
+            <w:r>
+              <w:rPr>
+                <w:b w:val="0"/>
+                <w:sz w:val="20"/>
+              </w:rPr>
+              <w:t>parlamento.pt, página da iniciativa PJL 662/XV (pareceres)</w:t>
+            </w:r>
+          </w:p>
+        </w:tc>
+      </w:tr>
+      <w:tr>
+        <w:tc>
+          <w:tcPr>
             <w:tcW w:w="14570" w:type="dxa"/>
             <w:gridSpan w:val="4"/>
           </w:tcPr>
@@ -16790,7 +18365,7 @@
                 <w:b/>
                 <w:sz w:val="20"/>
               </w:rPr>
-              <w:t>Partidos</w:t>
+              <w:t>Organizações internacionais e União Europeia</w:t>
             </w:r>
           </w:p>
         </w:tc>
@@ -16810,7 +18385,7 @@
                 <w:b w:val="0"/>
                 <w:sz w:val="20"/>
               </w:rPr>
-              <w:t>PAN (2021 a 2025)</w:t>
+              <w:t>Comissão Europeia, SWD(2024) 88 (síntese da evidência da proposta de regulamento sobre cães e gatos) (27.3.2024)</w:t>
             </w:r>
           </w:p>
         </w:tc>
@@ -16828,7 +18403,7 @@
                 <w:b w:val="0"/>
                 <w:sz w:val="20"/>
               </w:rPr>
-              <w:t>T e C</w:t>
+              <w:t>C</w:t>
             </w:r>
           </w:p>
         </w:tc>
@@ -16846,7 +18421,7 @@
                 <w:b w:val="0"/>
                 <w:sz w:val="20"/>
               </w:rPr>
-              <w:t>Figura do animal comunitário (projeto aprovado na generalidade em 2021, caducado, retomado nos PJL 662/XV e 88/XVI). Estatuto da família de acolhimento temporário (2024). Critica o OE2026 por nenhum avanço para animais comunitários e matilhas.</w:t>
+              <w:t>Os animais errantes ficaram fora do âmbito da proposta que deu origem ao Regulamento (UE) 2026/1818, apesar de pedidos das ONG. A gestão de errantes e o CED continuam a ser matéria nacional. Citação: «Many NGOs also expressed their desire to include stray animals under the scope of any proposal regarding dogs and cats.» (Muitas ONG manifestaram também o desejo de incluir os animais errantes no âmbito de qualquer proposta relativa a cães e gatos.)</w:t>
             </w:r>
           </w:p>
         </w:tc>
@@ -16864,7 +18439,7 @@
                 <w:b w:val="0"/>
                 <w:sz w:val="20"/>
               </w:rPr>
-              <w:t>https://www.pan.com.pt/pan-destaca-vitorias-no-bem-estar-animal-mas-denuncia-retrocesso-grave-no-orcamento-do-estado-para-2026/</w:t>
+              <w:t>https://food.ec.europa.eu/document/download/caf8cd1d-967a-4e60-a0e5-19401be1c6b3_en?filename=aw_awp_leg_dog-cat_swd-2024-88.pdf</w:t>
             </w:r>
           </w:p>
         </w:tc>
@@ -16884,7 +18459,7 @@
                 <w:b w:val="0"/>
                 <w:sz w:val="20"/>
               </w:rPr>
-              <w:t>PCP, proposta ao OE2026 (5.11.2025)</w:t>
+              <w:t>WOAH, Código Sanitário dos Animais Terrestres, cap. 7.7 (gestão de populações de cães) (10.6.2024)</w:t>
             </w:r>
           </w:p>
         </w:tc>
@@ -16902,7 +18477,7 @@
                 <w:b w:val="0"/>
                 <w:sz w:val="20"/>
               </w:rPr>
-              <w:t>T e C</w:t>
+              <w:t>C e T</w:t>
             </w:r>
           </w:p>
         </w:tc>
@@ -16920,7 +18495,7 @@
                 <w:b w:val="0"/>
                 <w:sz w:val="20"/>
               </w:rPr>
-              <w:t>Campanha nacional de esterilização com CED para cães não perigosos, registados no SIAC sem responsabilidade do município. Citação: «a título exclusivamente informativo, mediante a identificação genérica ‘Cães CED’ e com a exclusão das responsabilidades desses municípios inerentes à propriedade ou detenção desses animais».</w:t>
+              <w:t>Admite a captura, esterilização, vacinação e devolução de cães só como medida complementar, e nota que pode ser vista como abandono. Citação: «This method is not applicable in all situations and may be illegal in countries or regions where legislation prohibits the abandonment of dogs and authorities perceive the release of sterilised dogs as a form of abandonment.» (Este método não é aplicável em todas as situações e pode ser ilegal onde a lei proíba o abandono de cães e as autoridades considerem a libertação de cães esterilizados uma forma de abandono.)</w:t>
             </w:r>
           </w:p>
         </w:tc>
@@ -16938,7 +18513,7 @@
                 <w:b w:val="0"/>
                 <w:sz w:val="20"/>
               </w:rPr>
-              <w:t>https://www.pcp.pt/campanha-nacional-de-esterilizacao-de-animais-errantes-0</w:t>
+              <w:t>https://www.woah.org/fileadmin/Home/eng/Health_standards/tahc/2023/chapitre_aw_stray_dog.pdf</w:t>
             </w:r>
           </w:p>
         </w:tc>
@@ -16946,73 +18521,20 @@
       <w:tr>
         <w:tc>
           <w:tcPr>
-            <w:tcW w:w="2835" w:type="dxa"/>
-          </w:tcPr>
-          <w:p>
-            <w:pPr>
-              <w:spacing w:after="60"/>
-            </w:pPr>
-            <w:r/>
-            <w:r>
-              <w:rPr>
-                <w:b w:val="0"/>
-                <w:sz w:val="20"/>
-              </w:rPr>
-              <w:t>PCP (12.11.2021)</w:t>
-            </w:r>
-          </w:p>
-        </w:tc>
-        <w:tc>
-          <w:tcPr>
-            <w:tcW w:w="907" w:type="dxa"/>
-          </w:tcPr>
-          <w:p>
-            <w:pPr>
-              <w:spacing w:after="60"/>
-            </w:pPr>
-            <w:r/>
-            <w:r>
-              <w:rPr>
-                <w:b w:val="0"/>
-                <w:sz w:val="20"/>
-              </w:rPr>
-              <w:t>C</w:t>
-            </w:r>
-          </w:p>
-        </w:tc>
-        <w:tc>
-          <w:tcPr>
-            <w:tcW w:w="6860" w:type="dxa"/>
-          </w:tcPr>
-          <w:p>
-            <w:pPr>
-              <w:spacing w:after="60"/>
-            </w:pPr>
-            <w:r/>
-            <w:r>
-              <w:rPr>
-                <w:b w:val="0"/>
-                <w:sz w:val="20"/>
-              </w:rPr>
-              <w:t>Contra criar novas figuras legais sem meios: a solução é a esterilização e uma rede pública de médicos veterinários.</w:t>
-            </w:r>
-          </w:p>
-        </w:tc>
-        <w:tc>
-          <w:tcPr>
-            <w:tcW w:w="3969" w:type="dxa"/>
-          </w:tcPr>
-          <w:p>
-            <w:pPr>
-              <w:spacing w:after="60"/>
-            </w:pPr>
-            <w:r/>
-            <w:r>
-              <w:rPr>
-                <w:b w:val="0"/>
-                <w:sz w:val="20"/>
-              </w:rPr>
-              <w:t>https://www.pcp.pt/solucao-prevencao-pela-esterilizacao-rede-publica-de-veterinarios-nao-abate-de-animais-abandonados</w:t>
+            <w:tcW w:w="14570" w:type="dxa"/>
+            <w:gridSpan w:val="4"/>
+          </w:tcPr>
+          <w:p>
+            <w:pPr>
+              <w:spacing w:after="60"/>
+            </w:pPr>
+            <w:r/>
+            <w:r>
+              <w:rPr>
+                <w:b/>
+                <w:sz w:val="20"/>
+              </w:rPr>
+              <w:t>Partidos</w:t>
             </w:r>
           </w:p>
         </w:tc>
@@ -17032,7 +18554,7 @@
                 <w:b w:val="0"/>
                 <w:sz w:val="20"/>
               </w:rPr>
-              <w:t>Livre, programa eleitoral (2024)</w:t>
+              <w:t>PAN (2021 a 2025)</w:t>
             </w:r>
           </w:p>
         </w:tc>
@@ -17050,7 +18572,7 @@
                 <w:b w:val="0"/>
                 <w:sz w:val="20"/>
               </w:rPr>
-              <w:t>C</w:t>
+              <w:t>T e C</w:t>
             </w:r>
           </w:p>
         </w:tc>
@@ -17068,7 +18590,7 @@
                 <w:b w:val="0"/>
                 <w:sz w:val="20"/>
               </w:rPr>
-              <w:t>Reforço dos CED e alargamento a cães errantes, valorização do animal comunitário, protocolos com associações com metas e financiamento.</w:t>
+              <w:t>Figura do animal comunitário (projeto aprovado na generalidade em 2021, caducado, retomado nos PJL 662/XV e 88/XVI). Estatuto da família de acolhimento temporário (2024). Critica o OE2026 por nenhum avanço para animais comunitários e matilhas.</w:t>
             </w:r>
           </w:p>
         </w:tc>
@@ -17086,7 +18608,7 @@
                 <w:b w:val="0"/>
                 <w:sz w:val="20"/>
               </w:rPr>
-              <w:t>https://programa.partidolivre.pt/propostas/N.13/</w:t>
+              <w:t>https://www.pan.com.pt/pan-destaca-vitorias-no-bem-estar-animal-mas-denuncia-retrocesso-grave-no-orcamento-do-estado-para-2026/</w:t>
             </w:r>
           </w:p>
         </w:tc>
@@ -17106,6 +18628,228 @@
                 <w:b w:val="0"/>
                 <w:sz w:val="20"/>
               </w:rPr>
+              <w:t>PCP, proposta ao OE2026 (5.11.2025)</w:t>
+            </w:r>
+          </w:p>
+        </w:tc>
+        <w:tc>
+          <w:tcPr>
+            <w:tcW w:w="907" w:type="dxa"/>
+          </w:tcPr>
+          <w:p>
+            <w:pPr>
+              <w:spacing w:after="60"/>
+            </w:pPr>
+            <w:r/>
+            <w:r>
+              <w:rPr>
+                <w:b w:val="0"/>
+                <w:sz w:val="20"/>
+              </w:rPr>
+              <w:t>T e C</w:t>
+            </w:r>
+          </w:p>
+        </w:tc>
+        <w:tc>
+          <w:tcPr>
+            <w:tcW w:w="6860" w:type="dxa"/>
+          </w:tcPr>
+          <w:p>
+            <w:pPr>
+              <w:spacing w:after="60"/>
+            </w:pPr>
+            <w:r/>
+            <w:r>
+              <w:rPr>
+                <w:b w:val="0"/>
+                <w:sz w:val="20"/>
+              </w:rPr>
+              <w:t>Campanha nacional de esterilização com CED para cães não perigosos, registados no SIAC sem responsabilidade do município. Citação: «a título exclusivamente informativo, mediante a identificação genérica ‘Cães CED’ e com a exclusão das responsabilidades desses municípios inerentes à propriedade ou detenção desses animais».</w:t>
+            </w:r>
+          </w:p>
+        </w:tc>
+        <w:tc>
+          <w:tcPr>
+            <w:tcW w:w="3969" w:type="dxa"/>
+          </w:tcPr>
+          <w:p>
+            <w:pPr>
+              <w:spacing w:after="60"/>
+            </w:pPr>
+            <w:r/>
+            <w:r>
+              <w:rPr>
+                <w:b w:val="0"/>
+                <w:sz w:val="20"/>
+              </w:rPr>
+              <w:t>https://www.pcp.pt/campanha-nacional-de-esterilizacao-de-animais-errantes-0</w:t>
+            </w:r>
+          </w:p>
+        </w:tc>
+      </w:tr>
+      <w:tr>
+        <w:tc>
+          <w:tcPr>
+            <w:tcW w:w="2835" w:type="dxa"/>
+          </w:tcPr>
+          <w:p>
+            <w:pPr>
+              <w:spacing w:after="60"/>
+            </w:pPr>
+            <w:r/>
+            <w:r>
+              <w:rPr>
+                <w:b w:val="0"/>
+                <w:sz w:val="20"/>
+              </w:rPr>
+              <w:t>PCP (12.11.2021)</w:t>
+            </w:r>
+          </w:p>
+        </w:tc>
+        <w:tc>
+          <w:tcPr>
+            <w:tcW w:w="907" w:type="dxa"/>
+          </w:tcPr>
+          <w:p>
+            <w:pPr>
+              <w:spacing w:after="60"/>
+            </w:pPr>
+            <w:r/>
+            <w:r>
+              <w:rPr>
+                <w:b w:val="0"/>
+                <w:sz w:val="20"/>
+              </w:rPr>
+              <w:t>C</w:t>
+            </w:r>
+          </w:p>
+        </w:tc>
+        <w:tc>
+          <w:tcPr>
+            <w:tcW w:w="6860" w:type="dxa"/>
+          </w:tcPr>
+          <w:p>
+            <w:pPr>
+              <w:spacing w:after="60"/>
+            </w:pPr>
+            <w:r/>
+            <w:r>
+              <w:rPr>
+                <w:b w:val="0"/>
+                <w:sz w:val="20"/>
+              </w:rPr>
+              <w:t>Contra criar novas figuras legais sem meios: a solução é a esterilização e uma rede pública de médicos veterinários.</w:t>
+            </w:r>
+          </w:p>
+        </w:tc>
+        <w:tc>
+          <w:tcPr>
+            <w:tcW w:w="3969" w:type="dxa"/>
+          </w:tcPr>
+          <w:p>
+            <w:pPr>
+              <w:spacing w:after="60"/>
+            </w:pPr>
+            <w:r/>
+            <w:r>
+              <w:rPr>
+                <w:b w:val="0"/>
+                <w:sz w:val="20"/>
+              </w:rPr>
+              <w:t>https://www.pcp.pt/solucao-prevencao-pela-esterilizacao-rede-publica-de-veterinarios-nao-abate-de-animais-abandonados</w:t>
+            </w:r>
+          </w:p>
+        </w:tc>
+      </w:tr>
+      <w:tr>
+        <w:tc>
+          <w:tcPr>
+            <w:tcW w:w="2835" w:type="dxa"/>
+          </w:tcPr>
+          <w:p>
+            <w:pPr>
+              <w:spacing w:after="60"/>
+            </w:pPr>
+            <w:r/>
+            <w:r>
+              <w:rPr>
+                <w:b w:val="0"/>
+                <w:sz w:val="20"/>
+              </w:rPr>
+              <w:t>Livre, programa eleitoral (2024)</w:t>
+            </w:r>
+          </w:p>
+        </w:tc>
+        <w:tc>
+          <w:tcPr>
+            <w:tcW w:w="907" w:type="dxa"/>
+          </w:tcPr>
+          <w:p>
+            <w:pPr>
+              <w:spacing w:after="60"/>
+            </w:pPr>
+            <w:r/>
+            <w:r>
+              <w:rPr>
+                <w:b w:val="0"/>
+                <w:sz w:val="20"/>
+              </w:rPr>
+              <w:t>C</w:t>
+            </w:r>
+          </w:p>
+        </w:tc>
+        <w:tc>
+          <w:tcPr>
+            <w:tcW w:w="6860" w:type="dxa"/>
+          </w:tcPr>
+          <w:p>
+            <w:pPr>
+              <w:spacing w:after="60"/>
+            </w:pPr>
+            <w:r/>
+            <w:r>
+              <w:rPr>
+                <w:b w:val="0"/>
+                <w:sz w:val="20"/>
+              </w:rPr>
+              <w:t>Reforço dos CED e alargamento a cães errantes, valorização do animal comunitário, protocolos com associações com metas e financiamento.</w:t>
+            </w:r>
+          </w:p>
+        </w:tc>
+        <w:tc>
+          <w:tcPr>
+            <w:tcW w:w="3969" w:type="dxa"/>
+          </w:tcPr>
+          <w:p>
+            <w:pPr>
+              <w:spacing w:after="60"/>
+            </w:pPr>
+            <w:r/>
+            <w:r>
+              <w:rPr>
+                <w:b w:val="0"/>
+                <w:sz w:val="20"/>
+              </w:rPr>
+              <w:t>https://programa.partidolivre.pt/propostas/N.13/</w:t>
+            </w:r>
+          </w:p>
+        </w:tc>
+      </w:tr>
+      <w:tr>
+        <w:tc>
+          <w:tcPr>
+            <w:tcW w:w="2835" w:type="dxa"/>
+          </w:tcPr>
+          <w:p>
+            <w:pPr>
+              <w:spacing w:after="60"/>
+            </w:pPr>
+            <w:r/>
+            <w:r>
+              <w:rPr>
+                <w:b w:val="0"/>
+                <w:sz w:val="20"/>
+              </w:rPr>
               <w:t>Respostas dos partidos (Maratona pelos Animais) (mar. 2024)</w:t>
             </w:r>
           </w:p>
@@ -17161,6 +18905,80 @@
                 <w:sz w:val="20"/>
               </w:rPr>
               <w:t>https://maratonapelosanimais.pt/wp-content/uploads/2024/03/respostas-completas.pdf</w:t>
+            </w:r>
+          </w:p>
+        </w:tc>
+      </w:tr>
+      <w:tr>
+        <w:tc>
+          <w:tcPr>
+            <w:tcW w:w="2835" w:type="dxa"/>
+          </w:tcPr>
+          <w:p>
+            <w:pPr>
+              <w:spacing w:after="60"/>
+            </w:pPr>
+            <w:r/>
+            <w:r>
+              <w:rPr>
+                <w:b w:val="0"/>
+                <w:sz w:val="20"/>
+              </w:rPr>
+              <w:t>PAN, Projeto de Lei 662/XV (texto da iniciativa) (dez. 2023)</w:t>
+            </w:r>
+          </w:p>
+        </w:tc>
+        <w:tc>
+          <w:tcPr>
+            <w:tcW w:w="907" w:type="dxa"/>
+          </w:tcPr>
+          <w:p>
+            <w:pPr>
+              <w:spacing w:after="60"/>
+            </w:pPr>
+            <w:r/>
+            <w:r>
+              <w:rPr>
+                <w:b w:val="0"/>
+                <w:sz w:val="20"/>
+              </w:rPr>
+              <w:t>C e T</w:t>
+            </w:r>
+          </w:p>
+        </w:tc>
+        <w:tc>
+          <w:tcPr>
+            <w:tcW w:w="6860" w:type="dxa"/>
+          </w:tcPr>
+          <w:p>
+            <w:pPr>
+              <w:spacing w:after="60"/>
+            </w:pPr>
+            <w:r/>
+            <w:r>
+              <w:rPr>
+                <w:b w:val="0"/>
+                <w:sz w:val="20"/>
+              </w:rPr>
+              <w:t>Propõe a figura do animal comunitário, com registo e guarda a cargo de uma pessoa ou de um grupo, sob supervisão da câmara municipal. Citação (nova al. ff)): «“Animal comunitário” qualquer animal, nomeadamente cães e gatos, autorizado a permanecer em espaço e via públicos limitados, a que o animal esteja habituado e onde esteja integrado, cujo registo, guarda, alimentação e cuidados médico-veterinários são assegurados por uma pessoa, singular ou coletiva, ou por um grupo de pessoas integradas numa comunidade local de moradores, residenciais ou profissionais, comunidades escolares ou entidades públicas, sob supervisão da Câmara Municipal.»</w:t>
+            </w:r>
+          </w:p>
+        </w:tc>
+        <w:tc>
+          <w:tcPr>
+            <w:tcW w:w="3969" w:type="dxa"/>
+          </w:tcPr>
+          <w:p>
+            <w:pPr>
+              <w:spacing w:after="60"/>
+            </w:pPr>
+            <w:r/>
+            <w:r>
+              <w:rPr>
+                <w:b w:val="0"/>
+                <w:sz w:val="20"/>
+              </w:rPr>
+              <w:t>parlamento.pt, página da iniciativa PJL 662/XV</w:t>
             </w:r>
           </w:p>
         </w:tc>
@@ -19822,6 +21640,62 @@
           </w:p>
         </w:tc>
       </w:tr>
+      <w:tr>
+        <w:tc>
+          <w:tcPr>
+            <w:tcW w:w="1020" w:type="dxa"/>
+          </w:tcPr>
+          <w:p>
+            <w:pPr>
+              <w:spacing w:after="60"/>
+            </w:pPr>
+            <w:r/>
+            <w:r>
+              <w:rPr>
+                <w:b w:val="0"/>
+                <w:sz w:val="20"/>
+              </w:rPr>
+              <w:t>1.4</w:t>
+            </w:r>
+          </w:p>
+        </w:tc>
+        <w:tc>
+          <w:tcPr>
+            <w:tcW w:w="1417" w:type="dxa"/>
+          </w:tcPr>
+          <w:p>
+            <w:pPr>
+              <w:spacing w:after="60"/>
+            </w:pPr>
+            <w:r/>
+            <w:r>
+              <w:rPr>
+                <w:b w:val="0"/>
+                <w:sz w:val="20"/>
+              </w:rPr>
+              <w:t>25.9.2026</w:t>
+            </w:r>
+          </w:p>
+        </w:tc>
+        <w:tc>
+          <w:tcPr>
+            <w:tcW w:w="6633" w:type="dxa"/>
+          </w:tcPr>
+          <w:p>
+            <w:pPr>
+              <w:spacing w:after="60"/>
+            </w:pPr>
+            <w:r/>
+            <w:r>
+              <w:rPr>
+                <w:b w:val="0"/>
+                <w:sz w:val="20"/>
+              </w:rPr>
+              <w:t>Anexo B: 24 entradas novas com base em documentos lidos (relatórios do Provedor de Justiça 2020 e 2023, nota técnica da AR, SWD(2024) 88 da Comissão Europeia, WOAH, parecer da OMV ao PJL 662/XV, e-book do CEJ, RJLB, acórdãos do STJ, TRL, TRC e TC, regulamentos do Fundão e da Moita, artigos científicos sobre CED e predação). Novos grupos: Organizações internacionais e União Europeia; Investigação científica. Fichas T-06, T-13, T-14, T-16, T-18, C-01, C-02, C-03, C-05, C-06, C-09 e C-11 com fontes documentais acrescentadas.</w:t>
+            </w:r>
+          </w:p>
+        </w:tc>
+      </w:tr>
     </w:tbl>
     <w:sectPr>
       <w:pgSz w:w="11906" w:h="16838"/>
@@ -19844,7 +21718,7 @@
       <w:rPr>
         <w:sz w:val="16"/>
       </w:rPr>
-      <w:t xml:space="preserve">Memorando de acompanhamento do RGAC, versão 1.3. Página </w:t>
+      <w:t xml:space="preserve">Memorando de acompanhamento do RGAC, versão 1.4. Página </w:t>
     </w:r>
     <w:r>
       <w:rPr>

</xml_diff>

<commit_message>
Memorando RGAC v1.5: retiradas as notícias de imprensa; ficam em notas internas
Co-Authored-By: Claude Opus 5.5 <noreply@anthropic.com>
Claude-Session: https://claude.ai/code/session_014DugHn4TLfFaZJnbpoBJVk
</commit_message>
<xml_diff>
--- a/memorando_rgac/Memorando_Acompanhamento_RGAC.docx
+++ b/memorando_rgac/Memorando_Acompanhamento_RGAC.docx
@@ -79,7 +79,7 @@
                 <w:b w:val="0"/>
                 <w:sz w:val="20"/>
               </w:rPr>
-              <w:t>1.4</w:t>
+              <w:t>1.5</w:t>
             </w:r>
           </w:p>
         </w:tc>
@@ -117,7 +117,7 @@
                 <w:b w:val="0"/>
                 <w:sz w:val="20"/>
               </w:rPr>
-              <w:t>25.9.2026</w:t>
+              <w:t>27.9.2026</w:t>
             </w:r>
           </w:p>
         </w:tc>
@@ -823,7 +823,7 @@
           <w:b w:val="0"/>
           <w:i w:val="0"/>
         </w:rPr>
-        <w:t>As posições de entidades externas apoiam-se, sempre que possível, em documentos: diplomas, pareceres, relatórios, estratégias, recomendações, acórdãos, doutrina e artigos científicos. Quando uma posição só é conhecida pela imprensa, a ficha indica «fonte: imprensa» e a entrada fica numa nota própria no Anexo B, até se encontrar o documento de origem.</w:t>
+        <w:t>As posições de entidades externas assentam só em documentos: diplomas e projetos, pareceres, relatórios, estratégias, recomendações, acórdãos, doutrina e artigos científicos. Notícias de imprensa não são usadas como fonte.</w:t>
       </w:r>
     </w:p>
     <w:p>
@@ -4782,7 +4782,7 @@
                 <w:b w:val="0"/>
                 <w:sz w:val="20"/>
               </w:rPr>
-              <w:t>Contributos dos médicos veterinários municipais (6.3.2026); Tribunal da Relação de Coimbra, proc. 281/10.1TBCV.C1 (11.7.2012); Tribunal da Relação do Porto (11.11.2024), fonte: imprensa; STJ, proc. 478/05.6TBMGL.C1.S1 (14.11.2013): os arts. 493.º e 502.º do Código Civil podem coexistir; Tribunal da Relação de Lisboa, proc. 3121/03.4TBCSC.L1-6 (24.11.2009); Tribunal da Relação de Coimbra, proc. 6/22.9GCPBL.C1 (7.2.2024): dever de vigilância do detentor; CDU (resposta de 2024)</w:t>
+              <w:t>Contributos dos médicos veterinários municipais (6.3.2026); Tribunal da Relação de Coimbra, proc. 281/10.1TBCV.C1 (11.7.2012); STJ, proc. 478/05.6TBMGL.C1.S1 (14.11.2013): os arts. 493.º e 502.º do Código Civil podem coexistir; Tribunal da Relação de Lisboa, proc. 3121/03.4TBCSC.L1-6 (24.11.2009); Tribunal da Relação de Coimbra, proc. 6/22.9GCPBL.C1 (7.2.2024): dever de vigilância do detentor; CDU (resposta de 2024)</w:t>
             </w:r>
           </w:p>
         </w:tc>
@@ -5093,7 +5093,7 @@
                 <w:b w:val="0"/>
                 <w:sz w:val="20"/>
               </w:rPr>
-              <w:t>Estratégia Nacional para os Animais Errantes (ENAE), pp. 30-31; Contributos dos médicos veterinários municipais (6.3.2026); PAN (estatuto da família de acolhimento, 2024); Iniciativa Liberal (programa 2024), fonte: imprensa; SNMV (contra registos provisórios no SIAC); Raúl Farias, e-book do CEJ (2022): as associações, como pessoas coletivas, não respondem pelo crime de abandono</w:t>
+              <w:t>Estratégia Nacional para os Animais Errantes (ENAE), pp. 30-31; Contributos dos médicos veterinários municipais (6.3.2026); PAN (estatuto da família de acolhimento, 2024); SNMV (contra registos provisórios no SIAC); Raúl Farias, e-book do CEJ (2022): as associações, como pessoas coletivas, não respondem pelo crime de abandono</w:t>
             </w:r>
           </w:p>
         </w:tc>
@@ -5703,7 +5703,7 @@
                 <w:b w:val="0"/>
                 <w:sz w:val="20"/>
               </w:rPr>
-              <w:t>Contributos dos médicos veterinários municipais (6.3.2026); ANVETEM (falta de regulação das entidades privadas de proteção animal, 2020), fonte: imprensa; Tribunal da Relação de Lisboa, proc. 3121/03.4TBCSC.L1-6 (24.11.2009): detentor é aquele em cuja casa o animal é albergado; ENAE (família de acolhimento temporário e cuidador não regulados); Lei 8/2017, art. 493.º-A do Código Civil (despesas de quem socorreu o animal)</w:t>
+              <w:t>Contributos dos médicos veterinários municipais (6.3.2026); Tribunal da Relação de Lisboa, proc. 3121/03.4TBCSC.L1-6 (24.11.2009): detentor é aquele em cuja casa o animal é albergado; ENAE (família de acolhimento temporário e cuidador não regulados); Lei 8/2017, art. 493.º-A do Código Civil (despesas de quem socorreu o animal)</w:t>
             </w:r>
           </w:p>
         </w:tc>
@@ -6659,7 +6659,7 @@
                 <w:b w:val="0"/>
                 <w:sz w:val="20"/>
               </w:rPr>
-              <w:t>ENAE, p. 35 («Os programas CED não estão instituídos em todo o território»); Livre e PAN (respostas de 2024); ARPA (o CED é dever legal dos municípios, dez. 2022); Chega (programa 2024), fonte: imprensa; Animais de Rua (18.11.2024), fonte: imprensa; Gunther e outros, PNAS 2022, e Boone e outros, 2019 (o CED só resulta com esterilização intensa e contínua); Comissão Europeia, SWD(2024) 88 (errantes fora do âmbito do Regulamento (UE) 2026/1818)</w:t>
+              <w:t>ENAE, p. 35 («Os programas CED não estão instituídos em todo o território»); Livre e PAN (respostas de 2024); ARPA (o CED é dever legal dos municípios, dez. 2022); Gunther e outros, PNAS 2022, e Boone e outros, 2019 (o CED só resulta com esterilização intensa e contínua); Comissão Europeia, SWD(2024) 88 (errantes fora do âmbito do Regulamento (UE) 2026/1818)</w:t>
             </w:r>
           </w:p>
         </w:tc>
@@ -6970,7 +6970,7 @@
                 <w:b w:val="0"/>
                 <w:sz w:val="20"/>
               </w:rPr>
-              <w:t>ENAE, p. 35 («não está definido o conceito de "cuidador da colónia"»); Contributos dos médicos veterinários municipais (6.3.2026); PAN (figura do animal comunitário, PJL 662/XV); BE, Chega e Livre (animal comunitário, programas 2024), fonte: imprensa; Assembleia Municipal de Coimbra (regulamento de cuidadores, 30.6.2026), fonte: imprensa; Câmara Municipal do Porto (gestão diária pelas associações, 2021), fonte: imprensa; OMV, parecer ao PJL 662/XV (5.1.2024): contra o animal comunitário por diluir a responsabilidade; PAN, PJL 662/XV (definição de animal comunitário); Município do Fundão, Edital 145/2023, art. 4.º, n.º 1 (cuidador registado responsável pela colónia); Município da Moita, Regulamento 143/2025, art. 3.º, n.º 2</w:t>
+              <w:t>ENAE, p. 35 («não está definido o conceito de "cuidador da colónia"»); Contributos dos médicos veterinários municipais (6.3.2026); PAN (figura do animal comunitário, PJL 662/XV); OMV, parecer ao PJL 662/XV (5.1.2024): contra o animal comunitário por diluir a responsabilidade; PAN, PJL 662/XV (definição de animal comunitário); Município do Fundão, Edital 145/2023, art. 4.º, n.º 1 (cuidador registado responsável pela colónia); Município da Moita, Regulamento 143/2025, art. 3.º, n.º 2</w:t>
             </w:r>
           </w:p>
         </w:tc>
@@ -7903,7 +7903,7 @@
                 <w:b w:val="0"/>
                 <w:sz w:val="20"/>
               </w:rPr>
-              <w:t>Relatório final do GTBEA (DGAV, 2021); Projeto de revisão da Portaria 146/2017 (ANMP, 2021); ANMP (2018), fonte: imprensa; Provedora do Animal (cerca de 80 mil animais nos CRO, 25.10.2023), fonte: imprensa; Provedor de Justiça, Relatório 2023 (queixas sobre sobrelotação dos CRO)</w:t>
+              <w:t>Relatório final do GTBEA (DGAV, 2021); Projeto de revisão da Portaria 146/2017 (ANMP, 2021); Provedor de Justiça, Relatório 2023 (queixas sobre sobrelotação dos CRO)</w:t>
             </w:r>
           </w:p>
         </w:tc>
@@ -8176,7 +8176,7 @@
                 <w:b w:val="0"/>
                 <w:sz w:val="20"/>
               </w:rPr>
-              <w:t>OMV (25.11.2025), fonte: imprensa; OMV, parecer ao PJL 662/XV (5.1.2024): contra o CED em cães; WOAH, Código Sanitário dos Animais Terrestres, cap. 7.7 (CED em cães só como medida complementar); APMVEAC (parecer set. 2023); PAN e BE (2024); Contributos dos médicos veterinários municipais (6.3.2026); FEDRA; PCP (proposta ao OE2026); Livre (programa 2024); Movimento de Intervenção pelas Matilhas (Coimbra); Projeto de alteração da Portaria 146/2017 (esterilização excecional de cães)</w:t>
+              <w:t>OMV, parecer ao PJL 662/XV (5.1.2024): contra o CED em cães; WOAH, Código Sanitário dos Animais Terrestres, cap. 7.7 (CED em cães só como medida complementar); APMVEAC (parecer set. 2023); PAN e BE (2024); Contributos dos médicos veterinários municipais (6.3.2026); FEDRA; PCP (proposta ao OE2026); Livre (programa 2024); Movimento de Intervenção pelas Matilhas (Coimbra); Projeto de alteração da Portaria 146/2017 (esterilização excecional de cães)</w:t>
             </w:r>
           </w:p>
         </w:tc>
@@ -8734,7 +8734,7 @@
                 <w:b w:val="0"/>
                 <w:sz w:val="20"/>
               </w:rPr>
-              <w:t>CDU (resposta de 2024); Análise interna; Câmara Municipal do Porto (2021), fonte: imprensa; PCP (proposta ao OE2026); ARPA (dez. 2022)</w:t>
+              <w:t>CDU (resposta de 2024); Análise interna; PCP (proposta ao OE2026); ARPA (dez. 2022)</w:t>
             </w:r>
           </w:p>
         </w:tc>
@@ -9045,7 +9045,7 @@
                 <w:b w:val="0"/>
                 <w:sz w:val="20"/>
               </w:rPr>
-              <w:t>ENAE, p. 35 («não é possível aferir o número de animais nem o número e localização das colónias»); ENAE, §33 (número de registo nacional da colónia); Assembleia Municipal de Coimbra (mapeamento georreferenciado, 30.6.2026), fonte: imprensa; Provedoria dos Animais de Lisboa (sinalização de colónias, 10.9.2024), fonte: imprensa; Provedor de Justiça, Relatório 2023 (planos CED autorizados sem divulgação pública)</w:t>
+              <w:t>ENAE, p. 35 («não é possível aferir o número de animais nem o número e localização das colónias»); ENAE, §33 (número de registo nacional da colónia); Provedor de Justiça, Relatório 2023 (planos CED autorizados sem divulgação pública)</w:t>
             </w:r>
           </w:p>
         </w:tc>
@@ -10811,7 +10811,7 @@
                 <w:b w:val="0"/>
                 <w:sz w:val="20"/>
               </w:rPr>
-              <w:t>Relatório final do GTBEA (DGAV, 2021): financiamento como principal constrangimento; Inventário interno de zonas cinzentas do CED (zona 20); DGAV (140 médicos veterinários reconhecidos para 138 municípios, 8.1.2026), fonte: imprensa; OMV (cerca de 45% dos municípios com médico veterinário municipal, 22.8.2026), fonte: imprensa; Provedoria dos Animais de Lisboa (9.1.2026), fonte: imprensa; PCP (2021); ANMP (OE2025 sem verbas próprias para CRO), fonte: imprensa</w:t>
+              <w:t>Relatório final do GTBEA (DGAV, 2021): financiamento como principal constrangimento; Inventário interno de zonas cinzentas do CED (zona 20); PCP (2021)</w:t>
             </w:r>
           </w:p>
         </w:tc>
@@ -11298,18 +11298,6 @@
               <w:t>As câmaras devem apresentar à DGAV, todos os anos, um plano de controlo das populações errantes. O artigo não diz que dados são obrigatórios, não liga o plano ao registo das colónias no SIAC e não prevê consequências para quem não o apresenta. Um comentário do grupo de trabalho pede isso mesmo.</w:t>
             </w:r>
           </w:p>
-          <w:p>
-            <w:pPr>
-              <w:spacing w:after="60"/>
-            </w:pPr>
-            <w:r>
-              <w:rPr>
-                <w:b w:val="0"/>
-                <w:sz w:val="20"/>
-              </w:rPr>
-              <w:t>A Provedora do Animal diz que os dados anuais não permitem definir políticas.</w:t>
-            </w:r>
-          </w:p>
         </w:tc>
       </w:tr>
       <w:tr>
@@ -11383,7 +11371,7 @@
                 <w:b w:val="0"/>
                 <w:sz w:val="20"/>
               </w:rPr>
-              <w:t>Comentário do grupo de trabalho ao art. 85.º («prever sanções para os Municípios que não informam a DGAV»); Provedora do Animal (25.10.2023), fonte: imprensa; Paulo Afonso (21.4.2026), fonte: imprensa</w:t>
+              <w:t>Comentário do grupo de trabalho ao art. 85.º («prever sanções para os Municípios que não informam a DGAV»)</w:t>
             </w:r>
           </w:p>
         </w:tc>
@@ -14973,7 +14961,7 @@
           <w:b w:val="0"/>
           <w:i w:val="0"/>
         </w:rPr>
-        <w:t>Posições recolhidas em documentos oficiais, pareceres, estratégias, doutrina, artigos científicos e decisões judiciais sobre os dois temas deste memorando. As citações estão entre aspas e foram transcritas das fontes indicadas. Tema T: titular, detentor, proprietário e operador. Tema C: CED, colónias e animais errantes.</w:t>
+        <w:t>Posições recolhidas em documentos oficiais, pareceres, estratégias, doutrina, artigos científicos e decisões judiciais sobre os dois temas deste memorando. Não se usam notícias de imprensa. As citações estão entre aspas e foram transcritas das fontes indicadas. Tema T: titular, detentor, proprietário e operador. Tema C: CED, colónias e animais errantes.</w:t>
       </w:r>
     </w:p>
     <w:tbl>
@@ -18979,2197 +18967,6 @@
                 <w:sz w:val="20"/>
               </w:rPr>
               <w:t>parlamento.pt, página da iniciativa PJL 662/XV</w:t>
-            </w:r>
-          </w:p>
-        </w:tc>
-      </w:tr>
-    </w:tbl>
-    <w:p/>
-    <w:p>
-      <w:pPr>
-        <w:pStyle w:val="Heading2"/>
-      </w:pPr>
-      <w:r>
-        <w:rPr>
-          <w:i w:val="0"/>
-          <w:color w:val="000000"/>
-        </w:rPr>
-        <w:t>Nota. Posições conhecidas apenas através da imprensa</w:t>
-      </w:r>
-    </w:p>
-    <w:p>
-      <w:r>
-        <w:rPr>
-          <w:b w:val="0"/>
-          <w:i w:val="0"/>
-        </w:rPr>
-        <w:t>As posições seguintes foram recolhidas em notícias, entrevistas ou resumos publicados na imprensa. Ficam registadas como indicação, mas não servem de fundamento sem confirmação no documento de origem (comunicado, audição parlamentar, recomendação, programa eleitoral ou acórdão). Quando esse documento for encontrado, a entrada passa para a tabela principal.</w:t>
-      </w:r>
-    </w:p>
-    <w:tbl>
-      <w:tblPr>
-        <w:tblW w:w="14570" w:type="dxa"/>
-        <w:tblBorders>
-          <w:top w:val="single" w:sz="4" w:space="0" w:color="000000"/>
-          <w:left w:val="single" w:sz="4" w:space="0" w:color="000000"/>
-          <w:bottom w:val="single" w:sz="4" w:space="0" w:color="000000"/>
-          <w:right w:val="single" w:sz="4" w:space="0" w:color="000000"/>
-          <w:insideH w:val="single" w:sz="4" w:space="0" w:color="000000"/>
-          <w:insideV w:val="single" w:sz="4" w:space="0" w:color="000000"/>
-        </w:tblBorders>
-        <w:tblLayout w:type="fixed"/>
-        <w:tblLook w:firstColumn="1" w:firstRow="1" w:lastColumn="0" w:lastRow="0" w:noHBand="0" w:noVBand="1" w:val="04A0"/>
-      </w:tblPr>
-      <w:tblGrid>
-        <w:gridCol w:w="2835"/>
-        <w:gridCol w:w="907"/>
-        <w:gridCol w:w="6860"/>
-        <w:gridCol w:w="3969"/>
-      </w:tblGrid>
-      <w:tr>
-        <w:trPr>
-          <w:tblHeader w:val="true"/>
-        </w:trPr>
-        <w:tc>
-          <w:tcPr>
-            <w:tcW w:w="2835" w:type="dxa"/>
-          </w:tcPr>
-          <w:p>
-            <w:pPr>
-              <w:spacing w:after="60"/>
-            </w:pPr>
-            <w:r/>
-            <w:r>
-              <w:rPr>
-                <w:b/>
-                <w:sz w:val="20"/>
-              </w:rPr>
-              <w:t>Entidade</w:t>
-            </w:r>
-          </w:p>
-        </w:tc>
-        <w:tc>
-          <w:tcPr>
-            <w:tcW w:w="907" w:type="dxa"/>
-          </w:tcPr>
-          <w:p>
-            <w:pPr>
-              <w:spacing w:after="60"/>
-            </w:pPr>
-            <w:r/>
-            <w:r>
-              <w:rPr>
-                <w:b/>
-                <w:sz w:val="20"/>
-              </w:rPr>
-              <w:t>Tema</w:t>
-            </w:r>
-          </w:p>
-        </w:tc>
-        <w:tc>
-          <w:tcPr>
-            <w:tcW w:w="6860" w:type="dxa"/>
-          </w:tcPr>
-          <w:p>
-            <w:pPr>
-              <w:spacing w:after="60"/>
-            </w:pPr>
-            <w:r/>
-            <w:r>
-              <w:rPr>
-                <w:b/>
-                <w:sz w:val="20"/>
-              </w:rPr>
-              <w:t>Posição</w:t>
-            </w:r>
-          </w:p>
-        </w:tc>
-        <w:tc>
-          <w:tcPr>
-            <w:tcW w:w="3969" w:type="dxa"/>
-          </w:tcPr>
-          <w:p>
-            <w:pPr>
-              <w:spacing w:after="60"/>
-            </w:pPr>
-            <w:r/>
-            <w:r>
-              <w:rPr>
-                <w:b/>
-                <w:sz w:val="20"/>
-              </w:rPr>
-              <w:t>Fonte</w:t>
-            </w:r>
-          </w:p>
-        </w:tc>
-      </w:tr>
-      <w:tr>
-        <w:tc>
-          <w:tcPr>
-            <w:tcW w:w="14570" w:type="dxa"/>
-            <w:gridSpan w:val="4"/>
-          </w:tcPr>
-          <w:p>
-            <w:pPr>
-              <w:spacing w:after="60"/>
-            </w:pPr>
-            <w:r/>
-            <w:r>
-              <w:rPr>
-                <w:b/>
-                <w:sz w:val="20"/>
-              </w:rPr>
-              <w:t>Administração pública</w:t>
-            </w:r>
-          </w:p>
-        </w:tc>
-      </w:tr>
-      <w:tr>
-        <w:tc>
-          <w:tcPr>
-            <w:tcW w:w="2835" w:type="dxa"/>
-          </w:tcPr>
-          <w:p>
-            <w:pPr>
-              <w:spacing w:after="60"/>
-            </w:pPr>
-            <w:r/>
-            <w:r>
-              <w:rPr>
-                <w:b w:val="0"/>
-                <w:sz w:val="20"/>
-              </w:rPr>
-              <w:t>DGAV, diretora-geral (audição na Comissão de Agricultura) (8.1.2026)</w:t>
-            </w:r>
-          </w:p>
-        </w:tc>
-        <w:tc>
-          <w:tcPr>
-            <w:tcW w:w="907" w:type="dxa"/>
-          </w:tcPr>
-          <w:p>
-            <w:pPr>
-              <w:spacing w:after="60"/>
-            </w:pPr>
-            <w:r/>
-            <w:r>
-              <w:rPr>
-                <w:b w:val="0"/>
-                <w:sz w:val="20"/>
-              </w:rPr>
-              <w:t>C</w:t>
-            </w:r>
-          </w:p>
-        </w:tc>
-        <w:tc>
-          <w:tcPr>
-            <w:tcW w:w="6860" w:type="dxa"/>
-          </w:tcPr>
-          <w:p>
-            <w:pPr>
-              <w:spacing w:after="60"/>
-            </w:pPr>
-            <w:r/>
-            <w:r>
-              <w:rPr>
-                <w:b w:val="0"/>
-                <w:sz w:val="20"/>
-              </w:rPr>
-              <w:t>Defende que todos os concelhos tenham autoridade sanitária veterinária concelhia. Indica 140 médicos veterinários reconhecidos para 138 municípios.</w:t>
-            </w:r>
-          </w:p>
-        </w:tc>
-        <w:tc>
-          <w:tcPr>
-            <w:tcW w:w="3969" w:type="dxa"/>
-          </w:tcPr>
-          <w:p>
-            <w:pPr>
-              <w:spacing w:after="60"/>
-            </w:pPr>
-            <w:r/>
-            <w:r>
-              <w:rPr>
-                <w:b w:val="0"/>
-                <w:sz w:val="20"/>
-              </w:rPr>
-              <w:t>https://sapo.pt/artigo/diretora-da-dgav-defende-que-todos-os-municipios-tenham-medico-veterinario-concelhio-69600006ab728f90f0c5c2cf</w:t>
-            </w:r>
-          </w:p>
-        </w:tc>
-      </w:tr>
-      <w:tr>
-        <w:tc>
-          <w:tcPr>
-            <w:tcW w:w="2835" w:type="dxa"/>
-          </w:tcPr>
-          <w:p>
-            <w:pPr>
-              <w:spacing w:after="60"/>
-            </w:pPr>
-            <w:r/>
-            <w:r>
-              <w:rPr>
-                <w:b w:val="0"/>
-                <w:sz w:val="20"/>
-              </w:rPr>
-              <w:t>Provedora do Animal (audição parlamentar) (25.10.2023)</w:t>
-            </w:r>
-          </w:p>
-        </w:tc>
-        <w:tc>
-          <w:tcPr>
-            <w:tcW w:w="907" w:type="dxa"/>
-          </w:tcPr>
-          <w:p>
-            <w:pPr>
-              <w:spacing w:after="60"/>
-            </w:pPr>
-            <w:r/>
-            <w:r>
-              <w:rPr>
-                <w:b w:val="0"/>
-                <w:sz w:val="20"/>
-              </w:rPr>
-              <w:t>C</w:t>
-            </w:r>
-          </w:p>
-        </w:tc>
-        <w:tc>
-          <w:tcPr>
-            <w:tcW w:w="6860" w:type="dxa"/>
-          </w:tcPr>
-          <w:p>
-            <w:pPr>
-              <w:spacing w:after="60"/>
-            </w:pPr>
-            <w:r/>
-            <w:r>
-              <w:rPr>
-                <w:b w:val="0"/>
-                <w:sz w:val="20"/>
-              </w:rPr>
-              <w:t>Cerca de 80 mil animais a viver nos CRO, com tendência para 100 mil, e custos muito elevados. Os dados anuais não permitem definir políticas.</w:t>
-            </w:r>
-          </w:p>
-        </w:tc>
-        <w:tc>
-          <w:tcPr>
-            <w:tcW w:w="3969" w:type="dxa"/>
-          </w:tcPr>
-          <w:p>
-            <w:pPr>
-              <w:spacing w:after="60"/>
-            </w:pPr>
-            <w:r/>
-            <w:r>
-              <w:rPr>
-                <w:b w:val="0"/>
-                <w:sz w:val="20"/>
-              </w:rPr>
-              <w:t>https://observador.pt/2023/10/25/ha-80-000-animais-habitantes-nos-centros-de-recolha-alerta-provedora-do-animal/</w:t>
-            </w:r>
-          </w:p>
-        </w:tc>
-      </w:tr>
-      <w:tr>
-        <w:tc>
-          <w:tcPr>
-            <w:tcW w:w="2835" w:type="dxa"/>
-          </w:tcPr>
-          <w:p>
-            <w:pPr>
-              <w:spacing w:after="60"/>
-            </w:pPr>
-            <w:r/>
-            <w:r>
-              <w:rPr>
-                <w:b w:val="0"/>
-                <w:sz w:val="20"/>
-              </w:rPr>
-              <w:t>Provedora do Animal (24.7.2026)</w:t>
-            </w:r>
-          </w:p>
-        </w:tc>
-        <w:tc>
-          <w:tcPr>
-            <w:tcW w:w="907" w:type="dxa"/>
-          </w:tcPr>
-          <w:p>
-            <w:pPr>
-              <w:spacing w:after="60"/>
-            </w:pPr>
-            <w:r/>
-            <w:r>
-              <w:rPr>
-                <w:b w:val="0"/>
-                <w:sz w:val="20"/>
-              </w:rPr>
-              <w:t>C</w:t>
-            </w:r>
-          </w:p>
-        </w:tc>
-        <w:tc>
-          <w:tcPr>
-            <w:tcW w:w="6860" w:type="dxa"/>
-          </w:tcPr>
-          <w:p>
-            <w:pPr>
-              <w:spacing w:after="60"/>
-            </w:pPr>
-            <w:r/>
-            <w:r>
-              <w:rPr>
-                <w:b w:val="0"/>
-                <w:sz w:val="20"/>
-              </w:rPr>
-              <w:t>Defende a esterilização obrigatória com vales de livre escolha do centro veterinário e equipas nacionais de resgate.</w:t>
-            </w:r>
-          </w:p>
-        </w:tc>
-        <w:tc>
-          <w:tcPr>
-            <w:tcW w:w="3969" w:type="dxa"/>
-          </w:tcPr>
-          <w:p>
-            <w:pPr>
-              <w:spacing w:after="60"/>
-            </w:pPr>
-            <w:r/>
-            <w:r>
-              <w:rPr>
-                <w:b w:val="0"/>
-                <w:sz w:val="20"/>
-              </w:rPr>
-              <w:t>https://www.veterinaria-atual.pt/na-gestao/word-spay-day-esterilizacao/</w:t>
-            </w:r>
-          </w:p>
-        </w:tc>
-      </w:tr>
-      <w:tr>
-        <w:tc>
-          <w:tcPr>
-            <w:tcW w:w="2835" w:type="dxa"/>
-          </w:tcPr>
-          <w:p>
-            <w:pPr>
-              <w:spacing w:after="60"/>
-            </w:pPr>
-            <w:r/>
-            <w:r>
-              <w:rPr>
-                <w:b w:val="0"/>
-                <w:sz w:val="20"/>
-              </w:rPr>
-              <w:t>Provedoria dos Animais de Lisboa (9.1.2026)</w:t>
-            </w:r>
-          </w:p>
-        </w:tc>
-        <w:tc>
-          <w:tcPr>
-            <w:tcW w:w="907" w:type="dxa"/>
-          </w:tcPr>
-          <w:p>
-            <w:pPr>
-              <w:spacing w:after="60"/>
-            </w:pPr>
-            <w:r/>
-            <w:r>
-              <w:rPr>
-                <w:b w:val="0"/>
-                <w:sz w:val="20"/>
-              </w:rPr>
-              <w:t>C</w:t>
-            </w:r>
-          </w:p>
-        </w:tc>
-        <w:tc>
-          <w:tcPr>
-            <w:tcW w:w="6860" w:type="dxa"/>
-          </w:tcPr>
-          <w:p>
-            <w:pPr>
-              <w:spacing w:after="60"/>
-            </w:pPr>
-            <w:r/>
-            <w:r>
-              <w:rPr>
-                <w:b w:val="0"/>
-                <w:sz w:val="20"/>
-              </w:rPr>
-              <w:t>Recomenda a nomeação do médico veterinário municipal em Lisboa, que não existe. Sem ele ficam comprometidos a direção técnica do CRO, o destino dos animais e o parecer exigido para os CED.</w:t>
-            </w:r>
-          </w:p>
-        </w:tc>
-        <w:tc>
-          <w:tcPr>
-            <w:tcW w:w="3969" w:type="dxa"/>
-          </w:tcPr>
-          <w:p>
-            <w:pPr>
-              <w:spacing w:after="60"/>
-            </w:pPr>
-            <w:r/>
-            <w:r>
-              <w:rPr>
-                <w:b w:val="0"/>
-                <w:sz w:val="20"/>
-              </w:rPr>
-              <w:t>https://www.veterinaria-atual.pt/na-gestao/veterinario-municipal/</w:t>
-            </w:r>
-          </w:p>
-        </w:tc>
-      </w:tr>
-      <w:tr>
-        <w:tc>
-          <w:tcPr>
-            <w:tcW w:w="2835" w:type="dxa"/>
-          </w:tcPr>
-          <w:p>
-            <w:pPr>
-              <w:spacing w:after="60"/>
-            </w:pPr>
-            <w:r/>
-            <w:r>
-              <w:rPr>
-                <w:b w:val="0"/>
-                <w:sz w:val="20"/>
-              </w:rPr>
-              <w:t>Provedoria dos Animais de Lisboa (10.9.2024)</w:t>
-            </w:r>
-          </w:p>
-        </w:tc>
-        <w:tc>
-          <w:tcPr>
-            <w:tcW w:w="907" w:type="dxa"/>
-          </w:tcPr>
-          <w:p>
-            <w:pPr>
-              <w:spacing w:after="60"/>
-            </w:pPr>
-            <w:r/>
-            <w:r>
-              <w:rPr>
-                <w:b w:val="0"/>
-                <w:sz w:val="20"/>
-              </w:rPr>
-              <w:t>C</w:t>
-            </w:r>
-          </w:p>
-        </w:tc>
-        <w:tc>
-          <w:tcPr>
-            <w:tcW w:w="6860" w:type="dxa"/>
-          </w:tcPr>
-          <w:p>
-            <w:pPr>
-              <w:spacing w:after="60"/>
-            </w:pPr>
-            <w:r/>
-            <w:r>
-              <w:rPr>
-                <w:b w:val="0"/>
-                <w:sz w:val="20"/>
-              </w:rPr>
-              <w:t>Propõe sinalização das colónias CED (cerca de 12 000 gatos em mais de 1 500 colónias em Lisboa) e contactos de cuidadores para emergências.</w:t>
-            </w:r>
-          </w:p>
-        </w:tc>
-        <w:tc>
-          <w:tcPr>
-            <w:tcW w:w="3969" w:type="dxa"/>
-          </w:tcPr>
-          <w:p>
-            <w:pPr>
-              <w:spacing w:after="60"/>
-            </w:pPr>
-            <w:r/>
-            <w:r>
-              <w:rPr>
-                <w:b w:val="0"/>
-                <w:sz w:val="20"/>
-              </w:rPr>
-              <w:t>https://www.publico.pt/2024/09/10/local/noticia/provedoria-animais-lisboa-propoe-nova-sinaletica-proteger-animais-casos-emergencias-2103558</w:t>
-            </w:r>
-          </w:p>
-        </w:tc>
-      </w:tr>
-      <w:tr>
-        <w:tc>
-          <w:tcPr>
-            <w:tcW w:w="14570" w:type="dxa"/>
-            <w:gridSpan w:val="4"/>
-          </w:tcPr>
-          <w:p>
-            <w:pPr>
-              <w:spacing w:after="60"/>
-            </w:pPr>
-            <w:r/>
-            <w:r>
-              <w:rPr>
-                <w:b/>
-                <w:sz w:val="20"/>
-              </w:rPr>
-              <w:t>Conservação da natureza</w:t>
-            </w:r>
-          </w:p>
-        </w:tc>
-      </w:tr>
-      <w:tr>
-        <w:tc>
-          <w:tcPr>
-            <w:tcW w:w="2835" w:type="dxa"/>
-          </w:tcPr>
-          <w:p>
-            <w:pPr>
-              <w:spacing w:after="60"/>
-            </w:pPr>
-            <w:r/>
-            <w:r>
-              <w:rPr>
-                <w:b w:val="0"/>
-                <w:sz w:val="20"/>
-              </w:rPr>
-              <w:t>Miguel Clavero, Estação Biológica de Doñana (Espanha), entrevista ao DN (14.4.2023)</w:t>
-            </w:r>
-          </w:p>
-        </w:tc>
-        <w:tc>
-          <w:tcPr>
-            <w:tcW w:w="907" w:type="dxa"/>
-          </w:tcPr>
-          <w:p>
-            <w:pPr>
-              <w:spacing w:after="60"/>
-            </w:pPr>
-            <w:r/>
-            <w:r>
-              <w:rPr>
-                <w:b w:val="0"/>
-                <w:sz w:val="20"/>
-              </w:rPr>
-              <w:t>C</w:t>
-            </w:r>
-          </w:p>
-        </w:tc>
-        <w:tc>
-          <w:tcPr>
-            <w:tcW w:w="6860" w:type="dxa"/>
-          </w:tcPr>
-          <w:p>
-            <w:pPr>
-              <w:spacing w:after="60"/>
-            </w:pPr>
-            <w:r/>
-            <w:r>
-              <w:rPr>
-                <w:b w:val="0"/>
-                <w:sz w:val="20"/>
-              </w:rPr>
-              <w:t>Cientista espanhol. Defende que os gatos sem dono sejam retirados do meio natural, por métodos não letais sempre que possível, porque as colónias alimentadas continuam a caçar.</w:t>
-            </w:r>
-          </w:p>
-        </w:tc>
-        <w:tc>
-          <w:tcPr>
-            <w:tcW w:w="3969" w:type="dxa"/>
-          </w:tcPr>
-          <w:p>
-            <w:pPr>
-              <w:spacing w:after="60"/>
-            </w:pPr>
-            <w:r/>
-            <w:r>
-              <w:rPr>
-                <w:b w:val="0"/>
-                <w:sz w:val="20"/>
-              </w:rPr>
-              <w:t>https://www.dn.pt/sociedade/ha-que-manter-os-gatos-sem-dono-fora-do-meio-ambiente-16178512.html</w:t>
-            </w:r>
-          </w:p>
-        </w:tc>
-      </w:tr>
-      <w:tr>
-        <w:tc>
-          <w:tcPr>
-            <w:tcW w:w="14570" w:type="dxa"/>
-            <w:gridSpan w:val="4"/>
-          </w:tcPr>
-          <w:p>
-            <w:pPr>
-              <w:spacing w:after="60"/>
-            </w:pPr>
-            <w:r/>
-            <w:r>
-              <w:rPr>
-                <w:b/>
-                <w:sz w:val="20"/>
-              </w:rPr>
-              <w:t>Juristas, academia e tribunais</w:t>
-            </w:r>
-          </w:p>
-        </w:tc>
-      </w:tr>
-      <w:tr>
-        <w:tc>
-          <w:tcPr>
-            <w:tcW w:w="2835" w:type="dxa"/>
-          </w:tcPr>
-          <w:p>
-            <w:pPr>
-              <w:spacing w:after="60"/>
-            </w:pPr>
-            <w:r/>
-            <w:r>
-              <w:rPr>
-                <w:b w:val="0"/>
-                <w:sz w:val="20"/>
-              </w:rPr>
-              <w:t>Tribunal da Relação do Porto (11.11.2024)</w:t>
-            </w:r>
-          </w:p>
-        </w:tc>
-        <w:tc>
-          <w:tcPr>
-            <w:tcW w:w="907" w:type="dxa"/>
-          </w:tcPr>
-          <w:p>
-            <w:pPr>
-              <w:spacing w:after="60"/>
-            </w:pPr>
-            <w:r/>
-            <w:r>
-              <w:rPr>
-                <w:b w:val="0"/>
-                <w:sz w:val="20"/>
-              </w:rPr>
-              <w:t>T</w:t>
-            </w:r>
-          </w:p>
-        </w:tc>
-        <w:tc>
-          <w:tcPr>
-            <w:tcW w:w="6860" w:type="dxa"/>
-          </w:tcPr>
-          <w:p>
-            <w:pPr>
-              <w:spacing w:after="60"/>
-            </w:pPr>
-            <w:r/>
-            <w:r>
-              <w:rPr>
-                <w:b w:val="0"/>
-                <w:sz w:val="20"/>
-              </w:rPr>
-              <w:t>O detentor que mantinha o cão em sua casa responde pelos danos, ainda que não seja proprietário.</w:t>
-            </w:r>
-          </w:p>
-        </w:tc>
-        <w:tc>
-          <w:tcPr>
-            <w:tcW w:w="3969" w:type="dxa"/>
-          </w:tcPr>
-          <w:p>
-            <w:pPr>
-              <w:spacing w:after="60"/>
-            </w:pPr>
-            <w:r/>
-            <w:r>
-              <w:rPr>
-                <w:b w:val="0"/>
-                <w:sz w:val="20"/>
-              </w:rPr>
-              <w:t>https://www.lexpoint.pt/conteudos/987/133651/noticias/responsabilidade-por-danos-causados-por-animal</w:t>
-            </w:r>
-          </w:p>
-        </w:tc>
-      </w:tr>
-      <w:tr>
-        <w:tc>
-          <w:tcPr>
-            <w:tcW w:w="2835" w:type="dxa"/>
-          </w:tcPr>
-          <w:p>
-            <w:pPr>
-              <w:spacing w:after="60"/>
-            </w:pPr>
-            <w:r/>
-            <w:r>
-              <w:rPr>
-                <w:b w:val="0"/>
-                <w:sz w:val="20"/>
-              </w:rPr>
-              <w:t>Paulo Afonso, docente e médico veterinário (21.4.2026)</w:t>
-            </w:r>
-          </w:p>
-        </w:tc>
-        <w:tc>
-          <w:tcPr>
-            <w:tcW w:w="907" w:type="dxa"/>
-          </w:tcPr>
-          <w:p>
-            <w:pPr>
-              <w:spacing w:after="60"/>
-            </w:pPr>
-            <w:r/>
-            <w:r>
-              <w:rPr>
-                <w:b w:val="0"/>
-                <w:sz w:val="20"/>
-              </w:rPr>
-              <w:t>C</w:t>
-            </w:r>
-          </w:p>
-        </w:tc>
-        <w:tc>
-          <w:tcPr>
-            <w:tcW w:w="6860" w:type="dxa"/>
-          </w:tcPr>
-          <w:p>
-            <w:pPr>
-              <w:spacing w:after="60"/>
-            </w:pPr>
-            <w:r/>
-            <w:r>
-              <w:rPr>
-                <w:b w:val="0"/>
-                <w:sz w:val="20"/>
-              </w:rPr>
-              <w:t>A Lei 27/2016 ficou aquém: os CRO recolhem o mesmo número de animais que antes, sem coordenação nacional nem identificação suficiente.</w:t>
-            </w:r>
-          </w:p>
-        </w:tc>
-        <w:tc>
-          <w:tcPr>
-            <w:tcW w:w="3969" w:type="dxa"/>
-          </w:tcPr>
-          <w:p>
-            <w:pPr>
-              <w:spacing w:after="60"/>
-            </w:pPr>
-            <w:r/>
-            <w:r>
-              <w:rPr>
-                <w:b w:val="0"/>
-                <w:sz w:val="20"/>
-              </w:rPr>
-              <w:t>https://greensavers.sapo.pt/problema-dos-animais-errantes-persiste-uma-decada-depois-da-proibicao-de-abate/</w:t>
-            </w:r>
-          </w:p>
-        </w:tc>
-      </w:tr>
-      <w:tr>
-        <w:tc>
-          <w:tcPr>
-            <w:tcW w:w="14570" w:type="dxa"/>
-            <w:gridSpan w:val="4"/>
-          </w:tcPr>
-          <w:p>
-            <w:pPr>
-              <w:spacing w:after="60"/>
-            </w:pPr>
-            <w:r/>
-            <w:r>
-              <w:rPr>
-                <w:b/>
-                <w:sz w:val="20"/>
-              </w:rPr>
-              <w:t>Municípios e ANMP</w:t>
-            </w:r>
-          </w:p>
-        </w:tc>
-      </w:tr>
-      <w:tr>
-        <w:tc>
-          <w:tcPr>
-            <w:tcW w:w="2835" w:type="dxa"/>
-          </w:tcPr>
-          <w:p>
-            <w:pPr>
-              <w:spacing w:after="60"/>
-            </w:pPr>
-            <w:r/>
-            <w:r>
-              <w:rPr>
-                <w:b w:val="0"/>
-                <w:sz w:val="20"/>
-              </w:rPr>
-              <w:t>ANMP (2018 e 2024)</w:t>
-            </w:r>
-          </w:p>
-        </w:tc>
-        <w:tc>
-          <w:tcPr>
-            <w:tcW w:w="907" w:type="dxa"/>
-          </w:tcPr>
-          <w:p>
-            <w:pPr>
-              <w:spacing w:after="60"/>
-            </w:pPr>
-            <w:r/>
-            <w:r>
-              <w:rPr>
-                <w:b w:val="0"/>
-                <w:sz w:val="20"/>
-              </w:rPr>
-              <w:t>C</w:t>
-            </w:r>
-          </w:p>
-        </w:tc>
-        <w:tc>
-          <w:tcPr>
-            <w:tcW w:w="6860" w:type="dxa"/>
-          </w:tcPr>
-          <w:p>
-            <w:pPr>
-              <w:spacing w:after="60"/>
-            </w:pPr>
-            <w:r/>
-            <w:r>
-              <w:rPr>
-                <w:b w:val="0"/>
-                <w:sz w:val="20"/>
-              </w:rPr>
-              <w:t>Em 2018 disse ser impossível cumprir ao mesmo tempo a recolha obrigatória e a proibição do abate. Em 2024 lamentou que o OE2025 deixasse de prever verbas próprias para os CRO.</w:t>
-            </w:r>
-          </w:p>
-        </w:tc>
-        <w:tc>
-          <w:tcPr>
-            <w:tcW w:w="3969" w:type="dxa"/>
-          </w:tcPr>
-          <w:p>
-            <w:pPr>
-              <w:spacing w:after="60"/>
-            </w:pPr>
-            <w:r/>
-            <w:r>
-              <w:rPr>
-                <w:b w:val="0"/>
-                <w:sz w:val="20"/>
-              </w:rPr>
-              <w:t>https://www.rtp.pt/noticias/economia/anmp-lamenta-que-orcamento-do-estado-nao-contemple-verbas-para-centros-de-recolha-animal_n1612994</w:t>
-            </w:r>
-          </w:p>
-        </w:tc>
-      </w:tr>
-      <w:tr>
-        <w:tc>
-          <w:tcPr>
-            <w:tcW w:w="2835" w:type="dxa"/>
-          </w:tcPr>
-          <w:p>
-            <w:pPr>
-              <w:spacing w:after="60"/>
-            </w:pPr>
-            <w:r/>
-            <w:r>
-              <w:rPr>
-                <w:b w:val="0"/>
-                <w:sz w:val="20"/>
-              </w:rPr>
-              <w:t>Representante dos municípios (audição parlamentar) (25.10.2023)</w:t>
-            </w:r>
-          </w:p>
-        </w:tc>
-        <w:tc>
-          <w:tcPr>
-            <w:tcW w:w="907" w:type="dxa"/>
-          </w:tcPr>
-          <w:p>
-            <w:pPr>
-              <w:spacing w:after="60"/>
-            </w:pPr>
-            <w:r/>
-            <w:r>
-              <w:rPr>
-                <w:b w:val="0"/>
-                <w:sz w:val="20"/>
-              </w:rPr>
-              <w:t>C</w:t>
-            </w:r>
-          </w:p>
-        </w:tc>
-        <w:tc>
-          <w:tcPr>
-            <w:tcW w:w="6860" w:type="dxa"/>
-          </w:tcPr>
-          <w:p>
-            <w:pPr>
-              <w:spacing w:after="60"/>
-            </w:pPr>
-            <w:r/>
-            <w:r>
-              <w:rPr>
-                <w:b w:val="0"/>
-                <w:sz w:val="20"/>
-              </w:rPr>
-              <w:t>Só cerca de 200 dos 308 municípios têm CRO, mas todos estão obrigados a recolher.</w:t>
-            </w:r>
-          </w:p>
-        </w:tc>
-        <w:tc>
-          <w:tcPr>
-            <w:tcW w:w="3969" w:type="dxa"/>
-          </w:tcPr>
-          <w:p>
-            <w:pPr>
-              <w:spacing w:after="60"/>
-            </w:pPr>
-            <w:r/>
-            <w:r>
-              <w:rPr>
-                <w:b w:val="0"/>
-                <w:sz w:val="20"/>
-              </w:rPr>
-              <w:t>https://observador.pt/2023/10/25/ha-80-000-animais-habitantes-nos-centros-de-recolha-alerta-provedora-do-animal/</w:t>
-            </w:r>
-          </w:p>
-        </w:tc>
-      </w:tr>
-      <w:tr>
-        <w:tc>
-          <w:tcPr>
-            <w:tcW w:w="2835" w:type="dxa"/>
-          </w:tcPr>
-          <w:p>
-            <w:pPr>
-              <w:spacing w:after="60"/>
-            </w:pPr>
-            <w:r/>
-            <w:r>
-              <w:rPr>
-                <w:b w:val="0"/>
-                <w:sz w:val="20"/>
-              </w:rPr>
-              <w:t>Câmara Municipal do Porto (6.8.2021)</w:t>
-            </w:r>
-          </w:p>
-        </w:tc>
-        <w:tc>
-          <w:tcPr>
-            <w:tcW w:w="907" w:type="dxa"/>
-          </w:tcPr>
-          <w:p>
-            <w:pPr>
-              <w:spacing w:after="60"/>
-            </w:pPr>
-            <w:r/>
-            <w:r>
-              <w:rPr>
-                <w:b w:val="0"/>
-                <w:sz w:val="20"/>
-              </w:rPr>
-              <w:t>T e C</w:t>
-            </w:r>
-          </w:p>
-        </w:tc>
-        <w:tc>
-          <w:tcPr>
-            <w:tcW w:w="6860" w:type="dxa"/>
-          </w:tcPr>
-          <w:p>
-            <w:pPr>
-              <w:spacing w:after="60"/>
-            </w:pPr>
-            <w:r/>
-            <w:r>
-              <w:rPr>
-                <w:b w:val="0"/>
-                <w:sz w:val="20"/>
-              </w:rPr>
-              <w:t>Os gatos das colónias CED estão registados no SIAC em nome da câmara, mas a gestão diária cabe às associações. Mais de 70 colónias.</w:t>
-            </w:r>
-          </w:p>
-        </w:tc>
-        <w:tc>
-          <w:tcPr>
-            <w:tcW w:w="3969" w:type="dxa"/>
-          </w:tcPr>
-          <w:p>
-            <w:pPr>
-              <w:spacing w:after="60"/>
-            </w:pPr>
-            <w:r/>
-            <w:r>
-              <w:rPr>
-                <w:b w:val="0"/>
-                <w:sz w:val="20"/>
-              </w:rPr>
-              <w:t>https://poligrafo.sapo.pt/fact-check/colonia-de-gatos-sinalizada-por-placa-no-porto-esta-legalizada-e-os-animais-sao-propriedade-da-autarquia/</w:t>
-            </w:r>
-          </w:p>
-        </w:tc>
-      </w:tr>
-      <w:tr>
-        <w:tc>
-          <w:tcPr>
-            <w:tcW w:w="2835" w:type="dxa"/>
-          </w:tcPr>
-          <w:p>
-            <w:pPr>
-              <w:spacing w:after="60"/>
-            </w:pPr>
-            <w:r/>
-            <w:r>
-              <w:rPr>
-                <w:b w:val="0"/>
-                <w:sz w:val="20"/>
-              </w:rPr>
-              <w:t>Câmara Municipal do Entroncamento (14.9.2025)</w:t>
-            </w:r>
-          </w:p>
-        </w:tc>
-        <w:tc>
-          <w:tcPr>
-            <w:tcW w:w="907" w:type="dxa"/>
-          </w:tcPr>
-          <w:p>
-            <w:pPr>
-              <w:spacing w:after="60"/>
-            </w:pPr>
-            <w:r/>
-            <w:r>
-              <w:rPr>
-                <w:b w:val="0"/>
-                <w:sz w:val="20"/>
-              </w:rPr>
-              <w:t>C</w:t>
-            </w:r>
-          </w:p>
-        </w:tc>
-        <w:tc>
-          <w:tcPr>
-            <w:tcW w:w="6860" w:type="dxa"/>
-          </w:tcPr>
-          <w:p>
-            <w:pPr>
-              <w:spacing w:after="60"/>
-            </w:pPr>
-            <w:r/>
-            <w:r>
-              <w:rPr>
-                <w:b w:val="0"/>
-                <w:sz w:val="20"/>
-              </w:rPr>
-              <w:t>O médico veterinário municipal está sob grande pressão; a câmara vai contratar clínicas para esterilizações.</w:t>
-            </w:r>
-          </w:p>
-        </w:tc>
-        <w:tc>
-          <w:tcPr>
-            <w:tcW w:w="3969" w:type="dxa"/>
-          </w:tcPr>
-          <w:p>
-            <w:pPr>
-              <w:spacing w:after="60"/>
-            </w:pPr>
-            <w:r/>
-            <w:r>
-              <w:rPr>
-                <w:b w:val="0"/>
-                <w:sz w:val="20"/>
-              </w:rPr>
-              <w:t>https://omirante.pt/sociedade/2025-09-14-associacao-do-entroncamento-critica-falta-de-controlo-de-colonias-de-gatos-1a4940a3</w:t>
-            </w:r>
-          </w:p>
-        </w:tc>
-      </w:tr>
-      <w:tr>
-        <w:tc>
-          <w:tcPr>
-            <w:tcW w:w="2835" w:type="dxa"/>
-          </w:tcPr>
-          <w:p>
-            <w:pPr>
-              <w:spacing w:after="60"/>
-            </w:pPr>
-            <w:r/>
-            <w:r>
-              <w:rPr>
-                <w:b w:val="0"/>
-                <w:sz w:val="20"/>
-              </w:rPr>
-              <w:t>Assembleia Municipal de Coimbra (proposta aprovada) (30.6.2026)</w:t>
-            </w:r>
-          </w:p>
-        </w:tc>
-        <w:tc>
-          <w:tcPr>
-            <w:tcW w:w="907" w:type="dxa"/>
-          </w:tcPr>
-          <w:p>
-            <w:pPr>
-              <w:spacing w:after="60"/>
-            </w:pPr>
-            <w:r/>
-            <w:r>
-              <w:rPr>
-                <w:b w:val="0"/>
-                <w:sz w:val="20"/>
-              </w:rPr>
-              <w:t>C</w:t>
-            </w:r>
-          </w:p>
-        </w:tc>
-        <w:tc>
-          <w:tcPr>
-            <w:tcW w:w="6860" w:type="dxa"/>
-          </w:tcPr>
-          <w:p>
-            <w:pPr>
-              <w:spacing w:after="60"/>
-            </w:pPr>
-            <w:r/>
-            <w:r>
-              <w:rPr>
-                <w:b w:val="0"/>
-                <w:sz w:val="20"/>
-              </w:rPr>
-              <w:t>Mapeamento georreferenciado das colónias, regulamento municipal de cuidadores com formação, identificação, direitos e deveres, metas anuais de CED e apoio alimentar aos cuidadores.</w:t>
-            </w:r>
-          </w:p>
-        </w:tc>
-        <w:tc>
-          <w:tcPr>
-            <w:tcW w:w="3969" w:type="dxa"/>
-          </w:tcPr>
-          <w:p>
-            <w:pPr>
-              <w:spacing w:after="60"/>
-            </w:pPr>
-            <w:r/>
-            <w:r>
-              <w:rPr>
-                <w:b w:val="0"/>
-                <w:sz w:val="20"/>
-              </w:rPr>
-              <w:t>https://www.diariocoimbra.pt/2026/06/30/municipio-planeia-fazer-uma-melhor-gestao-das-colonias-de-gatos/</w:t>
-            </w:r>
-          </w:p>
-        </w:tc>
-      </w:tr>
-      <w:tr>
-        <w:tc>
-          <w:tcPr>
-            <w:tcW w:w="14570" w:type="dxa"/>
-            <w:gridSpan w:val="4"/>
-          </w:tcPr>
-          <w:p>
-            <w:pPr>
-              <w:spacing w:after="60"/>
-            </w:pPr>
-            <w:r/>
-            <w:r>
-              <w:rPr>
-                <w:b/>
-                <w:sz w:val="20"/>
-              </w:rPr>
-              <w:t>ONG e associações de proteção animal</w:t>
-            </w:r>
-          </w:p>
-        </w:tc>
-      </w:tr>
-      <w:tr>
-        <w:tc>
-          <w:tcPr>
-            <w:tcW w:w="2835" w:type="dxa"/>
-          </w:tcPr>
-          <w:p>
-            <w:pPr>
-              <w:spacing w:after="60"/>
-            </w:pPr>
-            <w:r/>
-            <w:r>
-              <w:rPr>
-                <w:b w:val="0"/>
-                <w:sz w:val="20"/>
-              </w:rPr>
-              <w:t>FEDRA (federação de associações) (22.8.2026)</w:t>
-            </w:r>
-          </w:p>
-        </w:tc>
-        <w:tc>
-          <w:tcPr>
-            <w:tcW w:w="907" w:type="dxa"/>
-          </w:tcPr>
-          <w:p>
-            <w:pPr>
-              <w:spacing w:after="60"/>
-            </w:pPr>
-            <w:r/>
-            <w:r>
-              <w:rPr>
-                <w:b w:val="0"/>
-                <w:sz w:val="20"/>
-              </w:rPr>
-              <w:t>C</w:t>
-            </w:r>
-          </w:p>
-        </w:tc>
-        <w:tc>
-          <w:tcPr>
-            <w:tcW w:w="6860" w:type="dxa"/>
-          </w:tcPr>
-          <w:p>
-            <w:pPr>
-              <w:spacing w:after="60"/>
-            </w:pPr>
-            <w:r/>
-            <w:r>
-              <w:rPr>
-                <w:b w:val="0"/>
-                <w:sz w:val="20"/>
-              </w:rPr>
-              <w:t>Esterilização obrigatória como serviço público, financiamento estável e CED para cães. Diz que as associações suportam as falhas do sistema.</w:t>
-            </w:r>
-          </w:p>
-        </w:tc>
-        <w:tc>
-          <w:tcPr>
-            <w:tcW w:w="3969" w:type="dxa"/>
-          </w:tcPr>
-          <w:p>
-            <w:pPr>
-              <w:spacing w:after="60"/>
-            </w:pPr>
-            <w:r/>
-            <w:r>
-              <w:rPr>
-                <w:b w:val="0"/>
-                <w:sz w:val="20"/>
-              </w:rPr>
-              <w:t>https://observador.pt/2026/08/22/veterinarios-e-associacoes-defendem-mais-investimento-na-esterilizacao-de-animais/</w:t>
-            </w:r>
-          </w:p>
-        </w:tc>
-      </w:tr>
-      <w:tr>
-        <w:tc>
-          <w:tcPr>
-            <w:tcW w:w="2835" w:type="dxa"/>
-          </w:tcPr>
-          <w:p>
-            <w:pPr>
-              <w:spacing w:after="60"/>
-            </w:pPr>
-            <w:r/>
-            <w:r>
-              <w:rPr>
-                <w:b w:val="0"/>
-                <w:sz w:val="20"/>
-              </w:rPr>
-              <w:t>Animais de Rua (18.11.2024)</w:t>
-            </w:r>
-          </w:p>
-        </w:tc>
-        <w:tc>
-          <w:tcPr>
-            <w:tcW w:w="907" w:type="dxa"/>
-          </w:tcPr>
-          <w:p>
-            <w:pPr>
-              <w:spacing w:after="60"/>
-            </w:pPr>
-            <w:r/>
-            <w:r>
-              <w:rPr>
-                <w:b w:val="0"/>
-                <w:sz w:val="20"/>
-              </w:rPr>
-              <w:t>C</w:t>
-            </w:r>
-          </w:p>
-        </w:tc>
-        <w:tc>
-          <w:tcPr>
-            <w:tcW w:w="6860" w:type="dxa"/>
-          </w:tcPr>
-          <w:p>
-            <w:pPr>
-              <w:spacing w:after="60"/>
-            </w:pPr>
-            <w:r/>
-            <w:r>
-              <w:rPr>
-                <w:b w:val="0"/>
-                <w:sz w:val="20"/>
-              </w:rPr>
-              <w:t>Pede mais pressão sobre os municípios para cumprirem o CED e colaboração com as ONG. Contra o corte de apoios no OE2025.</w:t>
-            </w:r>
-          </w:p>
-        </w:tc>
-        <w:tc>
-          <w:tcPr>
-            <w:tcW w:w="3969" w:type="dxa"/>
-          </w:tcPr>
-          <w:p>
-            <w:pPr>
-              <w:spacing w:after="60"/>
-            </w:pPr>
-            <w:r/>
-            <w:r>
-              <w:rPr>
-                <w:b w:val="0"/>
-                <w:sz w:val="20"/>
-              </w:rPr>
-              <w:t>https://jornaleconomico.sapo.pt/noticias/estamos-perante-um-retrocesso-inaceitavel-se-bem-estar-animal-nao-for-incluido-no-oe2025-diz-animais-de-rua/</w:t>
-            </w:r>
-          </w:p>
-        </w:tc>
-      </w:tr>
-      <w:tr>
-        <w:tc>
-          <w:tcPr>
-            <w:tcW w:w="2835" w:type="dxa"/>
-          </w:tcPr>
-          <w:p>
-            <w:pPr>
-              <w:spacing w:after="60"/>
-            </w:pPr>
-            <w:r/>
-            <w:r>
-              <w:rPr>
-                <w:b w:val="0"/>
-                <w:sz w:val="20"/>
-              </w:rPr>
-              <w:t>SOS Animal e ANIMAL (25.10.2019)</w:t>
-            </w:r>
-          </w:p>
-        </w:tc>
-        <w:tc>
-          <w:tcPr>
-            <w:tcW w:w="907" w:type="dxa"/>
-          </w:tcPr>
-          <w:p>
-            <w:pPr>
-              <w:spacing w:after="60"/>
-            </w:pPr>
-            <w:r/>
-            <w:r>
-              <w:rPr>
-                <w:b w:val="0"/>
-                <w:sz w:val="20"/>
-              </w:rPr>
-              <w:t>T</w:t>
-            </w:r>
-          </w:p>
-        </w:tc>
-        <w:tc>
-          <w:tcPr>
-            <w:tcW w:w="6860" w:type="dxa"/>
-          </w:tcPr>
-          <w:p>
-            <w:pPr>
-              <w:spacing w:after="60"/>
-            </w:pPr>
-            <w:r/>
-            <w:r>
-              <w:rPr>
-                <w:b w:val="0"/>
-                <w:sz w:val="20"/>
-              </w:rPr>
-              <w:t>O Estado não cumpre a lei: CRO lotados e listas de espera, com os animais a ficarem a cargo das associações.</w:t>
-            </w:r>
-          </w:p>
-        </w:tc>
-        <w:tc>
-          <w:tcPr>
-            <w:tcW w:w="3969" w:type="dxa"/>
-          </w:tcPr>
-          <w:p>
-            <w:pPr>
-              <w:spacing w:after="60"/>
-            </w:pPr>
-            <w:r/>
-            <w:r>
-              <w:rPr>
-                <w:b w:val="0"/>
-                <w:sz w:val="20"/>
-              </w:rPr>
-              <w:t>https://tvi.iol.pt/noticias/sociedade/canis/associacoes-culpam-o-estado-nao-ha-capacidade-para-receber-os-animais</w:t>
-            </w:r>
-          </w:p>
-        </w:tc>
-      </w:tr>
-      <w:tr>
-        <w:tc>
-          <w:tcPr>
-            <w:tcW w:w="2835" w:type="dxa"/>
-          </w:tcPr>
-          <w:p>
-            <w:pPr>
-              <w:spacing w:after="60"/>
-            </w:pPr>
-            <w:r/>
-            <w:r>
-              <w:rPr>
-                <w:b w:val="0"/>
-                <w:sz w:val="20"/>
-              </w:rPr>
-              <w:t>Abraços de 4 Patas (Entroncamento) (14.9.2025)</w:t>
-            </w:r>
-          </w:p>
-        </w:tc>
-        <w:tc>
-          <w:tcPr>
-            <w:tcW w:w="907" w:type="dxa"/>
-          </w:tcPr>
-          <w:p>
-            <w:pPr>
-              <w:spacing w:after="60"/>
-            </w:pPr>
-            <w:r/>
-            <w:r>
-              <w:rPr>
-                <w:b w:val="0"/>
-                <w:sz w:val="20"/>
-              </w:rPr>
-              <w:t>C</w:t>
-            </w:r>
-          </w:p>
-        </w:tc>
-        <w:tc>
-          <w:tcPr>
-            <w:tcW w:w="6860" w:type="dxa"/>
-          </w:tcPr>
-          <w:p>
-            <w:pPr>
-              <w:spacing w:after="60"/>
-            </w:pPr>
-            <w:r/>
-            <w:r>
-              <w:rPr>
-                <w:b w:val="0"/>
-                <w:sz w:val="20"/>
-              </w:rPr>
-              <w:t>O CED municipal perdeu eficácia, as esterilizações caíram e os voluntários fazem trabalho do médico veterinário municipal.</w:t>
-            </w:r>
-          </w:p>
-        </w:tc>
-        <w:tc>
-          <w:tcPr>
-            <w:tcW w:w="3969" w:type="dxa"/>
-          </w:tcPr>
-          <w:p>
-            <w:pPr>
-              <w:spacing w:after="60"/>
-            </w:pPr>
-            <w:r/>
-            <w:r>
-              <w:rPr>
-                <w:b w:val="0"/>
-                <w:sz w:val="20"/>
-              </w:rPr>
-              <w:t>https://omirante.pt/sociedade/2025-09-14-associacao-do-entroncamento-critica-falta-de-controlo-de-colonias-de-gatos-1a4940a3</w:t>
-            </w:r>
-          </w:p>
-        </w:tc>
-      </w:tr>
-      <w:tr>
-        <w:tc>
-          <w:tcPr>
-            <w:tcW w:w="2835" w:type="dxa"/>
-          </w:tcPr>
-          <w:p>
-            <w:pPr>
-              <w:spacing w:after="60"/>
-            </w:pPr>
-            <w:r/>
-            <w:r>
-              <w:rPr>
-                <w:b w:val="0"/>
-                <w:sz w:val="20"/>
-              </w:rPr>
-              <w:t>Associação São Francisco de Assis (Cascais) (29.1.2021)</w:t>
-            </w:r>
-          </w:p>
-        </w:tc>
-        <w:tc>
-          <w:tcPr>
-            <w:tcW w:w="907" w:type="dxa"/>
-          </w:tcPr>
-          <w:p>
-            <w:pPr>
-              <w:spacing w:after="60"/>
-            </w:pPr>
-            <w:r/>
-            <w:r>
-              <w:rPr>
-                <w:b w:val="0"/>
-                <w:sz w:val="20"/>
-              </w:rPr>
-              <w:t>C</w:t>
-            </w:r>
-          </w:p>
-        </w:tc>
-        <w:tc>
-          <w:tcPr>
-            <w:tcW w:w="6860" w:type="dxa"/>
-          </w:tcPr>
-          <w:p>
-            <w:pPr>
-              <w:spacing w:after="60"/>
-            </w:pPr>
-            <w:r/>
-            <w:r>
-              <w:rPr>
-                <w:b w:val="0"/>
-                <w:sz w:val="20"/>
-              </w:rPr>
-              <w:t>Defendeu a proibição de alimentar animais na via pública para gerir uma matilha no Guincho.</w:t>
-            </w:r>
-          </w:p>
-        </w:tc>
-        <w:tc>
-          <w:tcPr>
-            <w:tcW w:w="3969" w:type="dxa"/>
-          </w:tcPr>
-          <w:p>
-            <w:pPr>
-              <w:spacing w:after="60"/>
-            </w:pPr>
-            <w:r/>
-            <w:r>
-              <w:rPr>
-                <w:b w:val="0"/>
-                <w:sz w:val="20"/>
-              </w:rPr>
-              <w:t>https://poligrafo.sapo.pt/fact-check/proibido-alimentar-os-animais-punivel-com-coima-imagem-deste-cartaz-em-cascais-e-autentica</w:t>
-            </w:r>
-          </w:p>
-        </w:tc>
-      </w:tr>
-      <w:tr>
-        <w:tc>
-          <w:tcPr>
-            <w:tcW w:w="14570" w:type="dxa"/>
-            <w:gridSpan w:val="4"/>
-          </w:tcPr>
-          <w:p>
-            <w:pPr>
-              <w:spacing w:after="60"/>
-            </w:pPr>
-            <w:r/>
-            <w:r>
-              <w:rPr>
-                <w:b/>
-                <w:sz w:val="20"/>
-              </w:rPr>
-              <w:t>Ordens e associações profissionais</w:t>
-            </w:r>
-          </w:p>
-        </w:tc>
-      </w:tr>
-      <w:tr>
-        <w:tc>
-          <w:tcPr>
-            <w:tcW w:w="2835" w:type="dxa"/>
-          </w:tcPr>
-          <w:p>
-            <w:pPr>
-              <w:spacing w:after="60"/>
-            </w:pPr>
-            <w:r/>
-            <w:r>
-              <w:rPr>
-                <w:b w:val="0"/>
-                <w:sz w:val="20"/>
-              </w:rPr>
-              <w:t>OMV, comunicado sobre CED em cães (21.11.2025)</w:t>
-            </w:r>
-          </w:p>
-        </w:tc>
-        <w:tc>
-          <w:tcPr>
-            <w:tcW w:w="907" w:type="dxa"/>
-          </w:tcPr>
-          <w:p>
-            <w:pPr>
-              <w:spacing w:after="60"/>
-            </w:pPr>
-            <w:r/>
-            <w:r>
-              <w:rPr>
-                <w:b w:val="0"/>
-                <w:sz w:val="20"/>
-              </w:rPr>
-              <w:t>C</w:t>
-            </w:r>
-          </w:p>
-        </w:tc>
-        <w:tc>
-          <w:tcPr>
-            <w:tcW w:w="6860" w:type="dxa"/>
-          </w:tcPr>
-          <w:p>
-            <w:pPr>
-              <w:spacing w:after="60"/>
-            </w:pPr>
-            <w:r/>
-            <w:r>
-              <w:rPr>
-                <w:b w:val="0"/>
-                <w:sz w:val="20"/>
-              </w:rPr>
-              <w:t>Contra o CED em cães, que considera tecnicamente infundado e socialmente perigoso e uma desistência da administração local. Apoia o CED em gatos. Propõe reforço da captura e do alojamento em CRO.</w:t>
-            </w:r>
-          </w:p>
-        </w:tc>
-        <w:tc>
-          <w:tcPr>
-            <w:tcW w:w="3969" w:type="dxa"/>
-          </w:tcPr>
-          <w:p>
-            <w:pPr>
-              <w:spacing w:after="60"/>
-            </w:pPr>
-            <w:r/>
-            <w:r>
-              <w:rPr>
-                <w:b w:val="0"/>
-                <w:sz w:val="20"/>
-              </w:rPr>
-              <w:t>https://www.veterinaria-atual.pt/na-gestao/omv-programa-ced-caes/</w:t>
-            </w:r>
-          </w:p>
-        </w:tc>
-      </w:tr>
-      <w:tr>
-        <w:tc>
-          <w:tcPr>
-            <w:tcW w:w="2835" w:type="dxa"/>
-          </w:tcPr>
-          <w:p>
-            <w:pPr>
-              <w:spacing w:after="60"/>
-            </w:pPr>
-            <w:r/>
-            <w:r>
-              <w:rPr>
-                <w:b w:val="0"/>
-                <w:sz w:val="20"/>
-              </w:rPr>
-              <w:t>OMV, bastonário (22.8.2026)</w:t>
-            </w:r>
-          </w:p>
-        </w:tc>
-        <w:tc>
-          <w:tcPr>
-            <w:tcW w:w="907" w:type="dxa"/>
-          </w:tcPr>
-          <w:p>
-            <w:pPr>
-              <w:spacing w:after="60"/>
-            </w:pPr>
-            <w:r/>
-            <w:r>
-              <w:rPr>
-                <w:b w:val="0"/>
-                <w:sz w:val="20"/>
-              </w:rPr>
-              <w:t>T e C</w:t>
-            </w:r>
-          </w:p>
-        </w:tc>
-        <w:tc>
-          <w:tcPr>
-            <w:tcW w:w="6860" w:type="dxa"/>
-          </w:tcPr>
-          <w:p>
-            <w:pPr>
-              <w:spacing w:after="60"/>
-            </w:pPr>
-            <w:r/>
-            <w:r>
-              <w:rPr>
-                <w:b w:val="0"/>
-                <w:sz w:val="20"/>
-              </w:rPr>
-              <w:t>Esterilização obrigatória com financiamento público, registo SIAC com rastreio de ninhadas e um médico veterinário municipal por concelho. Refere que só cerca de 45% dos municípios têm médico veterinário municipal.</w:t>
-            </w:r>
-          </w:p>
-        </w:tc>
-        <w:tc>
-          <w:tcPr>
-            <w:tcW w:w="3969" w:type="dxa"/>
-          </w:tcPr>
-          <w:p>
-            <w:pPr>
-              <w:spacing w:after="60"/>
-            </w:pPr>
-            <w:r/>
-            <w:r>
-              <w:rPr>
-                <w:b w:val="0"/>
-                <w:sz w:val="20"/>
-              </w:rPr>
-              <w:t>https://observador.pt/2026/08/22/veterinarios-e-associacoes-defendem-mais-investimento-na-esterilizacao-de-animais/</w:t>
-            </w:r>
-          </w:p>
-        </w:tc>
-      </w:tr>
-      <w:tr>
-        <w:tc>
-          <w:tcPr>
-            <w:tcW w:w="2835" w:type="dxa"/>
-          </w:tcPr>
-          <w:p>
-            <w:pPr>
-              <w:spacing w:after="60"/>
-            </w:pPr>
-            <w:r/>
-            <w:r>
-              <w:rPr>
-                <w:b w:val="0"/>
-                <w:sz w:val="20"/>
-              </w:rPr>
-              <w:t>ANVETEM (2020)</w:t>
-            </w:r>
-          </w:p>
-        </w:tc>
-        <w:tc>
-          <w:tcPr>
-            <w:tcW w:w="907" w:type="dxa"/>
-          </w:tcPr>
-          <w:p>
-            <w:pPr>
-              <w:spacing w:after="60"/>
-            </w:pPr>
-            <w:r/>
-            <w:r>
-              <w:rPr>
-                <w:b w:val="0"/>
-                <w:sz w:val="20"/>
-              </w:rPr>
-              <w:t>C</w:t>
-            </w:r>
-          </w:p>
-        </w:tc>
-        <w:tc>
-          <w:tcPr>
-            <w:tcW w:w="6860" w:type="dxa"/>
-          </w:tcPr>
-          <w:p>
-            <w:pPr>
-              <w:spacing w:after="60"/>
-            </w:pPr>
-            <w:r/>
-            <w:r>
-              <w:rPr>
-                <w:b w:val="0"/>
-                <w:sz w:val="20"/>
-              </w:rPr>
-              <w:t>Diz que a Lei 27/2016 assentou em pressupostos errados e que os CRO estão sobrelotados. Aponta a falta de regulação das entidades privadas de proteção animal. Refere que só 172 dos 308 municípios tinham médico veterinário municipal.</w:t>
-            </w:r>
-          </w:p>
-        </w:tc>
-        <w:tc>
-          <w:tcPr>
-            <w:tcW w:w="3969" w:type="dxa"/>
-          </w:tcPr>
-          <w:p>
-            <w:pPr>
-              <w:spacing w:after="60"/>
-            </w:pPr>
-            <w:r/>
-            <w:r>
-              <w:rPr>
-                <w:b w:val="0"/>
-                <w:sz w:val="20"/>
-              </w:rPr>
-              <w:t>https://observador.pt/2020/03/08/associacao-de-veterinarios-diz-que-situacao-nos-canis-municipais-e-dramatica/</w:t>
-            </w:r>
-          </w:p>
-        </w:tc>
-      </w:tr>
-      <w:tr>
-        <w:tc>
-          <w:tcPr>
-            <w:tcW w:w="14570" w:type="dxa"/>
-            <w:gridSpan w:val="4"/>
-          </w:tcPr>
-          <w:p>
-            <w:pPr>
-              <w:spacing w:after="60"/>
-            </w:pPr>
-            <w:r/>
-            <w:r>
-              <w:rPr>
-                <w:b/>
-                <w:sz w:val="20"/>
-              </w:rPr>
-              <w:t>Partidos</w:t>
-            </w:r>
-          </w:p>
-        </w:tc>
-      </w:tr>
-      <w:tr>
-        <w:tc>
-          <w:tcPr>
-            <w:tcW w:w="2835" w:type="dxa"/>
-          </w:tcPr>
-          <w:p>
-            <w:pPr>
-              <w:spacing w:after="60"/>
-            </w:pPr>
-            <w:r/>
-            <w:r>
-              <w:rPr>
-                <w:b w:val="0"/>
-                <w:sz w:val="20"/>
-              </w:rPr>
-              <w:t>PAN, Inês Sousa Real (1.9.2026)</w:t>
-            </w:r>
-          </w:p>
-        </w:tc>
-        <w:tc>
-          <w:tcPr>
-            <w:tcW w:w="907" w:type="dxa"/>
-          </w:tcPr>
-          <w:p>
-            <w:pPr>
-              <w:spacing w:after="60"/>
-            </w:pPr>
-            <w:r/>
-            <w:r>
-              <w:rPr>
-                <w:b w:val="0"/>
-                <w:sz w:val="20"/>
-              </w:rPr>
-              <w:t>C</w:t>
-            </w:r>
-          </w:p>
-        </w:tc>
-        <w:tc>
-          <w:tcPr>
-            <w:tcW w:w="6860" w:type="dxa"/>
-          </w:tcPr>
-          <w:p>
-            <w:pPr>
-              <w:spacing w:after="60"/>
-            </w:pPr>
-            <w:r/>
-            <w:r>
-              <w:rPr>
-                <w:b w:val="0"/>
-                <w:sz w:val="20"/>
-              </w:rPr>
-              <w:t>A execução da Lei 27/2016 fica aquém: esterilizações em queda, pelo menos 96 municípios sem CRO e só 45% com médico veterinário municipal.</w:t>
-            </w:r>
-          </w:p>
-        </w:tc>
-        <w:tc>
-          <w:tcPr>
-            <w:tcW w:w="3969" w:type="dxa"/>
-          </w:tcPr>
-          <w:p>
-            <w:pPr>
-              <w:spacing w:after="60"/>
-            </w:pPr>
-            <w:r/>
-            <w:r>
-              <w:rPr>
-                <w:b w:val="0"/>
-                <w:sz w:val="20"/>
-              </w:rPr>
-              <w:t>https://pit.nit.pt/animais/10-anos-sem-abate-nos-canis-ha-leis-que-salvam-vidas</w:t>
-            </w:r>
-          </w:p>
-        </w:tc>
-      </w:tr>
-      <w:tr>
-        <w:tc>
-          <w:tcPr>
-            <w:tcW w:w="2835" w:type="dxa"/>
-          </w:tcPr>
-          <w:p>
-            <w:pPr>
-              <w:spacing w:after="60"/>
-            </w:pPr>
-            <w:r/>
-            <w:r>
-              <w:rPr>
-                <w:b w:val="0"/>
-                <w:sz w:val="20"/>
-              </w:rPr>
-              <w:t>Bloco de Esquerda, programa eleitoral (2024)</w:t>
-            </w:r>
-          </w:p>
-        </w:tc>
-        <w:tc>
-          <w:tcPr>
-            <w:tcW w:w="907" w:type="dxa"/>
-          </w:tcPr>
-          <w:p>
-            <w:pPr>
-              <w:spacing w:after="60"/>
-            </w:pPr>
-            <w:r/>
-            <w:r>
-              <w:rPr>
-                <w:b w:val="0"/>
-                <w:sz w:val="20"/>
-              </w:rPr>
-              <w:t>C</w:t>
-            </w:r>
-          </w:p>
-        </w:tc>
-        <w:tc>
-          <w:tcPr>
-            <w:tcW w:w="6860" w:type="dxa"/>
-          </w:tcPr>
-          <w:p>
-            <w:pPr>
-              <w:spacing w:after="60"/>
-            </w:pPr>
-            <w:r/>
-            <w:r>
-              <w:rPr>
-                <w:b w:val="0"/>
-                <w:sz w:val="20"/>
-              </w:rPr>
-              <w:t>CED, figura do animal comunitário e um médico veterinário municipal a tempo inteiro por município.</w:t>
-            </w:r>
-          </w:p>
-        </w:tc>
-        <w:tc>
-          <w:tcPr>
-            <w:tcW w:w="3969" w:type="dxa"/>
-          </w:tcPr>
-          <w:p>
-            <w:pPr>
-              <w:spacing w:after="60"/>
-            </w:pPr>
-            <w:r/>
-            <w:r>
-              <w:rPr>
-                <w:b w:val="0"/>
-                <w:sz w:val="20"/>
-              </w:rPr>
-              <w:t>https://pit.nit.pt/animais/legislativas-estao-ai-prometem-os-partidos-defesa-do-bem-estar-animal</w:t>
-            </w:r>
-          </w:p>
-        </w:tc>
-      </w:tr>
-      <w:tr>
-        <w:tc>
-          <w:tcPr>
-            <w:tcW w:w="2835" w:type="dxa"/>
-          </w:tcPr>
-          <w:p>
-            <w:pPr>
-              <w:spacing w:after="60"/>
-            </w:pPr>
-            <w:r/>
-            <w:r>
-              <w:rPr>
-                <w:b w:val="0"/>
-                <w:sz w:val="20"/>
-              </w:rPr>
-              <w:t>Chega, programa eleitoral (2024)</w:t>
-            </w:r>
-          </w:p>
-        </w:tc>
-        <w:tc>
-          <w:tcPr>
-            <w:tcW w:w="907" w:type="dxa"/>
-          </w:tcPr>
-          <w:p>
-            <w:pPr>
-              <w:spacing w:after="60"/>
-            </w:pPr>
-            <w:r/>
-            <w:r>
-              <w:rPr>
-                <w:b w:val="0"/>
-                <w:sz w:val="20"/>
-              </w:rPr>
-              <w:t>C</w:t>
-            </w:r>
-          </w:p>
-        </w:tc>
-        <w:tc>
-          <w:tcPr>
-            <w:tcW w:w="6860" w:type="dxa"/>
-          </w:tcPr>
-          <w:p>
-            <w:pPr>
-              <w:spacing w:after="60"/>
-            </w:pPr>
-            <w:r/>
-            <w:r>
-              <w:rPr>
-                <w:b w:val="0"/>
-                <w:sz w:val="20"/>
-              </w:rPr>
-              <w:t>Garantir o CED em todos os municípios e criar o estatuto do animal comunitário.</w:t>
-            </w:r>
-          </w:p>
-        </w:tc>
-        <w:tc>
-          <w:tcPr>
-            <w:tcW w:w="3969" w:type="dxa"/>
-          </w:tcPr>
-          <w:p>
-            <w:pPr>
-              <w:spacing w:after="60"/>
-            </w:pPr>
-            <w:r/>
-            <w:r>
-              <w:rPr>
-                <w:b w:val="0"/>
-                <w:sz w:val="20"/>
-              </w:rPr>
-              <w:t>https://pit.nit.pt/animais/legislativas-estao-ai-prometem-os-partidos-defesa-do-bem-estar-animal</w:t>
-            </w:r>
-          </w:p>
-        </w:tc>
-      </w:tr>
-      <w:tr>
-        <w:tc>
-          <w:tcPr>
-            <w:tcW w:w="2835" w:type="dxa"/>
-          </w:tcPr>
-          <w:p>
-            <w:pPr>
-              <w:spacing w:after="60"/>
-            </w:pPr>
-            <w:r/>
-            <w:r>
-              <w:rPr>
-                <w:b w:val="0"/>
-                <w:sz w:val="20"/>
-              </w:rPr>
-              <w:t>PS, programa eleitoral (2024)</w:t>
-            </w:r>
-          </w:p>
-        </w:tc>
-        <w:tc>
-          <w:tcPr>
-            <w:tcW w:w="907" w:type="dxa"/>
-          </w:tcPr>
-          <w:p>
-            <w:pPr>
-              <w:spacing w:after="60"/>
-            </w:pPr>
-            <w:r/>
-            <w:r>
-              <w:rPr>
-                <w:b w:val="0"/>
-                <w:sz w:val="20"/>
-              </w:rPr>
-              <w:t>C</w:t>
-            </w:r>
-          </w:p>
-        </w:tc>
-        <w:tc>
-          <w:tcPr>
-            <w:tcW w:w="6860" w:type="dxa"/>
-          </w:tcPr>
-          <w:p>
-            <w:pPr>
-              <w:spacing w:after="60"/>
-            </w:pPr>
-            <w:r/>
-            <w:r>
-              <w:rPr>
-                <w:b w:val="0"/>
-                <w:sz w:val="20"/>
-              </w:rPr>
-              <w:t>Programas de esterilização e vacinação para matilhas errantes. Não se pronuncia sobre CED de gatos.</w:t>
-            </w:r>
-          </w:p>
-        </w:tc>
-        <w:tc>
-          <w:tcPr>
-            <w:tcW w:w="3969" w:type="dxa"/>
-          </w:tcPr>
-          <w:p>
-            <w:pPr>
-              <w:spacing w:after="60"/>
-            </w:pPr>
-            <w:r/>
-            <w:r>
-              <w:rPr>
-                <w:b w:val="0"/>
-                <w:sz w:val="20"/>
-              </w:rPr>
-              <w:t>https://pit.nit.pt/animais/legislativas-estao-ai-prometem-os-partidos-defesa-do-bem-estar-animal</w:t>
-            </w:r>
-          </w:p>
-        </w:tc>
-      </w:tr>
-      <w:tr>
-        <w:tc>
-          <w:tcPr>
-            <w:tcW w:w="2835" w:type="dxa"/>
-          </w:tcPr>
-          <w:p>
-            <w:pPr>
-              <w:spacing w:after="60"/>
-            </w:pPr>
-            <w:r/>
-            <w:r>
-              <w:rPr>
-                <w:b w:val="0"/>
-                <w:sz w:val="20"/>
-              </w:rPr>
-              <w:t>PSD/AD e Iniciativa Liberal, programas eleitorais (2024)</w:t>
-            </w:r>
-          </w:p>
-        </w:tc>
-        <w:tc>
-          <w:tcPr>
-            <w:tcW w:w="907" w:type="dxa"/>
-          </w:tcPr>
-          <w:p>
-            <w:pPr>
-              <w:spacing w:after="60"/>
-            </w:pPr>
-            <w:r/>
-            <w:r>
-              <w:rPr>
-                <w:b w:val="0"/>
-                <w:sz w:val="20"/>
-              </w:rPr>
-              <w:t>T</w:t>
-            </w:r>
-          </w:p>
-        </w:tc>
-        <w:tc>
-          <w:tcPr>
-            <w:tcW w:w="6860" w:type="dxa"/>
-          </w:tcPr>
-          <w:p>
-            <w:pPr>
-              <w:spacing w:after="60"/>
-            </w:pPr>
-            <w:r/>
-            <w:r>
-              <w:rPr>
-                <w:b w:val="0"/>
-                <w:sz w:val="20"/>
-              </w:rPr>
-              <w:t>PSD/AD: campanhas contra o abandono e reforço dos CRO. IL: permitir que os CRO entreguem animais a particulares com apoio do Estado e financiar as associações em função dos animais a cargo.</w:t>
-            </w:r>
-          </w:p>
-        </w:tc>
-        <w:tc>
-          <w:tcPr>
-            <w:tcW w:w="3969" w:type="dxa"/>
-          </w:tcPr>
-          <w:p>
-            <w:pPr>
-              <w:spacing w:after="60"/>
-            </w:pPr>
-            <w:r/>
-            <w:r>
-              <w:rPr>
-                <w:b w:val="0"/>
-                <w:sz w:val="20"/>
-              </w:rPr>
-              <w:t>https://pit.nit.pt/animais/legislativas-estao-ai-prometem-os-partidos-defesa-do-bem-estar-animal</w:t>
             </w:r>
           </w:p>
         </w:tc>
@@ -21696,6 +19493,62 @@
           </w:p>
         </w:tc>
       </w:tr>
+      <w:tr>
+        <w:tc>
+          <w:tcPr>
+            <w:tcW w:w="1020" w:type="dxa"/>
+          </w:tcPr>
+          <w:p>
+            <w:pPr>
+              <w:spacing w:after="60"/>
+            </w:pPr>
+            <w:r/>
+            <w:r>
+              <w:rPr>
+                <w:b w:val="0"/>
+                <w:sz w:val="20"/>
+              </w:rPr>
+              <w:t>1.5</w:t>
+            </w:r>
+          </w:p>
+        </w:tc>
+        <w:tc>
+          <w:tcPr>
+            <w:tcW w:w="1417" w:type="dxa"/>
+          </w:tcPr>
+          <w:p>
+            <w:pPr>
+              <w:spacing w:after="60"/>
+            </w:pPr>
+            <w:r/>
+            <w:r>
+              <w:rPr>
+                <w:b w:val="0"/>
+                <w:sz w:val="20"/>
+              </w:rPr>
+              <w:t>27.9.2026</w:t>
+            </w:r>
+          </w:p>
+        </w:tc>
+        <w:tc>
+          <w:tcPr>
+            <w:tcW w:w="6633" w:type="dxa"/>
+          </w:tcPr>
+          <w:p>
+            <w:pPr>
+              <w:spacing w:after="60"/>
+            </w:pPr>
+            <w:r/>
+            <w:r>
+              <w:rPr>
+                <w:b w:val="0"/>
+                <w:sz w:val="20"/>
+              </w:rPr>
+              <w:t>Retiradas do memorando todas as notícias de imprensa: 26 entradas do Anexo B, 20 referências nas fichas e uma frase da ficha C-17. O Anexo B passa a ter só fontes documentais.</w:t>
+            </w:r>
+          </w:p>
+        </w:tc>
+      </w:tr>
     </w:tbl>
     <w:sectPr>
       <w:pgSz w:w="11906" w:h="16838"/>
@@ -21718,7 +19571,7 @@
       <w:rPr>
         <w:sz w:val="16"/>
       </w:rPr>
-      <w:t xml:space="preserve">Memorando de acompanhamento do RGAC, versão 1.4. Página </w:t>
+      <w:t xml:space="preserve">Memorando de acompanhamento do RGAC, versão 1.5. Página </w:t>
     </w:r>
     <w:r>
       <w:rPr>

</xml_diff>

<commit_message>
Memorando RGAC v1.6: bibliografia com ligações verificadas e script de verificação
Co-Authored-By: Claude Opus 5.5 <noreply@anthropic.com>
Claude-Session: https://claude.ai/code/session_014DugHn4TLfFaZJnbpoBJVk
</commit_message>
<xml_diff>
--- a/memorando_rgac/Memorando_Acompanhamento_RGAC.docx
+++ b/memorando_rgac/Memorando_Acompanhamento_RGAC.docx
@@ -79,7 +79,7 @@
                 <w:b w:val="0"/>
                 <w:sz w:val="20"/>
               </w:rPr>
-              <w:t>1.5</w:t>
+              <w:t>1.6</w:t>
             </w:r>
           </w:p>
         </w:tc>
@@ -758,7 +758,7 @@
           <w:b/>
           <w:i w:val="0"/>
         </w:rPr>
-        <w:t>Anexo C. Fontes</w:t>
+        <w:t>Registo de alterações</w:t>
       </w:r>
     </w:p>
     <w:p>
@@ -770,7 +770,7 @@
           <w:b/>
           <w:i w:val="0"/>
         </w:rPr>
-        <w:t>Registo de alterações</w:t>
+        <w:t>Bibliografia</w:t>
       </w:r>
     </w:p>
     <w:p>
@@ -7281,7 +7281,7 @@
                 <w:b w:val="0"/>
                 <w:sz w:val="20"/>
               </w:rPr>
-              <w:t>ENAE, p. 35 («Existem regulamentos ou posturas camarárias que proíbem alimentar animais errantes»); Contributo de um médico veterinário municipal (pede coimas aos alimentadores, posição contrária); Regulamentos municipais de Lisboa, Porto, Oeiras, Cascais e outros (excecionam cuidadores registados); Provedor de Justiça, Relatório 2020 (campanhas da DGAV contra a alimentação de errantes)</w:t>
+              <w:t>ENAE, p. 35 («Existem regulamentos ou posturas camarárias que proíbem alimentar animais errantes»); Contributo de um médico veterinário municipal (pede coimas aos alimentadores, posição contrária); Município do Fundão, Edital 145/2023 (o regime das colónias é exceção à proibição geral de alimentar na via pública); Provedor de Justiça, Relatório 2020 (campanhas da DGAV contra a alimentação de errantes)</w:t>
             </w:r>
           </w:p>
         </w:tc>
@@ -11571,7 +11571,7 @@
     <w:p>
       <w:pPr>
         <w:sectPr>
-          <w:footerReference w:type="default" r:id="rId9"/>
+          <w:footerReference w:type="default" r:id="rId65"/>
           <w:pgSz w:w="11906" w:h="16838"/>
           <w:pgMar w:top="1247" w:right="1417" w:bottom="1247" w:left="1417" w:header="720" w:footer="720" w:gutter="0"/>
           <w:cols w:space="720"/>
@@ -15743,7 +15743,7 @@
                 <w:b w:val="0"/>
                 <w:sz w:val="20"/>
               </w:rPr>
-              <w:t>parlamento.pt, página da iniciativa PJL 88/XVI</w:t>
+              <w:t>https://app.parlamento.pt/webutils/docs/doc.pdf?path=6148523063484d364c793968636d356c6443397a6158526c63793959566b6c4d5a5763765130394e4c7a64445156426c6379394562324e31625756756447397a5357357059326c6864476c3259554e7662576c7a633246764c7a4d344d6d49795a5751334c574977597a59744e44457a596930354d574d794c544d354e446c684d445a6a4e474a6c597935775a47593d&amp;fich=382b2ed7-b0c6-413b-91c2-3949a06c4bec.pdf&amp;Inline=true</w:t>
             </w:r>
           </w:p>
         </w:tc>
@@ -16060,7 +16060,7 @@
                 <w:b w:val="0"/>
                 <w:sz w:val="20"/>
               </w:rPr>
-              <w:t>https://academic.oup.com/jel/article/32/3/391/5640440</w:t>
+              <w:t>https://doi.org/10.1093/jel/eqz035</w:t>
             </w:r>
           </w:p>
         </w:tc>
@@ -16134,7 +16134,7 @@
                 <w:b w:val="0"/>
                 <w:sz w:val="20"/>
               </w:rPr>
-              <w:t>https://doi.org/10.1016/j.biocon.2025.111089</w:t>
+              <w:t>https://dspace.uevora.pt/rdpc/bitstream/10174/38522/1/Gal%C3%A3o%20et%20al_2025_When%20pets%20go%20wild.pdf</w:t>
             </w:r>
           </w:p>
         </w:tc>
@@ -16599,7 +16599,7 @@
                 <w:b w:val="0"/>
                 <w:sz w:val="20"/>
               </w:rPr>
-              <w:t>https://www.ncbi.nlm.nih.gov/pmc/articles/PMC11939513/</w:t>
+              <w:t>https://pmc.ncbi.nlm.nih.gov/articles/PMC11939513/</w:t>
             </w:r>
           </w:p>
         </w:tc>
@@ -17401,7 +17401,7 @@
                 <w:b w:val="0"/>
                 <w:sz w:val="20"/>
               </w:rPr>
-              <w:t>Regulamentos municipais (Lisboa, Porto, Oeiras, Cascais, Sintra, Leiria, entre outros) (vários)</w:t>
+              <w:t>Município do Fundão, Edital 145/2023: alimentação na via pública (23.1.2023)</w:t>
             </w:r>
           </w:p>
         </w:tc>
@@ -17437,7 +17437,7 @@
                 <w:b w:val="0"/>
                 <w:sz w:val="20"/>
               </w:rPr>
-              <w:t>Proíbem alimentar animais na via pública, com coimas que em Oeiras chegam a 8 000 euros. Em regra excecionam os cuidadores registados.</w:t>
+              <w:t>O regulamento de colónias funciona como exceção a uma proibição geral de alimentar animais na via pública. Citação (art. 1.º, n.º 3): «O regime constante do presente regulamento constitui uma exceção à proibição geral de espalhar alimentos nas vias e noutros espaços públicos, suscetível de atrair animais errantes.» As despesas de manutenção e alimentação das colónias ficam a cargo do município (no regulamento da Moita ficam a cargo do cuidador).</w:t>
             </w:r>
           </w:p>
         </w:tc>
@@ -17455,7 +17455,7 @@
                 <w:b w:val="0"/>
                 <w:sz w:val="20"/>
               </w:rPr>
-              <w:t>https://www.oeiras.pt/-/alimentacao-animais-via-publica</w:t>
+              <w:t>https://files.dre.pt/2s/2023/01/016000000/0033100335.pdf</w:t>
             </w:r>
           </w:p>
         </w:tc>
@@ -17698,7 +17698,7 @@
                 <w:b w:val="0"/>
                 <w:sz w:val="20"/>
               </w:rPr>
-              <w:t>Contributos MVM.docx (repositório)</w:t>
+              <w:t>repositório: Contributos MVM.docx</w:t>
             </w:r>
           </w:p>
         </w:tc>
@@ -17867,7 +17867,7 @@
                 <w:b w:val="0"/>
                 <w:sz w:val="20"/>
               </w:rPr>
-              <w:t>FEDRA - Plano de políticas públcias.pdf (repositório)</w:t>
+              <w:t>repositório: FEDRA - Plano de políticas públcias.pdf</w:t>
             </w:r>
           </w:p>
         </w:tc>
@@ -18110,7 +18110,7 @@
                 <w:b w:val="0"/>
                 <w:sz w:val="20"/>
               </w:rPr>
-              <w:t>Documentos de trabalho do RGBEAC e do RGAC (repositório)</w:t>
+              <w:t>repositório: Resumo_Comentarios_RGBEAC.docx</w:t>
             </w:r>
           </w:p>
         </w:tc>
@@ -18332,7 +18332,7 @@
                 <w:b w:val="0"/>
                 <w:sz w:val="20"/>
               </w:rPr>
-              <w:t>parlamento.pt, página da iniciativa PJL 662/XV (pareceres)</w:t>
+              <w:t>https://app.parlamento.pt/webutils/docs/doc.pdf?path=6148523063484d364c793968636d356c6443397a6158526c63793959566b786c5a793944543030764d5446445155564f5253394562324e31625756756447397a5357357059326c6864476c3259554e7662576c7a633246764c7a646c5a4746685a5749354c54466c4d4755744e4451305a4331684f544a6b4c57526c5a4464685a574e6a4f5467784d5335775a47593d&amp;fich=7edaaeb9-1e0e-444d-a92d-ded7aecc9811.pdf&amp;Inline=true</w:t>
             </w:r>
           </w:p>
         </w:tc>
@@ -18966,7 +18966,7 @@
                 <w:b w:val="0"/>
                 <w:sz w:val="20"/>
               </w:rPr>
-              <w:t>parlamento.pt, página da iniciativa PJL 662/XV</w:t>
+              <w:t>https://app.parlamento.pt/webutils/docs/doc.pdf?path=6148523063484d364c793968636d356c6443397a6158526c63793959566b786c5a79394562324e31625756756447397a5357357059326c6864476c32595338774d44566d4d7a426c4e7931694d44557a4c54526c4e446b744f5455774d79316a4f5459794e544e6d4d47566a4e6a49755a47396a65413d3d&amp;fich=005f30e7-b053-4e49-9503-c96253f0ec62.docx&amp;Inline=true</w:t>
             </w:r>
           </w:p>
         </w:tc>
@@ -18981,150 +18981,6 @@
           <w:docGrid w:linePitch="360"/>
         </w:sectPr>
       </w:pPr>
-    </w:p>
-    <w:p>
-      <w:pPr>
-        <w:pStyle w:val="Heading1"/>
-      </w:pPr>
-      <w:r>
-        <w:rPr>
-          <w:i w:val="0"/>
-          <w:color w:val="000000"/>
-        </w:rPr>
-        <w:t>Anexo C. Fontes</w:t>
-      </w:r>
-    </w:p>
-    <w:p>
-      <w:pPr>
-        <w:spacing w:after="60"/>
-      </w:pPr>
-      <w:r>
-        <w:rPr>
-          <w:b w:val="0"/>
-          <w:i w:val="0"/>
-        </w:rPr>
-        <w:t>RGAC: RGAC_DAJA_REV. FORMAL_V1_Versão TRABALHO - Revisto 30-06-2026 18h00 Grupo.docx (repositório).</w:t>
-      </w:r>
-    </w:p>
-    <w:p>
-      <w:pPr>
-        <w:spacing w:after="60"/>
-      </w:pPr>
-      <w:r>
-        <w:rPr>
-          <w:b w:val="0"/>
-          <w:i w:val="0"/>
-        </w:rPr>
-        <w:t>RGBEAC (jun. 2025) e versões comentadas de out. 2025 e fev. 2026 (repositório).</w:t>
-      </w:r>
-    </w:p>
-    <w:p>
-      <w:pPr>
-        <w:spacing w:after="60"/>
-      </w:pPr>
-      <w:r>
-        <w:rPr>
-          <w:b w:val="0"/>
-          <w:i w:val="0"/>
-        </w:rPr>
-        <w:t>DL 82/2019, DL 276/2001, DL 314/2003, DL 315/2009, Portaria 146/2017: versões consolidadas no DRE (diariodarepublica.pt), confirmadas na pasta Legislação vigente e no repositório.</w:t>
-      </w:r>
-    </w:p>
-    <w:p>
-      <w:pPr>
-        <w:spacing w:after="60"/>
-      </w:pPr>
-      <w:r>
-        <w:rPr>
-          <w:b w:val="0"/>
-          <w:i w:val="0"/>
-        </w:rPr>
-        <w:t>Código Civil e Código Penal: versões em vigor na PGDL (pgdlisboa.pt).</w:t>
-      </w:r>
-    </w:p>
-    <w:p>
-      <w:pPr>
-        <w:spacing w:after="60"/>
-      </w:pPr>
-      <w:r>
-        <w:rPr>
-          <w:b w:val="0"/>
-          <w:i w:val="0"/>
-        </w:rPr>
-        <w:t>Lei 27/2016 (repositório e DRE).</w:t>
-      </w:r>
-    </w:p>
-    <w:p>
-      <w:pPr>
-        <w:spacing w:after="60"/>
-      </w:pPr>
-      <w:r>
-        <w:rPr>
-          <w:b w:val="0"/>
-          <w:i w:val="0"/>
-        </w:rPr>
-        <w:t>Regulamento (UE) 2026/1818, JO L de 10.8.2026 (versões PT e EN no repositório).</w:t>
-      </w:r>
-    </w:p>
-    <w:p>
-      <w:pPr>
-        <w:spacing w:after="60"/>
-      </w:pPr>
-      <w:r>
-        <w:rPr>
-          <w:b w:val="0"/>
-          <w:i w:val="0"/>
-        </w:rPr>
-        <w:t>Estratégia Nacional para os Animais Errantes, ICNF, consulta pública de 2023: https://www.icnf.pt/api/file/doc/41f8f44aee23be1a</w:t>
-      </w:r>
-    </w:p>
-    <w:p>
-      <w:pPr>
-        <w:spacing w:after="60"/>
-      </w:pPr>
-      <w:r>
-        <w:rPr>
-          <w:b w:val="0"/>
-          <w:i w:val="0"/>
-        </w:rPr>
-        <w:t>Relatório final do GTBEA, DGAV, 2021: https://www.dgav.pt/wp-content/uploads/2021/08/Relatorio-FINAL-avaliacao-da-implementacao-da-Lei-27-2016.pdf</w:t>
-      </w:r>
-    </w:p>
-    <w:p>
-      <w:pPr>
-        <w:spacing w:after="60"/>
-      </w:pPr>
-      <w:r>
-        <w:rPr>
-          <w:b w:val="0"/>
-          <w:i w:val="0"/>
-        </w:rPr>
-        <w:t>Projeto de revisão da Portaria 146/2017 (ANMP, 2021): https://anmp.pt/file-viewer/?pstid=41508</w:t>
-      </w:r>
-    </w:p>
-    <w:p>
-      <w:pPr>
-        <w:spacing w:after="60"/>
-      </w:pPr>
-      <w:r>
-        <w:rPr>
-          <w:b w:val="0"/>
-          <w:i w:val="0"/>
-        </w:rPr>
-        <w:t>Contributos dos médicos veterinários municipais, reunião de 6.3.2026 (Contributos MVM.docx, repositório).</w:t>
-      </w:r>
-    </w:p>
-    <w:p>
-      <w:pPr>
-        <w:spacing w:after="60"/>
-      </w:pPr>
-      <w:r>
-        <w:rPr>
-          <w:b w:val="0"/>
-          <w:i w:val="0"/>
-        </w:rPr>
-        <w:t>Acórdão do Tribunal da Relação de Lisboa de 30.4.2025, proc. 1642/24.4T8AMD.L1-8 (dgsi.pt).</w:t>
-      </w:r>
     </w:p>
     <w:p>
       <w:pPr>
@@ -19549,7 +19405,1464 @@
           </w:p>
         </w:tc>
       </w:tr>
+      <w:tr>
+        <w:tc>
+          <w:tcPr>
+            <w:tcW w:w="1020" w:type="dxa"/>
+          </w:tcPr>
+          <w:p>
+            <w:pPr>
+              <w:spacing w:after="60"/>
+            </w:pPr>
+            <w:r/>
+            <w:r>
+              <w:rPr>
+                <w:b w:val="0"/>
+                <w:sz w:val="20"/>
+              </w:rPr>
+              <w:t>1.6</w:t>
+            </w:r>
+          </w:p>
+        </w:tc>
+        <w:tc>
+          <w:tcPr>
+            <w:tcW w:w="1417" w:type="dxa"/>
+          </w:tcPr>
+          <w:p>
+            <w:pPr>
+              <w:spacing w:after="60"/>
+            </w:pPr>
+            <w:r/>
+            <w:r>
+              <w:rPr>
+                <w:b w:val="0"/>
+                <w:sz w:val="20"/>
+              </w:rPr>
+              <w:t>27.9.2026</w:t>
+            </w:r>
+          </w:p>
+        </w:tc>
+        <w:tc>
+          <w:tcPr>
+            <w:tcW w:w="6633" w:type="dxa"/>
+          </w:tcPr>
+          <w:p>
+            <w:pPr>
+              <w:spacing w:after="60"/>
+            </w:pPr>
+            <w:r/>
+            <w:r>
+              <w:rPr>
+                <w:b w:val="0"/>
+                <w:sz w:val="20"/>
+              </w:rPr>
+              <w:t>Bibliografia no fim do documento, por tipo de fonte, com ligações clicáveis, verificadas uma a uma. O Anexo C (Fontes) passa para a bibliografia. Corrigidas as ligações do parlamento, de artigos científicos e da Universidade de Évora. A entrada sobre regulamentos municipais de Oeiras e outros foi substituída pelo Edital 145/2023 do Fundão, por não ser possível verificar a fonte.</w:t>
+            </w:r>
+          </w:p>
+        </w:tc>
+      </w:tr>
     </w:tbl>
+    <w:p>
+      <w:pPr>
+        <w:pStyle w:val="Heading1"/>
+      </w:pPr>
+      <w:r>
+        <w:rPr>
+          <w:i w:val="0"/>
+          <w:color w:val="000000"/>
+        </w:rPr>
+        <w:t>Bibliografia</w:t>
+      </w:r>
+    </w:p>
+    <w:p>
+      <w:r>
+        <w:rPr>
+          <w:b w:val="0"/>
+          <w:i w:val="0"/>
+        </w:rPr>
+        <w:t>Todas as ligações foram verificadas em 27.9.2026. Os documentos do repositório estão na pasta do projeto. Os textos legais citados foram confirmados online, na pasta Legislação vigente e no repositório.</w:t>
+      </w:r>
+    </w:p>
+    <w:p>
+      <w:pPr>
+        <w:pStyle w:val="Heading2"/>
+      </w:pPr>
+      <w:r>
+        <w:rPr>
+          <w:i w:val="0"/>
+          <w:color w:val="000000"/>
+        </w:rPr>
+        <w:t>Legislação e regulamentos</w:t>
+      </w:r>
+    </w:p>
+    <w:p>
+      <w:pPr>
+        <w:spacing w:after="80"/>
+        <w:ind w:left="454" w:hanging="454"/>
+      </w:pPr>
+      <w:r>
+        <w:rPr>
+          <w:b w:val="0"/>
+          <w:i w:val="0"/>
+        </w:rPr>
+        <w:t xml:space="preserve">Código Civil, aprovado pelo Decreto-Lei n.º 47344/66, de 25 de novembro, versão em vigor. </w:t>
+      </w:r>
+      <w:hyperlink r:id="rId9">
+        <w:r>
+          <w:rPr>
+            <w:u w:val="single"/>
+          </w:rPr>
+          <w:t xml:space="preserve">https://www.pgdlisboa.pt/leis/lei_mostra_articulado.php?nid=775&amp;tabela=leis</w:t>
+        </w:r>
+      </w:hyperlink>
+    </w:p>
+    <w:p>
+      <w:pPr>
+        <w:spacing w:after="80"/>
+        <w:ind w:left="454" w:hanging="454"/>
+      </w:pPr>
+      <w:r>
+        <w:rPr>
+          <w:b w:val="0"/>
+          <w:i w:val="0"/>
+        </w:rPr>
+        <w:t xml:space="preserve">Código Penal, aprovado pelo Decreto-Lei n.º 48/95, de 15 de março, versão em vigor. </w:t>
+      </w:r>
+      <w:hyperlink r:id="rId10">
+        <w:r>
+          <w:rPr>
+            <w:u w:val="single"/>
+          </w:rPr>
+          <w:t xml:space="preserve">https://www.pgdlisboa.pt/leis/lei_mostra_articulado.php?nid=109&amp;tabela=leis</w:t>
+        </w:r>
+      </w:hyperlink>
+    </w:p>
+    <w:p>
+      <w:pPr>
+        <w:spacing w:after="80"/>
+        <w:ind w:left="454" w:hanging="454"/>
+      </w:pPr>
+      <w:r>
+        <w:rPr>
+          <w:b w:val="0"/>
+          <w:i w:val="0"/>
+        </w:rPr>
+        <w:t xml:space="preserve">Decreto-Lei n.º 276/2001, de 17 de outubro (proteção dos animais de companhia), versão consolidada. </w:t>
+      </w:r>
+      <w:hyperlink r:id="rId11">
+        <w:r>
+          <w:rPr>
+            <w:u w:val="single"/>
+          </w:rPr>
+          <w:t xml:space="preserve">https://www.pgdlisboa.pt/leis/lei_mostra_articulado.php?nid=347&amp;tabela=leis</w:t>
+        </w:r>
+      </w:hyperlink>
+    </w:p>
+    <w:p>
+      <w:pPr>
+        <w:spacing w:after="80"/>
+        <w:ind w:left="454" w:hanging="454"/>
+      </w:pPr>
+      <w:r>
+        <w:rPr>
+          <w:b w:val="0"/>
+          <w:i w:val="0"/>
+        </w:rPr>
+        <w:t xml:space="preserve">Decreto-Lei n.º 314/2003, de 17 de dezembro (Programa Nacional de Luta e Vigilância Epidemiológica da Raiva Animal e Outras Zoonoses), versão consolidada. </w:t>
+      </w:r>
+      <w:hyperlink r:id="rId12">
+        <w:r>
+          <w:rPr>
+            <w:u w:val="single"/>
+          </w:rPr>
+          <w:t xml:space="preserve">https://www.pgdlisboa.pt/leis/lei_mostra_articulado.php?nid=339&amp;tabela=leis</w:t>
+        </w:r>
+      </w:hyperlink>
+    </w:p>
+    <w:p>
+      <w:pPr>
+        <w:spacing w:after="80"/>
+        <w:ind w:left="454" w:hanging="454"/>
+      </w:pPr>
+      <w:r>
+        <w:rPr>
+          <w:b w:val="0"/>
+          <w:i w:val="0"/>
+        </w:rPr>
+        <w:t xml:space="preserve">Decreto-Lei n.º 315/2009, de 29 de outubro (animais perigosos e potencialmente perigosos). </w:t>
+      </w:r>
+      <w:hyperlink r:id="rId13">
+        <w:r>
+          <w:rPr>
+            <w:u w:val="single"/>
+          </w:rPr>
+          <w:t xml:space="preserve">https://diariodarepublica.pt/dr/detalhe/decreto-lei/315-2009-483402</w:t>
+        </w:r>
+      </w:hyperlink>
+    </w:p>
+    <w:p>
+      <w:pPr>
+        <w:spacing w:after="80"/>
+        <w:ind w:left="454" w:hanging="454"/>
+      </w:pPr>
+      <w:r>
+        <w:rPr>
+          <w:b w:val="0"/>
+          <w:i w:val="0"/>
+        </w:rPr>
+        <w:t xml:space="preserve">Lei n.º 27/2016, de 23 de agosto (rede de centros de recolha oficial e proibição do abate), Diário da República, 1.ª série, n.º 161. </w:t>
+      </w:r>
+      <w:hyperlink r:id="rId14">
+        <w:r>
+          <w:rPr>
+            <w:u w:val="single"/>
+          </w:rPr>
+          <w:t xml:space="preserve">https://files.dre.pt/1s/2016/08/16100/0282702828.pdf</w:t>
+        </w:r>
+      </w:hyperlink>
+    </w:p>
+    <w:p>
+      <w:pPr>
+        <w:spacing w:after="80"/>
+        <w:ind w:left="454" w:hanging="454"/>
+      </w:pPr>
+      <w:r>
+        <w:rPr>
+          <w:b w:val="0"/>
+          <w:i w:val="0"/>
+        </w:rPr>
+        <w:t xml:space="preserve">Lei n.º 8/2017, de 3 de março (estatuto jurídico dos animais), Diário da República, 1.ª série, n.º 45. </w:t>
+      </w:r>
+      <w:hyperlink r:id="rId15">
+        <w:r>
+          <w:rPr>
+            <w:u w:val="single"/>
+          </w:rPr>
+          <w:t xml:space="preserve">https://files.diariodarepublica.pt/1s/2017/03/04500/0114501149.pdf</w:t>
+        </w:r>
+      </w:hyperlink>
+    </w:p>
+    <w:p>
+      <w:pPr>
+        <w:spacing w:after="80"/>
+        <w:ind w:left="454" w:hanging="454"/>
+      </w:pPr>
+      <w:r>
+        <w:rPr>
+          <w:b w:val="0"/>
+          <w:i w:val="0"/>
+        </w:rPr>
+        <w:t xml:space="preserve">Portaria n.º 146/2017, de 26 de abril (centros de recolha oficial e programas CED), Diário da República, 1.ª série, n.º 81. </w:t>
+      </w:r>
+      <w:hyperlink r:id="rId16">
+        <w:r>
+          <w:rPr>
+            <w:u w:val="single"/>
+          </w:rPr>
+          <w:t xml:space="preserve">https://files.diariodarepublica.pt/1s/2017/04/08100/0205602059.pdf</w:t>
+        </w:r>
+      </w:hyperlink>
+    </w:p>
+    <w:p>
+      <w:pPr>
+        <w:spacing w:after="80"/>
+        <w:ind w:left="454" w:hanging="454"/>
+      </w:pPr>
+      <w:r>
+        <w:rPr>
+          <w:b w:val="0"/>
+          <w:i w:val="0"/>
+        </w:rPr>
+        <w:t xml:space="preserve">Decreto-Lei n.º 82/2019, de 27 de junho (Sistema de Informação de Animais de Companhia), versão consolidada. </w:t>
+      </w:r>
+      <w:hyperlink r:id="rId17">
+        <w:r>
+          <w:rPr>
+            <w:u w:val="single"/>
+          </w:rPr>
+          <w:t xml:space="preserve">https://www.pgdlisboa.pt/leis/lei_mostra_articulado.php?nid=3093&amp;tabela=leis</w:t>
+        </w:r>
+      </w:hyperlink>
+    </w:p>
+    <w:p>
+      <w:pPr>
+        <w:spacing w:after="80"/>
+        <w:ind w:left="454" w:hanging="454"/>
+      </w:pPr>
+      <w:r>
+        <w:rPr>
+          <w:b w:val="0"/>
+          <w:i w:val="0"/>
+        </w:rPr>
+        <w:t xml:space="preserve">Regulamento (UE) 2026/1818 do Parlamento Europeu e do Conselho, de 17 de junho de 2026, relativo ao bem-estar dos cães e dos gatos e à respetiva rastreabilidade, JO L, 10.8.2026. </w:t>
+      </w:r>
+      <w:hyperlink r:id="rId18">
+        <w:r>
+          <w:rPr>
+            <w:u w:val="single"/>
+          </w:rPr>
+          <w:t xml:space="preserve">https://eur-lex.europa.eu/eli/reg/2026/1818/oj/por</w:t>
+        </w:r>
+      </w:hyperlink>
+    </w:p>
+    <w:p>
+      <w:pPr>
+        <w:spacing w:after="80"/>
+        <w:ind w:left="454" w:hanging="454"/>
+      </w:pPr>
+      <w:r>
+        <w:rPr>
+          <w:b w:val="0"/>
+          <w:i w:val="0"/>
+        </w:rPr>
+        <w:t xml:space="preserve">Município do Fundão, Edital n.º 145/2023, Regulamento do Programa de Gestão das Colónias de Gatos, Diário da República, 2.ª série, n.º 16, 23.1.2023. </w:t>
+      </w:r>
+      <w:hyperlink r:id="rId19">
+        <w:r>
+          <w:rPr>
+            <w:u w:val="single"/>
+          </w:rPr>
+          <w:t xml:space="preserve">https://files.dre.pt/2s/2023/01/016000000/0033100335.pdf</w:t>
+        </w:r>
+      </w:hyperlink>
+    </w:p>
+    <w:p>
+      <w:pPr>
+        <w:spacing w:after="80"/>
+        <w:ind w:left="454" w:hanging="454"/>
+      </w:pPr>
+      <w:r>
+        <w:rPr>
+          <w:b w:val="0"/>
+          <w:i w:val="0"/>
+        </w:rPr>
+        <w:t xml:space="preserve">Município da Moita, Regulamento n.º 143/2025, Regulamento do Cuidador Informal das Colónias de Gatos, Diário da República, 2.ª série, 23.1.2025. </w:t>
+      </w:r>
+      <w:hyperlink r:id="rId20">
+        <w:r>
+          <w:rPr>
+            <w:u w:val="single"/>
+          </w:rPr>
+          <w:t xml:space="preserve">https://www.cm-moita.pt/cmmoita/uploads/writer_file/document/9889/regulamento_cuidador_informal.pdf</w:t>
+        </w:r>
+      </w:hyperlink>
+    </w:p>
+    <w:p>
+      <w:pPr>
+        <w:pStyle w:val="Heading2"/>
+      </w:pPr>
+      <w:r>
+        <w:rPr>
+          <w:i w:val="0"/>
+          <w:color w:val="000000"/>
+        </w:rPr>
+        <w:t>Projetos e iniciativas legislativas</w:t>
+      </w:r>
+    </w:p>
+    <w:p>
+      <w:pPr>
+        <w:spacing w:after="80"/>
+        <w:ind w:left="454" w:hanging="454"/>
+      </w:pPr>
+      <w:r>
+        <w:rPr>
+          <w:b w:val="0"/>
+          <w:i w:val="0"/>
+        </w:rPr>
+        <w:t xml:space="preserve">Regime Geral do Animal de Companhia (RGAC), revisão formal DAJA V1, versão de trabalho revista pelo grupo em 30.6.2026, 18h00. </w:t>
+      </w:r>
+      <w:r>
+        <w:t>Repositório: RGAC_DAJA_REV. FORMAL_V1_Versão TRABALHO - Revisto 30-06-2026 18h00 Grupo.docx.</w:t>
+      </w:r>
+    </w:p>
+    <w:p>
+      <w:pPr>
+        <w:spacing w:after="80"/>
+        <w:ind w:left="454" w:hanging="454"/>
+      </w:pPr>
+      <w:r>
+        <w:rPr>
+          <w:b w:val="0"/>
+          <w:i w:val="0"/>
+        </w:rPr>
+        <w:t xml:space="preserve">Regime Geral do Bem-Estar dos Animais de Companhia (RGBEAC), proposta de junho de 2025. </w:t>
+      </w:r>
+      <w:r>
+        <w:t>Repositório: RGBEAC_junh_2025 Original com Índice.docx.</w:t>
+      </w:r>
+    </w:p>
+    <w:p>
+      <w:pPr>
+        <w:spacing w:after="80"/>
+        <w:ind w:left="454" w:hanging="454"/>
+      </w:pPr>
+      <w:r>
+        <w:rPr>
+          <w:b w:val="0"/>
+          <w:i w:val="0"/>
+        </w:rPr>
+        <w:t xml:space="preserve">RGBEAC, versão comentada de 19.2.2026. </w:t>
+      </w:r>
+      <w:r>
+        <w:t>Repositório: rgbeac 19.2.2026 (002).docx.</w:t>
+      </w:r>
+    </w:p>
+    <w:p>
+      <w:pPr>
+        <w:spacing w:after="80"/>
+        <w:ind w:left="454" w:hanging="454"/>
+      </w:pPr>
+      <w:r>
+        <w:rPr>
+          <w:b w:val="0"/>
+          <w:i w:val="0"/>
+        </w:rPr>
+        <w:t xml:space="preserve">ICNF (2021). Projeto de alteração da Portaria n.º 146/2017, enviado à ANMP. </w:t>
+      </w:r>
+      <w:hyperlink r:id="rId21">
+        <w:r>
+          <w:rPr>
+            <w:u w:val="single"/>
+          </w:rPr>
+          <w:t xml:space="preserve">https://anmp.pt/file-viewer/?pstid=41508</w:t>
+        </w:r>
+      </w:hyperlink>
+    </w:p>
+    <w:p>
+      <w:pPr>
+        <w:spacing w:after="80"/>
+        <w:ind w:left="454" w:hanging="454"/>
+      </w:pPr>
+      <w:r>
+        <w:rPr>
+          <w:b w:val="0"/>
+          <w:i w:val="0"/>
+        </w:rPr>
+        <w:t xml:space="preserve">PAN (2023). Projeto de Lei n.º 662/XV/1.ª, reconhece a figura do animal comunitário. </w:t>
+      </w:r>
+      <w:hyperlink r:id="rId22">
+        <w:r>
+          <w:rPr>
+            <w:u w:val="single"/>
+          </w:rPr>
+          <w:t xml:space="preserve">https://app.parlamento.pt/webutils/docs/doc.pdf?path=6148523063484d364c793968636d356c6443397a6158526c63793959566b786c5a79394562324e31625756756447397a5357357059326c6864476c32595338774d44566d4d7a426c4e7931694d44557a4c54526c4e446b744f5455774d79316a4f5459794e544e6d4d47566a4e6a49755a47396a65413d3d&amp;fich=005f30e7-b053-4e49-9503-c96253f0ec62.docx&amp;Inline=true</w:t>
+        </w:r>
+      </w:hyperlink>
+    </w:p>
+    <w:p>
+      <w:pPr>
+        <w:spacing w:after="80"/>
+        <w:ind w:left="454" w:hanging="454"/>
+      </w:pPr>
+      <w:r>
+        <w:rPr>
+          <w:b w:val="0"/>
+          <w:i w:val="0"/>
+        </w:rPr>
+        <w:t xml:space="preserve">Assembleia da República (2024). Nota técnica ao Projeto de Lei n.º 88/XVI/1.ª (PAN), 31.5.2024. </w:t>
+      </w:r>
+      <w:hyperlink r:id="rId23">
+        <w:r>
+          <w:rPr>
+            <w:u w:val="single"/>
+          </w:rPr>
+          <w:t xml:space="preserve">https://app.parlamento.pt/webutils/docs/doc.pdf?path=6148523063484d364c793968636d356c6443397a6158526c63793959566b6c4d5a5763765130394e4c7a64445156426c6379394562324e31625756756447397a5357357059326c6864476c3259554e7662576c7a633246764c7a4d344d6d49795a5751334c574977597a59744e44457a596930354d574d794c544d354e446c684d445a6a4e474a6c597935775a47593d&amp;fich=382b2ed7-b0c6-413b-91c2-3949a06c4bec.pdf&amp;Inline=true</w:t>
+        </w:r>
+      </w:hyperlink>
+    </w:p>
+    <w:p>
+      <w:pPr>
+        <w:pStyle w:val="Heading2"/>
+      </w:pPr>
+      <w:r>
+        <w:rPr>
+          <w:i w:val="0"/>
+          <w:color w:val="000000"/>
+        </w:rPr>
+        <w:t>Documentos oficiais, estratégias e relatórios</w:t>
+      </w:r>
+    </w:p>
+    <w:p>
+      <w:pPr>
+        <w:spacing w:after="80"/>
+        <w:ind w:left="454" w:hanging="454"/>
+      </w:pPr>
+      <w:r>
+        <w:rPr>
+          <w:b w:val="0"/>
+          <w:i w:val="0"/>
+        </w:rPr>
+        <w:t xml:space="preserve">ICNF (2023). Estratégia Nacional para os Animais Errantes (ENAE), versão submetida a consulta pública. </w:t>
+      </w:r>
+      <w:hyperlink r:id="rId24">
+        <w:r>
+          <w:rPr>
+            <w:u w:val="single"/>
+          </w:rPr>
+          <w:t xml:space="preserve">https://www.icnf.pt/api/file/doc/41f8f44aee23be1a</w:t>
+        </w:r>
+      </w:hyperlink>
+    </w:p>
+    <w:p>
+      <w:pPr>
+        <w:spacing w:after="80"/>
+        <w:ind w:left="454" w:hanging="454"/>
+      </w:pPr>
+      <w:r>
+        <w:rPr>
+          <w:b w:val="0"/>
+          <w:i w:val="0"/>
+        </w:rPr>
+        <w:t xml:space="preserve">DGAV (2021). Relatório final do Grupo de Trabalho para o Bem-Estar Animal: avaliação da implementação da Lei n.º 27/2016. </w:t>
+      </w:r>
+      <w:hyperlink r:id="rId25">
+        <w:r>
+          <w:rPr>
+            <w:u w:val="single"/>
+          </w:rPr>
+          <w:t xml:space="preserve">https://www.dgav.pt/wp-content/uploads/2021/08/Relatorio-FINAL-avaliacao-da-implementacao-da-Lei-27-2016.pdf</w:t>
+        </w:r>
+      </w:hyperlink>
+    </w:p>
+    <w:p>
+      <w:pPr>
+        <w:spacing w:after="80"/>
+        <w:ind w:left="454" w:hanging="454"/>
+      </w:pPr>
+      <w:r>
+        <w:rPr>
+          <w:b w:val="0"/>
+          <w:i w:val="0"/>
+        </w:rPr>
+        <w:t xml:space="preserve">Provedor de Justiça (1996). Recomendação n.º 82/A/96, à Câmara Municipal de Oeiras, 18.10.1996. </w:t>
+      </w:r>
+      <w:hyperlink r:id="rId26">
+        <w:r>
+          <w:rPr>
+            <w:u w:val="single"/>
+          </w:rPr>
+          <w:t xml:space="preserve">https://www.provedor-jus.pt/documentos/082A_96.pdf</w:t>
+        </w:r>
+      </w:hyperlink>
+    </w:p>
+    <w:p>
+      <w:pPr>
+        <w:spacing w:after="80"/>
+        <w:ind w:left="454" w:hanging="454"/>
+      </w:pPr>
+      <w:r>
+        <w:rPr>
+          <w:b w:val="0"/>
+          <w:i w:val="0"/>
+        </w:rPr>
+        <w:t xml:space="preserve">Provedor de Justiça (2009). Canídeos: captura, alojamento e abate, anotação ao processo R4579/08 (Câmara Municipal das Lajes do Pico), 8.5.2009. </w:t>
+      </w:r>
+      <w:hyperlink r:id="rId27">
+        <w:r>
+          <w:rPr>
+            <w:u w:val="single"/>
+          </w:rPr>
+          <w:t xml:space="preserve">https://www.provedor-jus.pt/documentos/canideos-captura-alojamento-e-abate/</w:t>
+        </w:r>
+      </w:hyperlink>
+    </w:p>
+    <w:p>
+      <w:pPr>
+        <w:spacing w:after="80"/>
+        <w:ind w:left="454" w:hanging="454"/>
+      </w:pPr>
+      <w:r>
+        <w:rPr>
+          <w:b w:val="0"/>
+          <w:i w:val="0"/>
+        </w:rPr>
+        <w:t xml:space="preserve">Provedor de Justiça (2013). Recomendação n.º 4/A/2013, acumulação de resíduos e animais (síndrome de Diógenes), 6.5.2013. </w:t>
+      </w:r>
+      <w:hyperlink r:id="rId28">
+        <w:r>
+          <w:rPr>
+            <w:u w:val="single"/>
+          </w:rPr>
+          <w:t xml:space="preserve">https://www.provedor-jus.pt/documentos/ambiente-salubridade-habitacao-acumulacao-de-residuos-saude-mental-sindrome-de-diogenes-004-a-2013/</w:t>
+        </w:r>
+      </w:hyperlink>
+    </w:p>
+    <w:p>
+      <w:pPr>
+        <w:spacing w:after="80"/>
+        <w:ind w:left="454" w:hanging="454"/>
+      </w:pPr>
+      <w:r>
+        <w:rPr>
+          <w:b w:val="0"/>
+          <w:i w:val="0"/>
+        </w:rPr>
+        <w:t xml:space="preserve">Provedor de Justiça (2021). Relatório à Assembleia da República 2020. </w:t>
+      </w:r>
+      <w:hyperlink r:id="rId29">
+        <w:r>
+          <w:rPr>
+            <w:u w:val="single"/>
+          </w:rPr>
+          <w:t xml:space="preserve">https://www.provedor-jus.pt/documentos/Relat2020%20_Relatorio.pdf</w:t>
+        </w:r>
+      </w:hyperlink>
+    </w:p>
+    <w:p>
+      <w:pPr>
+        <w:spacing w:after="80"/>
+        <w:ind w:left="454" w:hanging="454"/>
+      </w:pPr>
+      <w:r>
+        <w:rPr>
+          <w:b w:val="0"/>
+          <w:i w:val="0"/>
+        </w:rPr>
+        <w:t xml:space="preserve">Provedor de Justiça (2024). Relatório à Assembleia da República 2023. </w:t>
+      </w:r>
+      <w:hyperlink r:id="rId30">
+        <w:r>
+          <w:rPr>
+            <w:u w:val="single"/>
+          </w:rPr>
+          <w:t xml:space="preserve">https://www.provedor-jus.pt/documentos/Relatorio%202023.pdf</w:t>
+        </w:r>
+      </w:hyperlink>
+    </w:p>
+    <w:p>
+      <w:pPr>
+        <w:spacing w:after="80"/>
+        <w:ind w:left="454" w:hanging="454"/>
+      </w:pPr>
+      <w:r>
+        <w:rPr>
+          <w:b w:val="0"/>
+          <w:i w:val="0"/>
+        </w:rPr>
+        <w:t xml:space="preserve">Comissão Europeia (2024). Commission Staff Working Document SWD(2024) 88 final, Summarising evidence supporting the legislative proposal on the welfare of dogs and cats and their traceability, 27.3.2024. </w:t>
+      </w:r>
+      <w:hyperlink r:id="rId31">
+        <w:r>
+          <w:rPr>
+            <w:u w:val="single"/>
+          </w:rPr>
+          <w:t xml:space="preserve">https://food.ec.europa.eu/document/download/caf8cd1d-967a-4e60-a0e5-19401be1c6b3_en?filename=aw_awp_leg_dog-cat_swd-2024-88.pdf</w:t>
+        </w:r>
+      </w:hyperlink>
+    </w:p>
+    <w:p>
+      <w:pPr>
+        <w:spacing w:after="80"/>
+        <w:ind w:left="454" w:hanging="454"/>
+      </w:pPr>
+      <w:r>
+        <w:rPr>
+          <w:b w:val="0"/>
+          <w:i w:val="0"/>
+        </w:rPr>
+        <w:t xml:space="preserve">WOAH (2024). Terrestrial Animal Health Code, capítulo 7.7, Dog population management. </w:t>
+      </w:r>
+      <w:hyperlink r:id="rId32">
+        <w:r>
+          <w:rPr>
+            <w:u w:val="single"/>
+          </w:rPr>
+          <w:t xml:space="preserve">https://www.woah.org/fileadmin/Home/eng/Health_standards/tahc/2023/chapitre_aw_stray_dog.pdf</w:t>
+        </w:r>
+      </w:hyperlink>
+    </w:p>
+    <w:p>
+      <w:pPr>
+        <w:pStyle w:val="Heading2"/>
+      </w:pPr>
+      <w:r>
+        <w:rPr>
+          <w:i w:val="0"/>
+          <w:color w:val="000000"/>
+        </w:rPr>
+        <w:t>Pareceres de ordens, associações e ONG</w:t>
+      </w:r>
+    </w:p>
+    <w:p>
+      <w:pPr>
+        <w:spacing w:after="80"/>
+        <w:ind w:left="454" w:hanging="454"/>
+      </w:pPr>
+      <w:r>
+        <w:rPr>
+          <w:b w:val="0"/>
+          <w:i w:val="0"/>
+        </w:rPr>
+        <w:t xml:space="preserve">Ordem dos Médicos Veterinários (2015). Parecer sobre o abandono de animais em centros de atendimento médico-veterinário, novembro de 2015. </w:t>
+      </w:r>
+      <w:hyperlink r:id="rId33">
+        <w:r>
+          <w:rPr>
+            <w:u w:val="single"/>
+          </w:rPr>
+          <w:t xml:space="preserve">https://www.omv.pt/dmdocuments/vi_formacao_omv/abandono_animais_camv_ultimoparecer_nov2015.pdf</w:t>
+        </w:r>
+      </w:hyperlink>
+    </w:p>
+    <w:p>
+      <w:pPr>
+        <w:spacing w:after="80"/>
+        <w:ind w:left="454" w:hanging="454"/>
+      </w:pPr>
+      <w:r>
+        <w:rPr>
+          <w:b w:val="0"/>
+          <w:i w:val="0"/>
+        </w:rPr>
+        <w:t xml:space="preserve">Ordem dos Médicos Veterinários (2024). Parecer sobre o Projeto de Lei n.º 662/XV/1.ª (PAN), Of. n.º 02/CD/2024, 5.1.2024. </w:t>
+      </w:r>
+      <w:hyperlink r:id="rId34">
+        <w:r>
+          <w:rPr>
+            <w:u w:val="single"/>
+          </w:rPr>
+          <w:t xml:space="preserve">https://app.parlamento.pt/webutils/docs/doc.pdf?path=6148523063484d364c793968636d356c6443397a6158526c63793959566b786c5a793944543030764d5446445155564f5253394562324e31625756756447397a5357357059326c6864476c3259554e7662576c7a633246764c7a646c5a4746685a5749354c54466c4d4755744e4451305a4331684f544a6b4c57526c5a4464685a574e6a4f5467784d5335775a47593d&amp;fich=7edaaeb9-1e0e-444d-a92d-ded7aecc9811.pdf&amp;Inline=true</w:t>
+        </w:r>
+      </w:hyperlink>
+    </w:p>
+    <w:p>
+      <w:pPr>
+        <w:spacing w:after="80"/>
+        <w:ind w:left="454" w:hanging="454"/>
+      </w:pPr>
+      <w:r>
+        <w:rPr>
+          <w:b w:val="0"/>
+          <w:i w:val="0"/>
+        </w:rPr>
+        <w:t xml:space="preserve">APMVEAC (2021). Revisão crítica da legislação sobre animais de companhia, 9.4.2021. </w:t>
+      </w:r>
+      <w:hyperlink r:id="rId35">
+        <w:r>
+          <w:rPr>
+            <w:u w:val="single"/>
+          </w:rPr>
+          <w:t xml:space="preserve">https://apmveac.pt/wp-content/uploads/2021/04/Legislacao.Animais.Companhia_09-04-2021-amarelo-final-.pdf</w:t>
+        </w:r>
+      </w:hyperlink>
+    </w:p>
+    <w:p>
+      <w:pPr>
+        <w:spacing w:after="80"/>
+        <w:ind w:left="454" w:hanging="454"/>
+      </w:pPr>
+      <w:r>
+        <w:rPr>
+          <w:b w:val="0"/>
+          <w:i w:val="0"/>
+        </w:rPr>
+        <w:t xml:space="preserve">APMVEAC (2023). Parecer à consulta pública da Estratégia Nacional para os Animais Errantes, setembro de 2023. </w:t>
+      </w:r>
+      <w:hyperlink r:id="rId36">
+        <w:r>
+          <w:rPr>
+            <w:u w:val="single"/>
+          </w:rPr>
+          <w:t xml:space="preserve">https://apmveac.pt/wp-content/uploads/2023/09/Parecer-APMVEAC-Consulta-Publica-ENAE.pdf</w:t>
+        </w:r>
+      </w:hyperlink>
+    </w:p>
+    <w:p>
+      <w:pPr>
+        <w:spacing w:after="80"/>
+        <w:ind w:left="454" w:hanging="454"/>
+      </w:pPr>
+      <w:r>
+        <w:rPr>
+          <w:b w:val="0"/>
+          <w:i w:val="0"/>
+        </w:rPr>
+        <w:t xml:space="preserve">ARPA (2022). Parecer sobre o Decreto-Lei n.º 82/2019, dezembro de 2022. </w:t>
+      </w:r>
+      <w:hyperlink r:id="rId37">
+        <w:r>
+          <w:rPr>
+            <w:u w:val="single"/>
+          </w:rPr>
+          <w:t xml:space="preserve">https://www.arpa-associacao.pt/media/attachments/2022/12/14/parecer-arpa-versAo-4-final.pdf</w:t>
+        </w:r>
+      </w:hyperlink>
+    </w:p>
+    <w:p>
+      <w:pPr>
+        <w:spacing w:after="80"/>
+        <w:ind w:left="454" w:hanging="454"/>
+      </w:pPr>
+      <w:r>
+        <w:rPr>
+          <w:b w:val="0"/>
+          <w:i w:val="0"/>
+        </w:rPr>
+        <w:t xml:space="preserve">SPEA (2020). Parecer aos planos de gestão dos parques naturais de ilha dos Açores. </w:t>
+      </w:r>
+      <w:hyperlink r:id="rId38">
+        <w:r>
+          <w:rPr>
+            <w:u w:val="single"/>
+          </w:rPr>
+          <w:t xml:space="preserve">https://www.spea.pt/wp-content/uploads/2020/09/ParecerSPEA_Planos-Gestao-Parques-Naturais-Ilha-2020.pdf</w:t>
+        </w:r>
+      </w:hyperlink>
+    </w:p>
+    <w:p>
+      <w:pPr>
+        <w:spacing w:after="80"/>
+        <w:ind w:left="454" w:hanging="454"/>
+      </w:pPr>
+      <w:r>
+        <w:rPr>
+          <w:b w:val="0"/>
+          <w:i w:val="0"/>
+        </w:rPr>
+        <w:t xml:space="preserve">SPEA (2021). Um gato feliz e alimentado mantém o passarinho afastado?, 27.12.2021. </w:t>
+      </w:r>
+      <w:hyperlink r:id="rId39">
+        <w:r>
+          <w:rPr>
+            <w:u w:val="single"/>
+          </w:rPr>
+          <w:t xml:space="preserve">https://spea.pt/um-gato-feliz-e-alimentado-mantem-o-passarinho-afastado/</w:t>
+        </w:r>
+      </w:hyperlink>
+    </w:p>
+    <w:p>
+      <w:pPr>
+        <w:spacing w:after="80"/>
+        <w:ind w:left="454" w:hanging="454"/>
+      </w:pPr>
+      <w:r>
+        <w:rPr>
+          <w:b w:val="0"/>
+          <w:i w:val="0"/>
+        </w:rPr>
+        <w:t xml:space="preserve">FEDRA (2024). Plano de políticas públicas. </w:t>
+      </w:r>
+      <w:r>
+        <w:t>Repositório: FEDRA - Plano de políticas públcias.pdf.</w:t>
+      </w:r>
+    </w:p>
+    <w:p>
+      <w:pPr>
+        <w:spacing w:after="80"/>
+        <w:ind w:left="454" w:hanging="454"/>
+      </w:pPr>
+      <w:r>
+        <w:rPr>
+          <w:b w:val="0"/>
+          <w:i w:val="0"/>
+        </w:rPr>
+        <w:t xml:space="preserve">Movimento de Intervenção pelas Matilhas (Coimbra). Projeto. </w:t>
+      </w:r>
+      <w:hyperlink r:id="rId40">
+        <w:r>
+          <w:rPr>
+            <w:u w:val="single"/>
+          </w:rPr>
+          <w:t xml:space="preserve">https://matilhascoimbra.pt/pages/projecto-2</w:t>
+        </w:r>
+      </w:hyperlink>
+    </w:p>
+    <w:p>
+      <w:pPr>
+        <w:pStyle w:val="Heading2"/>
+      </w:pPr>
+      <w:r>
+        <w:rPr>
+          <w:i w:val="0"/>
+          <w:color w:val="000000"/>
+        </w:rPr>
+        <w:t>Partidos</w:t>
+      </w:r>
+    </w:p>
+    <w:p>
+      <w:pPr>
+        <w:spacing w:after="80"/>
+        <w:ind w:left="454" w:hanging="454"/>
+      </w:pPr>
+      <w:r>
+        <w:rPr>
+          <w:b w:val="0"/>
+          <w:i w:val="0"/>
+        </w:rPr>
+        <w:t xml:space="preserve">PAN (2025). PAN destaca vitórias no bem-estar animal, mas denuncia retrocesso grave no Orçamento do Estado para 2026. </w:t>
+      </w:r>
+      <w:hyperlink r:id="rId41">
+        <w:r>
+          <w:rPr>
+            <w:u w:val="single"/>
+          </w:rPr>
+          <w:t xml:space="preserve">https://www.pan.com.pt/pan-destaca-vitorias-no-bem-estar-animal-mas-denuncia-retrocesso-grave-no-orcamento-do-estado-para-2026/</w:t>
+        </w:r>
+      </w:hyperlink>
+    </w:p>
+    <w:p>
+      <w:pPr>
+        <w:spacing w:after="80"/>
+        <w:ind w:left="454" w:hanging="454"/>
+      </w:pPr>
+      <w:r>
+        <w:rPr>
+          <w:b w:val="0"/>
+          <w:i w:val="0"/>
+        </w:rPr>
+        <w:t xml:space="preserve">PCP (2021). Solução: prevenção pela esterilização, rede pública de veterinários, não abate de animais abandonados, 12.11.2021. </w:t>
+      </w:r>
+      <w:hyperlink r:id="rId42">
+        <w:r>
+          <w:rPr>
+            <w:u w:val="single"/>
+          </w:rPr>
+          <w:t xml:space="preserve">https://www.pcp.pt/solucao-prevencao-pela-esterilizacao-rede-publica-de-veterinarios-nao-abate-de-animais-abandonados</w:t>
+        </w:r>
+      </w:hyperlink>
+    </w:p>
+    <w:p>
+      <w:pPr>
+        <w:spacing w:after="80"/>
+        <w:ind w:left="454" w:hanging="454"/>
+      </w:pPr>
+      <w:r>
+        <w:rPr>
+          <w:b w:val="0"/>
+          <w:i w:val="0"/>
+        </w:rPr>
+        <w:t xml:space="preserve">PCP (2025). Campanha nacional de esterilização de animais errantes, proposta ao Orçamento do Estado para 2026, 5.11.2025. </w:t>
+      </w:r>
+      <w:hyperlink r:id="rId43">
+        <w:r>
+          <w:rPr>
+            <w:u w:val="single"/>
+          </w:rPr>
+          <w:t xml:space="preserve">https://www.pcp.pt/campanha-nacional-de-esterilizacao-de-animais-errantes-0</w:t>
+        </w:r>
+      </w:hyperlink>
+    </w:p>
+    <w:p>
+      <w:pPr>
+        <w:spacing w:after="80"/>
+        <w:ind w:left="454" w:hanging="454"/>
+      </w:pPr>
+      <w:r>
+        <w:rPr>
+          <w:b w:val="0"/>
+          <w:i w:val="0"/>
+        </w:rPr>
+        <w:t xml:space="preserve">Livre (2024). Programa eleitoral, proposta N.13. </w:t>
+      </w:r>
+      <w:hyperlink r:id="rId44">
+        <w:r>
+          <w:rPr>
+            <w:u w:val="single"/>
+          </w:rPr>
+          <w:t xml:space="preserve">https://programa.partidolivre.pt/propostas/N.13/</w:t>
+        </w:r>
+      </w:hyperlink>
+    </w:p>
+    <w:p>
+      <w:pPr>
+        <w:spacing w:after="80"/>
+        <w:ind w:left="454" w:hanging="454"/>
+      </w:pPr>
+      <w:r>
+        <w:rPr>
+          <w:b w:val="0"/>
+          <w:i w:val="0"/>
+        </w:rPr>
+        <w:t xml:space="preserve">Maratona pelos Animais (2024). Respostas completas dos partidos, março de 2024. </w:t>
+      </w:r>
+      <w:hyperlink r:id="rId45">
+        <w:r>
+          <w:rPr>
+            <w:u w:val="single"/>
+          </w:rPr>
+          <w:t xml:space="preserve">https://maratonapelosanimais.pt/wp-content/uploads/2024/03/respostas-completas.pdf</w:t>
+        </w:r>
+      </w:hyperlink>
+    </w:p>
+    <w:p>
+      <w:pPr>
+        <w:pStyle w:val="Heading2"/>
+      </w:pPr>
+      <w:r>
+        <w:rPr>
+          <w:i w:val="0"/>
+          <w:color w:val="000000"/>
+        </w:rPr>
+        <w:t>Doutrina</w:t>
+      </w:r>
+    </w:p>
+    <w:p>
+      <w:pPr>
+        <w:spacing w:after="80"/>
+        <w:ind w:left="454" w:hanging="454"/>
+      </w:pPr>
+      <w:r>
+        <w:rPr>
+          <w:b w:val="0"/>
+          <w:i w:val="0"/>
+        </w:rPr>
+        <w:t xml:space="preserve">Brito, Teresa Quintela de (2019). O abandono de animais de companhia. Revista Jurídica Luso-Brasileira, ano 5, n.º 2, pp. 77-95. </w:t>
+      </w:r>
+      <w:hyperlink r:id="rId46">
+        <w:r>
+          <w:rPr>
+            <w:u w:val="single"/>
+          </w:rPr>
+          <w:t xml:space="preserve">https://www.cidp.pt/revistas/rjlb/2019/2/2019_02_0077_0095.pdf</w:t>
+        </w:r>
+      </w:hyperlink>
+    </w:p>
+    <w:p>
+      <w:pPr>
+        <w:spacing w:after="80"/>
+        <w:ind w:left="454" w:hanging="454"/>
+      </w:pPr>
+      <w:r>
+        <w:rPr>
+          <w:b w:val="0"/>
+          <w:i w:val="0"/>
+        </w:rPr>
+        <w:t xml:space="preserve">Simões, Cátia (2019). O papel dos municípios na gestão do bem-estar animal: desafios legais e gestão municipal. Revista Jurídica Luso-Brasileira, ano 5, n.º 2, pp. 305-348. </w:t>
+      </w:r>
+      <w:hyperlink r:id="rId47">
+        <w:r>
+          <w:rPr>
+            <w:u w:val="single"/>
+          </w:rPr>
+          <w:t xml:space="preserve">https://www.cidp.pt/revistas/rjlb/2019/2/2019_02_0305_0348.pdf</w:t>
+        </w:r>
+      </w:hyperlink>
+    </w:p>
+    <w:p>
+      <w:pPr>
+        <w:spacing w:after="80"/>
+        <w:ind w:left="454" w:hanging="454"/>
+      </w:pPr>
+      <w:r>
+        <w:rPr>
+          <w:b w:val="0"/>
+          <w:i w:val="0"/>
+        </w:rPr>
+        <w:t xml:space="preserve">Araújo, Fernando; Marinho, Carlos; Farias, Raúl; Sousa, Susana Aires de; Dias, Cristina (2022). Direito dos animais. Lisboa: Centro de Estudos Judiciários, coleção Formação Contínua. </w:t>
+      </w:r>
+      <w:hyperlink r:id="rId48">
+        <w:r>
+          <w:rPr>
+            <w:u w:val="single"/>
+          </w:rPr>
+          <w:t xml:space="preserve">https://cej.justica.gov.pt/LinkClick.aspx?fileticket=VpuQj7jZ-us%3D&amp;portalid=30</w:t>
+        </w:r>
+      </w:hyperlink>
+    </w:p>
+    <w:p>
+      <w:pPr>
+        <w:pStyle w:val="Heading2"/>
+      </w:pPr>
+      <w:r>
+        <w:rPr>
+          <w:i w:val="0"/>
+          <w:color w:val="000000"/>
+        </w:rPr>
+        <w:t>Jurisprudência</w:t>
+      </w:r>
+    </w:p>
+    <w:p>
+      <w:pPr>
+        <w:spacing w:after="80"/>
+        <w:ind w:left="454" w:hanging="454"/>
+      </w:pPr>
+      <w:r>
+        <w:rPr>
+          <w:b w:val="0"/>
+          <w:i w:val="0"/>
+        </w:rPr>
+        <w:t xml:space="preserve">Tribunal da Relação de Lisboa, acórdão de 24.11.2009, proc. 3121/03.4TBCSC.L1-6. </w:t>
+      </w:r>
+      <w:hyperlink r:id="rId49">
+        <w:r>
+          <w:rPr>
+            <w:u w:val="single"/>
+          </w:rPr>
+          <w:t xml:space="preserve">https://jurisprudencia.pt/acordao/76412/</w:t>
+        </w:r>
+      </w:hyperlink>
+    </w:p>
+    <w:p>
+      <w:pPr>
+        <w:spacing w:after="80"/>
+        <w:ind w:left="454" w:hanging="454"/>
+      </w:pPr>
+      <w:r>
+        <w:rPr>
+          <w:b w:val="0"/>
+          <w:i w:val="0"/>
+        </w:rPr>
+        <w:t xml:space="preserve">Tribunal da Relação de Coimbra, acórdão de 11.7.2012, proc. 281/10.1TBCV.C1. </w:t>
+      </w:r>
+      <w:hyperlink r:id="rId50">
+        <w:r>
+          <w:rPr>
+            <w:u w:val="single"/>
+          </w:rPr>
+          <w:t xml:space="preserve">https://trc.pt/responsabilidade-civil-danos-causados-por-animais-dever-de-vigilancia/</w:t>
+        </w:r>
+      </w:hyperlink>
+    </w:p>
+    <w:p>
+      <w:pPr>
+        <w:spacing w:after="80"/>
+        <w:ind w:left="454" w:hanging="454"/>
+      </w:pPr>
+      <w:r>
+        <w:rPr>
+          <w:b w:val="0"/>
+          <w:i w:val="0"/>
+        </w:rPr>
+        <w:t xml:space="preserve">Supremo Tribunal de Justiça, acórdão de 14.11.2013, proc. 478/05.6TBMGL.C1.S1. </w:t>
+      </w:r>
+      <w:hyperlink r:id="rId51">
+        <w:r>
+          <w:rPr>
+            <w:u w:val="single"/>
+          </w:rPr>
+          <w:t xml:space="preserve">https://jurisprudencia.pt/acordao/128487/</w:t>
+        </w:r>
+      </w:hyperlink>
+    </w:p>
+    <w:p>
+      <w:pPr>
+        <w:spacing w:after="80"/>
+        <w:ind w:left="454" w:hanging="454"/>
+      </w:pPr>
+      <w:r>
+        <w:rPr>
+          <w:b w:val="0"/>
+          <w:i w:val="0"/>
+        </w:rPr>
+        <w:t xml:space="preserve">Tribunal Constitucional, Acórdão n.º 867/2021, de 10.11.2021. </w:t>
+      </w:r>
+      <w:hyperlink r:id="rId52">
+        <w:r>
+          <w:rPr>
+            <w:u w:val="single"/>
+          </w:rPr>
+          <w:t xml:space="preserve">https://www.tribunalconstitucional.pt/tc/acordaos/20210867.html</w:t>
+        </w:r>
+      </w:hyperlink>
+    </w:p>
+    <w:p>
+      <w:pPr>
+        <w:spacing w:after="80"/>
+        <w:ind w:left="454" w:hanging="454"/>
+      </w:pPr>
+      <w:r>
+        <w:rPr>
+          <w:b w:val="0"/>
+          <w:i w:val="0"/>
+        </w:rPr>
+        <w:t xml:space="preserve">Tribunal Constitucional, Acórdão n.º 70/2024, de 23.1.2024 (Plenário). </w:t>
+      </w:r>
+      <w:hyperlink r:id="rId53">
+        <w:r>
+          <w:rPr>
+            <w:u w:val="single"/>
+          </w:rPr>
+          <w:t xml:space="preserve">https://www.tribunalconstitucional.pt/tc/acordaos/20240070.html</w:t>
+        </w:r>
+      </w:hyperlink>
+    </w:p>
+    <w:p>
+      <w:pPr>
+        <w:spacing w:after="80"/>
+        <w:ind w:left="454" w:hanging="454"/>
+      </w:pPr>
+      <w:r>
+        <w:rPr>
+          <w:b w:val="0"/>
+          <w:i w:val="0"/>
+        </w:rPr>
+        <w:t xml:space="preserve">Tribunal da Relação de Coimbra, acórdão de 7.2.2024, proc. 6/22.9GCPBL.C1. </w:t>
+      </w:r>
+      <w:hyperlink r:id="rId54">
+        <w:r>
+          <w:rPr>
+            <w:u w:val="single"/>
+          </w:rPr>
+          <w:t xml:space="preserve">https://jurisprudencia.pt/acordao/221373/</w:t>
+        </w:r>
+      </w:hyperlink>
+    </w:p>
+    <w:p>
+      <w:pPr>
+        <w:spacing w:after="80"/>
+        <w:ind w:left="454" w:hanging="454"/>
+      </w:pPr>
+      <w:r>
+        <w:rPr>
+          <w:b w:val="0"/>
+          <w:i w:val="0"/>
+        </w:rPr>
+        <w:t xml:space="preserve">Tribunal Constitucional, Acórdão n.º 478/2024, de 20.6.2024. </w:t>
+      </w:r>
+      <w:hyperlink r:id="rId55">
+        <w:r>
+          <w:rPr>
+            <w:u w:val="single"/>
+          </w:rPr>
+          <w:t xml:space="preserve">https://www.tribunalconstitucional.pt/tc/acordaos/20240478.html</w:t>
+        </w:r>
+      </w:hyperlink>
+    </w:p>
+    <w:p>
+      <w:pPr>
+        <w:spacing w:after="80"/>
+        <w:ind w:left="454" w:hanging="454"/>
+      </w:pPr>
+      <w:r>
+        <w:rPr>
+          <w:b w:val="0"/>
+          <w:i w:val="0"/>
+        </w:rPr>
+        <w:t xml:space="preserve">Tribunal da Relação de Lisboa, acórdão de 30.4.2025, proc. 1642/24.4T8AMD.L1-8. </w:t>
+      </w:r>
+      <w:hyperlink r:id="rId56">
+        <w:r>
+          <w:rPr>
+            <w:u w:val="single"/>
+          </w:rPr>
+          <w:t xml:space="preserve">https://www.dgsi.pt/jtrl.nsf/33182fc732316039802565fa00497eec/7462ba7a0546bac680258c8b0049a31e?OpenDocument</w:t>
+        </w:r>
+      </w:hyperlink>
+    </w:p>
+    <w:p>
+      <w:pPr>
+        <w:pStyle w:val="Heading2"/>
+      </w:pPr>
+      <w:r>
+        <w:rPr>
+          <w:i w:val="0"/>
+          <w:color w:val="000000"/>
+        </w:rPr>
+        <w:t>Artigos científicos</w:t>
+      </w:r>
+    </w:p>
+    <w:p>
+      <w:pPr>
+        <w:spacing w:after="80"/>
+        <w:ind w:left="454" w:hanging="454"/>
+      </w:pPr>
+      <w:r>
+        <w:rPr>
+          <w:b w:val="0"/>
+          <w:i w:val="0"/>
+        </w:rPr>
+        <w:t xml:space="preserve">Loss, S. R.; Will, T.; Marra, P. P. (2013). The impact of free-ranging domestic cats on wildlife of the United States. Nature Communications, 4, 1396. </w:t>
+      </w:r>
+      <w:hyperlink r:id="rId57">
+        <w:r>
+          <w:rPr>
+            <w:u w:val="single"/>
+          </w:rPr>
+          <w:t xml:space="preserve">https://www.nature.com/articles/ncomms2380</w:t>
+        </w:r>
+      </w:hyperlink>
+    </w:p>
+    <w:p>
+      <w:pPr>
+        <w:spacing w:after="80"/>
+        <w:ind w:left="454" w:hanging="454"/>
+      </w:pPr>
+      <w:r>
+        <w:rPr>
+          <w:b w:val="0"/>
+          <w:i w:val="0"/>
+        </w:rPr>
+        <w:t xml:space="preserve">Foley, P.; Foley, J. E.; Levy, J. K.; Paik, T. (2005). Analysis of the impact of trap-neuter-return programs on populations of feral cats. Journal of the American Veterinary Medical Association, 227(11), 1775-1781. </w:t>
+      </w:r>
+      <w:hyperlink r:id="rId58">
+        <w:r>
+          <w:rPr>
+            <w:u w:val="single"/>
+          </w:rPr>
+          <w:t xml:space="preserve">https://doi.org/10.2460/javma.2005.227.1775</w:t>
+        </w:r>
+      </w:hyperlink>
+    </w:p>
+    <w:p>
+      <w:pPr>
+        <w:spacing w:after="80"/>
+        <w:ind w:left="454" w:hanging="454"/>
+      </w:pPr>
+      <w:r>
+        <w:rPr>
+          <w:b w:val="0"/>
+          <w:i w:val="0"/>
+        </w:rPr>
+        <w:t xml:space="preserve">Boone, J. D. e outros (2019). A long-term lens: cumulative impacts of free-roaming cat management strategy and intensity on preventable cat mortalities. Frontiers in Veterinary Science, 6, 238. </w:t>
+      </w:r>
+      <w:hyperlink r:id="rId59">
+        <w:r>
+          <w:rPr>
+            <w:u w:val="single"/>
+          </w:rPr>
+          <w:t xml:space="preserve">https://www.frontiersin.org/journals/veterinary-science/articles/10.3389/fvets.2019.00238/full</w:t>
+        </w:r>
+      </w:hyperlink>
+    </w:p>
+    <w:p>
+      <w:pPr>
+        <w:spacing w:after="80"/>
+        <w:ind w:left="454" w:hanging="454"/>
+      </w:pPr>
+      <w:r>
+        <w:rPr>
+          <w:b w:val="0"/>
+          <w:i w:val="0"/>
+        </w:rPr>
+        <w:t xml:space="preserve">Spehar, D. D.; Wolf, P. J. (2019). Integrated return-to-field and targeted trap-neuter-vaccinate-return programs result in reductions of feline intake and euthanasia at six municipal animal shelters. Frontiers in Veterinary Science, 6, 77. </w:t>
+      </w:r>
+      <w:hyperlink r:id="rId60">
+        <w:r>
+          <w:rPr>
+            <w:u w:val="single"/>
+          </w:rPr>
+          <w:t xml:space="preserve">https://www.frontiersin.org/journals/veterinary-science/articles/10.3389/fvets.2019.00077/full</w:t>
+        </w:r>
+      </w:hyperlink>
+    </w:p>
+    <w:p>
+      <w:pPr>
+        <w:spacing w:after="80"/>
+        <w:ind w:left="454" w:hanging="454"/>
+      </w:pPr>
+      <w:r>
+        <w:rPr>
+          <w:b w:val="0"/>
+          <w:i w:val="0"/>
+        </w:rPr>
+        <w:t xml:space="preserve">Trouwborst, A.; Somsen, H. (2020). Domestic cats (Felis catus) and European nature conservation law. Journal of Environmental Law, 32(3), 391-415. </w:t>
+      </w:r>
+      <w:hyperlink r:id="rId61">
+        <w:r>
+          <w:rPr>
+            <w:u w:val="single"/>
+          </w:rPr>
+          <w:t xml:space="preserve">https://doi.org/10.1093/jel/eqz035</w:t>
+        </w:r>
+      </w:hyperlink>
+    </w:p>
+    <w:p>
+      <w:pPr>
+        <w:spacing w:after="80"/>
+        <w:ind w:left="454" w:hanging="454"/>
+      </w:pPr>
+      <w:r>
+        <w:rPr>
+          <w:b w:val="0"/>
+          <w:i w:val="0"/>
+        </w:rPr>
+        <w:t xml:space="preserve">Gunther, I.; Hawlena, H.; Azriel, L.; Gibor, D.; Berke, O.; Klement, E. (2022). Reduction of free-roaming cat population requires high-intensity neutering in spatial contiguity to mitigate compensatory effects. Proceedings of the National Academy of Sciences, 119(15). </w:t>
+      </w:r>
+      <w:hyperlink r:id="rId62">
+        <w:r>
+          <w:rPr>
+            <w:u w:val="single"/>
+          </w:rPr>
+          <w:t xml:space="preserve">https://pmc.ncbi.nlm.nih.gov/articles/PMC9169806/</w:t>
+        </w:r>
+      </w:hyperlink>
+    </w:p>
+    <w:p>
+      <w:pPr>
+        <w:spacing w:after="80"/>
+        <w:ind w:left="454" w:hanging="454"/>
+      </w:pPr>
+      <w:r>
+        <w:rPr>
+          <w:b w:val="0"/>
+          <w:i w:val="0"/>
+        </w:rPr>
+        <w:t xml:space="preserve">Azevedo, A. e outros (2025). Social perceptions and attitudes towards free-roaming cats and dogs in Portugal: an exploratory study. Animals, 15(6), 771. </w:t>
+      </w:r>
+      <w:hyperlink r:id="rId63">
+        <w:r>
+          <w:rPr>
+            <w:u w:val="single"/>
+          </w:rPr>
+          <w:t xml:space="preserve">https://pmc.ncbi.nlm.nih.gov/articles/PMC11939513/</w:t>
+        </w:r>
+      </w:hyperlink>
+    </w:p>
+    <w:p>
+      <w:pPr>
+        <w:spacing w:after="80"/>
+        <w:ind w:left="454" w:hanging="454"/>
+      </w:pPr>
+      <w:r>
+        <w:rPr>
+          <w:b w:val="0"/>
+          <w:i w:val="0"/>
+        </w:rPr>
+        <w:t xml:space="preserve">Galão, M.; Soto, I.; Nunes, M.; Pedroso, N. M.; Rocha, R.; Rato, C. (2025). When pets go wild: integrating DNA metabarcoding and morphological analyses to investigate the impacts of free-ranging cats (Felis catus) on oceanic islands. Biological Conservation, 305, 111089. </w:t>
+      </w:r>
+      <w:hyperlink r:id="rId64">
+        <w:r>
+          <w:rPr>
+            <w:u w:val="single"/>
+          </w:rPr>
+          <w:t xml:space="preserve">https://dspace.uevora.pt/rdpc/bitstream/10174/38522/1/Gal%C3%A3o%20et%20al_2025_When%20pets%20go%20wild.pdf</w:t>
+        </w:r>
+      </w:hyperlink>
+    </w:p>
+    <w:p>
+      <w:pPr>
+        <w:pStyle w:val="Heading2"/>
+      </w:pPr>
+      <w:r>
+        <w:rPr>
+          <w:i w:val="0"/>
+          <w:color w:val="000000"/>
+        </w:rPr>
+        <w:t>Documentos de trabalho do grupo</w:t>
+      </w:r>
+    </w:p>
+    <w:p>
+      <w:pPr>
+        <w:spacing w:after="80"/>
+        <w:ind w:left="454" w:hanging="454"/>
+      </w:pPr>
+      <w:r>
+        <w:rPr>
+          <w:b w:val="0"/>
+          <w:i w:val="0"/>
+        </w:rPr>
+        <w:t xml:space="preserve">Contributos dos médicos veterinários municipais, reunião de Santarém, 6.3.2026. </w:t>
+      </w:r>
+      <w:r>
+        <w:t>Repositório: Contributos MVM.docx.</w:t>
+      </w:r>
+    </w:p>
+    <w:p>
+      <w:pPr>
+        <w:spacing w:after="80"/>
+        <w:ind w:left="454" w:hanging="454"/>
+      </w:pPr>
+      <w:r>
+        <w:rPr>
+          <w:b w:val="0"/>
+          <w:i w:val="0"/>
+        </w:rPr>
+        <w:t xml:space="preserve">Resumo dos comentários ao RGBEAC (OMV, SNMV, DAJA e outros revisores). </w:t>
+      </w:r>
+      <w:r>
+        <w:t>Repositório: Resumo_Comentarios_RGBEAC.docx.</w:t>
+      </w:r>
+    </w:p>
     <w:sectPr>
       <w:pgSz w:w="11906" w:h="16838"/>
       <w:pgMar w:top="1247" w:right="1417" w:bottom="1247" w:left="1417" w:header="720" w:footer="720" w:gutter="0"/>
@@ -19571,7 +20884,7 @@
       <w:rPr>
         <w:sz w:val="16"/>
       </w:rPr>
-      <w:t xml:space="preserve">Memorando de acompanhamento do RGAC, versão 1.5. Página </w:t>
+      <w:t xml:space="preserve">Memorando de acompanhamento do RGAC, versão 1.6. Página </w:t>
     </w:r>
     <w:r>
       <w:rPr>

</xml_diff>

<commit_message>
Memorando RGAC: três versões mantidas em paralelo, com verificação de alinhamento (v1.8)
Co-Authored-By: Claude Opus 5.5 <noreply@anthropic.com>
Claude-Session: https://claude.ai/code/session_014DugHn4TLfFaZJnbpoBJVk
</commit_message>
<xml_diff>
--- a/memorando_rgac/Memorando_Acompanhamento_RGAC.docx
+++ b/memorando_rgac/Memorando_Acompanhamento_RGAC.docx
@@ -79,7 +79,7 @@
                 <w:b w:val="0"/>
                 <w:sz w:val="20"/>
               </w:rPr>
-              <w:t>1.7</w:t>
+              <w:t>1.8</w:t>
             </w:r>
           </w:p>
         </w:tc>
@@ -20057,7 +20057,7 @@
                 <w:b w:val="0"/>
                 <w:sz w:val="20"/>
               </w:rPr>
-              <w:t>O art. 86.º tem dois n.º 5 e dois n.º 6, remete no n.º 1 para os arts. 65.º e 66.º (agora 84.º e 85.º) e no n.º 9 para o «n.º 4».</w:t>
+              <w:t>O art. 86.º tem dois n.º 5 e dois n.º 6, remete no n.º 1 para os «artigos 65.º e 66.º» (agora arts. 84.º e 85.º) e no n.º 9 para o «n.º 4».</w:t>
             </w:r>
           </w:p>
         </w:tc>
@@ -39823,6 +39823,62 @@
                 <w:sz w:val="20"/>
               </w:rPr>
               <w:t>Estrutura para a revisão do RGAC inteiro: um tema por capítulo, com letra própria; Anexo C com lapsos formais (L-01 a L-09, dos quais cinco novos: artigos 81.º e 142.º repetidos, segundo art. 142.º fora do lugar, subsecção com epígrafe que não corresponde, numeração de secções nos caps. IV e X); Anexo D com a cobertura da revisão artigo a artigo.</w:t>
+            </w:r>
+          </w:p>
+        </w:tc>
+      </w:tr>
+      <w:tr>
+        <w:tc>
+          <w:tcPr>
+            <w:tcW w:w="1020" w:type="dxa"/>
+          </w:tcPr>
+          <w:p>
+            <w:pPr>
+              <w:spacing w:after="60"/>
+            </w:pPr>
+            <w:r/>
+            <w:r>
+              <w:rPr>
+                <w:b w:val="0"/>
+                <w:sz w:val="20"/>
+              </w:rPr>
+              <w:t>1.8</w:t>
+            </w:r>
+          </w:p>
+        </w:tc>
+        <w:tc>
+          <w:tcPr>
+            <w:tcW w:w="1417" w:type="dxa"/>
+          </w:tcPr>
+          <w:p>
+            <w:pPr>
+              <w:spacing w:after="60"/>
+            </w:pPr>
+            <w:r/>
+            <w:r>
+              <w:rPr>
+                <w:b w:val="0"/>
+                <w:sz w:val="20"/>
+              </w:rPr>
+              <w:t>27.9.2026</w:t>
+            </w:r>
+          </w:p>
+        </w:tc>
+        <w:tc>
+          <w:tcPr>
+            <w:tcW w:w="6633" w:type="dxa"/>
+          </w:tcPr>
+          <w:p>
+            <w:pPr>
+              <w:spacing w:after="60"/>
+            </w:pPr>
+            <w:r/>
+            <w:r>
+              <w:rPr>
+                <w:b w:val="0"/>
+                <w:sz w:val="20"/>
+              </w:rPr>
+              <w:t>O memorando passa a ser mantido em três versões com o mesmo conteúdo: a principal (esta) e os ensaios 2.0 e 3.0 de organização. Lapso L-08: a remissão do art. 86.º, n.º 1 passa a citar «artigos 65.º e 66.º» entre aspas, como está no RGAC.</w:t>
             </w:r>
           </w:p>
         </w:tc>
@@ -41250,7 +41306,7 @@
       <w:rPr>
         <w:sz w:val="16"/>
       </w:rPr>
-      <w:t xml:space="preserve">Memorando de acompanhamento do RGAC, versão 1.7. Página </w:t>
+      <w:t xml:space="preserve">Memorando de acompanhamento do RGAC, versão 1.8. Página </w:t>
     </w:r>
     <w:r>
       <w:rPr>

</xml_diff>

<commit_message>
Memorando RGAC 1.10: recolha de errantes por particulares e estatuto de quem acolhe
Fichas novas T-20 (quem acolhe um errante pode ficar sem saída lícita), C-18
(definição de errante passa a abranger qualquer animal não identificado) e C-19
(Lei 75/2013 ainda atribui às câmaras o abate). T-14 e T-15 completadas: o RGAC
omite a entrega pelo particular prevista na Portaria 146/2017, torna a captura
exclusiva das câmaras e tem alíneas contraditórias no art. 140.º, n.º 2.
Três versões alinhadas e validadas. Verificação de ligações: 64 de 66; as duas
falhas são do sítio da APMVEAC, que responde 403 a todo o domínio a partir
deste servidor (passaram em 27.9.2026).

Co-Authored-By: Claude Opus 5.5 <noreply@anthropic.com>
Claude-Session: https://claude.ai/code/session_013gc37ZfszD9QAJQ5M1gWcB
</commit_message>
<xml_diff>
--- a/memorando_rgac/Memorando_Acompanhamento_RGAC.docx
+++ b/memorando_rgac/Memorando_Acompanhamento_RGAC.docx
@@ -79,7 +79,7 @@
                 <w:b w:val="0"/>
                 <w:sz w:val="20"/>
               </w:rPr>
-              <w:t>1.9</w:t>
+              <w:t>1.10</w:t>
             </w:r>
           </w:p>
         </w:tc>
@@ -117,7 +117,7 @@
                 <w:b w:val="0"/>
                 <w:sz w:val="20"/>
               </w:rPr>
-              <w:t>2.10.2026</w:t>
+              <w:t>8.10.2026</w:t>
             </w:r>
           </w:p>
         </w:tc>
@@ -485,6 +485,19 @@
     </w:p>
     <w:p>
       <w:pPr>
+        <w:spacing w:after="0"/>
+        <w:ind w:left="567"/>
+      </w:pPr>
+      <w:r>
+        <w:rPr>
+          <w:b w:val="0"/>
+          <w:i w:val="0"/>
+        </w:rPr>
+        <w:t>T-20. Quem acolhe um animal errante pode ficar sem saída lícita</w:t>
+      </w:r>
+    </w:p>
+    <w:p>
+      <w:pPr>
         <w:spacing w:after="40"/>
       </w:pPr>
     </w:p>
@@ -719,6 +732,32 @@
           <w:i w:val="0"/>
         </w:rPr>
         <w:t>C-17. Plano municipal de controlo de errantes sem conteúdo mínimo nem consequências</w:t>
+      </w:r>
+    </w:p>
+    <w:p>
+      <w:pPr>
+        <w:spacing w:after="0"/>
+        <w:ind w:left="567"/>
+      </w:pPr>
+      <w:r>
+        <w:rPr>
+          <w:b w:val="0"/>
+          <w:i w:val="0"/>
+        </w:rPr>
+        <w:t>C-18. A definição de animal errante passa a abranger qualquer animal não identificado</w:t>
+      </w:r>
+    </w:p>
+    <w:p>
+      <w:pPr>
+        <w:spacing w:after="0"/>
+        <w:ind w:left="567"/>
+      </w:pPr>
+      <w:r>
+        <w:rPr>
+          <w:b w:val="0"/>
+          <w:i w:val="0"/>
+        </w:rPr>
+        <w:t>C-19. A Lei 75/2013 ainda atribui às câmaras o abate de canídeos e gatídeos</w:t>
       </w:r>
     </w:p>
     <w:p>
@@ -5281,6 +5320,18 @@
               <w:t>Quem acolhe por iniciativa própria, sem operador, continua sem figura. O RGBEAC (jun. 2025) tinha a família de acolhimento temporário definida e regulada (arts. 4.º e 101.º). Uma revisora pediu «ELIMINAR ESTE CAPÍTULO» e a figura foi substituída pelo lar de acolhimento do Regulamento europeu.</w:t>
             </w:r>
           </w:p>
+          <w:p>
+            <w:pPr>
+              <w:spacing w:after="60"/>
+            </w:pPr>
+            <w:r>
+              <w:rPr>
+                <w:b w:val="0"/>
+                <w:sz w:val="20"/>
+              </w:rPr>
+              <w:t>O estatuto de detentor já abrange quem acolhe por iniciativa própria. O RGAC define detentor como o possuidor precário nos termos do art. 1253.º do Código Civil, responsável «enquanto se mantiver como tal» (art. 3.º). A al. a) do art. 1253.º abrange «Os que exercem o poder de facto sem intenção de agir como beneficiários do direito». O Tribunal da Relação do Porto aplicou o mesmo conceito, a partir do DL 82/2019, a quem tinha um cão na sua esfera de disponibilidade. O que falta não é o estatuto. Falta o regime: registo, limite de animais e forma de pôr termo ao acolhimento (ver T-20).</w:t>
+            </w:r>
+          </w:p>
         </w:tc>
       </w:tr>
       <w:tr>
@@ -5354,7 +5405,7 @@
                 <w:b w:val="0"/>
                 <w:sz w:val="20"/>
               </w:rPr>
-              <w:t>Estratégia Nacional para os Animais Errantes (ENAE), pp. 30-31; Contributos dos médicos veterinários municipais (6.3.2026); PAN (estatuto da família de acolhimento, 2024); SNMV (contra registos provisórios no SIAC); Raúl Farias, e-book do CEJ (2022): as associações, como pessoas coletivas, não respondem pelo crime de abandono</w:t>
+              <w:t>Estratégia Nacional para os Animais Errantes (ENAE), pp. 30-31; Contributos dos médicos veterinários municipais (6.3.2026); PAN (estatuto da família de acolhimento, 2024); SNMV (contra registos provisórios no SIAC); Raúl Farias, e-book do CEJ (2022): as associações, como pessoas coletivas, não respondem pelo crime de abandono; Tribunal da Relação do Porto, proc. 11/21.2GEVFR.P1 (8.5.2024): conceito de detentor do DL 82/2019 e do art. 1253.º do Código Civil</w:t>
             </w:r>
           </w:p>
         </w:tc>
@@ -5430,7 +5481,7 @@
                 <w:b w:val="0"/>
                 <w:sz w:val="20"/>
               </w:rPr>
-              <w:t>T-13, C-02</w:t>
+              <w:t>T-13, C-02, T-20</w:t>
             </w:r>
           </w:p>
         </w:tc>
@@ -5592,6 +5643,66 @@
               <w:t>Isto choca com o regime do achado do Código Civil (art. 1323.º), que permite ao achador anunciar o achado, ficar com o animal ao fim de um ano e retê-lo se houver receio de maus-tratos. Quem recolhe crias ou um animal ferido fica exposto a coima.</w:t>
             </w:r>
           </w:p>
+          <w:p>
+            <w:pPr>
+              <w:spacing w:after="60"/>
+            </w:pPr>
+            <w:r>
+              <w:rPr>
+                <w:b w:val="0"/>
+                <w:sz w:val="20"/>
+              </w:rPr>
+              <w:t>Hoje a recolha por particular está prevista. O n.º 2 do art. 7.º da Portaria 146/2017 manda comunicar o animal errante aos serviços municipais ou às entidades policiais, «ou o animal é entregue a uma dessas entidades, se quem o observou também o capturou». O art. 91.º, n.º 9 reproduz a primeira parte e omite esta.</w:t>
+            </w:r>
+          </w:p>
+          <w:p>
+            <w:pPr>
+              <w:spacing w:after="60"/>
+            </w:pPr>
+            <w:r>
+              <w:rPr>
+                <w:b w:val="0"/>
+                <w:sz w:val="20"/>
+              </w:rPr>
+              <w:t>O art. 91.º, n.º 3 diz que a captura e a recolha «competem, exclusivamente, às câmaras municipais». Na lei vigente a competência é atribuída às câmaras sem exclusivo: DL 276/2001, art. 19.º, n.º 1; DL 314/2003, art. 8.º, n.º 1; Lei 75/2013, anexo I, art. 33.º, n.º 1, al. ii). O Provedor de Justiça entendeu que as competências camarárias nesta matéria não são exclusivas, por referência a outras entidades públicas.</w:t>
+            </w:r>
+          </w:p>
+          <w:p>
+            <w:pPr>
+              <w:spacing w:after="60"/>
+            </w:pPr>
+            <w:r>
+              <w:rPr>
+                <w:b w:val="0"/>
+                <w:sz w:val="20"/>
+              </w:rPr>
+              <w:t>O art. 140.º, n.º 2 tem duas alíneas que se contradizem. Uma pune a recolha «sem apresentação dos mesmos ao serviço veterinário municipal», o que supõe que a recolha seguida de apresentação é lícita. A outra pune a recolha «por entidade diversa das câmaras municipais», o que a proíbe sempre.</w:t>
+            </w:r>
+          </w:p>
+          <w:p>
+            <w:pPr>
+              <w:spacing w:after="60"/>
+            </w:pPr>
+            <w:r>
+              <w:rPr>
+                <w:b w:val="0"/>
+                <w:sz w:val="20"/>
+              </w:rPr>
+              <w:t>O art. 1323.º do Código Civil trata do animal perdido. Uma cria nascida na rua nunca teve dono e pode ser adquirida por ocupação (art. 1318.º do Código Civil). A coima do art. 140.º, n.º 2 atinge também este caso.</w:t>
+            </w:r>
+          </w:p>
+          <w:p>
+            <w:pPr>
+              <w:spacing w:after="60"/>
+            </w:pPr>
+            <w:r>
+              <w:rPr>
+                <w:b w:val="0"/>
+                <w:sz w:val="20"/>
+              </w:rPr>
+              <w:t>Os regulamentos municipais lidos admitem a entrega por quem encontra o animal: Setúbal (RSBEAMS 2020, art. 44.º, n.º 1, al. b)), Braga (Aviso 5616/2023, art. 57.º, n.º 1, al. b)), Évora (regulamento do CRO, art. 19.º, n.º 7) e Coimbra (Aviso 6348/2023, art. 12.º). O art. 11.º, n.º 3 do regulamento de Coimbra omite, como o RGAC, a parte final do n.º 2 do art. 7.º da Portaria.</w:t>
+            </w:r>
+          </w:p>
         </w:tc>
       </w:tr>
       <w:tr>
@@ -5627,7 +5738,7 @@
                 <w:b w:val="0"/>
                 <w:sz w:val="20"/>
               </w:rPr>
-              <w:t>Articular o art. 91.º, n.º 9 com o art. 1323.º do Código Civil: permitir a guarda provisória pelo achador, com dever de comunicação e leitura do transponder num prazo curto.</w:t>
+              <w:t>Repor no art. 91.º, n.º 9 a parte final do n.º 2 do art. 7.º da Portaria 146/2017. Ressalvar no n.º 3 a recolha pontual por particular seguida de entrega ou comunicação num prazo curto, e as capturas em programa CED autorizado (ver C-04). No art. 140.º, n.º 2 manter só a recolha sem apresentação, com prazo fixado, e retirar a recolha por entidade diversa das câmaras. Articular com os arts. 1318.º e 1323.º do Código Civil.</w:t>
             </w:r>
           </w:p>
         </w:tc>
@@ -5665,7 +5776,7 @@
                 <w:b w:val="0"/>
                 <w:sz w:val="20"/>
               </w:rPr>
-              <w:t>Análise interna</w:t>
+              <w:t>Análise interna; Provedor de Justiça, processo R-4579/08 (Lajes do Pico): as competências camarárias não são exclusivas; Regulamentos municipais de Setúbal, Braga, Évora e Coimbra (leitura de 8.10.2026); Análise interna (pedido de esclarecimento sobre gatos de colónia acolhidos, Setúbal, 8.10.2026)</w:t>
             </w:r>
           </w:p>
         </w:tc>
@@ -5741,7 +5852,7 @@
                 <w:b w:val="0"/>
                 <w:sz w:val="20"/>
               </w:rPr>
-              <w:t>C-02, C-16</w:t>
+              <w:t>C-02, C-16, C-04, T-20</w:t>
             </w:r>
           </w:p>
         </w:tc>
@@ -6986,6 +7097,329 @@
                 <w:sz w:val="20"/>
               </w:rPr>
               <w:t>T-01, T-02, T-03, C-08</w:t>
+            </w:r>
+          </w:p>
+        </w:tc>
+      </w:tr>
+    </w:tbl>
+    <w:p/>
+    <w:p>
+      <w:pPr>
+        <w:pStyle w:val="Heading2"/>
+      </w:pPr>
+      <w:r>
+        <w:rPr>
+          <w:i w:val="0"/>
+          <w:color w:val="000000"/>
+        </w:rPr>
+        <w:t>T-20. Quem acolhe um animal errante pode ficar sem saída lícita</w:t>
+      </w:r>
+    </w:p>
+    <w:tbl>
+      <w:tblPr>
+        <w:tblW w:w="9071" w:type="dxa"/>
+        <w:jc w:val="center"/>
+        <w:tblBorders>
+          <w:top w:val="single" w:sz="4" w:space="0" w:color="000000"/>
+          <w:left w:val="single" w:sz="4" w:space="0" w:color="000000"/>
+          <w:bottom w:val="single" w:sz="4" w:space="0" w:color="000000"/>
+          <w:right w:val="single" w:sz="4" w:space="0" w:color="000000"/>
+          <w:insideH w:val="single" w:sz="4" w:space="0" w:color="000000"/>
+          <w:insideV w:val="single" w:sz="4" w:space="0" w:color="000000"/>
+        </w:tblBorders>
+        <w:tblLayout w:type="fixed"/>
+        <w:tblLook w:firstColumn="1" w:firstRow="1" w:lastColumn="0" w:lastRow="0" w:noHBand="0" w:noVBand="1" w:val="04A0"/>
+      </w:tblPr>
+      <w:tblGrid>
+        <w:gridCol w:w="1984"/>
+        <w:gridCol w:w="7087"/>
+      </w:tblGrid>
+      <w:tr>
+        <w:tc>
+          <w:tcPr>
+            <w:tcW w:w="1984" w:type="dxa"/>
+          </w:tcPr>
+          <w:p>
+            <w:pPr>
+              <w:spacing w:after="60"/>
+            </w:pPr>
+            <w:r/>
+            <w:r>
+              <w:rPr>
+                <w:b/>
+                <w:sz w:val="20"/>
+              </w:rPr>
+              <w:t>Onde</w:t>
+            </w:r>
+          </w:p>
+        </w:tc>
+        <w:tc>
+          <w:tcPr>
+            <w:tcW w:w="7087" w:type="dxa"/>
+          </w:tcPr>
+          <w:p>
+            <w:pPr>
+              <w:spacing w:after="60"/>
+            </w:pPr>
+            <w:r/>
+            <w:r>
+              <w:rPr>
+                <w:b w:val="0"/>
+                <w:sz w:val="20"/>
+              </w:rPr>
+              <w:t>art. 3.º, definição de «Abandono»; art. 94.º, n.ºs 7 e 8; art. 91.º, n.º 9</w:t>
+            </w:r>
+          </w:p>
+        </w:tc>
+      </w:tr>
+      <w:tr>
+        <w:tc>
+          <w:tcPr>
+            <w:tcW w:w="1984" w:type="dxa"/>
+          </w:tcPr>
+          <w:p>
+            <w:pPr>
+              <w:spacing w:after="60"/>
+            </w:pPr>
+            <w:r/>
+            <w:r>
+              <w:rPr>
+                <w:b/>
+                <w:sz w:val="20"/>
+              </w:rPr>
+              <w:t>Origem</w:t>
+            </w:r>
+          </w:p>
+        </w:tc>
+        <w:tc>
+          <w:tcPr>
+            <w:tcW w:w="7087" w:type="dxa"/>
+          </w:tcPr>
+          <w:p>
+            <w:pPr>
+              <w:spacing w:after="60"/>
+            </w:pPr>
+            <w:r/>
+            <w:r>
+              <w:rPr>
+                <w:b w:val="0"/>
+                <w:sz w:val="20"/>
+              </w:rPr>
+              <w:t>Já existia no regime vigente e o RGAC não resolve</w:t>
+            </w:r>
+          </w:p>
+        </w:tc>
+      </w:tr>
+      <w:tr>
+        <w:tc>
+          <w:tcPr>
+            <w:tcW w:w="1984" w:type="dxa"/>
+          </w:tcPr>
+          <w:p>
+            <w:pPr>
+              <w:spacing w:after="60"/>
+            </w:pPr>
+            <w:r/>
+            <w:r>
+              <w:rPr>
+                <w:b/>
+                <w:sz w:val="20"/>
+              </w:rPr>
+              <w:t>Problema</w:t>
+            </w:r>
+          </w:p>
+        </w:tc>
+        <w:tc>
+          <w:tcPr>
+            <w:tcW w:w="7087" w:type="dxa"/>
+          </w:tcPr>
+          <w:p>
+            <w:pPr>
+              <w:spacing w:after="60"/>
+            </w:pPr>
+            <w:r/>
+            <w:r>
+              <w:rPr>
+                <w:b w:val="0"/>
+                <w:sz w:val="20"/>
+              </w:rPr>
+              <w:t>Quem acolhe um animal errante passa a ser detentor (art. 3.º). Se depois o devolver à rua, a conduta cabe na definição de abandono: remoção «pelo detentor ou titular» sem comprovativo da transmissão da guarda para outra pessoa, para o município ou para associação zoófila (art. 3.º). Pode ainda caber no art. 388.º do Código Penal, que pune quem, «tendo o dever de guardar, vigiar ou assistir animal de companhia», o abandona.</w:t>
+            </w:r>
+          </w:p>
+          <w:p>
+            <w:pPr>
+              <w:spacing w:after="60"/>
+            </w:pPr>
+            <w:r>
+              <w:rPr>
+                <w:b w:val="0"/>
+                <w:sz w:val="20"/>
+              </w:rPr>
+              <w:t>A saída lícita é entregar o animal. O art. 94.º, n.º 7 só deixa pedir a recolha ao CRO aos titulares, e só por circunstâncias supervenientes. O n.º 8 manda os restantes titulares recorrer a associação zoófila. O detentor que não é titular não aparece em nenhum dos dois números. O art. 91.º, n.º 9 deixou de prever a entrega por quem capturou o animal (ver T-15).</w:t>
+            </w:r>
+          </w:p>
+          <w:p>
+            <w:pPr>
+              <w:spacing w:after="60"/>
+            </w:pPr>
+            <w:r>
+              <w:rPr>
+                <w:b w:val="0"/>
+                <w:sz w:val="20"/>
+              </w:rPr>
+              <w:t>No regime vigente o problema já existe na prática. Os regulamentos municipais permitem recusar a receção por sobrelotação (Setúbal, RSBEAMS 2020, art. 57.º, n.º 6) ou depois de ponderar fatores de risco (Coimbra, Aviso 6348/2023, art. 12.º, n.º 2). Quem acolheu fica entre a recusa do CRO e a proibição de abandono.</w:t>
+            </w:r>
+          </w:p>
+        </w:tc>
+      </w:tr>
+      <w:tr>
+        <w:tc>
+          <w:tcPr>
+            <w:tcW w:w="1984" w:type="dxa"/>
+          </w:tcPr>
+          <w:p>
+            <w:pPr>
+              <w:spacing w:after="60"/>
+            </w:pPr>
+            <w:r/>
+            <w:r>
+              <w:rPr>
+                <w:b/>
+                <w:sz w:val="20"/>
+              </w:rPr>
+              <w:t>Proposta</w:t>
+            </w:r>
+          </w:p>
+        </w:tc>
+        <w:tc>
+          <w:tcPr>
+            <w:tcW w:w="7087" w:type="dxa"/>
+          </w:tcPr>
+          <w:p>
+            <w:pPr>
+              <w:spacing w:after="60"/>
+            </w:pPr>
+            <w:r/>
+            <w:r>
+              <w:rPr>
+                <w:b w:val="0"/>
+                <w:sz w:val="20"/>
+              </w:rPr>
+              <w:t>Prever no art. 94.º que o detentor de animal errante que o tenha recolhido possa entregá-lo ao CRO. A recusa do CRO deve ser fundamentada e indicar alternativa: associação zoófila, lar de acolhimento ou integração no programa CED. A entrega recusada afasta a presunção de abandono.</w:t>
+            </w:r>
+          </w:p>
+        </w:tc>
+      </w:tr>
+      <w:tr>
+        <w:tc>
+          <w:tcPr>
+            <w:tcW w:w="1984" w:type="dxa"/>
+          </w:tcPr>
+          <w:p>
+            <w:pPr>
+              <w:spacing w:after="60"/>
+            </w:pPr>
+            <w:r/>
+            <w:r>
+              <w:rPr>
+                <w:b/>
+                <w:sz w:val="20"/>
+              </w:rPr>
+              <w:t>Quem levantou</w:t>
+            </w:r>
+          </w:p>
+        </w:tc>
+        <w:tc>
+          <w:tcPr>
+            <w:tcW w:w="7087" w:type="dxa"/>
+          </w:tcPr>
+          <w:p>
+            <w:pPr>
+              <w:spacing w:after="60"/>
+            </w:pPr>
+            <w:r/>
+            <w:r>
+              <w:rPr>
+                <w:b w:val="0"/>
+                <w:sz w:val="20"/>
+              </w:rPr>
+              <w:t>Análise interna (pedido de esclarecimento sobre gatos de colónia acolhidos, Setúbal, 8.10.2026); Tribunal da Relação do Porto, proc. 11/21.2GEVFR.P1 (8.5.2024): o detentor que não cuida do animal deve diligenciar a sua entrega a canil ou organização que o possa receber; Regulamentos municipais de Setúbal (2020) e Coimbra (2023)</w:t>
+            </w:r>
+          </w:p>
+        </w:tc>
+      </w:tr>
+      <w:tr>
+        <w:tc>
+          <w:tcPr>
+            <w:tcW w:w="1984" w:type="dxa"/>
+          </w:tcPr>
+          <w:p>
+            <w:pPr>
+              <w:spacing w:after="60"/>
+            </w:pPr>
+            <w:r/>
+            <w:r>
+              <w:rPr>
+                <w:b/>
+                <w:sz w:val="20"/>
+              </w:rPr>
+              <w:t>Estado</w:t>
+            </w:r>
+          </w:p>
+        </w:tc>
+        <w:tc>
+          <w:tcPr>
+            <w:tcW w:w="7087" w:type="dxa"/>
+          </w:tcPr>
+          <w:p>
+            <w:pPr>
+              <w:spacing w:after="60"/>
+            </w:pPr>
+            <w:r/>
+            <w:r>
+              <w:rPr>
+                <w:b w:val="0"/>
+                <w:sz w:val="20"/>
+              </w:rPr>
+              <w:t>Aberto</w:t>
+            </w:r>
+          </w:p>
+        </w:tc>
+      </w:tr>
+      <w:tr>
+        <w:tc>
+          <w:tcPr>
+            <w:tcW w:w="1984" w:type="dxa"/>
+          </w:tcPr>
+          <w:p>
+            <w:pPr>
+              <w:spacing w:after="60"/>
+            </w:pPr>
+            <w:r/>
+            <w:r>
+              <w:rPr>
+                <w:b/>
+                <w:sz w:val="20"/>
+              </w:rPr>
+              <w:t>Fichas relacionadas</w:t>
+            </w:r>
+          </w:p>
+        </w:tc>
+        <w:tc>
+          <w:tcPr>
+            <w:tcW w:w="7087" w:type="dxa"/>
+          </w:tcPr>
+          <w:p>
+            <w:pPr>
+              <w:spacing w:after="60"/>
+            </w:pPr>
+            <w:r/>
+            <w:r>
+              <w:rPr>
+                <w:b w:val="0"/>
+                <w:sz w:val="20"/>
+              </w:rPr>
+              <w:t>T-14, T-15</w:t>
             </w:r>
           </w:p>
         </w:tc>
@@ -12044,6 +12478,628 @@
                 <w:sz w:val="20"/>
               </w:rPr>
               <w:t>C-09</w:t>
+            </w:r>
+          </w:p>
+        </w:tc>
+      </w:tr>
+    </w:tbl>
+    <w:p/>
+    <w:p>
+      <w:pPr>
+        <w:pStyle w:val="Heading2"/>
+      </w:pPr>
+      <w:r>
+        <w:rPr>
+          <w:i w:val="0"/>
+          <w:color w:val="000000"/>
+        </w:rPr>
+        <w:t>C-18. A definição de animal errante passa a abranger qualquer animal não identificado</w:t>
+      </w:r>
+    </w:p>
+    <w:tbl>
+      <w:tblPr>
+        <w:tblW w:w="9071" w:type="dxa"/>
+        <w:jc w:val="center"/>
+        <w:tblBorders>
+          <w:top w:val="single" w:sz="4" w:space="0" w:color="000000"/>
+          <w:left w:val="single" w:sz="4" w:space="0" w:color="000000"/>
+          <w:bottom w:val="single" w:sz="4" w:space="0" w:color="000000"/>
+          <w:right w:val="single" w:sz="4" w:space="0" w:color="000000"/>
+          <w:insideH w:val="single" w:sz="4" w:space="0" w:color="000000"/>
+          <w:insideV w:val="single" w:sz="4" w:space="0" w:color="000000"/>
+        </w:tblBorders>
+        <w:tblLayout w:type="fixed"/>
+        <w:tblLook w:firstColumn="1" w:firstRow="1" w:lastColumn="0" w:lastRow="0" w:noHBand="0" w:noVBand="1" w:val="04A0"/>
+      </w:tblPr>
+      <w:tblGrid>
+        <w:gridCol w:w="1984"/>
+        <w:gridCol w:w="7087"/>
+      </w:tblGrid>
+      <w:tr>
+        <w:tc>
+          <w:tcPr>
+            <w:tcW w:w="1984" w:type="dxa"/>
+          </w:tcPr>
+          <w:p>
+            <w:pPr>
+              <w:spacing w:after="60"/>
+            </w:pPr>
+            <w:r/>
+            <w:r>
+              <w:rPr>
+                <w:b/>
+                <w:sz w:val="20"/>
+              </w:rPr>
+              <w:t>Onde</w:t>
+            </w:r>
+          </w:p>
+        </w:tc>
+        <w:tc>
+          <w:tcPr>
+            <w:tcW w:w="7087" w:type="dxa"/>
+          </w:tcPr>
+          <w:p>
+            <w:pPr>
+              <w:spacing w:after="60"/>
+            </w:pPr>
+            <w:r/>
+            <w:r>
+              <w:rPr>
+                <w:b w:val="0"/>
+                <w:sz w:val="20"/>
+              </w:rPr>
+              <w:t>art. 3.º, definição de «Animal errante»; art. 91.º, n.º 1, al. a)</w:t>
+            </w:r>
+          </w:p>
+        </w:tc>
+      </w:tr>
+      <w:tr>
+        <w:tc>
+          <w:tcPr>
+            <w:tcW w:w="1984" w:type="dxa"/>
+          </w:tcPr>
+          <w:p>
+            <w:pPr>
+              <w:spacing w:after="60"/>
+            </w:pPr>
+            <w:r/>
+            <w:r>
+              <w:rPr>
+                <w:b/>
+                <w:sz w:val="20"/>
+              </w:rPr>
+              <w:t>Origem</w:t>
+            </w:r>
+          </w:p>
+        </w:tc>
+        <w:tc>
+          <w:tcPr>
+            <w:tcW w:w="7087" w:type="dxa"/>
+          </w:tcPr>
+          <w:p>
+            <w:pPr>
+              <w:spacing w:after="60"/>
+            </w:pPr>
+            <w:r/>
+            <w:r>
+              <w:rPr>
+                <w:b w:val="0"/>
+                <w:sz w:val="20"/>
+              </w:rPr>
+              <w:t>Já existia; o RGAC resolve em parte</w:t>
+            </w:r>
+          </w:p>
+        </w:tc>
+      </w:tr>
+      <w:tr>
+        <w:tc>
+          <w:tcPr>
+            <w:tcW w:w="1984" w:type="dxa"/>
+          </w:tcPr>
+          <w:p>
+            <w:pPr>
+              <w:spacing w:after="60"/>
+            </w:pPr>
+            <w:r/>
+            <w:r>
+              <w:rPr>
+                <w:b/>
+                <w:sz w:val="20"/>
+              </w:rPr>
+              <w:t>Problema</w:t>
+            </w:r>
+          </w:p>
+        </w:tc>
+        <w:tc>
+          <w:tcPr>
+            <w:tcW w:w="7087" w:type="dxa"/>
+          </w:tcPr>
+          <w:p>
+            <w:pPr>
+              <w:spacing w:after="60"/>
+            </w:pPr>
+            <w:r/>
+            <w:r>
+              <w:rPr>
+                <w:b w:val="0"/>
+                <w:sz w:val="20"/>
+              </w:rPr>
+              <w:t>Hoje há duas definições. O DL 276/2001 (art. 2.º, n.º 1, al. c)) considera errante o animal encontrado em lugar público fora do controlo e guarda do detentor, «ou relativamente ao qual existam fortes indícios de que foi abandonado ou não tem detentor e não esteja identificado». O DL 314/2003 (art. 2.º, al. n)) só considera errante o cão ou gato encontrado em local público, fora do controlo ou vigilância do detentor, «e não identificado». Uma cria sem dono nascida num quintal é errante para o primeiro e não para o segundo.</w:t>
+            </w:r>
+          </w:p>
+          <w:p>
+            <w:pPr>
+              <w:spacing w:after="60"/>
+            </w:pPr>
+            <w:r>
+              <w:rPr>
+                <w:b w:val="0"/>
+                <w:sz w:val="20"/>
+              </w:rPr>
+              <w:t>O RGAC unifica, mas troca o «e» por «ou»: é errante também o animal «que não tem detentor ou não se encontra identificado» (art. 3.º). Lida à letra, qualquer animal não identificado é errante, mesmo em casa e com detentor, incluindo as crias antes do prazo de identificação. O art. 91.º, n.º 1, al. a) limita a captura aos errantes encontrados em lugares públicos, o que atenua o efeito, mas as outras normas que usam o conceito ficam com um âmbito que não se pretende.</w:t>
+            </w:r>
+          </w:p>
+        </w:tc>
+      </w:tr>
+      <w:tr>
+        <w:tc>
+          <w:tcPr>
+            <w:tcW w:w="1984" w:type="dxa"/>
+          </w:tcPr>
+          <w:p>
+            <w:pPr>
+              <w:spacing w:after="60"/>
+            </w:pPr>
+            <w:r/>
+            <w:r>
+              <w:rPr>
+                <w:b/>
+                <w:sz w:val="20"/>
+              </w:rPr>
+              <w:t>Proposta</w:t>
+            </w:r>
+          </w:p>
+        </w:tc>
+        <w:tc>
+          <w:tcPr>
+            <w:tcW w:w="7087" w:type="dxa"/>
+          </w:tcPr>
+          <w:p>
+            <w:pPr>
+              <w:spacing w:after="60"/>
+            </w:pPr>
+            <w:r/>
+            <w:r>
+              <w:rPr>
+                <w:b w:val="0"/>
+                <w:sz w:val="20"/>
+              </w:rPr>
+              <w:t>Repor a conjunção cumulativa: «que não tem detentor e não se encontra identificado». Ponderar excluir da definição os gatos integrados em programa CED (ver C-12).</w:t>
+            </w:r>
+          </w:p>
+        </w:tc>
+      </w:tr>
+      <w:tr>
+        <w:tc>
+          <w:tcPr>
+            <w:tcW w:w="1984" w:type="dxa"/>
+          </w:tcPr>
+          <w:p>
+            <w:pPr>
+              <w:spacing w:after="60"/>
+            </w:pPr>
+            <w:r/>
+            <w:r>
+              <w:rPr>
+                <w:b/>
+                <w:sz w:val="20"/>
+              </w:rPr>
+              <w:t>Quem levantou</w:t>
+            </w:r>
+          </w:p>
+        </w:tc>
+        <w:tc>
+          <w:tcPr>
+            <w:tcW w:w="7087" w:type="dxa"/>
+          </w:tcPr>
+          <w:p>
+            <w:pPr>
+              <w:spacing w:after="60"/>
+            </w:pPr>
+            <w:r/>
+            <w:r>
+              <w:rPr>
+                <w:b w:val="0"/>
+                <w:sz w:val="20"/>
+              </w:rPr>
+              <w:t>Análise interna (8.10.2026)</w:t>
+            </w:r>
+          </w:p>
+        </w:tc>
+      </w:tr>
+      <w:tr>
+        <w:tc>
+          <w:tcPr>
+            <w:tcW w:w="1984" w:type="dxa"/>
+          </w:tcPr>
+          <w:p>
+            <w:pPr>
+              <w:spacing w:after="60"/>
+            </w:pPr>
+            <w:r/>
+            <w:r>
+              <w:rPr>
+                <w:b/>
+                <w:sz w:val="20"/>
+              </w:rPr>
+              <w:t>Estado</w:t>
+            </w:r>
+          </w:p>
+        </w:tc>
+        <w:tc>
+          <w:tcPr>
+            <w:tcW w:w="7087" w:type="dxa"/>
+          </w:tcPr>
+          <w:p>
+            <w:pPr>
+              <w:spacing w:after="60"/>
+            </w:pPr>
+            <w:r/>
+            <w:r>
+              <w:rPr>
+                <w:b w:val="0"/>
+                <w:sz w:val="20"/>
+              </w:rPr>
+              <w:t>Aberto</w:t>
+            </w:r>
+          </w:p>
+        </w:tc>
+      </w:tr>
+      <w:tr>
+        <w:tc>
+          <w:tcPr>
+            <w:tcW w:w="1984" w:type="dxa"/>
+          </w:tcPr>
+          <w:p>
+            <w:pPr>
+              <w:spacing w:after="60"/>
+            </w:pPr>
+            <w:r/>
+            <w:r>
+              <w:rPr>
+                <w:b/>
+                <w:sz w:val="20"/>
+              </w:rPr>
+              <w:t>Fichas relacionadas</w:t>
+            </w:r>
+          </w:p>
+        </w:tc>
+        <w:tc>
+          <w:tcPr>
+            <w:tcW w:w="7087" w:type="dxa"/>
+          </w:tcPr>
+          <w:p>
+            <w:pPr>
+              <w:spacing w:after="60"/>
+            </w:pPr>
+            <w:r/>
+            <w:r>
+              <w:rPr>
+                <w:b w:val="0"/>
+                <w:sz w:val="20"/>
+              </w:rPr>
+              <w:t>C-12, T-15</w:t>
+            </w:r>
+          </w:p>
+        </w:tc>
+      </w:tr>
+    </w:tbl>
+    <w:p/>
+    <w:p>
+      <w:pPr>
+        <w:pStyle w:val="Heading2"/>
+      </w:pPr>
+      <w:r>
+        <w:rPr>
+          <w:i w:val="0"/>
+          <w:color w:val="000000"/>
+        </w:rPr>
+        <w:t>C-19. A Lei 75/2013 ainda atribui às câmaras o abate de canídeos e gatídeos</w:t>
+      </w:r>
+    </w:p>
+    <w:tbl>
+      <w:tblPr>
+        <w:tblW w:w="9071" w:type="dxa"/>
+        <w:jc w:val="center"/>
+        <w:tblBorders>
+          <w:top w:val="single" w:sz="4" w:space="0" w:color="000000"/>
+          <w:left w:val="single" w:sz="4" w:space="0" w:color="000000"/>
+          <w:bottom w:val="single" w:sz="4" w:space="0" w:color="000000"/>
+          <w:right w:val="single" w:sz="4" w:space="0" w:color="000000"/>
+          <w:insideH w:val="single" w:sz="4" w:space="0" w:color="000000"/>
+          <w:insideV w:val="single" w:sz="4" w:space="0" w:color="000000"/>
+        </w:tblBorders>
+        <w:tblLayout w:type="fixed"/>
+        <w:tblLook w:firstColumn="1" w:firstRow="1" w:lastColumn="0" w:lastRow="0" w:noHBand="0" w:noVBand="1" w:val="04A0"/>
+      </w:tblPr>
+      <w:tblGrid>
+        <w:gridCol w:w="1984"/>
+        <w:gridCol w:w="7087"/>
+      </w:tblGrid>
+      <w:tr>
+        <w:tc>
+          <w:tcPr>
+            <w:tcW w:w="1984" w:type="dxa"/>
+          </w:tcPr>
+          <w:p>
+            <w:pPr>
+              <w:spacing w:after="60"/>
+            </w:pPr>
+            <w:r/>
+            <w:r>
+              <w:rPr>
+                <w:b/>
+                <w:sz w:val="20"/>
+              </w:rPr>
+              <w:t>Onde</w:t>
+            </w:r>
+          </w:p>
+        </w:tc>
+        <w:tc>
+          <w:tcPr>
+            <w:tcW w:w="7087" w:type="dxa"/>
+          </w:tcPr>
+          <w:p>
+            <w:pPr>
+              <w:spacing w:after="60"/>
+            </w:pPr>
+            <w:r/>
+            <w:r>
+              <w:rPr>
+                <w:b w:val="0"/>
+                <w:sz w:val="20"/>
+              </w:rPr>
+              <w:t>sem norma no RGAC</w:t>
+            </w:r>
+          </w:p>
+        </w:tc>
+      </w:tr>
+      <w:tr>
+        <w:tc>
+          <w:tcPr>
+            <w:tcW w:w="1984" w:type="dxa"/>
+          </w:tcPr>
+          <w:p>
+            <w:pPr>
+              <w:spacing w:after="60"/>
+            </w:pPr>
+            <w:r/>
+            <w:r>
+              <w:rPr>
+                <w:b/>
+                <w:sz w:val="20"/>
+              </w:rPr>
+              <w:t>Origem</w:t>
+            </w:r>
+          </w:p>
+        </w:tc>
+        <w:tc>
+          <w:tcPr>
+            <w:tcW w:w="7087" w:type="dxa"/>
+          </w:tcPr>
+          <w:p>
+            <w:pPr>
+              <w:spacing w:after="60"/>
+            </w:pPr>
+            <w:r/>
+            <w:r>
+              <w:rPr>
+                <w:b w:val="0"/>
+                <w:sz w:val="20"/>
+              </w:rPr>
+              <w:t>Já existia no regime vigente e o RGAC não resolve</w:t>
+            </w:r>
+          </w:p>
+        </w:tc>
+      </w:tr>
+      <w:tr>
+        <w:tc>
+          <w:tcPr>
+            <w:tcW w:w="1984" w:type="dxa"/>
+          </w:tcPr>
+          <w:p>
+            <w:pPr>
+              <w:spacing w:after="60"/>
+            </w:pPr>
+            <w:r/>
+            <w:r>
+              <w:rPr>
+                <w:b/>
+                <w:sz w:val="20"/>
+              </w:rPr>
+              <w:t>Problema</w:t>
+            </w:r>
+          </w:p>
+        </w:tc>
+        <w:tc>
+          <w:tcPr>
+            <w:tcW w:w="7087" w:type="dxa"/>
+          </w:tcPr>
+          <w:p>
+            <w:pPr>
+              <w:spacing w:after="60"/>
+            </w:pPr>
+            <w:r/>
+            <w:r>
+              <w:rPr>
+                <w:b w:val="0"/>
+                <w:sz w:val="20"/>
+              </w:rPr>
+              <w:t>O anexo I da Lei 75/2013, art. 33.º, n.º 1, al. ii), dá à câmara municipal a competência para «Proceder à captura, alojamento e abate de canídeos e gatídeos». A redação é anterior à Lei 27/2016, que proibiu o abate como forma de controlo da população, e não foi alterada.</w:t>
+            </w:r>
+          </w:p>
+          <w:p>
+            <w:pPr>
+              <w:spacing w:after="60"/>
+            </w:pPr>
+            <w:r>
+              <w:rPr>
+                <w:b w:val="0"/>
+                <w:sz w:val="20"/>
+              </w:rPr>
+              <w:t>O RGAC revoga a Lei 27/2016 (art. 149.º, n.º 1) e não altera a Lei 75/2013. A norma geral de competência das câmaras continua a falar em abate.</w:t>
+            </w:r>
+          </w:p>
+        </w:tc>
+      </w:tr>
+      <w:tr>
+        <w:tc>
+          <w:tcPr>
+            <w:tcW w:w="1984" w:type="dxa"/>
+          </w:tcPr>
+          <w:p>
+            <w:pPr>
+              <w:spacing w:after="60"/>
+            </w:pPr>
+            <w:r/>
+            <w:r>
+              <w:rPr>
+                <w:b/>
+                <w:sz w:val="20"/>
+              </w:rPr>
+              <w:t>Proposta</w:t>
+            </w:r>
+          </w:p>
+        </w:tc>
+        <w:tc>
+          <w:tcPr>
+            <w:tcW w:w="7087" w:type="dxa"/>
+          </w:tcPr>
+          <w:p>
+            <w:pPr>
+              <w:spacing w:after="60"/>
+            </w:pPr>
+            <w:r/>
+            <w:r>
+              <w:rPr>
+                <w:b w:val="0"/>
+                <w:sz w:val="20"/>
+              </w:rPr>
+              <w:t>Alterar a al. ii) para «Proceder à captura, recolha, alojamento e esterilização de animais de companhia errantes». Verificar se, por ser matéria de competências das autarquias, a alteração exige lei da Assembleia da República ou autorização legislativa.</w:t>
+            </w:r>
+          </w:p>
+        </w:tc>
+      </w:tr>
+      <w:tr>
+        <w:tc>
+          <w:tcPr>
+            <w:tcW w:w="1984" w:type="dxa"/>
+          </w:tcPr>
+          <w:p>
+            <w:pPr>
+              <w:spacing w:after="60"/>
+            </w:pPr>
+            <w:r/>
+            <w:r>
+              <w:rPr>
+                <w:b/>
+                <w:sz w:val="20"/>
+              </w:rPr>
+              <w:t>Quem levantou</w:t>
+            </w:r>
+          </w:p>
+        </w:tc>
+        <w:tc>
+          <w:tcPr>
+            <w:tcW w:w="7087" w:type="dxa"/>
+          </w:tcPr>
+          <w:p>
+            <w:pPr>
+              <w:spacing w:after="60"/>
+            </w:pPr>
+            <w:r/>
+            <w:r>
+              <w:rPr>
+                <w:b w:val="0"/>
+                <w:sz w:val="20"/>
+              </w:rPr>
+              <w:t>Análise interna (8.10.2026)</w:t>
+            </w:r>
+          </w:p>
+        </w:tc>
+      </w:tr>
+      <w:tr>
+        <w:tc>
+          <w:tcPr>
+            <w:tcW w:w="1984" w:type="dxa"/>
+          </w:tcPr>
+          <w:p>
+            <w:pPr>
+              <w:spacing w:after="60"/>
+            </w:pPr>
+            <w:r/>
+            <w:r>
+              <w:rPr>
+                <w:b/>
+                <w:sz w:val="20"/>
+              </w:rPr>
+              <w:t>Estado</w:t>
+            </w:r>
+          </w:p>
+        </w:tc>
+        <w:tc>
+          <w:tcPr>
+            <w:tcW w:w="7087" w:type="dxa"/>
+          </w:tcPr>
+          <w:p>
+            <w:pPr>
+              <w:spacing w:after="60"/>
+            </w:pPr>
+            <w:r/>
+            <w:r>
+              <w:rPr>
+                <w:b w:val="0"/>
+                <w:sz w:val="20"/>
+              </w:rPr>
+              <w:t>Aberto</w:t>
+            </w:r>
+          </w:p>
+        </w:tc>
+      </w:tr>
+      <w:tr>
+        <w:tc>
+          <w:tcPr>
+            <w:tcW w:w="1984" w:type="dxa"/>
+          </w:tcPr>
+          <w:p>
+            <w:pPr>
+              <w:spacing w:after="60"/>
+            </w:pPr>
+            <w:r/>
+            <w:r>
+              <w:rPr>
+                <w:b/>
+                <w:sz w:val="20"/>
+              </w:rPr>
+              <w:t>Fichas relacionadas</w:t>
+            </w:r>
+          </w:p>
+        </w:tc>
+        <w:tc>
+          <w:tcPr>
+            <w:tcW w:w="7087" w:type="dxa"/>
+          </w:tcPr>
+          <w:p>
+            <w:pPr>
+              <w:spacing w:after="60"/>
+            </w:pPr>
+            <w:r/>
+            <w:r>
+              <w:rPr>
+                <w:b w:val="0"/>
+                <w:sz w:val="20"/>
+              </w:rPr>
+              <w:t>C-17</w:t>
             </w:r>
           </w:p>
         </w:tc>
@@ -12167,7 +13223,7 @@
     <w:p>
       <w:pPr>
         <w:sectPr>
-          <w:footerReference w:type="default" r:id="rId65"/>
+          <w:footerReference w:type="default" r:id="rId69"/>
           <w:pgSz w:w="11906" w:h="16838"/>
           <w:pgMar w:top="1247" w:right="1417" w:bottom="1247" w:left="1417" w:header="720" w:footer="720" w:gutter="0"/>
           <w:cols w:space="720"/>
@@ -14066,7 +15122,7 @@
                 <w:b w:val="0"/>
                 <w:sz w:val="20"/>
               </w:rPr>
-              <w:t>C-01</w:t>
+              <w:t>T-20</w:t>
             </w:r>
           </w:p>
         </w:tc>
@@ -14084,7 +15140,7 @@
                 <w:b w:val="0"/>
                 <w:sz w:val="20"/>
               </w:rPr>
-              <w:t>O CED passa a ser só uma faculdade das câmaras</w:t>
+              <w:t>Quem acolhe um animal errante pode ficar sem saída lícita</w:t>
             </w:r>
           </w:p>
         </w:tc>
@@ -14102,7 +15158,7 @@
                 <w:b w:val="0"/>
                 <w:sz w:val="20"/>
               </w:rPr>
-              <w:t>art. 86.º, n.º 1</w:t>
+              <w:t>art. 3.º, definição de «Abandono»</w:t>
             </w:r>
           </w:p>
         </w:tc>
@@ -14120,7 +15176,7 @@
                 <w:b w:val="0"/>
                 <w:sz w:val="20"/>
               </w:rPr>
-              <w:t>Criado pelo RGAC</w:t>
+              <w:t>Já existia</w:t>
             </w:r>
           </w:p>
         </w:tc>
@@ -14158,7 +15214,7 @@
                 <w:b w:val="0"/>
                 <w:sz w:val="20"/>
               </w:rPr>
-              <w:t>C-02</w:t>
+              <w:t>C-01</w:t>
             </w:r>
           </w:p>
         </w:tc>
@@ -14176,7 +15232,7 @@
                 <w:b w:val="0"/>
                 <w:sz w:val="20"/>
               </w:rPr>
-              <w:t>O cuidador de colónia não existe no texto</w:t>
+              <w:t>O CED passa a ser só uma faculdade das câmaras</w:t>
             </w:r>
           </w:p>
         </w:tc>
@@ -14194,7 +15250,7 @@
                 <w:b w:val="0"/>
                 <w:sz w:val="20"/>
               </w:rPr>
-              <w:t>art. 86.º (todo)</w:t>
+              <w:t>art. 86.º, n.º 1</w:t>
             </w:r>
           </w:p>
         </w:tc>
@@ -14250,7 +15306,7 @@
                 <w:b w:val="0"/>
                 <w:sz w:val="20"/>
               </w:rPr>
-              <w:t>C-03</w:t>
+              <w:t>C-02</w:t>
             </w:r>
           </w:p>
         </w:tc>
@@ -14268,7 +15324,7 @@
                 <w:b w:val="0"/>
                 <w:sz w:val="20"/>
               </w:rPr>
-              <w:t>Proibição nacional de alimentar animais na via pública</w:t>
+              <w:t>O cuidador de colónia não existe no texto</w:t>
             </w:r>
           </w:p>
         </w:tc>
@@ -14286,7 +15342,7 @@
                 <w:b w:val="0"/>
                 <w:sz w:val="20"/>
               </w:rPr>
-              <w:t>art. 84.º, n.º 3</w:t>
+              <w:t>art. 86.º (todo)</w:t>
             </w:r>
           </w:p>
         </w:tc>
@@ -14342,7 +15398,7 @@
                 <w:b w:val="0"/>
                 <w:sz w:val="20"/>
               </w:rPr>
-              <w:t>C-04</w:t>
+              <w:t>C-03</w:t>
             </w:r>
           </w:p>
         </w:tc>
@@ -14360,7 +15416,7 @@
                 <w:b w:val="0"/>
                 <w:sz w:val="20"/>
               </w:rPr>
-              <w:t>Só as câmaras podem capturar, mas o CED pode ser gerido por outras entidades</w:t>
+              <w:t>Proibição nacional de alimentar animais na via pública</w:t>
             </w:r>
           </w:p>
         </w:tc>
@@ -14378,7 +15434,7 @@
                 <w:b w:val="0"/>
                 <w:sz w:val="20"/>
               </w:rPr>
-              <w:t>art. 91.º, n.º 3</w:t>
+              <w:t>art. 84.º, n.º 3</w:t>
             </w:r>
           </w:p>
         </w:tc>
@@ -14434,7 +15490,7 @@
                 <w:b w:val="0"/>
                 <w:sz w:val="20"/>
               </w:rPr>
-              <w:t>C-05</w:t>
+              <w:t>C-04</w:t>
             </w:r>
           </w:p>
         </w:tc>
@@ -14452,7 +15508,7 @@
                 <w:b w:val="0"/>
                 <w:sz w:val="20"/>
               </w:rPr>
-              <w:t>Passagem obrigatória pelo CRO antes de o gato entrar na colónia</w:t>
+              <w:t>Só as câmaras podem capturar, mas o CED pode ser gerido por outras entidades</w:t>
             </w:r>
           </w:p>
         </w:tc>
@@ -14470,7 +15526,7 @@
                 <w:b w:val="0"/>
                 <w:sz w:val="20"/>
               </w:rPr>
-              <w:t>art. 86.º, n.º 6, al. d)</w:t>
+              <w:t>art. 91.º, n.º 3</w:t>
             </w:r>
           </w:p>
         </w:tc>
@@ -14488,7 +15544,7 @@
                 <w:b w:val="0"/>
                 <w:sz w:val="20"/>
               </w:rPr>
-              <w:t>Já existia</w:t>
+              <w:t>Criado pelo RGAC</w:t>
             </w:r>
           </w:p>
         </w:tc>
@@ -14526,7 +15582,7 @@
                 <w:b w:val="0"/>
                 <w:sz w:val="20"/>
               </w:rPr>
-              <w:t>C-06</w:t>
+              <w:t>C-05</w:t>
             </w:r>
           </w:p>
         </w:tc>
@@ -14544,7 +15600,7 @@
                 <w:b w:val="0"/>
                 <w:sz w:val="20"/>
               </w:rPr>
-              <w:t>Exclusão dos cães do CED</w:t>
+              <w:t>Passagem obrigatória pelo CRO antes de o gato entrar na colónia</w:t>
             </w:r>
           </w:p>
         </w:tc>
@@ -14562,7 +15618,7 @@
                 <w:b w:val="0"/>
                 <w:sz w:val="20"/>
               </w:rPr>
-              <w:t>art. 86.º, n.º 3</w:t>
+              <w:t>art. 86.º, n.º 6, al. d)</w:t>
             </w:r>
           </w:p>
         </w:tc>
@@ -14618,7 +15674,7 @@
                 <w:b w:val="0"/>
                 <w:sz w:val="20"/>
               </w:rPr>
-              <w:t>C-07</w:t>
+              <w:t>C-06</w:t>
             </w:r>
           </w:p>
         </w:tc>
@@ -14636,7 +15692,7 @@
                 <w:b w:val="0"/>
                 <w:sz w:val="20"/>
               </w:rPr>
-              <w:t>Remissões e numeração erradas no artigo do CED</w:t>
+              <w:t>Exclusão dos cães do CED</w:t>
             </w:r>
           </w:p>
         </w:tc>
@@ -14654,7 +15710,7 @@
                 <w:b w:val="0"/>
                 <w:sz w:val="20"/>
               </w:rPr>
-              <w:t>art. 86.º, n.ºs 1, 2, 5, 6 e 9</w:t>
+              <w:t>art. 86.º, n.º 3</w:t>
             </w:r>
           </w:p>
         </w:tc>
@@ -14672,7 +15728,7 @@
                 <w:b w:val="0"/>
                 <w:sz w:val="20"/>
               </w:rPr>
-              <w:t>Criado pelo RGAC</w:t>
+              <w:t>Já existia</w:t>
             </w:r>
           </w:p>
         </w:tc>
@@ -14710,7 +15766,7 @@
                 <w:b w:val="0"/>
                 <w:sz w:val="20"/>
               </w:rPr>
-              <w:t>C-08</w:t>
+              <w:t>C-07</w:t>
             </w:r>
           </w:p>
         </w:tc>
@@ -14728,7 +15784,7 @@
                 <w:b w:val="0"/>
                 <w:sz w:val="20"/>
               </w:rPr>
-              <w:t>Entidade promotora, entidade responsável e titular: quem responde pela colónia</w:t>
+              <w:t>Remissões e numeração erradas no artigo do CED</w:t>
             </w:r>
           </w:p>
         </w:tc>
@@ -14746,7 +15802,7 @@
                 <w:b w:val="0"/>
                 <w:sz w:val="20"/>
               </w:rPr>
-              <w:t>art. 86.º, n.ºs 4, 5 (segundo), 6 e 10</w:t>
+              <w:t>art. 86.º, n.ºs 1, 2, 5, 6 e 9</w:t>
             </w:r>
           </w:p>
         </w:tc>
@@ -14764,7 +15820,7 @@
                 <w:b w:val="0"/>
                 <w:sz w:val="20"/>
               </w:rPr>
-              <w:t>Já existia</w:t>
+              <w:t>Criado pelo RGAC</w:t>
             </w:r>
           </w:p>
         </w:tc>
@@ -14802,7 +15858,7 @@
                 <w:b w:val="0"/>
                 <w:sz w:val="20"/>
               </w:rPr>
-              <w:t>C-09</w:t>
+              <w:t>C-08</w:t>
             </w:r>
           </w:p>
         </w:tc>
@@ -14820,7 +15876,7 @@
                 <w:b w:val="0"/>
                 <w:sz w:val="20"/>
               </w:rPr>
-              <w:t>Registo da colónia no SIAC sem conteúdo definido</w:t>
+              <w:t>Entidade promotora, entidade responsável e titular: quem responde pela colónia</w:t>
             </w:r>
           </w:p>
         </w:tc>
@@ -14838,7 +15894,7 @@
                 <w:b w:val="0"/>
                 <w:sz w:val="20"/>
               </w:rPr>
-              <w:t>art. 86.º, n.º 6, al. f)</w:t>
+              <w:t>art. 86.º, n.ºs 4, 5 (segundo), 6 e 10</w:t>
             </w:r>
           </w:p>
         </w:tc>
@@ -14856,7 +15912,7 @@
                 <w:b w:val="0"/>
                 <w:sz w:val="20"/>
               </w:rPr>
-              <w:t>Resolvido em parte</w:t>
+              <w:t>Já existia</w:t>
             </w:r>
           </w:p>
         </w:tc>
@@ -14874,7 +15930,7 @@
                 <w:b w:val="0"/>
                 <w:sz w:val="20"/>
               </w:rPr>
-              <w:t>Parcialmente resolvido</w:t>
+              <w:t>Aberto</w:t>
             </w:r>
           </w:p>
         </w:tc>
@@ -14894,7 +15950,7 @@
                 <w:b w:val="0"/>
                 <w:sz w:val="20"/>
               </w:rPr>
-              <w:t>C-10</w:t>
+              <w:t>C-09</w:t>
             </w:r>
           </w:p>
         </w:tc>
@@ -14912,7 +15968,7 @@
                 <w:b w:val="0"/>
                 <w:sz w:val="20"/>
               </w:rPr>
-              <w:t>Colónias em prédios privados</w:t>
+              <w:t>Registo da colónia no SIAC sem conteúdo definido</w:t>
             </w:r>
           </w:p>
         </w:tc>
@@ -14930,7 +15986,7 @@
                 <w:b w:val="0"/>
                 <w:sz w:val="20"/>
               </w:rPr>
-              <w:t>art. 87.º</w:t>
+              <w:t>art. 86.º, n.º 6, al. f)</w:t>
             </w:r>
           </w:p>
         </w:tc>
@@ -14986,7 +16042,7 @@
                 <w:b w:val="0"/>
                 <w:sz w:val="20"/>
               </w:rPr>
-              <w:t>C-11</w:t>
+              <w:t>C-10</w:t>
             </w:r>
           </w:p>
         </w:tc>
@@ -15004,7 +16060,7 @@
                 <w:b w:val="0"/>
                 <w:sz w:val="20"/>
               </w:rPr>
-              <w:t>CED e conservação da natureza</w:t>
+              <w:t>Colónias em prédios privados</w:t>
             </w:r>
           </w:p>
         </w:tc>
@@ -15022,7 +16078,7 @@
                 <w:b w:val="0"/>
                 <w:sz w:val="20"/>
               </w:rPr>
-              <w:t>art. 86.º, n.º 5</w:t>
+              <w:t>art. 87.º</w:t>
             </w:r>
           </w:p>
         </w:tc>
@@ -15040,7 +16096,7 @@
                 <w:b w:val="0"/>
                 <w:sz w:val="20"/>
               </w:rPr>
-              <w:t>Já existia</w:t>
+              <w:t>Resolvido em parte</w:t>
             </w:r>
           </w:p>
         </w:tc>
@@ -15058,7 +16114,7 @@
                 <w:b w:val="0"/>
                 <w:sz w:val="20"/>
               </w:rPr>
-              <w:t>Aberto</w:t>
+              <w:t>Parcialmente resolvido</w:t>
             </w:r>
           </w:p>
         </w:tc>
@@ -15078,7 +16134,7 @@
                 <w:b w:val="0"/>
                 <w:sz w:val="20"/>
               </w:rPr>
-              <w:t>C-12</w:t>
+              <w:t>C-11</w:t>
             </w:r>
           </w:p>
         </w:tc>
@@ -15096,7 +16152,7 @@
                 <w:b w:val="0"/>
                 <w:sz w:val="20"/>
               </w:rPr>
-              <w:t>Gatos de colónia em infração permanente</w:t>
+              <w:t>CED e conservação da natureza</w:t>
             </w:r>
           </w:p>
         </w:tc>
@@ -15114,7 +16170,7 @@
                 <w:b w:val="0"/>
                 <w:sz w:val="20"/>
               </w:rPr>
-              <w:t>art. 60.º, n.º 1</w:t>
+              <w:t>art. 86.º, n.º 5</w:t>
             </w:r>
           </w:p>
         </w:tc>
@@ -15132,7 +16188,7 @@
                 <w:b w:val="0"/>
                 <w:sz w:val="20"/>
               </w:rPr>
-              <w:t>Criado pelo RGAC</w:t>
+              <w:t>Já existia</w:t>
             </w:r>
           </w:p>
         </w:tc>
@@ -15170,7 +16226,7 @@
                 <w:b w:val="0"/>
                 <w:sz w:val="20"/>
               </w:rPr>
-              <w:t>C-13</w:t>
+              <w:t>C-12</w:t>
             </w:r>
           </w:p>
         </w:tc>
@@ -15188,7 +16244,7 @@
                 <w:b w:val="0"/>
                 <w:sz w:val="20"/>
               </w:rPr>
-              <w:t>Crias e gatos sociáveis: retirar ou devolver</w:t>
+              <w:t>Gatos de colónia em infração permanente</w:t>
             </w:r>
           </w:p>
         </w:tc>
@@ -15206,7 +16262,7 @@
                 <w:b w:val="0"/>
                 <w:sz w:val="20"/>
               </w:rPr>
-              <w:t>art. 86.º, n.º 7</w:t>
+              <w:t>art. 60.º, n.º 1</w:t>
             </w:r>
           </w:p>
         </w:tc>
@@ -15224,7 +16280,7 @@
                 <w:b w:val="0"/>
                 <w:sz w:val="20"/>
               </w:rPr>
-              <w:t>Já existia</w:t>
+              <w:t>Criado pelo RGAC</w:t>
             </w:r>
           </w:p>
         </w:tc>
@@ -15262,7 +16318,7 @@
                 <w:b w:val="0"/>
                 <w:sz w:val="20"/>
               </w:rPr>
-              <w:t>C-14</w:t>
+              <w:t>C-13</w:t>
             </w:r>
           </w:p>
         </w:tc>
@@ -15280,7 +16336,7 @@
                 <w:b w:val="0"/>
                 <w:sz w:val="20"/>
               </w:rPr>
-              <w:t>Suspensão do programa e recolha dos gatos sem garantias</w:t>
+              <w:t>Crias e gatos sociáveis: retirar ou devolver</w:t>
             </w:r>
           </w:p>
         </w:tc>
@@ -15298,7 +16354,7 @@
                 <w:b w:val="0"/>
                 <w:sz w:val="20"/>
               </w:rPr>
-              <w:t>art. 86.º, n.ºs 2 e 9</w:t>
+              <w:t>art. 86.º, n.º 7</w:t>
             </w:r>
           </w:p>
         </w:tc>
@@ -15354,7 +16410,7 @@
                 <w:b w:val="0"/>
                 <w:sz w:val="20"/>
               </w:rPr>
-              <w:t>C-15</w:t>
+              <w:t>C-14</w:t>
             </w:r>
           </w:p>
         </w:tc>
@@ -15372,7 +16428,7 @@
                 <w:b w:val="0"/>
                 <w:sz w:val="20"/>
               </w:rPr>
-              <w:t>Meios: médicos veterinários municipais e financiamento</w:t>
+              <w:t>Suspensão do programa e recolha dos gatos sem garantias</w:t>
             </w:r>
           </w:p>
         </w:tc>
@@ -15390,7 +16446,7 @@
                 <w:b w:val="0"/>
                 <w:sz w:val="20"/>
               </w:rPr>
-              <w:t>art. 86.º, n.ºs 1, 5 (segundo) e 10</w:t>
+              <w:t>art. 86.º, n.ºs 2 e 9</w:t>
             </w:r>
           </w:p>
         </w:tc>
@@ -15446,7 +16502,7 @@
                 <w:b w:val="0"/>
                 <w:sz w:val="20"/>
               </w:rPr>
-              <w:t>C-16</w:t>
+              <w:t>C-15</w:t>
             </w:r>
           </w:p>
         </w:tc>
@@ -15464,7 +16520,7 @@
                 <w:b w:val="0"/>
                 <w:sz w:val="20"/>
               </w:rPr>
-              <w:t>Conflito com vizinhos e dimensão da colónia</w:t>
+              <w:t>Meios: médicos veterinários municipais e financiamento</w:t>
             </w:r>
           </w:p>
         </w:tc>
@@ -15482,7 +16538,7 @@
                 <w:b w:val="0"/>
                 <w:sz w:val="20"/>
               </w:rPr>
-              <w:t>art. 86.º, n.º 6 (segundo)</w:t>
+              <w:t>art. 86.º, n.ºs 1, 5 (segundo) e 10</w:t>
             </w:r>
           </w:p>
         </w:tc>
@@ -15538,6 +16594,98 @@
                 <w:b w:val="0"/>
                 <w:sz w:val="20"/>
               </w:rPr>
+              <w:t>C-16</w:t>
+            </w:r>
+          </w:p>
+        </w:tc>
+        <w:tc>
+          <w:tcPr>
+            <w:tcW w:w="5216" w:type="dxa"/>
+          </w:tcPr>
+          <w:p>
+            <w:pPr>
+              <w:spacing w:after="60"/>
+            </w:pPr>
+            <w:r/>
+            <w:r>
+              <w:rPr>
+                <w:b w:val="0"/>
+                <w:sz w:val="20"/>
+              </w:rPr>
+              <w:t>Conflito com vizinhos e dimensão da colónia</w:t>
+            </w:r>
+          </w:p>
+        </w:tc>
+        <w:tc>
+          <w:tcPr>
+            <w:tcW w:w="3969" w:type="dxa"/>
+          </w:tcPr>
+          <w:p>
+            <w:pPr>
+              <w:spacing w:after="60"/>
+            </w:pPr>
+            <w:r/>
+            <w:r>
+              <w:rPr>
+                <w:b w:val="0"/>
+                <w:sz w:val="20"/>
+              </w:rPr>
+              <w:t>art. 86.º, n.º 6 (segundo)</w:t>
+            </w:r>
+          </w:p>
+        </w:tc>
+        <w:tc>
+          <w:tcPr>
+            <w:tcW w:w="2381" w:type="dxa"/>
+          </w:tcPr>
+          <w:p>
+            <w:pPr>
+              <w:spacing w:after="60"/>
+            </w:pPr>
+            <w:r/>
+            <w:r>
+              <w:rPr>
+                <w:b w:val="0"/>
+                <w:sz w:val="20"/>
+              </w:rPr>
+              <w:t>Já existia</w:t>
+            </w:r>
+          </w:p>
+        </w:tc>
+        <w:tc>
+          <w:tcPr>
+            <w:tcW w:w="1928" w:type="dxa"/>
+          </w:tcPr>
+          <w:p>
+            <w:pPr>
+              <w:spacing w:after="60"/>
+            </w:pPr>
+            <w:r/>
+            <w:r>
+              <w:rPr>
+                <w:b w:val="0"/>
+                <w:sz w:val="20"/>
+              </w:rPr>
+              <w:t>Aberto</w:t>
+            </w:r>
+          </w:p>
+        </w:tc>
+      </w:tr>
+      <w:tr>
+        <w:tc>
+          <w:tcPr>
+            <w:tcW w:w="1020" w:type="dxa"/>
+          </w:tcPr>
+          <w:p>
+            <w:pPr>
+              <w:spacing w:after="60"/>
+            </w:pPr>
+            <w:r/>
+            <w:r>
+              <w:rPr>
+                <w:b w:val="0"/>
+                <w:sz w:val="20"/>
+              </w:rPr>
               <w:t>C-17</w:t>
             </w:r>
           </w:p>
@@ -15575,6 +16723,190 @@
                 <w:sz w:val="20"/>
               </w:rPr>
               <w:t>art. 85.º, n.ºs 1 a 3</w:t>
+            </w:r>
+          </w:p>
+        </w:tc>
+        <w:tc>
+          <w:tcPr>
+            <w:tcW w:w="2381" w:type="dxa"/>
+          </w:tcPr>
+          <w:p>
+            <w:pPr>
+              <w:spacing w:after="60"/>
+            </w:pPr>
+            <w:r/>
+            <w:r>
+              <w:rPr>
+                <w:b w:val="0"/>
+                <w:sz w:val="20"/>
+              </w:rPr>
+              <w:t>Já existia</w:t>
+            </w:r>
+          </w:p>
+        </w:tc>
+        <w:tc>
+          <w:tcPr>
+            <w:tcW w:w="1928" w:type="dxa"/>
+          </w:tcPr>
+          <w:p>
+            <w:pPr>
+              <w:spacing w:after="60"/>
+            </w:pPr>
+            <w:r/>
+            <w:r>
+              <w:rPr>
+                <w:b w:val="0"/>
+                <w:sz w:val="20"/>
+              </w:rPr>
+              <w:t>Aberto</w:t>
+            </w:r>
+          </w:p>
+        </w:tc>
+      </w:tr>
+      <w:tr>
+        <w:tc>
+          <w:tcPr>
+            <w:tcW w:w="1020" w:type="dxa"/>
+          </w:tcPr>
+          <w:p>
+            <w:pPr>
+              <w:spacing w:after="60"/>
+            </w:pPr>
+            <w:r/>
+            <w:r>
+              <w:rPr>
+                <w:b w:val="0"/>
+                <w:sz w:val="20"/>
+              </w:rPr>
+              <w:t>C-18</w:t>
+            </w:r>
+          </w:p>
+        </w:tc>
+        <w:tc>
+          <w:tcPr>
+            <w:tcW w:w="5216" w:type="dxa"/>
+          </w:tcPr>
+          <w:p>
+            <w:pPr>
+              <w:spacing w:after="60"/>
+            </w:pPr>
+            <w:r/>
+            <w:r>
+              <w:rPr>
+                <w:b w:val="0"/>
+                <w:sz w:val="20"/>
+              </w:rPr>
+              <w:t>A definição de animal errante passa a abranger qualquer animal não identificado</w:t>
+            </w:r>
+          </w:p>
+        </w:tc>
+        <w:tc>
+          <w:tcPr>
+            <w:tcW w:w="3969" w:type="dxa"/>
+          </w:tcPr>
+          <w:p>
+            <w:pPr>
+              <w:spacing w:after="60"/>
+            </w:pPr>
+            <w:r/>
+            <w:r>
+              <w:rPr>
+                <w:b w:val="0"/>
+                <w:sz w:val="20"/>
+              </w:rPr>
+              <w:t>art. 3.º, definição de «Animal errante»</w:t>
+            </w:r>
+          </w:p>
+        </w:tc>
+        <w:tc>
+          <w:tcPr>
+            <w:tcW w:w="2381" w:type="dxa"/>
+          </w:tcPr>
+          <w:p>
+            <w:pPr>
+              <w:spacing w:after="60"/>
+            </w:pPr>
+            <w:r/>
+            <w:r>
+              <w:rPr>
+                <w:b w:val="0"/>
+                <w:sz w:val="20"/>
+              </w:rPr>
+              <w:t>Resolvido em parte</w:t>
+            </w:r>
+          </w:p>
+        </w:tc>
+        <w:tc>
+          <w:tcPr>
+            <w:tcW w:w="1928" w:type="dxa"/>
+          </w:tcPr>
+          <w:p>
+            <w:pPr>
+              <w:spacing w:after="60"/>
+            </w:pPr>
+            <w:r/>
+            <w:r>
+              <w:rPr>
+                <w:b w:val="0"/>
+                <w:sz w:val="20"/>
+              </w:rPr>
+              <w:t>Aberto</w:t>
+            </w:r>
+          </w:p>
+        </w:tc>
+      </w:tr>
+      <w:tr>
+        <w:tc>
+          <w:tcPr>
+            <w:tcW w:w="1020" w:type="dxa"/>
+          </w:tcPr>
+          <w:p>
+            <w:pPr>
+              <w:spacing w:after="60"/>
+            </w:pPr>
+            <w:r/>
+            <w:r>
+              <w:rPr>
+                <w:b w:val="0"/>
+                <w:sz w:val="20"/>
+              </w:rPr>
+              <w:t>C-19</w:t>
+            </w:r>
+          </w:p>
+        </w:tc>
+        <w:tc>
+          <w:tcPr>
+            <w:tcW w:w="5216" w:type="dxa"/>
+          </w:tcPr>
+          <w:p>
+            <w:pPr>
+              <w:spacing w:after="60"/>
+            </w:pPr>
+            <w:r/>
+            <w:r>
+              <w:rPr>
+                <w:b w:val="0"/>
+                <w:sz w:val="20"/>
+              </w:rPr>
+              <w:t>A Lei 75/2013 ainda atribui às câmaras o abate de canídeos e gatídeos</w:t>
+            </w:r>
+          </w:p>
+        </w:tc>
+        <w:tc>
+          <w:tcPr>
+            <w:tcW w:w="3969" w:type="dxa"/>
+          </w:tcPr>
+          <w:p>
+            <w:pPr>
+              <w:spacing w:after="60"/>
+            </w:pPr>
+            <w:r/>
+            <w:r>
+              <w:rPr>
+                <w:b w:val="0"/>
+                <w:sz w:val="20"/>
+              </w:rPr>
+              <w:t>sem norma no RGAC</w:t>
             </w:r>
           </w:p>
         </w:tc>
@@ -15623,7 +16955,7 @@
           <w:b w:val="0"/>
           <w:i w:val="0"/>
         </w:rPr>
-        <w:t>Total: 36 fichas, das quais 32 em aberto.</w:t>
+        <w:t>Total: 39 fichas, das quais 35 em aberto.</w:t>
       </w:r>
     </w:p>
     <w:p>
@@ -21879,7 +23211,7 @@
                 <w:b w:val="0"/>
                 <w:sz w:val="20"/>
               </w:rPr>
-              <w:t>10</w:t>
+              <w:t>11</w:t>
             </w:r>
           </w:p>
         </w:tc>
@@ -21897,7 +23229,7 @@
                 <w:b w:val="0"/>
                 <w:sz w:val="20"/>
               </w:rPr>
-              <w:t>8</w:t>
+              <w:t>7</w:t>
             </w:r>
           </w:p>
         </w:tc>
@@ -22759,7 +24091,7 @@
                 <w:b/>
                 <w:sz w:val="20"/>
               </w:rPr>
-              <w:t>29</w:t>
+              <w:t>30</w:t>
             </w:r>
           </w:p>
         </w:tc>
@@ -22777,7 +24109,7 @@
                 <w:b/>
                 <w:sz w:val="20"/>
               </w:rPr>
-              <w:t>123</w:t>
+              <w:t>122</w:t>
             </w:r>
           </w:p>
         </w:tc>
@@ -23225,7 +24557,7 @@
                 <w:b w:val="0"/>
                 <w:sz w:val="20"/>
               </w:rPr>
-              <w:t>T-01, T-03, T-06, T-09, T-14, T-18, T-19, C-02, C-12</w:t>
+              <w:t>T-01, T-03, T-06, T-09, T-14, T-18, T-19, T-20, C-02, C-12, C-18</w:t>
             </w:r>
           </w:p>
         </w:tc>
@@ -33047,7 +34379,7 @@
                 <w:b w:val="0"/>
                 <w:sz w:val="20"/>
               </w:rPr>
-              <w:t>T-15, C-04, C-12, L-05</w:t>
+              <w:t>T-15, T-20, C-04, C-12, C-18, L-05</w:t>
             </w:r>
           </w:p>
         </w:tc>
@@ -33354,7 +34686,7 @@
                 <w:b w:val="0"/>
                 <w:sz w:val="20"/>
               </w:rPr>
-              <w:t>Por rever</w:t>
+              <w:t>Parcial</w:t>
             </w:r>
           </w:p>
         </w:tc>
@@ -33372,6 +34704,7 @@
                 <w:b w:val="0"/>
                 <w:sz w:val="20"/>
               </w:rPr>
+              <w:t>T-20</w:t>
             </w:r>
           </w:p>
         </w:tc>
@@ -40375,6 +41708,62 @@
                 <w:sz w:val="20"/>
               </w:rPr>
               <w:t>Ficha T-19: nada diz quem é titular quando o animal não tem proprietário. A definição da al. f) do art. 3.º do DL 82/2019 pressupõe dono ou possuidor com animus, e o RGAC só fecha a lacuna no CED. A ficha qualifica a proposta da T-01: repor o critério do DL 82/2019 não resolve o animal sem dono.</w:t>
+            </w:r>
+          </w:p>
+        </w:tc>
+      </w:tr>
+      <w:tr>
+        <w:tc>
+          <w:tcPr>
+            <w:tcW w:w="1020" w:type="dxa"/>
+          </w:tcPr>
+          <w:p>
+            <w:pPr>
+              <w:spacing w:after="60"/>
+            </w:pPr>
+            <w:r/>
+            <w:r>
+              <w:rPr>
+                <w:b w:val="0"/>
+                <w:sz w:val="20"/>
+              </w:rPr>
+              <w:t>1.10</w:t>
+            </w:r>
+          </w:p>
+        </w:tc>
+        <w:tc>
+          <w:tcPr>
+            <w:tcW w:w="1417" w:type="dxa"/>
+          </w:tcPr>
+          <w:p>
+            <w:pPr>
+              <w:spacing w:after="60"/>
+            </w:pPr>
+            <w:r/>
+            <w:r>
+              <w:rPr>
+                <w:b w:val="0"/>
+                <w:sz w:val="20"/>
+              </w:rPr>
+              <w:t>8.10.2026</w:t>
+            </w:r>
+          </w:p>
+        </w:tc>
+        <w:tc>
+          <w:tcPr>
+            <w:tcW w:w="6633" w:type="dxa"/>
+          </w:tcPr>
+          <w:p>
+            <w:pPr>
+              <w:spacing w:after="60"/>
+            </w:pPr>
+            <w:r/>
+            <w:r>
+              <w:rPr>
+                <w:b w:val="0"/>
+                <w:sz w:val="20"/>
+              </w:rPr>
+              <w:t>Recolha de errantes por particulares e estatuto de quem acolhe. Fichas novas: T-20 (quem acolhe um animal errante pode ficar sem saída lícita), C-18 (a definição de animal errante passa a abranger qualquer animal não identificado) e C-19 (a Lei 75/2013 ainda atribui às câmaras o abate de canídeos e gatídeos). Fichas T-14 e T-15 completadas: o RGAC omite a entrega pelo particular prevista no n.º 2 do art. 7.º da Portaria 146/2017, torna a captura exclusiva das câmaras e tem duas alíneas contraditórias no art. 140.º, n.º 2. Fontes novas: Lei 75/2013, regulamentos de Setúbal e Coimbra, acórdão do TRP de 8.5.2024.</w:t>
             </w:r>
           </w:p>
         </w:tc>
@@ -40667,6 +42056,69 @@
     </w:p>
     <w:p>
       <w:pPr>
+        <w:spacing w:after="80"/>
+        <w:ind w:left="454" w:hanging="454"/>
+      </w:pPr>
+      <w:r>
+        <w:rPr>
+          <w:b w:val="0"/>
+          <w:i w:val="0"/>
+        </w:rPr>
+        <w:t xml:space="preserve">Lei n.º 75/2013, de 12 de setembro (regime jurídico das autarquias locais), versão consolidada. </w:t>
+      </w:r>
+      <w:hyperlink r:id="rId21">
+        <w:r>
+          <w:rPr>
+            <w:u w:val="single"/>
+          </w:rPr>
+          <w:t xml:space="preserve">https://www.pgdlisboa.pt/leis/lei_mostra_articulado.php?nid=1990&amp;tabela=leis</w:t>
+        </w:r>
+      </w:hyperlink>
+    </w:p>
+    <w:p>
+      <w:pPr>
+        <w:spacing w:after="80"/>
+        <w:ind w:left="454" w:hanging="454"/>
+      </w:pPr>
+      <w:r>
+        <w:rPr>
+          <w:b w:val="0"/>
+          <w:i w:val="0"/>
+        </w:rPr>
+        <w:t xml:space="preserve">Município de Setúbal, Regulamento de Saúde e Bem-Estar Animal (RSBEAMS), aprovado pela Assembleia Municipal em 26.6.2020. </w:t>
+      </w:r>
+      <w:hyperlink r:id="rId22">
+        <w:r>
+          <w:rPr>
+            <w:u w:val="single"/>
+          </w:rPr>
+          <w:t xml:space="preserve">https://www.mun-setubal.pt/wp-content/uploads/2020/07/RSBEAMS-2020.pdf</w:t>
+        </w:r>
+      </w:hyperlink>
+    </w:p>
+    <w:p>
+      <w:pPr>
+        <w:spacing w:after="80"/>
+        <w:ind w:left="454" w:hanging="454"/>
+      </w:pPr>
+      <w:r>
+        <w:rPr>
+          <w:b w:val="0"/>
+          <w:i w:val="0"/>
+        </w:rPr>
+        <w:t xml:space="preserve">Município de Coimbra, Aviso n.º 6348/2023, Diário da República, 2.ª série, n.º 61, de 27.3.2023. </w:t>
+      </w:r>
+      <w:hyperlink r:id="rId23">
+        <w:r>
+          <w:rPr>
+            <w:u w:val="single"/>
+          </w:rPr>
+          <w:t xml:space="preserve">https://files.diariodarepublica.pt/gratuitos/2s/2023/03/2S061A0000S00.pdf</w:t>
+        </w:r>
+      </w:hyperlink>
+    </w:p>
+    <w:p>
+      <w:pPr>
         <w:pStyle w:val="Heading2"/>
       </w:pPr>
       <w:r>
@@ -40737,7 +42189,7 @@
         </w:rPr>
         <w:t xml:space="preserve">ICNF (2021). Projeto de alteração da Portaria n.º 146/2017, enviado à ANMP. </w:t>
       </w:r>
-      <w:hyperlink r:id="rId21">
+      <w:hyperlink r:id="rId24">
         <w:r>
           <w:rPr>
             <w:u w:val="single"/>
@@ -40758,7 +42210,7 @@
         </w:rPr>
         <w:t xml:space="preserve">PAN (2023). Projeto de Lei n.º 662/XV/1.ª, reconhece a figura do animal comunitário. </w:t>
       </w:r>
-      <w:hyperlink r:id="rId22">
+      <w:hyperlink r:id="rId25">
         <w:r>
           <w:rPr>
             <w:u w:val="single"/>
@@ -40779,7 +42231,7 @@
         </w:rPr>
         <w:t xml:space="preserve">Assembleia da República (2024). Nota técnica ao Projeto de Lei n.º 88/XVI/1.ª (PAN), 31.5.2024. </w:t>
       </w:r>
-      <w:hyperlink r:id="rId23">
+      <w:hyperlink r:id="rId26">
         <w:r>
           <w:rPr>
             <w:u w:val="single"/>
@@ -40812,7 +42264,7 @@
         </w:rPr>
         <w:t xml:space="preserve">ICNF (2023). Estratégia Nacional para os Animais Errantes (ENAE), versão submetida a consulta pública. </w:t>
       </w:r>
-      <w:hyperlink r:id="rId24">
+      <w:hyperlink r:id="rId27">
         <w:r>
           <w:rPr>
             <w:u w:val="single"/>
@@ -40833,7 +42285,7 @@
         </w:rPr>
         <w:t xml:space="preserve">DGAV (2021). Relatório final do Grupo de Trabalho para o Bem-Estar Animal: avaliação da implementação da Lei n.º 27/2016. </w:t>
       </w:r>
-      <w:hyperlink r:id="rId25">
+      <w:hyperlink r:id="rId28">
         <w:r>
           <w:rPr>
             <w:u w:val="single"/>
@@ -40854,7 +42306,7 @@
         </w:rPr>
         <w:t xml:space="preserve">Provedor de Justiça (1996). Recomendação n.º 82/A/96, à Câmara Municipal de Oeiras, 18.10.1996. </w:t>
       </w:r>
-      <w:hyperlink r:id="rId26">
+      <w:hyperlink r:id="rId29">
         <w:r>
           <w:rPr>
             <w:u w:val="single"/>
@@ -40875,7 +42327,7 @@
         </w:rPr>
         <w:t xml:space="preserve">Provedor de Justiça (2009). Canídeos: captura, alojamento e abate, anotação ao processo R4579/08 (Câmara Municipal das Lajes do Pico), 8.5.2009. </w:t>
       </w:r>
-      <w:hyperlink r:id="rId27">
+      <w:hyperlink r:id="rId30">
         <w:r>
           <w:rPr>
             <w:u w:val="single"/>
@@ -40896,7 +42348,7 @@
         </w:rPr>
         <w:t xml:space="preserve">Provedor de Justiça (2013). Recomendação n.º 4/A/2013, acumulação de resíduos e animais (síndrome de Diógenes), 6.5.2013. </w:t>
       </w:r>
-      <w:hyperlink r:id="rId28">
+      <w:hyperlink r:id="rId31">
         <w:r>
           <w:rPr>
             <w:u w:val="single"/>
@@ -40917,7 +42369,7 @@
         </w:rPr>
         <w:t xml:space="preserve">Provedor de Justiça (2021). Relatório à Assembleia da República 2020. </w:t>
       </w:r>
-      <w:hyperlink r:id="rId29">
+      <w:hyperlink r:id="rId32">
         <w:r>
           <w:rPr>
             <w:u w:val="single"/>
@@ -40938,7 +42390,7 @@
         </w:rPr>
         <w:t xml:space="preserve">Provedor de Justiça (2024). Relatório à Assembleia da República 2023. </w:t>
       </w:r>
-      <w:hyperlink r:id="rId30">
+      <w:hyperlink r:id="rId33">
         <w:r>
           <w:rPr>
             <w:u w:val="single"/>
@@ -40959,7 +42411,7 @@
         </w:rPr>
         <w:t xml:space="preserve">Comissão Europeia (2024). Commission Staff Working Document SWD(2024) 88 final, Summarising evidence supporting the legislative proposal on the welfare of dogs and cats and their traceability, 27.3.2024. </w:t>
       </w:r>
-      <w:hyperlink r:id="rId31">
+      <w:hyperlink r:id="rId34">
         <w:r>
           <w:rPr>
             <w:u w:val="single"/>
@@ -40980,7 +42432,7 @@
         </w:rPr>
         <w:t xml:space="preserve">WOAH (2024). Terrestrial Animal Health Code, capítulo 7.7, Dog population management. </w:t>
       </w:r>
-      <w:hyperlink r:id="rId32">
+      <w:hyperlink r:id="rId35">
         <w:r>
           <w:rPr>
             <w:u w:val="single"/>
@@ -41013,7 +42465,7 @@
         </w:rPr>
         <w:t xml:space="preserve">Ordem dos Médicos Veterinários (2015). Parecer sobre o abandono de animais em centros de atendimento médico-veterinário, novembro de 2015. </w:t>
       </w:r>
-      <w:hyperlink r:id="rId33">
+      <w:hyperlink r:id="rId36">
         <w:r>
           <w:rPr>
             <w:u w:val="single"/>
@@ -41034,7 +42486,7 @@
         </w:rPr>
         <w:t xml:space="preserve">Ordem dos Médicos Veterinários (2024). Parecer sobre o Projeto de Lei n.º 662/XV/1.ª (PAN), Of. n.º 02/CD/2024, 5.1.2024. </w:t>
       </w:r>
-      <w:hyperlink r:id="rId34">
+      <w:hyperlink r:id="rId37">
         <w:r>
           <w:rPr>
             <w:u w:val="single"/>
@@ -41055,7 +42507,7 @@
         </w:rPr>
         <w:t xml:space="preserve">APMVEAC (2021). Revisão crítica da legislação sobre animais de companhia, 9.4.2021. </w:t>
       </w:r>
-      <w:hyperlink r:id="rId35">
+      <w:hyperlink r:id="rId38">
         <w:r>
           <w:rPr>
             <w:u w:val="single"/>
@@ -41076,7 +42528,7 @@
         </w:rPr>
         <w:t xml:space="preserve">APMVEAC (2023). Parecer à consulta pública da Estratégia Nacional para os Animais Errantes, setembro de 2023. </w:t>
       </w:r>
-      <w:hyperlink r:id="rId36">
+      <w:hyperlink r:id="rId39">
         <w:r>
           <w:rPr>
             <w:u w:val="single"/>
@@ -41097,7 +42549,7 @@
         </w:rPr>
         <w:t xml:space="preserve">ARPA (2022). Parecer sobre o Decreto-Lei n.º 82/2019, dezembro de 2022. </w:t>
       </w:r>
-      <w:hyperlink r:id="rId37">
+      <w:hyperlink r:id="rId40">
         <w:r>
           <w:rPr>
             <w:u w:val="single"/>
@@ -41118,7 +42570,7 @@
         </w:rPr>
         <w:t xml:space="preserve">SPEA (2020). Parecer aos planos de gestão dos parques naturais de ilha dos Açores. </w:t>
       </w:r>
-      <w:hyperlink r:id="rId38">
+      <w:hyperlink r:id="rId41">
         <w:r>
           <w:rPr>
             <w:u w:val="single"/>
@@ -41139,7 +42591,7 @@
         </w:rPr>
         <w:t xml:space="preserve">SPEA (2021). Um gato feliz e alimentado mantém o passarinho afastado?, 27.12.2021. </w:t>
       </w:r>
-      <w:hyperlink r:id="rId39">
+      <w:hyperlink r:id="rId42">
         <w:r>
           <w:rPr>
             <w:u w:val="single"/>
@@ -41176,7 +42628,7 @@
         </w:rPr>
         <w:t xml:space="preserve">Movimento de Intervenção pelas Matilhas (Coimbra). Projeto. </w:t>
       </w:r>
-      <w:hyperlink r:id="rId40">
+      <w:hyperlink r:id="rId43">
         <w:r>
           <w:rPr>
             <w:u w:val="single"/>
@@ -41209,7 +42661,7 @@
         </w:rPr>
         <w:t xml:space="preserve">PAN (2025). PAN destaca vitórias no bem-estar animal, mas denuncia retrocesso grave no Orçamento do Estado para 2026. </w:t>
       </w:r>
-      <w:hyperlink r:id="rId41">
+      <w:hyperlink r:id="rId44">
         <w:r>
           <w:rPr>
             <w:u w:val="single"/>
@@ -41230,7 +42682,7 @@
         </w:rPr>
         <w:t xml:space="preserve">PCP (2021). Solução: prevenção pela esterilização, rede pública de veterinários, não abate de animais abandonados, 12.11.2021. </w:t>
       </w:r>
-      <w:hyperlink r:id="rId42">
+      <w:hyperlink r:id="rId45">
         <w:r>
           <w:rPr>
             <w:u w:val="single"/>
@@ -41251,7 +42703,7 @@
         </w:rPr>
         <w:t xml:space="preserve">PCP (2025). Campanha nacional de esterilização de animais errantes, proposta ao Orçamento do Estado para 2026, 5.11.2025. </w:t>
       </w:r>
-      <w:hyperlink r:id="rId43">
+      <w:hyperlink r:id="rId46">
         <w:r>
           <w:rPr>
             <w:u w:val="single"/>
@@ -41272,7 +42724,7 @@
         </w:rPr>
         <w:t xml:space="preserve">Livre (2024). Programa eleitoral, proposta N.13. </w:t>
       </w:r>
-      <w:hyperlink r:id="rId44">
+      <w:hyperlink r:id="rId47">
         <w:r>
           <w:rPr>
             <w:u w:val="single"/>
@@ -41293,7 +42745,7 @@
         </w:rPr>
         <w:t xml:space="preserve">Maratona pelos Animais (2024). Respostas completas dos partidos, março de 2024. </w:t>
       </w:r>
-      <w:hyperlink r:id="rId45">
+      <w:hyperlink r:id="rId48">
         <w:r>
           <w:rPr>
             <w:u w:val="single"/>
@@ -41326,7 +42778,7 @@
         </w:rPr>
         <w:t xml:space="preserve">Brito, Teresa Quintela de (2019). O abandono de animais de companhia. Revista Jurídica Luso-Brasileira, ano 5, n.º 2, pp. 77-95. </w:t>
       </w:r>
-      <w:hyperlink r:id="rId46">
+      <w:hyperlink r:id="rId49">
         <w:r>
           <w:rPr>
             <w:u w:val="single"/>
@@ -41347,7 +42799,7 @@
         </w:rPr>
         <w:t xml:space="preserve">Simões, Cátia (2019). O papel dos municípios na gestão do bem-estar animal: desafios legais e gestão municipal. Revista Jurídica Luso-Brasileira, ano 5, n.º 2, pp. 305-348. </w:t>
       </w:r>
-      <w:hyperlink r:id="rId47">
+      <w:hyperlink r:id="rId50">
         <w:r>
           <w:rPr>
             <w:u w:val="single"/>
@@ -41368,7 +42820,7 @@
         </w:rPr>
         <w:t xml:space="preserve">Araújo, Fernando; Marinho, Carlos; Farias, Raúl; Sousa, Susana Aires de; Dias, Cristina (2022). Direito dos animais. Lisboa: Centro de Estudos Judiciários, coleção Formação Contínua. </w:t>
       </w:r>
-      <w:hyperlink r:id="rId48">
+      <w:hyperlink r:id="rId51">
         <w:r>
           <w:rPr>
             <w:u w:val="single"/>
@@ -41401,7 +42853,7 @@
         </w:rPr>
         <w:t xml:space="preserve">Tribunal da Relação de Lisboa, acórdão de 24.11.2009, proc. 3121/03.4TBCSC.L1-6. </w:t>
       </w:r>
-      <w:hyperlink r:id="rId49">
+      <w:hyperlink r:id="rId52">
         <w:r>
           <w:rPr>
             <w:u w:val="single"/>
@@ -41422,7 +42874,7 @@
         </w:rPr>
         <w:t xml:space="preserve">Tribunal da Relação de Coimbra, acórdão de 11.7.2012, proc. 281/10.1TBCV.C1. </w:t>
       </w:r>
-      <w:hyperlink r:id="rId50">
+      <w:hyperlink r:id="rId53">
         <w:r>
           <w:rPr>
             <w:u w:val="single"/>
@@ -41443,7 +42895,7 @@
         </w:rPr>
         <w:t xml:space="preserve">Supremo Tribunal de Justiça, acórdão de 14.11.2013, proc. 478/05.6TBMGL.C1.S1. </w:t>
       </w:r>
-      <w:hyperlink r:id="rId51">
+      <w:hyperlink r:id="rId54">
         <w:r>
           <w:rPr>
             <w:u w:val="single"/>
@@ -41464,7 +42916,7 @@
         </w:rPr>
         <w:t xml:space="preserve">Tribunal Constitucional, Acórdão n.º 867/2021, de 10.11.2021. </w:t>
       </w:r>
-      <w:hyperlink r:id="rId52">
+      <w:hyperlink r:id="rId55">
         <w:r>
           <w:rPr>
             <w:u w:val="single"/>
@@ -41485,7 +42937,7 @@
         </w:rPr>
         <w:t xml:space="preserve">Tribunal Constitucional, Acórdão n.º 70/2024, de 23.1.2024 (Plenário). </w:t>
       </w:r>
-      <w:hyperlink r:id="rId53">
+      <w:hyperlink r:id="rId56">
         <w:r>
           <w:rPr>
             <w:u w:val="single"/>
@@ -41506,7 +42958,7 @@
         </w:rPr>
         <w:t xml:space="preserve">Tribunal da Relação de Coimbra, acórdão de 7.2.2024, proc. 6/22.9GCPBL.C1. </w:t>
       </w:r>
-      <w:hyperlink r:id="rId54">
+      <w:hyperlink r:id="rId57">
         <w:r>
           <w:rPr>
             <w:u w:val="single"/>
@@ -41527,7 +42979,7 @@
         </w:rPr>
         <w:t xml:space="preserve">Tribunal Constitucional, Acórdão n.º 478/2024, de 20.6.2024. </w:t>
       </w:r>
-      <w:hyperlink r:id="rId55">
+      <w:hyperlink r:id="rId58">
         <w:r>
           <w:rPr>
             <w:u w:val="single"/>
@@ -41548,12 +43000,33 @@
         </w:rPr>
         <w:t xml:space="preserve">Tribunal da Relação de Lisboa, acórdão de 30.4.2025, proc. 1642/24.4T8AMD.L1-8. </w:t>
       </w:r>
-      <w:hyperlink r:id="rId56">
+      <w:hyperlink r:id="rId59">
         <w:r>
           <w:rPr>
             <w:u w:val="single"/>
           </w:rPr>
           <w:t xml:space="preserve">https://www.dgsi.pt/jtrl.nsf/33182fc732316039802565fa00497eec/7462ba7a0546bac680258c8b0049a31e?OpenDocument</w:t>
+        </w:r>
+      </w:hyperlink>
+    </w:p>
+    <w:p>
+      <w:pPr>
+        <w:spacing w:after="80"/>
+        <w:ind w:left="454" w:hanging="454"/>
+      </w:pPr>
+      <w:r>
+        <w:rPr>
+          <w:b w:val="0"/>
+          <w:i w:val="0"/>
+        </w:rPr>
+        <w:t xml:space="preserve">Tribunal da Relação do Porto, acórdão de 8.5.2024, proc. 11/21.2GEVFR.P1. </w:t>
+      </w:r>
+      <w:hyperlink r:id="rId60">
+        <w:r>
+          <w:rPr>
+            <w:u w:val="single"/>
+          </w:rPr>
+          <w:t xml:space="preserve">https://www.dgsi.pt/jtrp.nsf/56a6e7121657f91e80257cda00381fdf/703e8b815ea39ece80258b34004b8157</w:t>
         </w:r>
       </w:hyperlink>
     </w:p>
@@ -41581,7 +43054,7 @@
         </w:rPr>
         <w:t xml:space="preserve">Loss, S. R.; Will, T.; Marra, P. P. (2013). The impact of free-ranging domestic cats on wildlife of the United States. Nature Communications, 4, 1396. </w:t>
       </w:r>
-      <w:hyperlink r:id="rId57">
+      <w:hyperlink r:id="rId61">
         <w:r>
           <w:rPr>
             <w:u w:val="single"/>
@@ -41602,7 +43075,7 @@
         </w:rPr>
         <w:t xml:space="preserve">Foley, P.; Foley, J. E.; Levy, J. K.; Paik, T. (2005). Analysis of the impact of trap-neuter-return programs on populations of feral cats. Journal of the American Veterinary Medical Association, 227(11), 1775-1781. </w:t>
       </w:r>
-      <w:hyperlink r:id="rId58">
+      <w:hyperlink r:id="rId62">
         <w:r>
           <w:rPr>
             <w:u w:val="single"/>
@@ -41623,7 +43096,7 @@
         </w:rPr>
         <w:t xml:space="preserve">Boone, J. D. e outros (2019). A long-term lens: cumulative impacts of free-roaming cat management strategy and intensity on preventable cat mortalities. Frontiers in Veterinary Science, 6, 238. </w:t>
       </w:r>
-      <w:hyperlink r:id="rId59">
+      <w:hyperlink r:id="rId63">
         <w:r>
           <w:rPr>
             <w:u w:val="single"/>
@@ -41644,7 +43117,7 @@
         </w:rPr>
         <w:t xml:space="preserve">Spehar, D. D.; Wolf, P. J. (2019). Integrated return-to-field and targeted trap-neuter-vaccinate-return programs result in reductions of feline intake and euthanasia at six municipal animal shelters. Frontiers in Veterinary Science, 6, 77. </w:t>
       </w:r>
-      <w:hyperlink r:id="rId60">
+      <w:hyperlink r:id="rId64">
         <w:r>
           <w:rPr>
             <w:u w:val="single"/>
@@ -41665,7 +43138,7 @@
         </w:rPr>
         <w:t xml:space="preserve">Trouwborst, A.; Somsen, H. (2020). Domestic cats (Felis catus) and European nature conservation law. Journal of Environmental Law, 32(3), 391-415. </w:t>
       </w:r>
-      <w:hyperlink r:id="rId61">
+      <w:hyperlink r:id="rId65">
         <w:r>
           <w:rPr>
             <w:u w:val="single"/>
@@ -41686,7 +43159,7 @@
         </w:rPr>
         <w:t xml:space="preserve">Gunther, I.; Hawlena, H.; Azriel, L.; Gibor, D.; Berke, O.; Klement, E. (2022). Reduction of free-roaming cat population requires high-intensity neutering in spatial contiguity to mitigate compensatory effects. Proceedings of the National Academy of Sciences, 119(15). </w:t>
       </w:r>
-      <w:hyperlink r:id="rId62">
+      <w:hyperlink r:id="rId66">
         <w:r>
           <w:rPr>
             <w:u w:val="single"/>
@@ -41707,7 +43180,7 @@
         </w:rPr>
         <w:t xml:space="preserve">Azevedo, A. e outros (2025). Social perceptions and attitudes towards free-roaming cats and dogs in Portugal: an exploratory study. Animals, 15(6), 771. </w:t>
       </w:r>
-      <w:hyperlink r:id="rId63">
+      <w:hyperlink r:id="rId67">
         <w:r>
           <w:rPr>
             <w:u w:val="single"/>
@@ -41728,7 +43201,7 @@
         </w:rPr>
         <w:t xml:space="preserve">Galão, M.; Soto, I.; Nunes, M.; Pedroso, N. M.; Rocha, R.; Rato, C. (2025). When pets go wild: integrating DNA metabarcoding and morphological analyses to investigate the impacts of free-ranging cats (Felis catus) on oceanic islands. Biological Conservation, 305, 111089. </w:t>
       </w:r>
-      <w:hyperlink r:id="rId64">
+      <w:hyperlink r:id="rId68">
         <w:r>
           <w:rPr>
             <w:u w:val="single"/>
@@ -41802,7 +43275,7 @@
       <w:rPr>
         <w:sz w:val="16"/>
       </w:rPr>
-      <w:t xml:space="preserve">Memorando de acompanhamento do RGAC, versão 1.9. Página </w:t>
+      <w:t xml:space="preserve">Memorando de acompanhamento do RGAC, versão 1.10. Página </w:t>
     </w:r>
     <w:r>
       <w:rPr>

</xml_diff>